<commit_message>
Refresh all generated examples, synthesis outputs, demos and workbook
</commit_message>
<xml_diff>
--- a/docs/SharpHDL_Classroom_Proposal.docx
+++ b/docs/SharpHDL_Classroom_Proposal.docx
@@ -19789,6 +19789,445 @@
           <w:sz w:val="20"/>
         </w:rPr>
         <w:t>Requirements and exact boundaries: CONSTRUCTS_AND_REQUIREMENTS.md and SEQUENTIAL_CIL.md. Reproducible native-code, graph and RTL checks: tests/run-advanced.sh. These tests establish the included cases; they are not a proof for every program.</w:t>
+      </w:r>
+    </w:p>
+    <w:p>
+      <w:r>
+        <w:br w:type="page"/>
+      </w:r>
+    </w:p>
+    <w:p>
+      <w:pPr>
+        <w:pStyle w:val="Heading1"/>
+      </w:pPr>
+      <w:r>
+        <w:t>Teacher extension  Names on the wires</w:t>
+      </w:r>
+    </w:p>
+    <w:p>
+      <w:r>
+        <w:t>A label helps us follow a wire through a drawing. SharpHDL can put useful labels on the wires in its generated Verilog too. The label changes what we call the wire, not the number it carries or when that number changes.</w:t>
+      </w:r>
+    </w:p>
+    <w:p>
+      <w:pPr>
+        <w:spacing w:after="200"/>
+      </w:pPr>
+      <w:r>
+        <w:rPr>
+          <w:rFonts w:ascii="DejaVu Sans Mono" w:hAnsi="DejaVu Sans Mono"/>
+          <w:sz w:val="20"/>
+        </w:rPr>
+        <w:t>var address = (baseAddress + offset)</w:t>
+        <w:br/>
+        <w:t xml:space="preserve">    .Named("effective_address");</w:t>
+        <w:br/>
+        <w:t>var selected = address.Eq(Expr.Const(16, 0xff02))</w:t>
+        <w:br/>
+        <w:t xml:space="preserve">    .Named("uart_tx_selected");</w:t>
+      </w:r>
+    </w:p>
+    <w:p>
+      <w:pPr>
+        <w:pStyle w:val="Heading2"/>
+      </w:pPr>
+      <w:r>
+        <w:t>Follow a labeled wire</w:t>
+      </w:r>
+    </w:p>
+    <w:p>
+      <w:pPr>
+        <w:spacing w:after="200"/>
+      </w:pPr>
+      <w:r>
+        <w:rPr>
+          <w:rFonts w:ascii="DejaVu Sans Mono" w:hAnsi="DejaVu Sans Mono"/>
+          <w:sz w:val="20"/>
+        </w:rPr>
+        <w:t>assign n_uart_tx_selected =</w:t>
+        <w:br/>
+        <w:t xml:space="preserve">    n_effective_address == 16'd65282;</w:t>
+      </w:r>
+    </w:p>
+    <w:p>
+      <w:r>
+        <w:t>Read this aloud: the UART transmit register is selected when the address equals 65282. The same number written in hexadecimal is FF02. In TinyRisc, that address means send a byte. The comparison makes a one-bit yes-or-no wire; it does not store a number or add a clock.</w:t>
+      </w:r>
+    </w:p>
+    <w:tbl>
+      <w:tblPr>
+        <w:tblW w:type="auto" w:w="0"/>
+        <w:tblLayout w:type="fixed"/>
+        <w:tblLook w:firstColumn="1" w:firstRow="1" w:lastColumn="0" w:lastRow="0" w:noHBand="0" w:noVBand="1" w:val="04A0"/>
+      </w:tblPr>
+      <w:tblGrid>
+        <w:gridCol w:w="3600"/>
+        <w:gridCol w:w="6480"/>
+      </w:tblGrid>
+      <w:tr>
+        <w:trPr>
+          <w:cantSplit/>
+          <w:tblHeader/>
+        </w:trPr>
+        <w:tc>
+          <w:tcPr>
+            <w:tcW w:type="dxa" w:w="3600"/>
+            <w:vAlign w:val="center"/>
+            <w:shd w:fill="17365D"/>
+            <w:tcBorders>
+              <w:top w:val="single" w:sz="4" w:color="D9D9D9"/>
+              <w:left w:val="single" w:sz="4" w:color="D9D9D9"/>
+              <w:bottom w:val="single" w:sz="4" w:color="D9D9D9"/>
+              <w:right w:val="single" w:sz="4" w:color="D9D9D9"/>
+            </w:tcBorders>
+            <w:tcMar>
+              <w:top w:w="90" w:type="dxa"/>
+              <w:left w:w="90" w:type="dxa"/>
+              <w:bottom w:w="90" w:type="dxa"/>
+              <w:right w:w="90" w:type="dxa"/>
+            </w:tcMar>
+          </w:tcPr>
+          <w:p>
+            <w:pPr>
+              <w:spacing w:after="40" w:line="252" w:lineRule="auto"/>
+              <w:jc w:val="center"/>
+            </w:pPr>
+            <w:r>
+              <w:rPr>
+                <w:b/>
+                <w:color w:val="FFFFFF"/>
+                <w:sz w:val="21"/>
+              </w:rPr>
+              <w:t>Label</w:t>
+            </w:r>
+          </w:p>
+        </w:tc>
+        <w:tc>
+          <w:tcPr>
+            <w:tcW w:type="dxa" w:w="6480"/>
+            <w:vAlign w:val="center"/>
+            <w:shd w:fill="17365D"/>
+            <w:tcBorders>
+              <w:top w:val="single" w:sz="4" w:color="D9D9D9"/>
+              <w:left w:val="single" w:sz="4" w:color="D9D9D9"/>
+              <w:bottom w:val="single" w:sz="4" w:color="D9D9D9"/>
+              <w:right w:val="single" w:sz="4" w:color="D9D9D9"/>
+            </w:tcBorders>
+            <w:tcMar>
+              <w:top w:w="90" w:type="dxa"/>
+              <w:left w:w="90" w:type="dxa"/>
+              <w:bottom w:w="90" w:type="dxa"/>
+              <w:right w:w="90" w:type="dxa"/>
+            </w:tcMar>
+          </w:tcPr>
+          <w:p>
+            <w:pPr>
+              <w:spacing w:after="40" w:line="252" w:lineRule="auto"/>
+            </w:pPr>
+            <w:r>
+              <w:rPr>
+                <w:b/>
+                <w:color w:val="FFFFFF"/>
+                <w:sz w:val="21"/>
+              </w:rPr>
+              <w:t>What it tells us</w:t>
+            </w:r>
+          </w:p>
+        </w:tc>
+      </w:tr>
+      <w:tr>
+        <w:trPr>
+          <w:cantSplit/>
+        </w:trPr>
+        <w:tc>
+          <w:tcPr>
+            <w:tcW w:type="dxa" w:w="3600"/>
+            <w:vAlign w:val="center"/>
+            <w:shd w:fill="FFFFFF"/>
+            <w:tcBorders>
+              <w:top w:val="single" w:sz="4" w:color="D9D9D9"/>
+              <w:left w:val="single" w:sz="4" w:color="D9D9D9"/>
+              <w:bottom w:val="single" w:sz="4" w:color="D9D9D9"/>
+              <w:right w:val="single" w:sz="4" w:color="D9D9D9"/>
+            </w:tcBorders>
+            <w:tcMar>
+              <w:top w:w="90" w:type="dxa"/>
+              <w:left w:w="90" w:type="dxa"/>
+              <w:bottom w:w="90" w:type="dxa"/>
+              <w:right w:w="90" w:type="dxa"/>
+            </w:tcMar>
+          </w:tcPr>
+          <w:p>
+            <w:pPr>
+              <w:spacing w:after="40" w:line="252" w:lineRule="auto"/>
+            </w:pPr>
+            <w:r>
+              <w:rPr>
+                <w:sz w:val="21"/>
+              </w:rPr>
+              <w:t>n_effective_address</w:t>
+            </w:r>
+          </w:p>
+        </w:tc>
+        <w:tc>
+          <w:tcPr>
+            <w:tcW w:type="dxa" w:w="6480"/>
+            <w:vAlign w:val="center"/>
+            <w:shd w:fill="FFFFFF"/>
+            <w:tcBorders>
+              <w:top w:val="single" w:sz="4" w:color="D9D9D9"/>
+              <w:left w:val="single" w:sz="4" w:color="D9D9D9"/>
+              <w:bottom w:val="single" w:sz="4" w:color="D9D9D9"/>
+              <w:right w:val="single" w:sz="4" w:color="D9D9D9"/>
+            </w:tcBorders>
+            <w:tcMar>
+              <w:top w:w="90" w:type="dxa"/>
+              <w:left w:w="90" w:type="dxa"/>
+              <w:bottom w:w="90" w:type="dxa"/>
+              <w:right w:w="90" w:type="dxa"/>
+            </w:tcMar>
+          </w:tcPr>
+          <w:p>
+            <w:pPr>
+              <w:spacing w:after="40" w:line="252" w:lineRule="auto"/>
+            </w:pPr>
+            <w:r>
+              <w:rPr>
+                <w:sz w:val="21"/>
+              </w:rPr>
+              <w:t>The address calculated by adding the base and offset.</w:t>
+            </w:r>
+          </w:p>
+        </w:tc>
+      </w:tr>
+      <w:tr>
+        <w:trPr>
+          <w:cantSplit/>
+        </w:trPr>
+        <w:tc>
+          <w:tcPr>
+            <w:tcW w:type="dxa" w:w="3600"/>
+            <w:vAlign w:val="center"/>
+            <w:shd w:fill="EDF5F7"/>
+            <w:tcBorders>
+              <w:top w:val="single" w:sz="4" w:color="D9D9D9"/>
+              <w:left w:val="single" w:sz="4" w:color="D9D9D9"/>
+              <w:bottom w:val="single" w:sz="4" w:color="D9D9D9"/>
+              <w:right w:val="single" w:sz="4" w:color="D9D9D9"/>
+            </w:tcBorders>
+            <w:tcMar>
+              <w:top w:w="90" w:type="dxa"/>
+              <w:left w:w="90" w:type="dxa"/>
+              <w:bottom w:w="90" w:type="dxa"/>
+              <w:right w:w="90" w:type="dxa"/>
+            </w:tcMar>
+          </w:tcPr>
+          <w:p>
+            <w:pPr>
+              <w:spacing w:after="40" w:line="252" w:lineRule="auto"/>
+            </w:pPr>
+            <w:r>
+              <w:rPr>
+                <w:sz w:val="21"/>
+              </w:rPr>
+              <w:t>n_uart_tx_selected</w:t>
+            </w:r>
+          </w:p>
+        </w:tc>
+        <w:tc>
+          <w:tcPr>
+            <w:tcW w:type="dxa" w:w="6480"/>
+            <w:vAlign w:val="center"/>
+            <w:shd w:fill="EDF5F7"/>
+            <w:tcBorders>
+              <w:top w:val="single" w:sz="4" w:color="D9D9D9"/>
+              <w:left w:val="single" w:sz="4" w:color="D9D9D9"/>
+              <w:bottom w:val="single" w:sz="4" w:color="D9D9D9"/>
+              <w:right w:val="single" w:sz="4" w:color="D9D9D9"/>
+            </w:tcBorders>
+            <w:tcMar>
+              <w:top w:w="90" w:type="dxa"/>
+              <w:left w:w="90" w:type="dxa"/>
+              <w:bottom w:w="90" w:type="dxa"/>
+              <w:right w:w="90" w:type="dxa"/>
+            </w:tcMar>
+          </w:tcPr>
+          <w:p>
+            <w:pPr>
+              <w:spacing w:after="40" w:line="252" w:lineRule="auto"/>
+            </w:pPr>
+            <w:r>
+              <w:rPr>
+                <w:sz w:val="21"/>
+              </w:rPr>
+              <w:t>A yes-or-no result identifying the transmit register.</w:t>
+            </w:r>
+          </w:p>
+        </w:tc>
+      </w:tr>
+      <w:tr>
+        <w:trPr>
+          <w:cantSplit/>
+        </w:trPr>
+        <w:tc>
+          <w:tcPr>
+            <w:tcW w:type="dxa" w:w="3600"/>
+            <w:vAlign w:val="center"/>
+            <w:shd w:fill="FFFFFF"/>
+            <w:tcBorders>
+              <w:top w:val="single" w:sz="4" w:color="D9D9D9"/>
+              <w:left w:val="single" w:sz="4" w:color="D9D9D9"/>
+              <w:bottom w:val="single" w:sz="4" w:color="D9D9D9"/>
+              <w:right w:val="single" w:sz="4" w:color="D9D9D9"/>
+            </w:tcBorders>
+            <w:tcMar>
+              <w:top w:w="90" w:type="dxa"/>
+              <w:left w:w="90" w:type="dxa"/>
+              <w:bottom w:w="90" w:type="dxa"/>
+              <w:right w:w="90" w:type="dxa"/>
+            </w:tcMar>
+          </w:tcPr>
+          <w:p>
+            <w:pPr>
+              <w:spacing w:after="40" w:line="252" w:lineRule="auto"/>
+              <w:jc w:val="center"/>
+            </w:pPr>
+            <w:r>
+              <w:rPr>
+                <w:sz w:val="21"/>
+              </w:rPr>
+              <w:t>n_add_17</w:t>
+            </w:r>
+          </w:p>
+        </w:tc>
+        <w:tc>
+          <w:tcPr>
+            <w:tcW w:type="dxa" w:w="6480"/>
+            <w:vAlign w:val="center"/>
+            <w:shd w:fill="FFFFFF"/>
+            <w:tcBorders>
+              <w:top w:val="single" w:sz="4" w:color="D9D9D9"/>
+              <w:left w:val="single" w:sz="4" w:color="D9D9D9"/>
+              <w:bottom w:val="single" w:sz="4" w:color="D9D9D9"/>
+              <w:right w:val="single" w:sz="4" w:color="D9D9D9"/>
+            </w:tcBorders>
+            <w:tcMar>
+              <w:top w:w="90" w:type="dxa"/>
+              <w:left w:w="90" w:type="dxa"/>
+              <w:bottom w:w="90" w:type="dxa"/>
+              <w:right w:w="90" w:type="dxa"/>
+            </w:tcMar>
+          </w:tcPr>
+          <w:p>
+            <w:pPr>
+              <w:spacing w:after="40" w:line="252" w:lineRule="auto"/>
+            </w:pPr>
+            <w:r>
+              <w:rPr>
+                <w:sz w:val="21"/>
+              </w:rPr>
+              <w:t>An unnamed addition; the number distinguishes this particular wire.</w:t>
+            </w:r>
+          </w:p>
+        </w:tc>
+      </w:tr>
+      <w:tr>
+        <w:trPr>
+          <w:cantSplit/>
+        </w:trPr>
+        <w:tc>
+          <w:tcPr>
+            <w:tcW w:type="dxa" w:w="3600"/>
+            <w:vAlign w:val="center"/>
+            <w:shd w:fill="EDF5F7"/>
+            <w:tcBorders>
+              <w:top w:val="single" w:sz="4" w:color="D9D9D9"/>
+              <w:left w:val="single" w:sz="4" w:color="D9D9D9"/>
+              <w:bottom w:val="single" w:sz="4" w:color="D9D9D9"/>
+              <w:right w:val="single" w:sz="4" w:color="D9D9D9"/>
+            </w:tcBorders>
+            <w:tcMar>
+              <w:top w:w="90" w:type="dxa"/>
+              <w:left w:w="90" w:type="dxa"/>
+              <w:bottom w:w="90" w:type="dxa"/>
+              <w:right w:w="90" w:type="dxa"/>
+            </w:tcMar>
+          </w:tcPr>
+          <w:p>
+            <w:pPr>
+              <w:spacing w:after="40" w:line="252" w:lineRule="auto"/>
+            </w:pPr>
+            <w:r>
+              <w:rPr>
+                <w:sz w:val="21"/>
+              </w:rPr>
+              <w:t>Method_IL_0002_add</w:t>
+            </w:r>
+          </w:p>
+        </w:tc>
+        <w:tc>
+          <w:tcPr>
+            <w:tcW w:type="dxa" w:w="6480"/>
+            <w:vAlign w:val="center"/>
+            <w:shd w:fill="EDF5F7"/>
+            <w:tcBorders>
+              <w:top w:val="single" w:sz="4" w:color="D9D9D9"/>
+              <w:left w:val="single" w:sz="4" w:color="D9D9D9"/>
+              <w:bottom w:val="single" w:sz="4" w:color="D9D9D9"/>
+              <w:right w:val="single" w:sz="4" w:color="D9D9D9"/>
+            </w:tcBorders>
+            <w:tcMar>
+              <w:top w:w="90" w:type="dxa"/>
+              <w:left w:w="90" w:type="dxa"/>
+              <w:bottom w:w="90" w:type="dxa"/>
+              <w:right w:w="90" w:type="dxa"/>
+            </w:tcMar>
+          </w:tcPr>
+          <w:p>
+            <w:pPr>
+              <w:spacing w:after="40" w:line="252" w:lineRule="auto"/>
+            </w:pPr>
+            <w:r>
+              <w:rPr>
+                <w:sz w:val="21"/>
+              </w:rPr>
+              <w:t>Arithmetic traced to a method and instruction offset in CIL.</w:t>
+            </w:r>
+          </w:p>
+        </w:tc>
+      </w:tr>
+    </w:tbl>
+    <w:p>
+      <w:pPr>
+        <w:spacing w:after="80" w:line="20" w:lineRule="exact"/>
+      </w:pPr>
+    </w:p>
+    <w:p>
+      <w:pPr>
+        <w:pStyle w:val="Heading2"/>
+      </w:pPr>
+      <w:r>
+        <w:t>Try a detective experiment</w:t>
+      </w:r>
+    </w:p>
+    <w:p>
+      <w:r>
+        <w:t>Open docs/tinyrisc/TinyRisc_Demo.html. Step one instruction at a time and watch the PC, registers and output LEDs. Predict the next value before stepping. The prepared program adds 5 + 4 + 3 + 2 + 1 and leaves 15 on the LEDs. Its bundled trace works offline; the optional fresh VeriSim run needs the simulator engine.</w:t>
+      </w:r>
+    </w:p>
+    <w:p>
+      <w:r>
+        <w:rPr>
+          <w:b/>
+          <w:sz w:val="20"/>
+        </w:rPr>
+        <w:t xml:space="preserve">Guide note </w:t>
+      </w:r>
+      <w:r>
+        <w:rPr>
+          <w:sz w:val="20"/>
+        </w:rPr>
+        <w:t>The source builder supplies application names explicitly with Named. C# local names are not automatically recovered. Duplicate hints receive suffixes; every intermediate wire keeps its width and truncation. The demo steps through a recorded trace. A fresh VeriSim run executes real RTL, but is not a live paused processor. Requirements and examples: NET_NAMING.md.</w:t>
       </w:r>
     </w:p>
     <w:sectPr>

</xml_diff>

<commit_message>
Add five WebAssembly workbook experiments with waveform comparisons
</commit_message>
<xml_diff>
--- a/docs/SharpHDL_Classroom_Proposal.docx
+++ b/docs/SharpHDL_Classroom_Proposal.docx
@@ -3718,6 +3718,16 @@
       </w:r>
     </w:p>
     <w:p>
+      <w:hyperlink r:id="rId14">
+        <w:r>
+          <w:rPr>
+            <w:color w:val="075963"/>
+          </w:rPr>
+          <w:t>Browser experiment: Add two and wrap — eight-bit version</w:t>
+        </w:r>
+      </w:hyperlink>
+    </w:p>
+    <w:p>
       <w:r>
         <w:br w:type="page"/>
       </w:r>
@@ -3768,7 +3778,7 @@
                     <pic:cNvPicPr/>
                   </pic:nvPicPr>
                   <pic:blipFill>
-                    <a:blip r:embed="rId14"/>
+                    <a:blip r:embed="rId15"/>
                     <a:stretch>
                       <a:fillRect/>
                     </a:stretch>
@@ -4400,7 +4410,7 @@
                     <pic:cNvPicPr/>
                   </pic:nvPicPr>
                   <pic:blipFill>
-                    <a:blip r:embed="rId15"/>
+                    <a:blip r:embed="rId16"/>
                     <a:stretch>
                       <a:fillRect/>
                     </a:stretch>
@@ -5051,7 +5061,7 @@
                     <pic:cNvPicPr/>
                   </pic:nvPicPr>
                   <pic:blipFill>
-                    <a:blip r:embed="rId16"/>
+                    <a:blip r:embed="rId17"/>
                     <a:stretch>
                       <a:fillRect/>
                     </a:stretch>
@@ -5179,7 +5189,7 @@
                     <pic:cNvPicPr/>
                   </pic:nvPicPr>
                   <pic:blipFill>
-                    <a:blip r:embed="rId17"/>
+                    <a:blip r:embed="rId18"/>
                     <a:stretch>
                       <a:fillRect/>
                     </a:stretch>
@@ -5862,6 +5872,16 @@
       </w:r>
     </w:p>
     <w:p>
+      <w:hyperlink r:id="rId19">
+        <w:r>
+          <w:rPr>
+            <w:color w:val="075963"/>
+          </w:rPr>
+          <w:t>Browser experiment: Count, pause, resume</w:t>
+        </w:r>
+      </w:hyperlink>
+    </w:p>
+    <w:p>
       <w:r>
         <w:br w:type="page"/>
       </w:r>
@@ -5907,7 +5927,7 @@
                     <pic:cNvPicPr/>
                   </pic:nvPicPr>
                   <pic:blipFill>
-                    <a:blip r:embed="rId18"/>
+                    <a:blip r:embed="rId20"/>
                     <a:stretch>
                       <a:fillRect/>
                     </a:stretch>
@@ -6539,7 +6559,7 @@
                     <pic:cNvPicPr/>
                   </pic:nvPicPr>
                   <pic:blipFill>
-                    <a:blip r:embed="rId19"/>
+                    <a:blip r:embed="rId21"/>
                     <a:stretch>
                       <a:fillRect/>
                     </a:stretch>
@@ -7178,7 +7198,7 @@
                     <pic:cNvPicPr/>
                   </pic:nvPicPr>
                   <pic:blipFill>
-                    <a:blip r:embed="rId20"/>
+                    <a:blip r:embed="rId22"/>
                     <a:stretch>
                       <a:fillRect/>
                     </a:stretch>
@@ -7640,7 +7660,7 @@
                     <pic:cNvPicPr/>
                   </pic:nvPicPr>
                   <pic:blipFill>
-                    <a:blip r:embed="rId21"/>
+                    <a:blip r:embed="rId23"/>
                     <a:stretch>
                       <a:fillRect/>
                     </a:stretch>
@@ -7732,7 +7752,7 @@
                     <pic:cNvPicPr/>
                   </pic:nvPicPr>
                   <pic:blipFill>
-                    <a:blip r:embed="rId22"/>
+                    <a:blip r:embed="rId24"/>
                     <a:stretch>
                       <a:fillRect/>
                     </a:stretch>
@@ -8314,7 +8334,7 @@
                     <pic:cNvPicPr/>
                   </pic:nvPicPr>
                   <pic:blipFill>
-                    <a:blip r:embed="rId23"/>
+                    <a:blip r:embed="rId25"/>
                     <a:stretch>
                       <a:fillRect/>
                     </a:stretch>
@@ -18211,7 +18231,7 @@
       <w:r>
         <w:drawing>
           <wp:inline xmlns:a="http://schemas.openxmlformats.org/drawingml/2006/main" xmlns:pic="http://schemas.openxmlformats.org/drawingml/2006/picture">
-            <wp:extent cx="6126480" cy="1309684"/>
+            <wp:extent cx="5669280" cy="1211946"/>
             <wp:docPr id="16" name="Picture 16" descr="The controller remembers one state. Start enters Running; four enabled practice ticks reach Done. Stop cancels a running drill. Reset returns to Ready." title="fsm lab"/>
             <wp:cNvGraphicFramePr>
               <a:graphicFrameLocks noChangeAspect="1"/>
@@ -18224,7 +18244,7 @@
                     <pic:cNvPicPr/>
                   </pic:nvPicPr>
                   <pic:blipFill>
-                    <a:blip r:embed="rId24"/>
+                    <a:blip r:embed="rId26"/>
                     <a:stretch>
                       <a:fillRect/>
                     </a:stretch>
@@ -18232,7 +18252,7 @@
                   <pic:spPr>
                     <a:xfrm>
                       <a:off x="0" y="0"/>
-                      <a:ext cx="6126480" cy="1309684"/>
+                      <a:ext cx="5669280" cy="1211946"/>
                     </a:xfrm>
                     <a:prstGeom prst="rect"/>
                   </pic:spPr>
@@ -18661,8 +18681,18 @@
         <w:rPr>
           <w:sz w:val="20"/>
         </w:rPr>
-        <w:t>The page simulates actual exported graphs, not Verilog. Its engine and the emitted RTL are checked against independent expected traces. Source, tests and the feature roadmap are in the project. Open in VeriSim links launch actual RTL and teacher benches; initial loading needs network access.</w:t>
+        <w:t>The Clock Lab simulates exported graphs. The linked WASM lab runs generated Verilog with a teacher bench. Both are checked against expected traces. Fresh WASM runs need engine files.</w:t>
       </w:r>
+    </w:p>
+    <w:p>
+      <w:hyperlink r:id="rId27">
+        <w:r>
+          <w:rPr>
+            <w:color w:val="075963"/>
+          </w:rPr>
+          <w:t>Browser experiment: Coach the hockey drill in real RTL</w:t>
+        </w:r>
+      </w:hyperlink>
     </w:p>
     <w:p>
       <w:r>
@@ -19344,7 +19374,7 @@
     </w:p>
     <w:p>
       <w:r>
-        <w:t>Try seed 10 and n = 3. Predict 16, then open the Clocked while loop link in the HTML. In VeriSim, run the prepared bench and inspect busy, done and result. The adult owns the testbench; children predict and read the waveform.</w:t>
+        <w:t>Try seed 10 and n = 3. Predict 16, then open A loop that takes clock ticks in the workbook WASM lab. Run the prepared bench and inspect busy, done and result. The adult owns the testbench; children predict and read the waveform.</w:t>
       </w:r>
     </w:p>
     <w:p>
@@ -19361,6 +19391,16 @@
         </w:rPr>
         <w:t>Timing depends on compiled CIL: loads, comparisons, branches and stores take separate clocks. This first scheduler does not promise the smallest circuit, automatic pipelining or a particular FPGA frequency. A memory read adds one wait edge.</w:t>
       </w:r>
+    </w:p>
+    <w:p>
+      <w:hyperlink r:id="rId28">
+        <w:r>
+          <w:rPr>
+            <w:color w:val="075963"/>
+          </w:rPr>
+          <w:t>Browser experiment: A loop that takes clock ticks</w:t>
+        </w:r>
+      </w:hyperlink>
     </w:p>
     <w:p>
       <w:r>
@@ -19773,7 +19813,7 @@
     </w:p>
     <w:p>
       <w:r>
-        <w:t>The offline Clock Lab evaluates exported circuit graphs. The Open in VeriSim links load actual generated Verilog plus a prepared testbench into the external browser simulator. Its first load needs network access. The exact link payloads pass local Icarus tests; hosted browser UI execution has not been verified here.</w:t>
+        <w:t>The offline Clock Lab evaluates exported circuit graphs. The separate workbook WASM lab runs actual generated Verilog and prepared testbenches on the page, using the VeriSim Icarus WebAssembly engine. Its five experiments have browser and native-trace agreement tests. Fresh runs need engine files; bundled recorded traces work offline.</w:t>
       </w:r>
     </w:p>
     <w:p>
@@ -20228,6 +20268,1179 @@
           <w:sz w:val="20"/>
         </w:rPr>
         <w:t>The source builder supplies application names explicitly with Named. C# local names are not automatically recovered. Duplicate hints receive suffixes; every intermediate wire keeps its width and truncation. The demo steps through a recorded trace. A fresh VeriSim run executes real RTL, but is not a live paused processor. Requirements and examples: NET_NAMING.md.</w:t>
+      </w:r>
+    </w:p>
+    <w:p>
+      <w:r>
+        <w:br w:type="page"/>
+      </w:r>
+    </w:p>
+    <w:p>
+      <w:pPr>
+        <w:pStyle w:val="Heading1"/>
+      </w:pPr>
+      <w:r>
+        <w:t>Browser lab  Follow the clock</w:t>
+      </w:r>
+    </w:p>
+    <w:p>
+      <w:r>
+        <w:t>Open the workbook WASM lab after your guide starts the server described on the next page. WASM means WebAssembly: it lets a simulator run in the browser. You do not need to install FPGA software to explore the recorded traces.</w:t>
+      </w:r>
+    </w:p>
+    <w:p>
+      <w:pPr>
+        <w:pStyle w:val="Heading2"/>
+      </w:pPr>
+      <w:r>
+        <w:t>Predict first and run second</w:t>
+      </w:r>
+    </w:p>
+    <w:p>
+      <w:r>
+        <w:t>Choose Add two and wrap. Predict the answers for B = 0, 7 and 254. Press Run RTL with WebAssembly. When it reports a fresh simulation passed, move the cursor and read A. The answers are 2, 9 and 0. This browser example uses eight bits; our starter-board arithmetic lesson uses four.</w:t>
+      </w:r>
+    </w:p>
+    <w:p>
+      <w:hyperlink r:id="rId14">
+        <w:r>
+          <w:rPr>
+            <w:color w:val="075963"/>
+          </w:rPr>
+          <w:t>Browser experiment: Add two and wrap</w:t>
+        </w:r>
+      </w:hyperlink>
+    </w:p>
+    <w:p>
+      <w:pPr>
+        <w:pStyle w:val="Heading2"/>
+      </w:pPr>
+      <w:r>
+        <w:t>Now give a register a clock</w:t>
+      </w:r>
+    </w:p>
+    <w:p>
+      <w:r>
+        <w:t>Choose Count, pause, resume. Look for the upward edges of clk. Enable lets the counter move; a low enable makes it keep its number. The orange line is your viewing cursor, not another signal.</w:t>
+      </w:r>
+    </w:p>
+    <w:p>
+      <w:pPr>
+        <w:keepNext/>
+        <w:spacing w:after="40"/>
+        <w:jc w:val="center"/>
+      </w:pPr>
+      <w:r>
+        <w:drawing>
+          <wp:inline xmlns:a="http://schemas.openxmlformats.org/drawingml/2006/main" xmlns:pic="http://schemas.openxmlformats.org/drawingml/2006/picture">
+            <wp:extent cx="6217920" cy="1391901"/>
+            <wp:docPr id="17" name="Picture 17" descr="Actual browser simulation: reset to zero, count three, hold for two clocks, then count once more." title="wasm counter wave"/>
+            <wp:cNvGraphicFramePr>
+              <a:graphicFrameLocks noChangeAspect="1"/>
+            </wp:cNvGraphicFramePr>
+            <a:graphic>
+              <a:graphicData uri="http://schemas.openxmlformats.org/drawingml/2006/picture">
+                <pic:pic>
+                  <pic:nvPicPr>
+                    <pic:cNvPr id="0" name="wasm_counter_wave.png"/>
+                    <pic:cNvPicPr/>
+                  </pic:nvPicPr>
+                  <pic:blipFill>
+                    <a:blip r:embed="rId29"/>
+                    <a:stretch>
+                      <a:fillRect/>
+                    </a:stretch>
+                  </pic:blipFill>
+                  <pic:spPr>
+                    <a:xfrm>
+                      <a:off x="0" y="0"/>
+                      <a:ext cx="6217920" cy="1391901"/>
+                    </a:xfrm>
+                    <a:prstGeom prst="rect"/>
+                  </pic:spPr>
+                </pic:pic>
+              </a:graphicData>
+            </a:graphic>
+          </wp:inline>
+        </w:drawing>
+      </w:r>
+    </w:p>
+    <w:p>
+      <w:pPr>
+        <w:spacing w:after="160"/>
+        <w:jc w:val="center"/>
+      </w:pPr>
+      <w:r>
+        <w:rPr>
+          <w:i/>
+          <w:sz w:val="20"/>
+        </w:rPr>
+        <w:t>Actual browser simulation: reset to zero, count three, hold for two clocks, then count once more.</w:t>
+      </w:r>
+    </w:p>
+    <w:tbl>
+      <w:tblPr>
+        <w:tblW w:type="auto" w:w="0"/>
+        <w:tblLayout w:type="fixed"/>
+        <w:tblLook w:firstColumn="1" w:firstRow="1" w:lastColumn="0" w:lastRow="0" w:noHBand="0" w:noVBand="1" w:val="04A0"/>
+      </w:tblPr>
+      <w:tblGrid>
+        <w:gridCol w:w="2448"/>
+        <w:gridCol w:w="4176"/>
+        <w:gridCol w:w="3456"/>
+      </w:tblGrid>
+      <w:tr>
+        <w:trPr>
+          <w:cantSplit/>
+          <w:tblHeader/>
+        </w:trPr>
+        <w:tc>
+          <w:tcPr>
+            <w:tcW w:type="dxa" w:w="2448"/>
+            <w:vAlign w:val="center"/>
+            <w:shd w:fill="17365D"/>
+            <w:tcBorders>
+              <w:top w:val="single" w:sz="4" w:color="D9D9D9"/>
+              <w:left w:val="single" w:sz="4" w:color="D9D9D9"/>
+              <w:bottom w:val="single" w:sz="4" w:color="D9D9D9"/>
+              <w:right w:val="single" w:sz="4" w:color="D9D9D9"/>
+            </w:tcBorders>
+            <w:tcMar>
+              <w:top w:w="90" w:type="dxa"/>
+              <w:left w:w="90" w:type="dxa"/>
+              <w:bottom w:w="90" w:type="dxa"/>
+              <w:right w:w="90" w:type="dxa"/>
+            </w:tcMar>
+          </w:tcPr>
+          <w:p>
+            <w:pPr>
+              <w:spacing w:after="40" w:line="252" w:lineRule="auto"/>
+            </w:pPr>
+            <w:r>
+              <w:rPr>
+                <w:b/>
+                <w:color w:val="FFFFFF"/>
+                <w:sz w:val="21"/>
+              </w:rPr>
+              <w:t>Rising edge time</w:t>
+            </w:r>
+          </w:p>
+        </w:tc>
+        <w:tc>
+          <w:tcPr>
+            <w:tcW w:type="dxa" w:w="4176"/>
+            <w:vAlign w:val="center"/>
+            <w:shd w:fill="17365D"/>
+            <w:tcBorders>
+              <w:top w:val="single" w:sz="4" w:color="D9D9D9"/>
+              <w:left w:val="single" w:sz="4" w:color="D9D9D9"/>
+              <w:bottom w:val="single" w:sz="4" w:color="D9D9D9"/>
+              <w:right w:val="single" w:sz="4" w:color="D9D9D9"/>
+            </w:tcBorders>
+            <w:tcMar>
+              <w:top w:w="90" w:type="dxa"/>
+              <w:left w:w="90" w:type="dxa"/>
+              <w:bottom w:w="90" w:type="dxa"/>
+              <w:right w:w="90" w:type="dxa"/>
+            </w:tcMar>
+          </w:tcPr>
+          <w:p>
+            <w:pPr>
+              <w:spacing w:after="40" w:line="252" w:lineRule="auto"/>
+            </w:pPr>
+            <w:r>
+              <w:rPr>
+                <w:b/>
+                <w:color w:val="FFFFFF"/>
+                <w:sz w:val="21"/>
+              </w:rPr>
+              <w:t>What happens</w:t>
+            </w:r>
+          </w:p>
+        </w:tc>
+        <w:tc>
+          <w:tcPr>
+            <w:tcW w:type="dxa" w:w="3456"/>
+            <w:vAlign w:val="center"/>
+            <w:shd w:fill="17365D"/>
+            <w:tcBorders>
+              <w:top w:val="single" w:sz="4" w:color="D9D9D9"/>
+              <w:left w:val="single" w:sz="4" w:color="D9D9D9"/>
+              <w:bottom w:val="single" w:sz="4" w:color="D9D9D9"/>
+              <w:right w:val="single" w:sz="4" w:color="D9D9D9"/>
+            </w:tcBorders>
+            <w:tcMar>
+              <w:top w:w="90" w:type="dxa"/>
+              <w:left w:w="90" w:type="dxa"/>
+              <w:bottom w:w="90" w:type="dxa"/>
+              <w:right w:w="90" w:type="dxa"/>
+            </w:tcMar>
+          </w:tcPr>
+          <w:p>
+            <w:pPr>
+              <w:spacing w:after="40" w:line="252" w:lineRule="auto"/>
+            </w:pPr>
+            <w:r>
+              <w:rPr>
+                <w:b/>
+                <w:color w:val="FFFFFF"/>
+                <w:sz w:val="21"/>
+              </w:rPr>
+              <w:t>Predict the count</w:t>
+            </w:r>
+          </w:p>
+        </w:tc>
+      </w:tr>
+      <w:tr>
+        <w:trPr>
+          <w:cantSplit/>
+        </w:trPr>
+        <w:tc>
+          <w:tcPr>
+            <w:tcW w:type="dxa" w:w="2448"/>
+            <w:vAlign w:val="center"/>
+            <w:shd w:fill="FFFFFF"/>
+            <w:tcBorders>
+              <w:top w:val="single" w:sz="4" w:color="D9D9D9"/>
+              <w:left w:val="single" w:sz="4" w:color="D9D9D9"/>
+              <w:bottom w:val="single" w:sz="4" w:color="D9D9D9"/>
+              <w:right w:val="single" w:sz="4" w:color="D9D9D9"/>
+            </w:tcBorders>
+            <w:tcMar>
+              <w:top w:w="90" w:type="dxa"/>
+              <w:left w:w="90" w:type="dxa"/>
+              <w:bottom w:w="90" w:type="dxa"/>
+              <w:right w:w="90" w:type="dxa"/>
+            </w:tcMar>
+          </w:tcPr>
+          <w:p>
+            <w:pPr>
+              <w:spacing w:after="40" w:line="252" w:lineRule="auto"/>
+              <w:jc w:val="center"/>
+            </w:pPr>
+            <w:r>
+              <w:rPr>
+                <w:sz w:val="21"/>
+              </w:rPr>
+              <w:t>2 ns</w:t>
+            </w:r>
+          </w:p>
+        </w:tc>
+        <w:tc>
+          <w:tcPr>
+            <w:tcW w:type="dxa" w:w="4176"/>
+            <w:vAlign w:val="center"/>
+            <w:shd w:fill="FFFFFF"/>
+            <w:tcBorders>
+              <w:top w:val="single" w:sz="4" w:color="D9D9D9"/>
+              <w:left w:val="single" w:sz="4" w:color="D9D9D9"/>
+              <w:bottom w:val="single" w:sz="4" w:color="D9D9D9"/>
+              <w:right w:val="single" w:sz="4" w:color="D9D9D9"/>
+            </w:tcBorders>
+            <w:tcMar>
+              <w:top w:w="90" w:type="dxa"/>
+              <w:left w:w="90" w:type="dxa"/>
+              <w:bottom w:w="90" w:type="dxa"/>
+              <w:right w:w="90" w:type="dxa"/>
+            </w:tcMar>
+          </w:tcPr>
+          <w:p>
+            <w:pPr>
+              <w:spacing w:after="40" w:line="252" w:lineRule="auto"/>
+            </w:pPr>
+            <w:r>
+              <w:rPr>
+                <w:sz w:val="21"/>
+              </w:rPr>
+              <w:t>Reset</w:t>
+            </w:r>
+          </w:p>
+        </w:tc>
+        <w:tc>
+          <w:tcPr>
+            <w:tcW w:type="dxa" w:w="3456"/>
+            <w:vAlign w:val="center"/>
+            <w:shd w:fill="FFFFFF"/>
+            <w:tcBorders>
+              <w:top w:val="single" w:sz="4" w:color="D9D9D9"/>
+              <w:left w:val="single" w:sz="4" w:color="D9D9D9"/>
+              <w:bottom w:val="single" w:sz="4" w:color="D9D9D9"/>
+              <w:right w:val="single" w:sz="4" w:color="D9D9D9"/>
+            </w:tcBorders>
+            <w:tcMar>
+              <w:top w:w="90" w:type="dxa"/>
+              <w:left w:w="90" w:type="dxa"/>
+              <w:bottom w:w="90" w:type="dxa"/>
+              <w:right w:w="90" w:type="dxa"/>
+            </w:tcMar>
+          </w:tcPr>
+          <w:p>
+            <w:pPr>
+              <w:spacing w:after="40" w:line="252" w:lineRule="auto"/>
+            </w:pPr>
+            <w:r>
+              <w:rPr>
+                <w:sz w:val="21"/>
+              </w:rPr>
+              <w:t>0</w:t>
+            </w:r>
+          </w:p>
+        </w:tc>
+      </w:tr>
+      <w:tr>
+        <w:trPr>
+          <w:cantSplit/>
+        </w:trPr>
+        <w:tc>
+          <w:tcPr>
+            <w:tcW w:type="dxa" w:w="2448"/>
+            <w:vAlign w:val="center"/>
+            <w:shd w:fill="EDF5F7"/>
+            <w:tcBorders>
+              <w:top w:val="single" w:sz="4" w:color="D9D9D9"/>
+              <w:left w:val="single" w:sz="4" w:color="D9D9D9"/>
+              <w:bottom w:val="single" w:sz="4" w:color="D9D9D9"/>
+              <w:right w:val="single" w:sz="4" w:color="D9D9D9"/>
+            </w:tcBorders>
+            <w:tcMar>
+              <w:top w:w="90" w:type="dxa"/>
+              <w:left w:w="90" w:type="dxa"/>
+              <w:bottom w:w="90" w:type="dxa"/>
+              <w:right w:w="90" w:type="dxa"/>
+            </w:tcMar>
+          </w:tcPr>
+          <w:p>
+            <w:pPr>
+              <w:spacing w:after="40" w:line="252" w:lineRule="auto"/>
+              <w:jc w:val="center"/>
+            </w:pPr>
+            <w:r>
+              <w:rPr>
+                <w:sz w:val="21"/>
+              </w:rPr>
+              <w:t>6, 10 and 14 ns</w:t>
+            </w:r>
+          </w:p>
+        </w:tc>
+        <w:tc>
+          <w:tcPr>
+            <w:tcW w:type="dxa" w:w="4176"/>
+            <w:vAlign w:val="center"/>
+            <w:shd w:fill="EDF5F7"/>
+            <w:tcBorders>
+              <w:top w:val="single" w:sz="4" w:color="D9D9D9"/>
+              <w:left w:val="single" w:sz="4" w:color="D9D9D9"/>
+              <w:bottom w:val="single" w:sz="4" w:color="D9D9D9"/>
+              <w:right w:val="single" w:sz="4" w:color="D9D9D9"/>
+            </w:tcBorders>
+            <w:tcMar>
+              <w:top w:w="90" w:type="dxa"/>
+              <w:left w:w="90" w:type="dxa"/>
+              <w:bottom w:w="90" w:type="dxa"/>
+              <w:right w:w="90" w:type="dxa"/>
+            </w:tcMar>
+          </w:tcPr>
+          <w:p>
+            <w:pPr>
+              <w:spacing w:after="40" w:line="252" w:lineRule="auto"/>
+            </w:pPr>
+            <w:r>
+              <w:rPr>
+                <w:sz w:val="21"/>
+              </w:rPr>
+              <w:t>Enable is on</w:t>
+            </w:r>
+          </w:p>
+        </w:tc>
+        <w:tc>
+          <w:tcPr>
+            <w:tcW w:type="dxa" w:w="3456"/>
+            <w:vAlign w:val="center"/>
+            <w:shd w:fill="EDF5F7"/>
+            <w:tcBorders>
+              <w:top w:val="single" w:sz="4" w:color="D9D9D9"/>
+              <w:left w:val="single" w:sz="4" w:color="D9D9D9"/>
+              <w:bottom w:val="single" w:sz="4" w:color="D9D9D9"/>
+              <w:right w:val="single" w:sz="4" w:color="D9D9D9"/>
+            </w:tcBorders>
+            <w:tcMar>
+              <w:top w:w="90" w:type="dxa"/>
+              <w:left w:w="90" w:type="dxa"/>
+              <w:bottom w:w="90" w:type="dxa"/>
+              <w:right w:w="90" w:type="dxa"/>
+            </w:tcMar>
+          </w:tcPr>
+          <w:p>
+            <w:pPr>
+              <w:spacing w:after="40" w:line="252" w:lineRule="auto"/>
+            </w:pPr>
+            <w:r>
+              <w:rPr>
+                <w:sz w:val="21"/>
+              </w:rPr>
+              <w:t>1, 2, 3</w:t>
+            </w:r>
+          </w:p>
+        </w:tc>
+      </w:tr>
+      <w:tr>
+        <w:trPr>
+          <w:cantSplit/>
+        </w:trPr>
+        <w:tc>
+          <w:tcPr>
+            <w:tcW w:type="dxa" w:w="2448"/>
+            <w:vAlign w:val="center"/>
+            <w:shd w:fill="FFFFFF"/>
+            <w:tcBorders>
+              <w:top w:val="single" w:sz="4" w:color="D9D9D9"/>
+              <w:left w:val="single" w:sz="4" w:color="D9D9D9"/>
+              <w:bottom w:val="single" w:sz="4" w:color="D9D9D9"/>
+              <w:right w:val="single" w:sz="4" w:color="D9D9D9"/>
+            </w:tcBorders>
+            <w:tcMar>
+              <w:top w:w="90" w:type="dxa"/>
+              <w:left w:w="90" w:type="dxa"/>
+              <w:bottom w:w="90" w:type="dxa"/>
+              <w:right w:w="90" w:type="dxa"/>
+            </w:tcMar>
+          </w:tcPr>
+          <w:p>
+            <w:pPr>
+              <w:spacing w:after="40" w:line="252" w:lineRule="auto"/>
+              <w:jc w:val="center"/>
+            </w:pPr>
+            <w:r>
+              <w:rPr>
+                <w:sz w:val="21"/>
+              </w:rPr>
+              <w:t>18 and 22 ns</w:t>
+            </w:r>
+          </w:p>
+        </w:tc>
+        <w:tc>
+          <w:tcPr>
+            <w:tcW w:type="dxa" w:w="4176"/>
+            <w:vAlign w:val="center"/>
+            <w:shd w:fill="FFFFFF"/>
+            <w:tcBorders>
+              <w:top w:val="single" w:sz="4" w:color="D9D9D9"/>
+              <w:left w:val="single" w:sz="4" w:color="D9D9D9"/>
+              <w:bottom w:val="single" w:sz="4" w:color="D9D9D9"/>
+              <w:right w:val="single" w:sz="4" w:color="D9D9D9"/>
+            </w:tcBorders>
+            <w:tcMar>
+              <w:top w:w="90" w:type="dxa"/>
+              <w:left w:w="90" w:type="dxa"/>
+              <w:bottom w:w="90" w:type="dxa"/>
+              <w:right w:w="90" w:type="dxa"/>
+            </w:tcMar>
+          </w:tcPr>
+          <w:p>
+            <w:pPr>
+              <w:spacing w:after="40" w:line="252" w:lineRule="auto"/>
+            </w:pPr>
+            <w:r>
+              <w:rPr>
+                <w:sz w:val="21"/>
+              </w:rPr>
+              <w:t>Enable is off</w:t>
+            </w:r>
+          </w:p>
+        </w:tc>
+        <w:tc>
+          <w:tcPr>
+            <w:tcW w:type="dxa" w:w="3456"/>
+            <w:vAlign w:val="center"/>
+            <w:shd w:fill="FFFFFF"/>
+            <w:tcBorders>
+              <w:top w:val="single" w:sz="4" w:color="D9D9D9"/>
+              <w:left w:val="single" w:sz="4" w:color="D9D9D9"/>
+              <w:bottom w:val="single" w:sz="4" w:color="D9D9D9"/>
+              <w:right w:val="single" w:sz="4" w:color="D9D9D9"/>
+            </w:tcBorders>
+            <w:tcMar>
+              <w:top w:w="90" w:type="dxa"/>
+              <w:left w:w="90" w:type="dxa"/>
+              <w:bottom w:w="90" w:type="dxa"/>
+              <w:right w:w="90" w:type="dxa"/>
+            </w:tcMar>
+          </w:tcPr>
+          <w:p>
+            <w:pPr>
+              <w:spacing w:after="40" w:line="252" w:lineRule="auto"/>
+            </w:pPr>
+            <w:r>
+              <w:rPr>
+                <w:sz w:val="21"/>
+              </w:rPr>
+              <w:t>____, ____</w:t>
+            </w:r>
+          </w:p>
+        </w:tc>
+      </w:tr>
+      <w:tr>
+        <w:trPr>
+          <w:cantSplit/>
+        </w:trPr>
+        <w:tc>
+          <w:tcPr>
+            <w:tcW w:type="dxa" w:w="2448"/>
+            <w:vAlign w:val="center"/>
+            <w:shd w:fill="EDF5F7"/>
+            <w:tcBorders>
+              <w:top w:val="single" w:sz="4" w:color="D9D9D9"/>
+              <w:left w:val="single" w:sz="4" w:color="D9D9D9"/>
+              <w:bottom w:val="single" w:sz="4" w:color="D9D9D9"/>
+              <w:right w:val="single" w:sz="4" w:color="D9D9D9"/>
+            </w:tcBorders>
+            <w:tcMar>
+              <w:top w:w="90" w:type="dxa"/>
+              <w:left w:w="90" w:type="dxa"/>
+              <w:bottom w:w="90" w:type="dxa"/>
+              <w:right w:w="90" w:type="dxa"/>
+            </w:tcMar>
+          </w:tcPr>
+          <w:p>
+            <w:pPr>
+              <w:spacing w:after="40" w:line="252" w:lineRule="auto"/>
+              <w:jc w:val="center"/>
+            </w:pPr>
+            <w:r>
+              <w:rPr>
+                <w:sz w:val="21"/>
+              </w:rPr>
+              <w:t>26 ns</w:t>
+            </w:r>
+          </w:p>
+        </w:tc>
+        <w:tc>
+          <w:tcPr>
+            <w:tcW w:type="dxa" w:w="4176"/>
+            <w:vAlign w:val="center"/>
+            <w:shd w:fill="EDF5F7"/>
+            <w:tcBorders>
+              <w:top w:val="single" w:sz="4" w:color="D9D9D9"/>
+              <w:left w:val="single" w:sz="4" w:color="D9D9D9"/>
+              <w:bottom w:val="single" w:sz="4" w:color="D9D9D9"/>
+              <w:right w:val="single" w:sz="4" w:color="D9D9D9"/>
+            </w:tcBorders>
+            <w:tcMar>
+              <w:top w:w="90" w:type="dxa"/>
+              <w:left w:w="90" w:type="dxa"/>
+              <w:bottom w:w="90" w:type="dxa"/>
+              <w:right w:w="90" w:type="dxa"/>
+            </w:tcMar>
+          </w:tcPr>
+          <w:p>
+            <w:pPr>
+              <w:spacing w:after="40" w:line="252" w:lineRule="auto"/>
+            </w:pPr>
+            <w:r>
+              <w:rPr>
+                <w:sz w:val="21"/>
+              </w:rPr>
+              <w:t>Enable is on again</w:t>
+            </w:r>
+          </w:p>
+        </w:tc>
+        <w:tc>
+          <w:tcPr>
+            <w:tcW w:type="dxa" w:w="3456"/>
+            <w:vAlign w:val="center"/>
+            <w:shd w:fill="EDF5F7"/>
+            <w:tcBorders>
+              <w:top w:val="single" w:sz="4" w:color="D9D9D9"/>
+              <w:left w:val="single" w:sz="4" w:color="D9D9D9"/>
+              <w:bottom w:val="single" w:sz="4" w:color="D9D9D9"/>
+              <w:right w:val="single" w:sz="4" w:color="D9D9D9"/>
+            </w:tcBorders>
+            <w:tcMar>
+              <w:top w:w="90" w:type="dxa"/>
+              <w:left w:w="90" w:type="dxa"/>
+              <w:bottom w:w="90" w:type="dxa"/>
+              <w:right w:w="90" w:type="dxa"/>
+            </w:tcMar>
+          </w:tcPr>
+          <w:p>
+            <w:pPr>
+              <w:spacing w:after="40" w:line="252" w:lineRule="auto"/>
+            </w:pPr>
+            <w:r>
+              <w:rPr>
+                <w:sz w:val="21"/>
+              </w:rPr>
+              <w:t>____</w:t>
+            </w:r>
+          </w:p>
+        </w:tc>
+      </w:tr>
+    </w:tbl>
+    <w:p>
+      <w:pPr>
+        <w:spacing w:after="80" w:line="20" w:lineRule="exact"/>
+      </w:pPr>
+    </w:p>
+    <w:p>
+      <w:hyperlink r:id="rId19">
+        <w:r>
+          <w:rPr>
+            <w:color w:val="075963"/>
+          </w:rPr>
+          <w:t>Browser experiment: Count, pause, resume</w:t>
+        </w:r>
+      </w:hyperlink>
+    </w:p>
+    <w:p>
+      <w:r>
+        <w:rPr>
+          <w:b/>
+        </w:rPr>
+        <w:t xml:space="preserve">Tell your partner </w:t>
+      </w:r>
+      <w:r>
+        <w:t>Why does the adder change while clk stays low, but the counter wait for an upward edge?</w:t>
+      </w:r>
+    </w:p>
+    <w:p>
+      <w:r>
+        <w:rPr>
+          <w:b/>
+          <w:sz w:val="20"/>
+        </w:rPr>
+        <w:t xml:space="preserve">Guide note </w:t>
+      </w:r>
+      <w:r>
+        <w:rPr>
+          <w:sz w:val="20"/>
+        </w:rPr>
+        <w:t>Counter answers: 3, 3, 4. Next event may visit a falling edge or an input change; it is not Next clock. First/Next/Last event replay a completed trace. The time labels arrange the test; they are not measurements of FPGA speed.</w:t>
+      </w:r>
+    </w:p>
+    <w:p>
+      <w:r>
+        <w:br w:type="page"/>
+      </w:r>
+    </w:p>
+    <w:p>
+      <w:pPr>
+        <w:pStyle w:val="Heading1"/>
+      </w:pPr>
+      <w:r>
+        <w:t>Browser lab  Guide and extension cards</w:t>
+      </w:r>
+    </w:p>
+    <w:p>
+      <w:pPr>
+        <w:pStyle w:val="Heading2"/>
+      </w:pPr>
+      <w:r>
+        <w:t>Start the lab on a computer</w:t>
+      </w:r>
+    </w:p>
+    <w:p>
+      <w:pPr>
+        <w:spacing w:after="200"/>
+      </w:pPr>
+      <w:r>
+        <w:rPr>
+          <w:rFonts w:ascii="DejaVu Sans Mono" w:hAnsi="DejaVu Sans Mono"/>
+          <w:sz w:val="20"/>
+        </w:rPr>
+        <w:t>python3 -m http.server 8090 --directory docs</w:t>
+      </w:r>
+    </w:p>
+    <w:p>
+      <w:r>
+        <w:t>Run that command from the repository root. Open http://localhost:8090/interactive/SharpHDL_WASM_Lab.html on the same computer. Workbook experiment links use this address. For a tablet, replace localhost with the teacher computer’s address.</w:t>
+      </w:r>
+    </w:p>
+    <w:p>
+      <w:r>
+        <w:t>The default fresh simulation loads the VeriSim engine from the internet. To prepare offline use, first run the command below while connected, then check Use downloaded engine in the lab. Keep the supplied docs folders together.</w:t>
+      </w:r>
+    </w:p>
+    <w:p>
+      <w:pPr>
+        <w:spacing w:after="200"/>
+      </w:pPr>
+      <w:r>
+        <w:rPr>
+          <w:rFonts w:ascii="DejaVu Sans Mono" w:hAnsi="DejaVu Sans Mono"/>
+          <w:sz w:val="20"/>
+        </w:rPr>
+        <w:t>python3 tools/fetch_verisim_runtime.py</w:t>
+      </w:r>
+    </w:p>
+    <w:p>
+      <w:pPr>
+        <w:pStyle w:val="Heading2"/>
+      </w:pPr>
+      <w:r>
+        <w:t>Three extension cards</w:t>
+      </w:r>
+    </w:p>
+    <w:tbl>
+      <w:tblPr>
+        <w:tblW w:type="auto" w:w="0"/>
+        <w:tblLayout w:type="fixed"/>
+        <w:tblLook w:firstColumn="1" w:firstRow="1" w:lastColumn="0" w:lastRow="0" w:noHBand="0" w:noVBand="1" w:val="04A0"/>
+      </w:tblPr>
+      <w:tblGrid>
+        <w:gridCol w:w="2880"/>
+        <w:gridCol w:w="4320"/>
+        <w:gridCol w:w="2880"/>
+      </w:tblGrid>
+      <w:tr>
+        <w:trPr>
+          <w:cantSplit/>
+          <w:tblHeader/>
+        </w:trPr>
+        <w:tc>
+          <w:tcPr>
+            <w:tcW w:type="dxa" w:w="2880"/>
+            <w:vAlign w:val="center"/>
+            <w:shd w:fill="17365D"/>
+            <w:tcBorders>
+              <w:top w:val="single" w:sz="4" w:color="D9D9D9"/>
+              <w:left w:val="single" w:sz="4" w:color="D9D9D9"/>
+              <w:bottom w:val="single" w:sz="4" w:color="D9D9D9"/>
+              <w:right w:val="single" w:sz="4" w:color="D9D9D9"/>
+            </w:tcBorders>
+            <w:tcMar>
+              <w:top w:w="90" w:type="dxa"/>
+              <w:left w:w="90" w:type="dxa"/>
+              <w:bottom w:w="90" w:type="dxa"/>
+              <w:right w:w="90" w:type="dxa"/>
+            </w:tcMar>
+          </w:tcPr>
+          <w:p>
+            <w:pPr>
+              <w:spacing w:after="40" w:line="252" w:lineRule="auto"/>
+              <w:jc w:val="center"/>
+            </w:pPr>
+            <w:r>
+              <w:rPr>
+                <w:b/>
+                <w:color w:val="FFFFFF"/>
+                <w:sz w:val="20"/>
+              </w:rPr>
+              <w:t>Experiment</w:t>
+            </w:r>
+          </w:p>
+        </w:tc>
+        <w:tc>
+          <w:tcPr>
+            <w:tcW w:type="dxa" w:w="4320"/>
+            <w:vAlign w:val="center"/>
+            <w:shd w:fill="17365D"/>
+            <w:tcBorders>
+              <w:top w:val="single" w:sz="4" w:color="D9D9D9"/>
+              <w:left w:val="single" w:sz="4" w:color="D9D9D9"/>
+              <w:bottom w:val="single" w:sz="4" w:color="D9D9D9"/>
+              <w:right w:val="single" w:sz="4" w:color="D9D9D9"/>
+            </w:tcBorders>
+            <w:tcMar>
+              <w:top w:w="90" w:type="dxa"/>
+              <w:left w:w="90" w:type="dxa"/>
+              <w:bottom w:w="90" w:type="dxa"/>
+              <w:right w:w="90" w:type="dxa"/>
+            </w:tcMar>
+          </w:tcPr>
+          <w:p>
+            <w:pPr>
+              <w:spacing w:after="40" w:line="252" w:lineRule="auto"/>
+            </w:pPr>
+            <w:r>
+              <w:rPr>
+                <w:b/>
+                <w:color w:val="FFFFFF"/>
+                <w:sz w:val="20"/>
+              </w:rPr>
+              <w:t>Predict before running</w:t>
+            </w:r>
+          </w:p>
+        </w:tc>
+        <w:tc>
+          <w:tcPr>
+            <w:tcW w:type="dxa" w:w="2880"/>
+            <w:vAlign w:val="center"/>
+            <w:shd w:fill="17365D"/>
+            <w:tcBorders>
+              <w:top w:val="single" w:sz="4" w:color="D9D9D9"/>
+              <w:left w:val="single" w:sz="4" w:color="D9D9D9"/>
+              <w:bottom w:val="single" w:sz="4" w:color="D9D9D9"/>
+              <w:right w:val="single" w:sz="4" w:color="D9D9D9"/>
+            </w:tcBorders>
+            <w:tcMar>
+              <w:top w:w="90" w:type="dxa"/>
+              <w:left w:w="90" w:type="dxa"/>
+              <w:bottom w:w="90" w:type="dxa"/>
+              <w:right w:w="90" w:type="dxa"/>
+            </w:tcMar>
+          </w:tcPr>
+          <w:p>
+            <w:pPr>
+              <w:spacing w:after="40" w:line="252" w:lineRule="auto"/>
+            </w:pPr>
+            <w:r>
+              <w:rPr>
+                <w:b/>
+                <w:color w:val="FFFFFF"/>
+                <w:sz w:val="20"/>
+              </w:rPr>
+              <w:t>Look at these waves</w:t>
+            </w:r>
+          </w:p>
+        </w:tc>
+      </w:tr>
+      <w:tr>
+        <w:trPr>
+          <w:cantSplit/>
+        </w:trPr>
+        <w:tc>
+          <w:tcPr>
+            <w:tcW w:type="dxa" w:w="2880"/>
+            <w:vAlign w:val="center"/>
+            <w:shd w:fill="FFFFFF"/>
+            <w:tcBorders>
+              <w:top w:val="single" w:sz="4" w:color="D9D9D9"/>
+              <w:left w:val="single" w:sz="4" w:color="D9D9D9"/>
+              <w:bottom w:val="single" w:sz="4" w:color="D9D9D9"/>
+              <w:right w:val="single" w:sz="4" w:color="D9D9D9"/>
+            </w:tcBorders>
+            <w:tcMar>
+              <w:top w:w="90" w:type="dxa"/>
+              <w:left w:w="90" w:type="dxa"/>
+              <w:bottom w:w="90" w:type="dxa"/>
+              <w:right w:w="90" w:type="dxa"/>
+            </w:tcMar>
+          </w:tcPr>
+          <w:p>
+            <w:pPr>
+              <w:spacing w:after="40" w:line="252" w:lineRule="auto"/>
+            </w:pPr>
+            <w:r>
+              <w:rPr>
+                <w:sz w:val="20"/>
+              </w:rPr>
+              <w:t>Coach the hockey drill</w:t>
+            </w:r>
+          </w:p>
+        </w:tc>
+        <w:tc>
+          <w:tcPr>
+            <w:tcW w:type="dxa" w:w="4320"/>
+            <w:vAlign w:val="center"/>
+            <w:shd w:fill="FFFFFF"/>
+            <w:tcBorders>
+              <w:top w:val="single" w:sz="4" w:color="D9D9D9"/>
+              <w:left w:val="single" w:sz="4" w:color="D9D9D9"/>
+              <w:bottom w:val="single" w:sz="4" w:color="D9D9D9"/>
+              <w:right w:val="single" w:sz="4" w:color="D9D9D9"/>
+            </w:tcBorders>
+            <w:tcMar>
+              <w:top w:w="90" w:type="dxa"/>
+              <w:left w:w="90" w:type="dxa"/>
+              <w:bottom w:w="90" w:type="dxa"/>
+              <w:right w:w="90" w:type="dxa"/>
+            </w:tcMar>
+          </w:tcPr>
+          <w:p>
+            <w:pPr>
+              <w:spacing w:after="40" w:line="252" w:lineRule="auto"/>
+            </w:pPr>
+            <w:r>
+              <w:rPr>
+                <w:sz w:val="20"/>
+              </w:rPr>
+              <w:t>Start begins at zero; four following enabled edges reach Done.</w:t>
+            </w:r>
+          </w:p>
+        </w:tc>
+        <w:tc>
+          <w:tcPr>
+            <w:tcW w:type="dxa" w:w="2880"/>
+            <w:vAlign w:val="center"/>
+            <w:shd w:fill="FFFFFF"/>
+            <w:tcBorders>
+              <w:top w:val="single" w:sz="4" w:color="D9D9D9"/>
+              <w:left w:val="single" w:sz="4" w:color="D9D9D9"/>
+              <w:bottom w:val="single" w:sz="4" w:color="D9D9D9"/>
+              <w:right w:val="single" w:sz="4" w:color="D9D9D9"/>
+            </w:tcBorders>
+            <w:tcMar>
+              <w:top w:w="90" w:type="dxa"/>
+              <w:left w:w="90" w:type="dxa"/>
+              <w:bottom w:w="90" w:type="dxa"/>
+              <w:right w:w="90" w:type="dxa"/>
+            </w:tcMar>
+          </w:tcPr>
+          <w:p>
+            <w:pPr>
+              <w:spacing w:after="40" w:line="252" w:lineRule="auto"/>
+            </w:pPr>
+            <w:r>
+              <w:rPr>
+                <w:sz w:val="20"/>
+              </w:rPr>
+              <w:t>s_ticks, s_phase, s_done</w:t>
+            </w:r>
+          </w:p>
+        </w:tc>
+      </w:tr>
+      <w:tr>
+        <w:trPr>
+          <w:cantSplit/>
+        </w:trPr>
+        <w:tc>
+          <w:tcPr>
+            <w:tcW w:type="dxa" w:w="2880"/>
+            <w:vAlign w:val="center"/>
+            <w:shd w:fill="EDF5F7"/>
+            <w:tcBorders>
+              <w:top w:val="single" w:sz="4" w:color="D9D9D9"/>
+              <w:left w:val="single" w:sz="4" w:color="D9D9D9"/>
+              <w:bottom w:val="single" w:sz="4" w:color="D9D9D9"/>
+              <w:right w:val="single" w:sz="4" w:color="D9D9D9"/>
+            </w:tcBorders>
+            <w:tcMar>
+              <w:top w:w="90" w:type="dxa"/>
+              <w:left w:w="90" w:type="dxa"/>
+              <w:bottom w:w="90" w:type="dxa"/>
+              <w:right w:w="90" w:type="dxa"/>
+            </w:tcMar>
+          </w:tcPr>
+          <w:p>
+            <w:pPr>
+              <w:spacing w:after="40" w:line="252" w:lineRule="auto"/>
+            </w:pPr>
+            <w:r>
+              <w:rPr>
+                <w:sz w:val="20"/>
+              </w:rPr>
+              <w:t>Twelve additions, no clocks</w:t>
+            </w:r>
+          </w:p>
+        </w:tc>
+        <w:tc>
+          <w:tcPr>
+            <w:tcW w:type="dxa" w:w="4320"/>
+            <w:vAlign w:val="center"/>
+            <w:shd w:fill="EDF5F7"/>
+            <w:tcBorders>
+              <w:top w:val="single" w:sz="4" w:color="D9D9D9"/>
+              <w:left w:val="single" w:sz="4" w:color="D9D9D9"/>
+              <w:bottom w:val="single" w:sz="4" w:color="D9D9D9"/>
+              <w:right w:val="single" w:sz="4" w:color="D9D9D9"/>
+            </w:tcBorders>
+            <w:tcMar>
+              <w:top w:w="90" w:type="dxa"/>
+              <w:left w:w="90" w:type="dxa"/>
+              <w:bottom w:w="90" w:type="dxa"/>
+              <w:right w:w="90" w:type="dxa"/>
+            </w:tcMar>
+          </w:tcPr>
+          <w:p>
+            <w:pPr>
+              <w:spacing w:after="40" w:line="252" w:lineRule="auto"/>
+            </w:pPr>
+            <w:r>
+              <w:rPr>
+                <w:sz w:val="20"/>
+              </w:rPr>
+              <w:t>2 + 12 × 3 = ____. Does it need clock edges?</w:t>
+            </w:r>
+          </w:p>
+        </w:tc>
+        <w:tc>
+          <w:tcPr>
+            <w:tcW w:type="dxa" w:w="2880"/>
+            <w:vAlign w:val="center"/>
+            <w:shd w:fill="EDF5F7"/>
+            <w:tcBorders>
+              <w:top w:val="single" w:sz="4" w:color="D9D9D9"/>
+              <w:left w:val="single" w:sz="4" w:color="D9D9D9"/>
+              <w:bottom w:val="single" w:sz="4" w:color="D9D9D9"/>
+              <w:right w:val="single" w:sz="4" w:color="D9D9D9"/>
+            </w:tcBorders>
+            <w:tcMar>
+              <w:top w:w="90" w:type="dxa"/>
+              <w:left w:w="90" w:type="dxa"/>
+              <w:bottom w:w="90" w:type="dxa"/>
+              <w:right w:w="90" w:type="dxa"/>
+            </w:tcMar>
+          </w:tcPr>
+          <w:p>
+            <w:pPr>
+              <w:spacing w:after="40" w:line="252" w:lineRule="auto"/>
+            </w:pPr>
+            <w:r>
+              <w:rPr>
+                <w:sz w:val="20"/>
+              </w:rPr>
+              <w:t>s_a, s_b, s_y; clk stays low</w:t>
+            </w:r>
+          </w:p>
+        </w:tc>
+      </w:tr>
+      <w:tr>
+        <w:trPr>
+          <w:cantSplit/>
+        </w:trPr>
+        <w:tc>
+          <w:tcPr>
+            <w:tcW w:type="dxa" w:w="2880"/>
+            <w:vAlign w:val="center"/>
+            <w:shd w:fill="FFFFFF"/>
+            <w:tcBorders>
+              <w:top w:val="single" w:sz="4" w:color="D9D9D9"/>
+              <w:left w:val="single" w:sz="4" w:color="D9D9D9"/>
+              <w:bottom w:val="single" w:sz="4" w:color="D9D9D9"/>
+              <w:right w:val="single" w:sz="4" w:color="D9D9D9"/>
+            </w:tcBorders>
+            <w:tcMar>
+              <w:top w:w="90" w:type="dxa"/>
+              <w:left w:w="90" w:type="dxa"/>
+              <w:bottom w:w="90" w:type="dxa"/>
+              <w:right w:w="90" w:type="dxa"/>
+            </w:tcMar>
+          </w:tcPr>
+          <w:p>
+            <w:pPr>
+              <w:spacing w:after="40" w:line="252" w:lineRule="auto"/>
+            </w:pPr>
+            <w:r>
+              <w:rPr>
+                <w:sz w:val="20"/>
+              </w:rPr>
+              <w:t>A loop that takes clock ticks</w:t>
+            </w:r>
+          </w:p>
+        </w:tc>
+        <w:tc>
+          <w:tcPr>
+            <w:tcW w:type="dxa" w:w="4320"/>
+            <w:vAlign w:val="center"/>
+            <w:shd w:fill="FFFFFF"/>
+            <w:tcBorders>
+              <w:top w:val="single" w:sz="4" w:color="D9D9D9"/>
+              <w:left w:val="single" w:sz="4" w:color="D9D9D9"/>
+              <w:bottom w:val="single" w:sz="4" w:color="D9D9D9"/>
+              <w:right w:val="single" w:sz="4" w:color="D9D9D9"/>
+            </w:tcBorders>
+            <w:tcMar>
+              <w:top w:w="90" w:type="dxa"/>
+              <w:left w:w="90" w:type="dxa"/>
+              <w:bottom w:w="90" w:type="dxa"/>
+              <w:right w:w="90" w:type="dxa"/>
+            </w:tcMar>
+          </w:tcPr>
+          <w:p>
+            <w:pPr>
+              <w:spacing w:after="40" w:line="252" w:lineRule="auto"/>
+            </w:pPr>
+            <w:r>
+              <w:rPr>
+                <w:sz w:val="20"/>
+              </w:rPr>
+              <w:t>10 + 3 + 2 + 1 = ____. When is it valid?</w:t>
+            </w:r>
+          </w:p>
+        </w:tc>
+        <w:tc>
+          <w:tcPr>
+            <w:tcW w:type="dxa" w:w="2880"/>
+            <w:vAlign w:val="center"/>
+            <w:shd w:fill="FFFFFF"/>
+            <w:tcBorders>
+              <w:top w:val="single" w:sz="4" w:color="D9D9D9"/>
+              <w:left w:val="single" w:sz="4" w:color="D9D9D9"/>
+              <w:bottom w:val="single" w:sz="4" w:color="D9D9D9"/>
+              <w:right w:val="single" w:sz="4" w:color="D9D9D9"/>
+            </w:tcBorders>
+            <w:tcMar>
+              <w:top w:w="90" w:type="dxa"/>
+              <w:left w:w="90" w:type="dxa"/>
+              <w:bottom w:w="90" w:type="dxa"/>
+              <w:right w:w="90" w:type="dxa"/>
+            </w:tcMar>
+          </w:tcPr>
+          <w:p>
+            <w:pPr>
+              <w:spacing w:after="40" w:line="252" w:lineRule="auto"/>
+            </w:pPr>
+            <w:r>
+              <w:rPr>
+                <w:sz w:val="20"/>
+              </w:rPr>
+              <w:t>s_busy, s_done, s_result, s_fault</w:t>
+            </w:r>
+          </w:p>
+        </w:tc>
+      </w:tr>
+    </w:tbl>
+    <w:p>
+      <w:pPr>
+        <w:spacing w:after="80" w:line="20" w:lineRule="exact"/>
+      </w:pPr>
+    </w:p>
+    <w:p>
+      <w:hyperlink r:id="rId27">
+        <w:r>
+          <w:rPr>
+            <w:color w:val="075963"/>
+          </w:rPr>
+          <w:t>Browser experiment: Coach the hockey drill</w:t>
+        </w:r>
+      </w:hyperlink>
+    </w:p>
+    <w:p>
+      <w:hyperlink r:id="rId30">
+        <w:r>
+          <w:rPr>
+            <w:color w:val="075963"/>
+          </w:rPr>
+          <w:t>Browser experiment: Twelve additions, no clocks</w:t>
+        </w:r>
+      </w:hyperlink>
+    </w:p>
+    <w:p>
+      <w:hyperlink r:id="rId28">
+        <w:r>
+          <w:rPr>
+            <w:color w:val="075963"/>
+          </w:rPr>
+          <w:t>Browser experiment: A loop that takes clock ticks</w:t>
+        </w:r>
+      </w:hyperlink>
+    </w:p>
+    <w:p>
+      <w:pPr>
+        <w:pStyle w:val="Heading2"/>
+      </w:pPr>
+      <w:r>
+        <w:t>What the buttons really do</w:t>
+      </w:r>
+    </w:p>
+    <w:p>
+      <w:r>
+        <w:t>Run RTL compiles and simulates the generated Verilog in WebAssembly, then replaces the waveform trace. The teacher’s testbench checks the answers. Restore recorded trace returns to the bundled native-Icarus result. Cancel stops a worker; a run also has a 60-second limit. The children can read waves without writing a testbench.</w:t>
+      </w:r>
+    </w:p>
+    <w:p>
+      <w:r>
+        <w:rPr>
+          <w:b/>
+          <w:sz w:val="20"/>
+        </w:rPr>
+        <w:t xml:space="preserve">Guide note </w:t>
+      </w:r>
+      <w:r>
+        <w:rPr>
+          <w:sz w:val="20"/>
+        </w:rPr>
+        <w:t>Extension answers: four enabled ticks; 38 without clock edges; 16 when Done is high and Fault and Timeout are low. Unknown X/Z is not zero. A CIL operation can take a clock; a whole loop iteration usually takes several. Full source, testbenches, requirements and engine attribution: WASM_WORKBOOK.md. TinyRisc_Demo.html is the next PC/register/LED exercise.</w:t>
       </w:r>
     </w:p>
     <w:sectPr>

</xml_diff>

<commit_message>
Demonstrate direct and skid-buffer backpressure in workbook WASM lab
</commit_message>
<xml_diff>
--- a/docs/SharpHDL_Classroom_Proposal.docx
+++ b/docs/SharpHDL_Classroom_Proposal.docx
@@ -19813,7 +19813,7 @@
     </w:p>
     <w:p>
       <w:r>
-        <w:t>The offline Clock Lab evaluates exported circuit graphs. The separate workbook WASM lab runs actual generated Verilog and prepared testbenches on the page, using the VeriSim Icarus WebAssembly engine. Its five experiments have browser and native-trace agreement tests. Fresh runs need engine files; bundled recorded traces work offline.</w:t>
+        <w:t>The offline Clock Lab evaluates exported circuit graphs. The separate workbook WASM lab runs actual generated Verilog and prepared testbenches on the page, using the VeriSim Icarus WebAssembly engine. Its seven experiments have browser and native-trace agreement tests. Fresh runs need engine files; bundled recorded traces work offline.</w:t>
       </w:r>
     </w:p>
     <w:p>
@@ -21441,6 +21441,1420 @@
           <w:sz w:val="20"/>
         </w:rPr>
         <w:t>Extension answers: four enabled ticks; 38 without clock edges; 16 when Done is high and Fault and Timeout are low. Unknown X/Z is not zero. A CIL operation can take a clock; a whole loop iteration usually takes several. Full source, testbenches, requirements and engine attribution: WASM_WORKBOOK.md. TinyRisc_Demo.html is the next PC/register/LED exercise.</w:t>
+      </w:r>
+    </w:p>
+    <w:p>
+      <w:r>
+        <w:br w:type="page"/>
+      </w:r>
+    </w:p>
+    <w:p>
+      <w:pPr>
+        <w:pStyle w:val="Heading1"/>
+      </w:pPr>
+      <w:r>
+        <w:t>Browser lab  Passing cards without losing one</w:t>
+      </w:r>
+    </w:p>
+    <w:p>
+      <w:r>
+        <w:t>A sender has cards 10, 11 and 12. The receiver says Wait for three clock claps. Compare a direct connection with a skid buffer that has two waiting places. Both must deliver every card exactly once.</w:t>
+      </w:r>
+    </w:p>
+    <w:p>
+      <w:pPr>
+        <w:keepNext/>
+        <w:spacing w:after="40"/>
+        <w:jc w:val="center"/>
+      </w:pPr>
+      <w:r>
+        <w:drawing>
+          <wp:inline xmlns:a="http://schemas.openxmlformats.org/drawingml/2006/main" xmlns:pic="http://schemas.openxmlformats.org/drawingml/2006/picture">
+            <wp:extent cx="4389120" cy="1623974"/>
+            <wp:docPr id="18" name="Picture 18" descr="The head holds the next card to deliver. The spill saves one extra card. In this experiment A is 10 and B is 11." title="skid"/>
+            <wp:cNvGraphicFramePr>
+              <a:graphicFrameLocks noChangeAspect="1"/>
+            </wp:cNvGraphicFramePr>
+            <a:graphic>
+              <a:graphicData uri="http://schemas.openxmlformats.org/drawingml/2006/picture">
+                <pic:pic>
+                  <pic:nvPicPr>
+                    <pic:cNvPr id="0" name="skid.png"/>
+                    <pic:cNvPicPr/>
+                  </pic:nvPicPr>
+                  <pic:blipFill>
+                    <a:blip r:embed="rId22"/>
+                    <a:stretch>
+                      <a:fillRect/>
+                    </a:stretch>
+                  </pic:blipFill>
+                  <pic:spPr>
+                    <a:xfrm>
+                      <a:off x="0" y="0"/>
+                      <a:ext cx="4389120" cy="1623974"/>
+                    </a:xfrm>
+                    <a:prstGeom prst="rect"/>
+                  </pic:spPr>
+                </pic:pic>
+              </a:graphicData>
+            </a:graphic>
+          </wp:inline>
+        </w:drawing>
+      </w:r>
+    </w:p>
+    <w:p>
+      <w:pPr>
+        <w:spacing w:after="160"/>
+        <w:jc w:val="center"/>
+      </w:pPr>
+      <w:r>
+        <w:rPr>
+          <w:i/>
+          <w:sz w:val="20"/>
+        </w:rPr>
+        <w:t>The head holds the next card to deliver. The spill saves one extra card. In this experiment A is 10 and B is 11.</w:t>
+      </w:r>
+    </w:p>
+    <w:p>
+      <w:pPr>
+        <w:pStyle w:val="Heading2"/>
+      </w:pPr>
+      <w:r>
+        <w:t>Two signals make a promise</w:t>
+      </w:r>
+    </w:p>
+    <w:p>
+      <w:r>
+        <w:t>Valid means I am offering a card. Ready means I can take it. A card changes hands only on an upward clock edge when both are 1. When Valid is 1 and Ready is 0, keep the card and its labels still. That wait signal is called backpressure.</w:t>
+      </w:r>
+    </w:p>
+    <w:tbl>
+      <w:tblPr>
+        <w:tblW w:type="auto" w:w="0"/>
+        <w:tblLayout w:type="fixed"/>
+        <w:tblLook w:firstColumn="1" w:firstRow="1" w:lastColumn="0" w:lastRow="0" w:noHBand="0" w:noVBand="1" w:val="04A0"/>
+      </w:tblPr>
+      <w:tblGrid>
+        <w:gridCol w:w="1440"/>
+        <w:gridCol w:w="1872"/>
+        <w:gridCol w:w="2016"/>
+        <w:gridCol w:w="2016"/>
+        <w:gridCol w:w="2736"/>
+      </w:tblGrid>
+      <w:tr>
+        <w:trPr>
+          <w:cantSplit/>
+          <w:tblHeader/>
+        </w:trPr>
+        <w:tc>
+          <w:tcPr>
+            <w:tcW w:type="dxa" w:w="1440"/>
+            <w:vAlign w:val="center"/>
+            <w:shd w:fill="17365D"/>
+            <w:tcBorders>
+              <w:top w:val="single" w:sz="4" w:color="D9D9D9"/>
+              <w:left w:val="single" w:sz="4" w:color="D9D9D9"/>
+              <w:bottom w:val="single" w:sz="4" w:color="D9D9D9"/>
+              <w:right w:val="single" w:sz="4" w:color="D9D9D9"/>
+            </w:tcBorders>
+            <w:tcMar>
+              <w:top w:w="90" w:type="dxa"/>
+              <w:left w:w="90" w:type="dxa"/>
+              <w:bottom w:w="90" w:type="dxa"/>
+              <w:right w:w="90" w:type="dxa"/>
+            </w:tcMar>
+          </w:tcPr>
+          <w:p>
+            <w:pPr>
+              <w:spacing w:after="40" w:line="252" w:lineRule="auto"/>
+              <w:jc w:val="center"/>
+            </w:pPr>
+            <w:r>
+              <w:rPr>
+                <w:b/>
+                <w:color w:val="FFFFFF"/>
+                <w:sz w:val="20"/>
+              </w:rPr>
+              <w:t>After edge</w:t>
+            </w:r>
+          </w:p>
+        </w:tc>
+        <w:tc>
+          <w:tcPr>
+            <w:tcW w:type="dxa" w:w="1872"/>
+            <w:vAlign w:val="center"/>
+            <w:shd w:fill="17365D"/>
+            <w:tcBorders>
+              <w:top w:val="single" w:sz="4" w:color="D9D9D9"/>
+              <w:left w:val="single" w:sz="4" w:color="D9D9D9"/>
+              <w:bottom w:val="single" w:sz="4" w:color="D9D9D9"/>
+              <w:right w:val="single" w:sz="4" w:color="D9D9D9"/>
+            </w:tcBorders>
+            <w:tcMar>
+              <w:top w:w="90" w:type="dxa"/>
+              <w:left w:w="90" w:type="dxa"/>
+              <w:bottom w:w="90" w:type="dxa"/>
+              <w:right w:w="90" w:type="dxa"/>
+            </w:tcMar>
+          </w:tcPr>
+          <w:p>
+            <w:pPr>
+              <w:spacing w:after="40" w:line="252" w:lineRule="auto"/>
+            </w:pPr>
+            <w:r>
+              <w:rPr>
+                <w:b/>
+                <w:color w:val="FFFFFF"/>
+                <w:sz w:val="20"/>
+              </w:rPr>
+              <w:t>Receiver Ready</w:t>
+            </w:r>
+          </w:p>
+        </w:tc>
+        <w:tc>
+          <w:tcPr>
+            <w:tcW w:type="dxa" w:w="2016"/>
+            <w:vAlign w:val="center"/>
+            <w:shd w:fill="17365D"/>
+            <w:tcBorders>
+              <w:top w:val="single" w:sz="4" w:color="D9D9D9"/>
+              <w:left w:val="single" w:sz="4" w:color="D9D9D9"/>
+              <w:bottom w:val="single" w:sz="4" w:color="D9D9D9"/>
+              <w:right w:val="single" w:sz="4" w:color="D9D9D9"/>
+            </w:tcBorders>
+            <w:tcMar>
+              <w:top w:w="90" w:type="dxa"/>
+              <w:left w:w="90" w:type="dxa"/>
+              <w:bottom w:w="90" w:type="dxa"/>
+              <w:right w:w="90" w:type="dxa"/>
+            </w:tcMar>
+          </w:tcPr>
+          <w:p>
+            <w:pPr>
+              <w:spacing w:after="40" w:line="252" w:lineRule="auto"/>
+            </w:pPr>
+            <w:r>
+              <w:rPr>
+                <w:b/>
+                <w:color w:val="FFFFFF"/>
+                <w:sz w:val="20"/>
+              </w:rPr>
+              <w:t>Direct accepted</w:t>
+            </w:r>
+          </w:p>
+        </w:tc>
+        <w:tc>
+          <w:tcPr>
+            <w:tcW w:type="dxa" w:w="2016"/>
+            <w:vAlign w:val="center"/>
+            <w:shd w:fill="17365D"/>
+            <w:tcBorders>
+              <w:top w:val="single" w:sz="4" w:color="D9D9D9"/>
+              <w:left w:val="single" w:sz="4" w:color="D9D9D9"/>
+              <w:bottom w:val="single" w:sz="4" w:color="D9D9D9"/>
+              <w:right w:val="single" w:sz="4" w:color="D9D9D9"/>
+            </w:tcBorders>
+            <w:tcMar>
+              <w:top w:w="90" w:type="dxa"/>
+              <w:left w:w="90" w:type="dxa"/>
+              <w:bottom w:w="90" w:type="dxa"/>
+              <w:right w:w="90" w:type="dxa"/>
+            </w:tcMar>
+          </w:tcPr>
+          <w:p>
+            <w:pPr>
+              <w:spacing w:after="40" w:line="252" w:lineRule="auto"/>
+            </w:pPr>
+            <w:r>
+              <w:rPr>
+                <w:b/>
+                <w:color w:val="FFFFFF"/>
+                <w:sz w:val="20"/>
+              </w:rPr>
+              <w:t>Skid accepted</w:t>
+            </w:r>
+          </w:p>
+        </w:tc>
+        <w:tc>
+          <w:tcPr>
+            <w:tcW w:type="dxa" w:w="2736"/>
+            <w:vAlign w:val="center"/>
+            <w:shd w:fill="17365D"/>
+            <w:tcBorders>
+              <w:top w:val="single" w:sz="4" w:color="D9D9D9"/>
+              <w:left w:val="single" w:sz="4" w:color="D9D9D9"/>
+              <w:bottom w:val="single" w:sz="4" w:color="D9D9D9"/>
+              <w:right w:val="single" w:sz="4" w:color="D9D9D9"/>
+            </w:tcBorders>
+            <w:tcMar>
+              <w:top w:w="90" w:type="dxa"/>
+              <w:left w:w="90" w:type="dxa"/>
+              <w:bottom w:w="90" w:type="dxa"/>
+              <w:right w:w="90" w:type="dxa"/>
+            </w:tcMar>
+          </w:tcPr>
+          <w:p>
+            <w:pPr>
+              <w:spacing w:after="40" w:line="252" w:lineRule="auto"/>
+            </w:pPr>
+            <w:r>
+              <w:rPr>
+                <w:b/>
+                <w:color w:val="FFFFFF"/>
+                <w:sz w:val="20"/>
+              </w:rPr>
+              <w:t>Each receiver gets</w:t>
+            </w:r>
+          </w:p>
+        </w:tc>
+      </w:tr>
+      <w:tr>
+        <w:trPr>
+          <w:cantSplit/>
+        </w:trPr>
+        <w:tc>
+          <w:tcPr>
+            <w:tcW w:type="dxa" w:w="1440"/>
+            <w:vAlign w:val="center"/>
+            <w:shd w:fill="FFFFFF"/>
+            <w:tcBorders>
+              <w:top w:val="single" w:sz="4" w:color="D9D9D9"/>
+              <w:left w:val="single" w:sz="4" w:color="D9D9D9"/>
+              <w:bottom w:val="single" w:sz="4" w:color="D9D9D9"/>
+              <w:right w:val="single" w:sz="4" w:color="D9D9D9"/>
+            </w:tcBorders>
+            <w:tcMar>
+              <w:top w:w="90" w:type="dxa"/>
+              <w:left w:w="90" w:type="dxa"/>
+              <w:bottom w:w="90" w:type="dxa"/>
+              <w:right w:w="90" w:type="dxa"/>
+            </w:tcMar>
+          </w:tcPr>
+          <w:p>
+            <w:pPr>
+              <w:spacing w:after="40" w:line="252" w:lineRule="auto"/>
+              <w:jc w:val="center"/>
+            </w:pPr>
+            <w:r>
+              <w:rPr>
+                <w:sz w:val="20"/>
+              </w:rPr>
+              <w:t>1</w:t>
+            </w:r>
+          </w:p>
+        </w:tc>
+        <w:tc>
+          <w:tcPr>
+            <w:tcW w:type="dxa" w:w="1872"/>
+            <w:vAlign w:val="center"/>
+            <w:shd w:fill="FFFFFF"/>
+            <w:tcBorders>
+              <w:top w:val="single" w:sz="4" w:color="D9D9D9"/>
+              <w:left w:val="single" w:sz="4" w:color="D9D9D9"/>
+              <w:bottom w:val="single" w:sz="4" w:color="D9D9D9"/>
+              <w:right w:val="single" w:sz="4" w:color="D9D9D9"/>
+            </w:tcBorders>
+            <w:tcMar>
+              <w:top w:w="90" w:type="dxa"/>
+              <w:left w:w="90" w:type="dxa"/>
+              <w:bottom w:w="90" w:type="dxa"/>
+              <w:right w:w="90" w:type="dxa"/>
+            </w:tcMar>
+          </w:tcPr>
+          <w:p>
+            <w:pPr>
+              <w:spacing w:after="40" w:line="252" w:lineRule="auto"/>
+            </w:pPr>
+            <w:r>
+              <w:rPr>
+                <w:sz w:val="20"/>
+              </w:rPr>
+              <w:t>0</w:t>
+            </w:r>
+          </w:p>
+        </w:tc>
+        <w:tc>
+          <w:tcPr>
+            <w:tcW w:type="dxa" w:w="2016"/>
+            <w:vAlign w:val="center"/>
+            <w:shd w:fill="FFFFFF"/>
+            <w:tcBorders>
+              <w:top w:val="single" w:sz="4" w:color="D9D9D9"/>
+              <w:left w:val="single" w:sz="4" w:color="D9D9D9"/>
+              <w:bottom w:val="single" w:sz="4" w:color="D9D9D9"/>
+              <w:right w:val="single" w:sz="4" w:color="D9D9D9"/>
+            </w:tcBorders>
+            <w:tcMar>
+              <w:top w:w="90" w:type="dxa"/>
+              <w:left w:w="90" w:type="dxa"/>
+              <w:bottom w:w="90" w:type="dxa"/>
+              <w:right w:w="90" w:type="dxa"/>
+            </w:tcMar>
+          </w:tcPr>
+          <w:p>
+            <w:pPr>
+              <w:spacing w:after="40" w:line="252" w:lineRule="auto"/>
+            </w:pPr>
+            <w:r>
+              <w:rPr>
+                <w:sz w:val="20"/>
+              </w:rPr>
+              <w:t>0</w:t>
+            </w:r>
+          </w:p>
+        </w:tc>
+        <w:tc>
+          <w:tcPr>
+            <w:tcW w:type="dxa" w:w="2016"/>
+            <w:vAlign w:val="center"/>
+            <w:shd w:fill="FFFFFF"/>
+            <w:tcBorders>
+              <w:top w:val="single" w:sz="4" w:color="D9D9D9"/>
+              <w:left w:val="single" w:sz="4" w:color="D9D9D9"/>
+              <w:bottom w:val="single" w:sz="4" w:color="D9D9D9"/>
+              <w:right w:val="single" w:sz="4" w:color="D9D9D9"/>
+            </w:tcBorders>
+            <w:tcMar>
+              <w:top w:w="90" w:type="dxa"/>
+              <w:left w:w="90" w:type="dxa"/>
+              <w:bottom w:w="90" w:type="dxa"/>
+              <w:right w:w="90" w:type="dxa"/>
+            </w:tcMar>
+          </w:tcPr>
+          <w:p>
+            <w:pPr>
+              <w:spacing w:after="40" w:line="252" w:lineRule="auto"/>
+            </w:pPr>
+            <w:r>
+              <w:rPr>
+                <w:sz w:val="20"/>
+              </w:rPr>
+              <w:t>1</w:t>
+            </w:r>
+          </w:p>
+        </w:tc>
+        <w:tc>
+          <w:tcPr>
+            <w:tcW w:type="dxa" w:w="2736"/>
+            <w:vAlign w:val="center"/>
+            <w:shd w:fill="FFFFFF"/>
+            <w:tcBorders>
+              <w:top w:val="single" w:sz="4" w:color="D9D9D9"/>
+              <w:left w:val="single" w:sz="4" w:color="D9D9D9"/>
+              <w:bottom w:val="single" w:sz="4" w:color="D9D9D9"/>
+              <w:right w:val="single" w:sz="4" w:color="D9D9D9"/>
+            </w:tcBorders>
+            <w:tcMar>
+              <w:top w:w="90" w:type="dxa"/>
+              <w:left w:w="90" w:type="dxa"/>
+              <w:bottom w:w="90" w:type="dxa"/>
+              <w:right w:w="90" w:type="dxa"/>
+            </w:tcMar>
+          </w:tcPr>
+          <w:p>
+            <w:pPr>
+              <w:spacing w:after="40" w:line="252" w:lineRule="auto"/>
+            </w:pPr>
+            <w:r>
+              <w:rPr>
+                <w:sz w:val="20"/>
+              </w:rPr>
+              <w:t>Nothing</w:t>
+            </w:r>
+          </w:p>
+        </w:tc>
+      </w:tr>
+      <w:tr>
+        <w:trPr>
+          <w:cantSplit/>
+        </w:trPr>
+        <w:tc>
+          <w:tcPr>
+            <w:tcW w:type="dxa" w:w="1440"/>
+            <w:vAlign w:val="center"/>
+            <w:shd w:fill="EDF5F7"/>
+            <w:tcBorders>
+              <w:top w:val="single" w:sz="4" w:color="D9D9D9"/>
+              <w:left w:val="single" w:sz="4" w:color="D9D9D9"/>
+              <w:bottom w:val="single" w:sz="4" w:color="D9D9D9"/>
+              <w:right w:val="single" w:sz="4" w:color="D9D9D9"/>
+            </w:tcBorders>
+            <w:tcMar>
+              <w:top w:w="90" w:type="dxa"/>
+              <w:left w:w="90" w:type="dxa"/>
+              <w:bottom w:w="90" w:type="dxa"/>
+              <w:right w:w="90" w:type="dxa"/>
+            </w:tcMar>
+          </w:tcPr>
+          <w:p>
+            <w:pPr>
+              <w:spacing w:after="40" w:line="252" w:lineRule="auto"/>
+              <w:jc w:val="center"/>
+            </w:pPr>
+            <w:r>
+              <w:rPr>
+                <w:sz w:val="20"/>
+              </w:rPr>
+              <w:t>2</w:t>
+            </w:r>
+          </w:p>
+        </w:tc>
+        <w:tc>
+          <w:tcPr>
+            <w:tcW w:type="dxa" w:w="1872"/>
+            <w:vAlign w:val="center"/>
+            <w:shd w:fill="EDF5F7"/>
+            <w:tcBorders>
+              <w:top w:val="single" w:sz="4" w:color="D9D9D9"/>
+              <w:left w:val="single" w:sz="4" w:color="D9D9D9"/>
+              <w:bottom w:val="single" w:sz="4" w:color="D9D9D9"/>
+              <w:right w:val="single" w:sz="4" w:color="D9D9D9"/>
+            </w:tcBorders>
+            <w:tcMar>
+              <w:top w:w="90" w:type="dxa"/>
+              <w:left w:w="90" w:type="dxa"/>
+              <w:bottom w:w="90" w:type="dxa"/>
+              <w:right w:w="90" w:type="dxa"/>
+            </w:tcMar>
+          </w:tcPr>
+          <w:p>
+            <w:pPr>
+              <w:spacing w:after="40" w:line="252" w:lineRule="auto"/>
+            </w:pPr>
+            <w:r>
+              <w:rPr>
+                <w:sz w:val="20"/>
+              </w:rPr>
+              <w:t>0</w:t>
+            </w:r>
+          </w:p>
+        </w:tc>
+        <w:tc>
+          <w:tcPr>
+            <w:tcW w:type="dxa" w:w="2016"/>
+            <w:vAlign w:val="center"/>
+            <w:shd w:fill="EDF5F7"/>
+            <w:tcBorders>
+              <w:top w:val="single" w:sz="4" w:color="D9D9D9"/>
+              <w:left w:val="single" w:sz="4" w:color="D9D9D9"/>
+              <w:bottom w:val="single" w:sz="4" w:color="D9D9D9"/>
+              <w:right w:val="single" w:sz="4" w:color="D9D9D9"/>
+            </w:tcBorders>
+            <w:tcMar>
+              <w:top w:w="90" w:type="dxa"/>
+              <w:left w:w="90" w:type="dxa"/>
+              <w:bottom w:w="90" w:type="dxa"/>
+              <w:right w:w="90" w:type="dxa"/>
+            </w:tcMar>
+          </w:tcPr>
+          <w:p>
+            <w:pPr>
+              <w:spacing w:after="40" w:line="252" w:lineRule="auto"/>
+            </w:pPr>
+            <w:r>
+              <w:rPr>
+                <w:sz w:val="20"/>
+              </w:rPr>
+              <w:t>0</w:t>
+            </w:r>
+          </w:p>
+        </w:tc>
+        <w:tc>
+          <w:tcPr>
+            <w:tcW w:type="dxa" w:w="2016"/>
+            <w:vAlign w:val="center"/>
+            <w:shd w:fill="EDF5F7"/>
+            <w:tcBorders>
+              <w:top w:val="single" w:sz="4" w:color="D9D9D9"/>
+              <w:left w:val="single" w:sz="4" w:color="D9D9D9"/>
+              <w:bottom w:val="single" w:sz="4" w:color="D9D9D9"/>
+              <w:right w:val="single" w:sz="4" w:color="D9D9D9"/>
+            </w:tcBorders>
+            <w:tcMar>
+              <w:top w:w="90" w:type="dxa"/>
+              <w:left w:w="90" w:type="dxa"/>
+              <w:bottom w:w="90" w:type="dxa"/>
+              <w:right w:w="90" w:type="dxa"/>
+            </w:tcMar>
+          </w:tcPr>
+          <w:p>
+            <w:pPr>
+              <w:spacing w:after="40" w:line="252" w:lineRule="auto"/>
+            </w:pPr>
+            <w:r>
+              <w:rPr>
+                <w:sz w:val="20"/>
+              </w:rPr>
+              <w:t>2</w:t>
+            </w:r>
+          </w:p>
+        </w:tc>
+        <w:tc>
+          <w:tcPr>
+            <w:tcW w:type="dxa" w:w="2736"/>
+            <w:vAlign w:val="center"/>
+            <w:shd w:fill="EDF5F7"/>
+            <w:tcBorders>
+              <w:top w:val="single" w:sz="4" w:color="D9D9D9"/>
+              <w:left w:val="single" w:sz="4" w:color="D9D9D9"/>
+              <w:bottom w:val="single" w:sz="4" w:color="D9D9D9"/>
+              <w:right w:val="single" w:sz="4" w:color="D9D9D9"/>
+            </w:tcBorders>
+            <w:tcMar>
+              <w:top w:w="90" w:type="dxa"/>
+              <w:left w:w="90" w:type="dxa"/>
+              <w:bottom w:w="90" w:type="dxa"/>
+              <w:right w:w="90" w:type="dxa"/>
+            </w:tcMar>
+          </w:tcPr>
+          <w:p>
+            <w:pPr>
+              <w:spacing w:after="40" w:line="252" w:lineRule="auto"/>
+            </w:pPr>
+            <w:r>
+              <w:rPr>
+                <w:sz w:val="20"/>
+              </w:rPr>
+              <w:t>Nothing</w:t>
+            </w:r>
+          </w:p>
+        </w:tc>
+      </w:tr>
+      <w:tr>
+        <w:trPr>
+          <w:cantSplit/>
+        </w:trPr>
+        <w:tc>
+          <w:tcPr>
+            <w:tcW w:type="dxa" w:w="1440"/>
+            <w:vAlign w:val="center"/>
+            <w:shd w:fill="FFFFFF"/>
+            <w:tcBorders>
+              <w:top w:val="single" w:sz="4" w:color="D9D9D9"/>
+              <w:left w:val="single" w:sz="4" w:color="D9D9D9"/>
+              <w:bottom w:val="single" w:sz="4" w:color="D9D9D9"/>
+              <w:right w:val="single" w:sz="4" w:color="D9D9D9"/>
+            </w:tcBorders>
+            <w:tcMar>
+              <w:top w:w="90" w:type="dxa"/>
+              <w:left w:w="90" w:type="dxa"/>
+              <w:bottom w:w="90" w:type="dxa"/>
+              <w:right w:w="90" w:type="dxa"/>
+            </w:tcMar>
+          </w:tcPr>
+          <w:p>
+            <w:pPr>
+              <w:spacing w:after="40" w:line="252" w:lineRule="auto"/>
+              <w:jc w:val="center"/>
+            </w:pPr>
+            <w:r>
+              <w:rPr>
+                <w:sz w:val="20"/>
+              </w:rPr>
+              <w:t>3</w:t>
+            </w:r>
+          </w:p>
+        </w:tc>
+        <w:tc>
+          <w:tcPr>
+            <w:tcW w:type="dxa" w:w="1872"/>
+            <w:vAlign w:val="center"/>
+            <w:shd w:fill="FFFFFF"/>
+            <w:tcBorders>
+              <w:top w:val="single" w:sz="4" w:color="D9D9D9"/>
+              <w:left w:val="single" w:sz="4" w:color="D9D9D9"/>
+              <w:bottom w:val="single" w:sz="4" w:color="D9D9D9"/>
+              <w:right w:val="single" w:sz="4" w:color="D9D9D9"/>
+            </w:tcBorders>
+            <w:tcMar>
+              <w:top w:w="90" w:type="dxa"/>
+              <w:left w:w="90" w:type="dxa"/>
+              <w:bottom w:w="90" w:type="dxa"/>
+              <w:right w:w="90" w:type="dxa"/>
+            </w:tcMar>
+          </w:tcPr>
+          <w:p>
+            <w:pPr>
+              <w:spacing w:after="40" w:line="252" w:lineRule="auto"/>
+            </w:pPr>
+            <w:r>
+              <w:rPr>
+                <w:sz w:val="20"/>
+              </w:rPr>
+              <w:t>0</w:t>
+            </w:r>
+          </w:p>
+        </w:tc>
+        <w:tc>
+          <w:tcPr>
+            <w:tcW w:type="dxa" w:w="2016"/>
+            <w:vAlign w:val="center"/>
+            <w:shd w:fill="FFFFFF"/>
+            <w:tcBorders>
+              <w:top w:val="single" w:sz="4" w:color="D9D9D9"/>
+              <w:left w:val="single" w:sz="4" w:color="D9D9D9"/>
+              <w:bottom w:val="single" w:sz="4" w:color="D9D9D9"/>
+              <w:right w:val="single" w:sz="4" w:color="D9D9D9"/>
+            </w:tcBorders>
+            <w:tcMar>
+              <w:top w:w="90" w:type="dxa"/>
+              <w:left w:w="90" w:type="dxa"/>
+              <w:bottom w:w="90" w:type="dxa"/>
+              <w:right w:w="90" w:type="dxa"/>
+            </w:tcMar>
+          </w:tcPr>
+          <w:p>
+            <w:pPr>
+              <w:spacing w:after="40" w:line="252" w:lineRule="auto"/>
+            </w:pPr>
+            <w:r>
+              <w:rPr>
+                <w:sz w:val="20"/>
+              </w:rPr>
+              <w:t>0</w:t>
+            </w:r>
+          </w:p>
+        </w:tc>
+        <w:tc>
+          <w:tcPr>
+            <w:tcW w:type="dxa" w:w="2016"/>
+            <w:vAlign w:val="center"/>
+            <w:shd w:fill="FFFFFF"/>
+            <w:tcBorders>
+              <w:top w:val="single" w:sz="4" w:color="D9D9D9"/>
+              <w:left w:val="single" w:sz="4" w:color="D9D9D9"/>
+              <w:bottom w:val="single" w:sz="4" w:color="D9D9D9"/>
+              <w:right w:val="single" w:sz="4" w:color="D9D9D9"/>
+            </w:tcBorders>
+            <w:tcMar>
+              <w:top w:w="90" w:type="dxa"/>
+              <w:left w:w="90" w:type="dxa"/>
+              <w:bottom w:w="90" w:type="dxa"/>
+              <w:right w:w="90" w:type="dxa"/>
+            </w:tcMar>
+          </w:tcPr>
+          <w:p>
+            <w:pPr>
+              <w:spacing w:after="40" w:line="252" w:lineRule="auto"/>
+            </w:pPr>
+            <w:r>
+              <w:rPr>
+                <w:sz w:val="20"/>
+              </w:rPr>
+              <w:t>2</w:t>
+            </w:r>
+          </w:p>
+        </w:tc>
+        <w:tc>
+          <w:tcPr>
+            <w:tcW w:type="dxa" w:w="2736"/>
+            <w:vAlign w:val="center"/>
+            <w:shd w:fill="FFFFFF"/>
+            <w:tcBorders>
+              <w:top w:val="single" w:sz="4" w:color="D9D9D9"/>
+              <w:left w:val="single" w:sz="4" w:color="D9D9D9"/>
+              <w:bottom w:val="single" w:sz="4" w:color="D9D9D9"/>
+              <w:right w:val="single" w:sz="4" w:color="D9D9D9"/>
+            </w:tcBorders>
+            <w:tcMar>
+              <w:top w:w="90" w:type="dxa"/>
+              <w:left w:w="90" w:type="dxa"/>
+              <w:bottom w:w="90" w:type="dxa"/>
+              <w:right w:w="90" w:type="dxa"/>
+            </w:tcMar>
+          </w:tcPr>
+          <w:p>
+            <w:pPr>
+              <w:spacing w:after="40" w:line="252" w:lineRule="auto"/>
+            </w:pPr>
+            <w:r>
+              <w:rPr>
+                <w:sz w:val="20"/>
+              </w:rPr>
+              <w:t>Nothing</w:t>
+            </w:r>
+          </w:p>
+        </w:tc>
+      </w:tr>
+      <w:tr>
+        <w:trPr>
+          <w:cantSplit/>
+        </w:trPr>
+        <w:tc>
+          <w:tcPr>
+            <w:tcW w:type="dxa" w:w="1440"/>
+            <w:vAlign w:val="center"/>
+            <w:shd w:fill="EDF5F7"/>
+            <w:tcBorders>
+              <w:top w:val="single" w:sz="4" w:color="D9D9D9"/>
+              <w:left w:val="single" w:sz="4" w:color="D9D9D9"/>
+              <w:bottom w:val="single" w:sz="4" w:color="D9D9D9"/>
+              <w:right w:val="single" w:sz="4" w:color="D9D9D9"/>
+            </w:tcBorders>
+            <w:tcMar>
+              <w:top w:w="90" w:type="dxa"/>
+              <w:left w:w="90" w:type="dxa"/>
+              <w:bottom w:w="90" w:type="dxa"/>
+              <w:right w:w="90" w:type="dxa"/>
+            </w:tcMar>
+          </w:tcPr>
+          <w:p>
+            <w:pPr>
+              <w:spacing w:after="40" w:line="252" w:lineRule="auto"/>
+              <w:jc w:val="center"/>
+            </w:pPr>
+            <w:r>
+              <w:rPr>
+                <w:sz w:val="20"/>
+              </w:rPr>
+              <w:t>4</w:t>
+            </w:r>
+          </w:p>
+        </w:tc>
+        <w:tc>
+          <w:tcPr>
+            <w:tcW w:type="dxa" w:w="1872"/>
+            <w:vAlign w:val="center"/>
+            <w:shd w:fill="EDF5F7"/>
+            <w:tcBorders>
+              <w:top w:val="single" w:sz="4" w:color="D9D9D9"/>
+              <w:left w:val="single" w:sz="4" w:color="D9D9D9"/>
+              <w:bottom w:val="single" w:sz="4" w:color="D9D9D9"/>
+              <w:right w:val="single" w:sz="4" w:color="D9D9D9"/>
+            </w:tcBorders>
+            <w:tcMar>
+              <w:top w:w="90" w:type="dxa"/>
+              <w:left w:w="90" w:type="dxa"/>
+              <w:bottom w:w="90" w:type="dxa"/>
+              <w:right w:w="90" w:type="dxa"/>
+            </w:tcMar>
+          </w:tcPr>
+          <w:p>
+            <w:pPr>
+              <w:spacing w:after="40" w:line="252" w:lineRule="auto"/>
+            </w:pPr>
+            <w:r>
+              <w:rPr>
+                <w:sz w:val="20"/>
+              </w:rPr>
+              <w:t>1</w:t>
+            </w:r>
+          </w:p>
+        </w:tc>
+        <w:tc>
+          <w:tcPr>
+            <w:tcW w:type="dxa" w:w="2016"/>
+            <w:vAlign w:val="center"/>
+            <w:shd w:fill="EDF5F7"/>
+            <w:tcBorders>
+              <w:top w:val="single" w:sz="4" w:color="D9D9D9"/>
+              <w:left w:val="single" w:sz="4" w:color="D9D9D9"/>
+              <w:bottom w:val="single" w:sz="4" w:color="D9D9D9"/>
+              <w:right w:val="single" w:sz="4" w:color="D9D9D9"/>
+            </w:tcBorders>
+            <w:tcMar>
+              <w:top w:w="90" w:type="dxa"/>
+              <w:left w:w="90" w:type="dxa"/>
+              <w:bottom w:w="90" w:type="dxa"/>
+              <w:right w:w="90" w:type="dxa"/>
+            </w:tcMar>
+          </w:tcPr>
+          <w:p>
+            <w:pPr>
+              <w:spacing w:after="40" w:line="252" w:lineRule="auto"/>
+            </w:pPr>
+            <w:r>
+              <w:rPr>
+                <w:sz w:val="20"/>
+              </w:rPr>
+              <w:t>1</w:t>
+            </w:r>
+          </w:p>
+        </w:tc>
+        <w:tc>
+          <w:tcPr>
+            <w:tcW w:type="dxa" w:w="2016"/>
+            <w:vAlign w:val="center"/>
+            <w:shd w:fill="EDF5F7"/>
+            <w:tcBorders>
+              <w:top w:val="single" w:sz="4" w:color="D9D9D9"/>
+              <w:left w:val="single" w:sz="4" w:color="D9D9D9"/>
+              <w:bottom w:val="single" w:sz="4" w:color="D9D9D9"/>
+              <w:right w:val="single" w:sz="4" w:color="D9D9D9"/>
+            </w:tcBorders>
+            <w:tcMar>
+              <w:top w:w="90" w:type="dxa"/>
+              <w:left w:w="90" w:type="dxa"/>
+              <w:bottom w:w="90" w:type="dxa"/>
+              <w:right w:w="90" w:type="dxa"/>
+            </w:tcMar>
+          </w:tcPr>
+          <w:p>
+            <w:pPr>
+              <w:spacing w:after="40" w:line="252" w:lineRule="auto"/>
+            </w:pPr>
+            <w:r>
+              <w:rPr>
+                <w:sz w:val="20"/>
+              </w:rPr>
+              <w:t>2</w:t>
+            </w:r>
+          </w:p>
+        </w:tc>
+        <w:tc>
+          <w:tcPr>
+            <w:tcW w:type="dxa" w:w="2736"/>
+            <w:vAlign w:val="center"/>
+            <w:shd w:fill="EDF5F7"/>
+            <w:tcBorders>
+              <w:top w:val="single" w:sz="4" w:color="D9D9D9"/>
+              <w:left w:val="single" w:sz="4" w:color="D9D9D9"/>
+              <w:bottom w:val="single" w:sz="4" w:color="D9D9D9"/>
+              <w:right w:val="single" w:sz="4" w:color="D9D9D9"/>
+            </w:tcBorders>
+            <w:tcMar>
+              <w:top w:w="90" w:type="dxa"/>
+              <w:left w:w="90" w:type="dxa"/>
+              <w:bottom w:w="90" w:type="dxa"/>
+              <w:right w:w="90" w:type="dxa"/>
+            </w:tcMar>
+          </w:tcPr>
+          <w:p>
+            <w:pPr>
+              <w:spacing w:after="40" w:line="252" w:lineRule="auto"/>
+            </w:pPr>
+            <w:r>
+              <w:rPr>
+                <w:sz w:val="20"/>
+              </w:rPr>
+              <w:t>10</w:t>
+            </w:r>
+          </w:p>
+        </w:tc>
+      </w:tr>
+      <w:tr>
+        <w:trPr>
+          <w:cantSplit/>
+        </w:trPr>
+        <w:tc>
+          <w:tcPr>
+            <w:tcW w:type="dxa" w:w="1440"/>
+            <w:vAlign w:val="center"/>
+            <w:shd w:fill="FFFFFF"/>
+            <w:tcBorders>
+              <w:top w:val="single" w:sz="4" w:color="D9D9D9"/>
+              <w:left w:val="single" w:sz="4" w:color="D9D9D9"/>
+              <w:bottom w:val="single" w:sz="4" w:color="D9D9D9"/>
+              <w:right w:val="single" w:sz="4" w:color="D9D9D9"/>
+            </w:tcBorders>
+            <w:tcMar>
+              <w:top w:w="90" w:type="dxa"/>
+              <w:left w:w="90" w:type="dxa"/>
+              <w:bottom w:w="90" w:type="dxa"/>
+              <w:right w:w="90" w:type="dxa"/>
+            </w:tcMar>
+          </w:tcPr>
+          <w:p>
+            <w:pPr>
+              <w:spacing w:after="40" w:line="252" w:lineRule="auto"/>
+              <w:jc w:val="center"/>
+            </w:pPr>
+            <w:r>
+              <w:rPr>
+                <w:sz w:val="20"/>
+              </w:rPr>
+              <w:t>5</w:t>
+            </w:r>
+          </w:p>
+        </w:tc>
+        <w:tc>
+          <w:tcPr>
+            <w:tcW w:type="dxa" w:w="1872"/>
+            <w:vAlign w:val="center"/>
+            <w:shd w:fill="FFFFFF"/>
+            <w:tcBorders>
+              <w:top w:val="single" w:sz="4" w:color="D9D9D9"/>
+              <w:left w:val="single" w:sz="4" w:color="D9D9D9"/>
+              <w:bottom w:val="single" w:sz="4" w:color="D9D9D9"/>
+              <w:right w:val="single" w:sz="4" w:color="D9D9D9"/>
+            </w:tcBorders>
+            <w:tcMar>
+              <w:top w:w="90" w:type="dxa"/>
+              <w:left w:w="90" w:type="dxa"/>
+              <w:bottom w:w="90" w:type="dxa"/>
+              <w:right w:w="90" w:type="dxa"/>
+            </w:tcMar>
+          </w:tcPr>
+          <w:p>
+            <w:pPr>
+              <w:spacing w:after="40" w:line="252" w:lineRule="auto"/>
+            </w:pPr>
+            <w:r>
+              <w:rPr>
+                <w:sz w:val="20"/>
+              </w:rPr>
+              <w:t>1</w:t>
+            </w:r>
+          </w:p>
+        </w:tc>
+        <w:tc>
+          <w:tcPr>
+            <w:tcW w:type="dxa" w:w="2016"/>
+            <w:vAlign w:val="center"/>
+            <w:shd w:fill="FFFFFF"/>
+            <w:tcBorders>
+              <w:top w:val="single" w:sz="4" w:color="D9D9D9"/>
+              <w:left w:val="single" w:sz="4" w:color="D9D9D9"/>
+              <w:bottom w:val="single" w:sz="4" w:color="D9D9D9"/>
+              <w:right w:val="single" w:sz="4" w:color="D9D9D9"/>
+            </w:tcBorders>
+            <w:tcMar>
+              <w:top w:w="90" w:type="dxa"/>
+              <w:left w:w="90" w:type="dxa"/>
+              <w:bottom w:w="90" w:type="dxa"/>
+              <w:right w:w="90" w:type="dxa"/>
+            </w:tcMar>
+          </w:tcPr>
+          <w:p>
+            <w:pPr>
+              <w:spacing w:after="40" w:line="252" w:lineRule="auto"/>
+            </w:pPr>
+            <w:r>
+              <w:rPr>
+                <w:sz w:val="20"/>
+              </w:rPr>
+              <w:t>2</w:t>
+            </w:r>
+          </w:p>
+        </w:tc>
+        <w:tc>
+          <w:tcPr>
+            <w:tcW w:type="dxa" w:w="2016"/>
+            <w:vAlign w:val="center"/>
+            <w:shd w:fill="FFFFFF"/>
+            <w:tcBorders>
+              <w:top w:val="single" w:sz="4" w:color="D9D9D9"/>
+              <w:left w:val="single" w:sz="4" w:color="D9D9D9"/>
+              <w:bottom w:val="single" w:sz="4" w:color="D9D9D9"/>
+              <w:right w:val="single" w:sz="4" w:color="D9D9D9"/>
+            </w:tcBorders>
+            <w:tcMar>
+              <w:top w:w="90" w:type="dxa"/>
+              <w:left w:w="90" w:type="dxa"/>
+              <w:bottom w:w="90" w:type="dxa"/>
+              <w:right w:w="90" w:type="dxa"/>
+            </w:tcMar>
+          </w:tcPr>
+          <w:p>
+            <w:pPr>
+              <w:spacing w:after="40" w:line="252" w:lineRule="auto"/>
+            </w:pPr>
+            <w:r>
+              <w:rPr>
+                <w:sz w:val="20"/>
+              </w:rPr>
+              <w:t>3</w:t>
+            </w:r>
+          </w:p>
+        </w:tc>
+        <w:tc>
+          <w:tcPr>
+            <w:tcW w:type="dxa" w:w="2736"/>
+            <w:vAlign w:val="center"/>
+            <w:shd w:fill="FFFFFF"/>
+            <w:tcBorders>
+              <w:top w:val="single" w:sz="4" w:color="D9D9D9"/>
+              <w:left w:val="single" w:sz="4" w:color="D9D9D9"/>
+              <w:bottom w:val="single" w:sz="4" w:color="D9D9D9"/>
+              <w:right w:val="single" w:sz="4" w:color="D9D9D9"/>
+            </w:tcBorders>
+            <w:tcMar>
+              <w:top w:w="90" w:type="dxa"/>
+              <w:left w:w="90" w:type="dxa"/>
+              <w:bottom w:w="90" w:type="dxa"/>
+              <w:right w:w="90" w:type="dxa"/>
+            </w:tcMar>
+          </w:tcPr>
+          <w:p>
+            <w:pPr>
+              <w:spacing w:after="40" w:line="252" w:lineRule="auto"/>
+            </w:pPr>
+            <w:r>
+              <w:rPr>
+                <w:sz w:val="20"/>
+              </w:rPr>
+              <w:t>11</w:t>
+            </w:r>
+          </w:p>
+        </w:tc>
+      </w:tr>
+      <w:tr>
+        <w:trPr>
+          <w:cantSplit/>
+        </w:trPr>
+        <w:tc>
+          <w:tcPr>
+            <w:tcW w:type="dxa" w:w="1440"/>
+            <w:vAlign w:val="center"/>
+            <w:shd w:fill="EDF5F7"/>
+            <w:tcBorders>
+              <w:top w:val="single" w:sz="4" w:color="D9D9D9"/>
+              <w:left w:val="single" w:sz="4" w:color="D9D9D9"/>
+              <w:bottom w:val="single" w:sz="4" w:color="D9D9D9"/>
+              <w:right w:val="single" w:sz="4" w:color="D9D9D9"/>
+            </w:tcBorders>
+            <w:tcMar>
+              <w:top w:w="90" w:type="dxa"/>
+              <w:left w:w="90" w:type="dxa"/>
+              <w:bottom w:w="90" w:type="dxa"/>
+              <w:right w:w="90" w:type="dxa"/>
+            </w:tcMar>
+          </w:tcPr>
+          <w:p>
+            <w:pPr>
+              <w:spacing w:after="40" w:line="252" w:lineRule="auto"/>
+              <w:jc w:val="center"/>
+            </w:pPr>
+            <w:r>
+              <w:rPr>
+                <w:sz w:val="20"/>
+              </w:rPr>
+              <w:t>6</w:t>
+            </w:r>
+          </w:p>
+        </w:tc>
+        <w:tc>
+          <w:tcPr>
+            <w:tcW w:type="dxa" w:w="1872"/>
+            <w:vAlign w:val="center"/>
+            <w:shd w:fill="EDF5F7"/>
+            <w:tcBorders>
+              <w:top w:val="single" w:sz="4" w:color="D9D9D9"/>
+              <w:left w:val="single" w:sz="4" w:color="D9D9D9"/>
+              <w:bottom w:val="single" w:sz="4" w:color="D9D9D9"/>
+              <w:right w:val="single" w:sz="4" w:color="D9D9D9"/>
+            </w:tcBorders>
+            <w:tcMar>
+              <w:top w:w="90" w:type="dxa"/>
+              <w:left w:w="90" w:type="dxa"/>
+              <w:bottom w:w="90" w:type="dxa"/>
+              <w:right w:w="90" w:type="dxa"/>
+            </w:tcMar>
+          </w:tcPr>
+          <w:p>
+            <w:pPr>
+              <w:spacing w:after="40" w:line="252" w:lineRule="auto"/>
+            </w:pPr>
+            <w:r>
+              <w:rPr>
+                <w:sz w:val="20"/>
+              </w:rPr>
+              <w:t>1</w:t>
+            </w:r>
+          </w:p>
+        </w:tc>
+        <w:tc>
+          <w:tcPr>
+            <w:tcW w:type="dxa" w:w="2016"/>
+            <w:vAlign w:val="center"/>
+            <w:shd w:fill="EDF5F7"/>
+            <w:tcBorders>
+              <w:top w:val="single" w:sz="4" w:color="D9D9D9"/>
+              <w:left w:val="single" w:sz="4" w:color="D9D9D9"/>
+              <w:bottom w:val="single" w:sz="4" w:color="D9D9D9"/>
+              <w:right w:val="single" w:sz="4" w:color="D9D9D9"/>
+            </w:tcBorders>
+            <w:tcMar>
+              <w:top w:w="90" w:type="dxa"/>
+              <w:left w:w="90" w:type="dxa"/>
+              <w:bottom w:w="90" w:type="dxa"/>
+              <w:right w:w="90" w:type="dxa"/>
+            </w:tcMar>
+          </w:tcPr>
+          <w:p>
+            <w:pPr>
+              <w:spacing w:after="40" w:line="252" w:lineRule="auto"/>
+            </w:pPr>
+            <w:r>
+              <w:rPr>
+                <w:sz w:val="20"/>
+              </w:rPr>
+              <w:t>3</w:t>
+            </w:r>
+          </w:p>
+        </w:tc>
+        <w:tc>
+          <w:tcPr>
+            <w:tcW w:type="dxa" w:w="2016"/>
+            <w:vAlign w:val="center"/>
+            <w:shd w:fill="EDF5F7"/>
+            <w:tcBorders>
+              <w:top w:val="single" w:sz="4" w:color="D9D9D9"/>
+              <w:left w:val="single" w:sz="4" w:color="D9D9D9"/>
+              <w:bottom w:val="single" w:sz="4" w:color="D9D9D9"/>
+              <w:right w:val="single" w:sz="4" w:color="D9D9D9"/>
+            </w:tcBorders>
+            <w:tcMar>
+              <w:top w:w="90" w:type="dxa"/>
+              <w:left w:w="90" w:type="dxa"/>
+              <w:bottom w:w="90" w:type="dxa"/>
+              <w:right w:w="90" w:type="dxa"/>
+            </w:tcMar>
+          </w:tcPr>
+          <w:p>
+            <w:pPr>
+              <w:spacing w:after="40" w:line="252" w:lineRule="auto"/>
+            </w:pPr>
+            <w:r>
+              <w:rPr>
+                <w:sz w:val="20"/>
+              </w:rPr>
+              <w:t>3</w:t>
+            </w:r>
+          </w:p>
+        </w:tc>
+        <w:tc>
+          <w:tcPr>
+            <w:tcW w:type="dxa" w:w="2736"/>
+            <w:vAlign w:val="center"/>
+            <w:shd w:fill="EDF5F7"/>
+            <w:tcBorders>
+              <w:top w:val="single" w:sz="4" w:color="D9D9D9"/>
+              <w:left w:val="single" w:sz="4" w:color="D9D9D9"/>
+              <w:bottom w:val="single" w:sz="4" w:color="D9D9D9"/>
+              <w:right w:val="single" w:sz="4" w:color="D9D9D9"/>
+            </w:tcBorders>
+            <w:tcMar>
+              <w:top w:w="90" w:type="dxa"/>
+              <w:left w:w="90" w:type="dxa"/>
+              <w:bottom w:w="90" w:type="dxa"/>
+              <w:right w:w="90" w:type="dxa"/>
+            </w:tcMar>
+          </w:tcPr>
+          <w:p>
+            <w:pPr>
+              <w:spacing w:after="40" w:line="252" w:lineRule="auto"/>
+            </w:pPr>
+            <w:r>
+              <w:rPr>
+                <w:sz w:val="20"/>
+              </w:rPr>
+              <w:t>12</w:t>
+            </w:r>
+          </w:p>
+        </w:tc>
+      </w:tr>
+      <w:tr>
+        <w:trPr>
+          <w:cantSplit/>
+        </w:trPr>
+        <w:tc>
+          <w:tcPr>
+            <w:tcW w:type="dxa" w:w="1440"/>
+            <w:vAlign w:val="center"/>
+            <w:shd w:fill="FFFFFF"/>
+            <w:tcBorders>
+              <w:top w:val="single" w:sz="4" w:color="D9D9D9"/>
+              <w:left w:val="single" w:sz="4" w:color="D9D9D9"/>
+              <w:bottom w:val="single" w:sz="4" w:color="D9D9D9"/>
+              <w:right w:val="single" w:sz="4" w:color="D9D9D9"/>
+            </w:tcBorders>
+            <w:tcMar>
+              <w:top w:w="90" w:type="dxa"/>
+              <w:left w:w="90" w:type="dxa"/>
+              <w:bottom w:w="90" w:type="dxa"/>
+              <w:right w:w="90" w:type="dxa"/>
+            </w:tcMar>
+          </w:tcPr>
+          <w:p>
+            <w:pPr>
+              <w:spacing w:after="40" w:line="252" w:lineRule="auto"/>
+              <w:jc w:val="center"/>
+            </w:pPr>
+            <w:r>
+              <w:rPr>
+                <w:sz w:val="20"/>
+              </w:rPr>
+              <w:t>7</w:t>
+            </w:r>
+          </w:p>
+        </w:tc>
+        <w:tc>
+          <w:tcPr>
+            <w:tcW w:type="dxa" w:w="1872"/>
+            <w:vAlign w:val="center"/>
+            <w:shd w:fill="FFFFFF"/>
+            <w:tcBorders>
+              <w:top w:val="single" w:sz="4" w:color="D9D9D9"/>
+              <w:left w:val="single" w:sz="4" w:color="D9D9D9"/>
+              <w:bottom w:val="single" w:sz="4" w:color="D9D9D9"/>
+              <w:right w:val="single" w:sz="4" w:color="D9D9D9"/>
+            </w:tcBorders>
+            <w:tcMar>
+              <w:top w:w="90" w:type="dxa"/>
+              <w:left w:w="90" w:type="dxa"/>
+              <w:bottom w:w="90" w:type="dxa"/>
+              <w:right w:w="90" w:type="dxa"/>
+            </w:tcMar>
+          </w:tcPr>
+          <w:p>
+            <w:pPr>
+              <w:spacing w:after="40" w:line="252" w:lineRule="auto"/>
+            </w:pPr>
+            <w:r>
+              <w:rPr>
+                <w:sz w:val="20"/>
+              </w:rPr>
+              <w:t>1</w:t>
+            </w:r>
+          </w:p>
+        </w:tc>
+        <w:tc>
+          <w:tcPr>
+            <w:tcW w:type="dxa" w:w="2016"/>
+            <w:vAlign w:val="center"/>
+            <w:shd w:fill="FFFFFF"/>
+            <w:tcBorders>
+              <w:top w:val="single" w:sz="4" w:color="D9D9D9"/>
+              <w:left w:val="single" w:sz="4" w:color="D9D9D9"/>
+              <w:bottom w:val="single" w:sz="4" w:color="D9D9D9"/>
+              <w:right w:val="single" w:sz="4" w:color="D9D9D9"/>
+            </w:tcBorders>
+            <w:tcMar>
+              <w:top w:w="90" w:type="dxa"/>
+              <w:left w:w="90" w:type="dxa"/>
+              <w:bottom w:w="90" w:type="dxa"/>
+              <w:right w:w="90" w:type="dxa"/>
+            </w:tcMar>
+          </w:tcPr>
+          <w:p>
+            <w:pPr>
+              <w:spacing w:after="40" w:line="252" w:lineRule="auto"/>
+            </w:pPr>
+            <w:r>
+              <w:rPr>
+                <w:sz w:val="20"/>
+              </w:rPr>
+              <w:t>3</w:t>
+            </w:r>
+          </w:p>
+        </w:tc>
+        <w:tc>
+          <w:tcPr>
+            <w:tcW w:type="dxa" w:w="2016"/>
+            <w:vAlign w:val="center"/>
+            <w:shd w:fill="FFFFFF"/>
+            <w:tcBorders>
+              <w:top w:val="single" w:sz="4" w:color="D9D9D9"/>
+              <w:left w:val="single" w:sz="4" w:color="D9D9D9"/>
+              <w:bottom w:val="single" w:sz="4" w:color="D9D9D9"/>
+              <w:right w:val="single" w:sz="4" w:color="D9D9D9"/>
+            </w:tcBorders>
+            <w:tcMar>
+              <w:top w:w="90" w:type="dxa"/>
+              <w:left w:w="90" w:type="dxa"/>
+              <w:bottom w:w="90" w:type="dxa"/>
+              <w:right w:w="90" w:type="dxa"/>
+            </w:tcMar>
+          </w:tcPr>
+          <w:p>
+            <w:pPr>
+              <w:spacing w:after="40" w:line="252" w:lineRule="auto"/>
+            </w:pPr>
+            <w:r>
+              <w:rPr>
+                <w:sz w:val="20"/>
+              </w:rPr>
+              <w:t>3</w:t>
+            </w:r>
+          </w:p>
+        </w:tc>
+        <w:tc>
+          <w:tcPr>
+            <w:tcW w:type="dxa" w:w="2736"/>
+            <w:vAlign w:val="center"/>
+            <w:shd w:fill="FFFFFF"/>
+            <w:tcBorders>
+              <w:top w:val="single" w:sz="4" w:color="D9D9D9"/>
+              <w:left w:val="single" w:sz="4" w:color="D9D9D9"/>
+              <w:bottom w:val="single" w:sz="4" w:color="D9D9D9"/>
+              <w:right w:val="single" w:sz="4" w:color="D9D9D9"/>
+            </w:tcBorders>
+            <w:tcMar>
+              <w:top w:w="90" w:type="dxa"/>
+              <w:left w:w="90" w:type="dxa"/>
+              <w:bottom w:w="90" w:type="dxa"/>
+              <w:right w:w="90" w:type="dxa"/>
+            </w:tcMar>
+          </w:tcPr>
+          <w:p>
+            <w:pPr>
+              <w:spacing w:after="40" w:line="252" w:lineRule="auto"/>
+            </w:pPr>
+            <w:r>
+              <w:rPr>
+                <w:sz w:val="20"/>
+              </w:rPr>
+              <w:t>Nothing</w:t>
+            </w:r>
+          </w:p>
+        </w:tc>
+      </w:tr>
+    </w:tbl>
+    <w:p>
+      <w:pPr>
+        <w:spacing w:after="80" w:line="20" w:lineRule="exact"/>
+      </w:pPr>
+    </w:p>
+    <w:p>
+      <w:r>
+        <w:t>Accepted counts are totals since reset. Predict where card 12 waits at edge 3. Why does the full skid buffer still refuse a new card at edge 4, even though the receiver takes card 10?</w:t>
+      </w:r>
+    </w:p>
+    <w:p>
+      <w:hyperlink r:id="rId31">
+        <w:r>
+          <w:rPr>
+            <w:color w:val="075963"/>
+          </w:rPr>
+          <w:t>Browser experiment: Backpressure without a buffer</w:t>
+        </w:r>
+      </w:hyperlink>
+    </w:p>
+    <w:p>
+      <w:hyperlink r:id="rId32">
+        <w:r>
+          <w:rPr>
+            <w:color w:val="075963"/>
+          </w:rPr>
+          <w:t>Browser experiment: Backpressure with a skid buffer</w:t>
+        </w:r>
+      </w:hyperlink>
+    </w:p>
+    <w:p>
+      <w:r>
+        <w:rPr>
+          <w:b/>
+        </w:rPr>
+        <w:t xml:space="preserve">Waveform detective </w:t>
+      </w:r>
+      <w:r>
+        <w:t>Watch clk, sink_ready, input ready/data, output valid/data and the sent/received counters. LAST marks card 12. A high accepted or delivered wire counts only at a rising edge. Invalid data is not a card being offered.</w:t>
+      </w:r>
+    </w:p>
+    <w:p>
+      <w:r>
+        <w:rPr>
+          <w:b/>
+          <w:sz w:val="20"/>
+        </w:rPr>
+        <w:t xml:space="preserve">Guide note </w:t>
+      </w:r>
+      <w:r>
+        <w:rPr>
+          <w:sz w:val="20"/>
+        </w:rPr>
+        <w:t>At edge 3, the skid sender holds 12; the direct sender holds 10. Skid Ready comes from stored occupancy, so room becomes visible after edge 4. A buffer absorbs short waits; it cannot speed up the receiver. Counters belong to the teacher bench. Source and BP requirements: SKID_BUFFER_AND_VERILOG_COMMENTS.md.</w:t>
       </w:r>
     </w:p>
     <w:sectPr>

</xml_diff>

<commit_message>
Complete five design and teaching review rounds with validated fixes
</commit_message>
<xml_diff>
--- a/docs/SharpHDL_Classroom_Proposal.docx
+++ b/docs/SharpHDL_Classroom_Proposal.docx
@@ -3753,7 +3753,7 @@
     </w:p>
     <w:p>
       <w:r>
-        <w:t>Four bits can represent 0 through 15. The number 16 needs five bits: 10000. Our four-bit answer keeps only the four places on the right.</w:t>
+        <w:t>Before this lesson, restore the constant to 2. Your guide rebuilds with boards/GoBoard/lesson.sh 2 and programs that image. Check B = 3 gives A = 5. Four bits can represent 0 through 15. The number 16 needs five bits: 10000. Our four-bit answer keeps only the four places on the right.</w:t>
       </w:r>
     </w:p>
     <w:p>
@@ -7149,7 +7149,7 @@
         <w:rPr>
           <w:sz w:val="20"/>
         </w:rPr>
-        <w:t>The existing starter provides an adder and run/pause counter. A capstone needs edits or a teacher-provided template. Decimal scores, a pattern game and a precision reaction timer are extensions, not features already implemented in the supplied starter.</w:t>
+        <w:t>The existing starter provides an adder and run/pause counter. Use the tested ShotCounter.cs template and Guided capstone page near the end. It runs in simulation; board-shell integration is a separate teacher task. Decimal scores, a pattern game and a precision reaction timer are extensions, not features already implemented in the supplied starter.</w:t>
       </w:r>
     </w:p>
     <w:p>
@@ -10750,7 +10750,7 @@
     </w:p>
     <w:p>
       <w:r>
-        <w:t>Validate startup, button polarity, single increments on holds, both displays, Run/Pause and a changed-constant rebuild on one real board. Confirm its USB programming interface and revision. For twelve children, six stations budget about $540 before tax/shipping: six $70 boards plus estimated $20 accessories per station. Computers are excluded.</w:t>
+        <w:t>Complete boards/GoBoard/CLASSROOM_PILOT.md on one real station, then a second. Validate startup, buttons, displays, programming and recovery. Confirm its USB programming interface and revision. For twelve children, six stations budget about $540 before tax/shipping: six $70 boards plus estimated $20 accessories per station. Computers are excluded.</w:t>
       </w:r>
     </w:p>
     <w:p>
@@ -20914,7 +20914,7 @@
         <w:rPr>
           <w:sz w:val="20"/>
         </w:rPr>
-        <w:t>Counter answers: 3, 3, 4. Next event may visit a falling edge or an input change; it is not Next clock. First/Next/Last event replay a completed trace. The time labels arrange the test; they are not measurements of FPGA speed.</w:t>
+        <w:t>Counter answers: 3, 3, 4. Use Next rising edge to visit clock edges; the first is reset. Time is displayed in ns. Next event also visits falling edges and input changes. All cursor controls replay a completed trace. The time labels arrange the test; they are not measurements of FPGA speed.</w:t>
       </w:r>
     </w:p>
     <w:p>
@@ -22855,6 +22855,2292 @@
           <w:sz w:val="20"/>
         </w:rPr>
         <w:t>At edge 3, the skid sender holds 12; the direct sender holds 10. Skid Ready comes from stored occupancy, so room becomes visible after edge 4. A buffer absorbs short waits; it cannot speed up the receiver. Counters belong to the teacher bench. Source and BP requirements: SKID_BUFFER_AND_VERILOG_COMMENTS.md.</w:t>
+      </w:r>
+    </w:p>
+    <w:p>
+      <w:r>
+        <w:br w:type="page"/>
+      </w:r>
+    </w:p>
+    <w:p>
+      <w:pPr>
+        <w:pStyle w:val="Heading1"/>
+      </w:pPr>
+      <w:r>
+        <w:t>Practice  Offer a card and give permission</w:t>
+      </w:r>
+    </w:p>
+    <w:p>
+      <w:r>
+        <w:t>Choose a sender, a receiver and a clock caller. The sender holds a number card and a Valid card. The receiver holds a Ready card facing backward toward the sender. The caller claps for a rising clock edge.</w:t>
+      </w:r>
+    </w:p>
+    <w:p>
+      <w:pPr>
+        <w:keepNext/>
+        <w:spacing w:after="40"/>
+        <w:jc w:val="center"/>
+      </w:pPr>
+      <w:r>
+        <w:drawing>
+          <wp:inline xmlns:a="http://schemas.openxmlformats.org/drawingml/2006/main" xmlns:pic="http://schemas.openxmlformats.org/drawingml/2006/picture">
+            <wp:extent cx="3840480" cy="1420978"/>
+            <wp:docPr id="19" name="Picture 19" descr="Data and Valid move forward; Ready moves backward. Empty means no valid card, even if old data bits remain." title="skid"/>
+            <wp:cNvGraphicFramePr>
+              <a:graphicFrameLocks noChangeAspect="1"/>
+            </wp:cNvGraphicFramePr>
+            <a:graphic>
+              <a:graphicData uri="http://schemas.openxmlformats.org/drawingml/2006/picture">
+                <pic:pic>
+                  <pic:nvPicPr>
+                    <pic:cNvPr id="0" name="skid.png"/>
+                    <pic:cNvPicPr/>
+                  </pic:nvPicPr>
+                  <pic:blipFill>
+                    <a:blip r:embed="rId22"/>
+                    <a:stretch>
+                      <a:fillRect/>
+                    </a:stretch>
+                  </pic:blipFill>
+                  <pic:spPr>
+                    <a:xfrm>
+                      <a:off x="0" y="0"/>
+                      <a:ext cx="3840480" cy="1420978"/>
+                    </a:xfrm>
+                    <a:prstGeom prst="rect"/>
+                  </pic:spPr>
+                </pic:pic>
+              </a:graphicData>
+            </a:graphic>
+          </wp:inline>
+        </w:drawing>
+      </w:r>
+    </w:p>
+    <w:p>
+      <w:pPr>
+        <w:spacing w:after="160"/>
+        <w:jc w:val="center"/>
+      </w:pPr>
+      <w:r>
+        <w:rPr>
+          <w:i/>
+          <w:sz w:val="20"/>
+        </w:rPr>
+        <w:t>Data and Valid move forward; Ready moves backward. Empty means no valid card, even if old data bits remain.</w:t>
+      </w:r>
+    </w:p>
+    <w:tbl>
+      <w:tblPr>
+        <w:tblW w:type="auto" w:w="0"/>
+        <w:tblLayout w:type="fixed"/>
+        <w:tblLook w:firstColumn="1" w:firstRow="1" w:lastColumn="0" w:lastRow="0" w:noHBand="0" w:noVBand="1" w:val="04A0"/>
+      </w:tblPr>
+      <w:tblGrid>
+        <w:gridCol w:w="1440"/>
+        <w:gridCol w:w="1440"/>
+        <w:gridCol w:w="7200"/>
+      </w:tblGrid>
+      <w:tr>
+        <w:trPr>
+          <w:cantSplit/>
+          <w:tblHeader/>
+        </w:trPr>
+        <w:tc>
+          <w:tcPr>
+            <w:tcW w:type="dxa" w:w="1440"/>
+            <w:vAlign w:val="center"/>
+            <w:shd w:fill="17365D"/>
+            <w:tcBorders>
+              <w:top w:val="single" w:sz="4" w:color="D9D9D9"/>
+              <w:left w:val="single" w:sz="4" w:color="D9D9D9"/>
+              <w:bottom w:val="single" w:sz="4" w:color="D9D9D9"/>
+              <w:right w:val="single" w:sz="4" w:color="D9D9D9"/>
+            </w:tcBorders>
+            <w:tcMar>
+              <w:top w:w="90" w:type="dxa"/>
+              <w:left w:w="90" w:type="dxa"/>
+              <w:bottom w:w="90" w:type="dxa"/>
+              <w:right w:w="90" w:type="dxa"/>
+            </w:tcMar>
+          </w:tcPr>
+          <w:p>
+            <w:pPr>
+              <w:spacing w:after="40" w:line="252" w:lineRule="auto"/>
+              <w:jc w:val="center"/>
+            </w:pPr>
+            <w:r>
+              <w:rPr>
+                <w:b/>
+                <w:color w:val="FFFFFF"/>
+                <w:sz w:val="22"/>
+              </w:rPr>
+              <w:t>Valid</w:t>
+            </w:r>
+          </w:p>
+        </w:tc>
+        <w:tc>
+          <w:tcPr>
+            <w:tcW w:type="dxa" w:w="1440"/>
+            <w:vAlign w:val="center"/>
+            <w:shd w:fill="17365D"/>
+            <w:tcBorders>
+              <w:top w:val="single" w:sz="4" w:color="D9D9D9"/>
+              <w:left w:val="single" w:sz="4" w:color="D9D9D9"/>
+              <w:bottom w:val="single" w:sz="4" w:color="D9D9D9"/>
+              <w:right w:val="single" w:sz="4" w:color="D9D9D9"/>
+            </w:tcBorders>
+            <w:tcMar>
+              <w:top w:w="90" w:type="dxa"/>
+              <w:left w:w="90" w:type="dxa"/>
+              <w:bottom w:w="90" w:type="dxa"/>
+              <w:right w:w="90" w:type="dxa"/>
+            </w:tcMar>
+          </w:tcPr>
+          <w:p>
+            <w:pPr>
+              <w:spacing w:after="40" w:line="252" w:lineRule="auto"/>
+            </w:pPr>
+            <w:r>
+              <w:rPr>
+                <w:b/>
+                <w:color w:val="FFFFFF"/>
+                <w:sz w:val="22"/>
+              </w:rPr>
+              <w:t>Ready</w:t>
+            </w:r>
+          </w:p>
+        </w:tc>
+        <w:tc>
+          <w:tcPr>
+            <w:tcW w:type="dxa" w:w="7200"/>
+            <w:vAlign w:val="center"/>
+            <w:shd w:fill="17365D"/>
+            <w:tcBorders>
+              <w:top w:val="single" w:sz="4" w:color="D9D9D9"/>
+              <w:left w:val="single" w:sz="4" w:color="D9D9D9"/>
+              <w:bottom w:val="single" w:sz="4" w:color="D9D9D9"/>
+              <w:right w:val="single" w:sz="4" w:color="D9D9D9"/>
+            </w:tcBorders>
+            <w:tcMar>
+              <w:top w:w="90" w:type="dxa"/>
+              <w:left w:w="90" w:type="dxa"/>
+              <w:bottom w:w="90" w:type="dxa"/>
+              <w:right w:w="90" w:type="dxa"/>
+            </w:tcMar>
+          </w:tcPr>
+          <w:p>
+            <w:pPr>
+              <w:spacing w:after="40" w:line="252" w:lineRule="auto"/>
+            </w:pPr>
+            <w:r>
+              <w:rPr>
+                <w:b/>
+                <w:color w:val="FFFFFF"/>
+                <w:sz w:val="22"/>
+              </w:rPr>
+              <w:t>At the clap</w:t>
+            </w:r>
+          </w:p>
+        </w:tc>
+      </w:tr>
+      <w:tr>
+        <w:trPr>
+          <w:cantSplit/>
+        </w:trPr>
+        <w:tc>
+          <w:tcPr>
+            <w:tcW w:type="dxa" w:w="1440"/>
+            <w:vAlign w:val="center"/>
+            <w:shd w:fill="FFFFFF"/>
+            <w:tcBorders>
+              <w:top w:val="single" w:sz="4" w:color="D9D9D9"/>
+              <w:left w:val="single" w:sz="4" w:color="D9D9D9"/>
+              <w:bottom w:val="single" w:sz="4" w:color="D9D9D9"/>
+              <w:right w:val="single" w:sz="4" w:color="D9D9D9"/>
+            </w:tcBorders>
+            <w:tcMar>
+              <w:top w:w="90" w:type="dxa"/>
+              <w:left w:w="90" w:type="dxa"/>
+              <w:bottom w:w="90" w:type="dxa"/>
+              <w:right w:w="90" w:type="dxa"/>
+            </w:tcMar>
+          </w:tcPr>
+          <w:p>
+            <w:pPr>
+              <w:spacing w:after="40" w:line="252" w:lineRule="auto"/>
+              <w:jc w:val="center"/>
+            </w:pPr>
+            <w:r>
+              <w:rPr>
+                <w:sz w:val="22"/>
+              </w:rPr>
+              <w:t>0</w:t>
+            </w:r>
+          </w:p>
+        </w:tc>
+        <w:tc>
+          <w:tcPr>
+            <w:tcW w:type="dxa" w:w="1440"/>
+            <w:vAlign w:val="center"/>
+            <w:shd w:fill="FFFFFF"/>
+            <w:tcBorders>
+              <w:top w:val="single" w:sz="4" w:color="D9D9D9"/>
+              <w:left w:val="single" w:sz="4" w:color="D9D9D9"/>
+              <w:bottom w:val="single" w:sz="4" w:color="D9D9D9"/>
+              <w:right w:val="single" w:sz="4" w:color="D9D9D9"/>
+            </w:tcBorders>
+            <w:tcMar>
+              <w:top w:w="90" w:type="dxa"/>
+              <w:left w:w="90" w:type="dxa"/>
+              <w:bottom w:w="90" w:type="dxa"/>
+              <w:right w:w="90" w:type="dxa"/>
+            </w:tcMar>
+          </w:tcPr>
+          <w:p>
+            <w:pPr>
+              <w:spacing w:after="40" w:line="252" w:lineRule="auto"/>
+            </w:pPr>
+            <w:r>
+              <w:rPr>
+                <w:sz w:val="22"/>
+              </w:rPr>
+              <w:t>0</w:t>
+            </w:r>
+          </w:p>
+        </w:tc>
+        <w:tc>
+          <w:tcPr>
+            <w:tcW w:type="dxa" w:w="7200"/>
+            <w:vAlign w:val="center"/>
+            <w:shd w:fill="FFFFFF"/>
+            <w:tcBorders>
+              <w:top w:val="single" w:sz="4" w:color="D9D9D9"/>
+              <w:left w:val="single" w:sz="4" w:color="D9D9D9"/>
+              <w:bottom w:val="single" w:sz="4" w:color="D9D9D9"/>
+              <w:right w:val="single" w:sz="4" w:color="D9D9D9"/>
+            </w:tcBorders>
+            <w:tcMar>
+              <w:top w:w="90" w:type="dxa"/>
+              <w:left w:w="90" w:type="dxa"/>
+              <w:bottom w:w="90" w:type="dxa"/>
+              <w:right w:w="90" w:type="dxa"/>
+            </w:tcMar>
+          </w:tcPr>
+          <w:p>
+            <w:pPr>
+              <w:spacing w:after="40" w:line="252" w:lineRule="auto"/>
+            </w:pPr>
+            <w:r>
+              <w:rPr>
+                <w:sz w:val="22"/>
+              </w:rPr>
+              <w:t>No transfer</w:t>
+            </w:r>
+          </w:p>
+        </w:tc>
+      </w:tr>
+      <w:tr>
+        <w:trPr>
+          <w:cantSplit/>
+        </w:trPr>
+        <w:tc>
+          <w:tcPr>
+            <w:tcW w:type="dxa" w:w="1440"/>
+            <w:vAlign w:val="center"/>
+            <w:shd w:fill="EDF5F7"/>
+            <w:tcBorders>
+              <w:top w:val="single" w:sz="4" w:color="D9D9D9"/>
+              <w:left w:val="single" w:sz="4" w:color="D9D9D9"/>
+              <w:bottom w:val="single" w:sz="4" w:color="D9D9D9"/>
+              <w:right w:val="single" w:sz="4" w:color="D9D9D9"/>
+            </w:tcBorders>
+            <w:tcMar>
+              <w:top w:w="90" w:type="dxa"/>
+              <w:left w:w="90" w:type="dxa"/>
+              <w:bottom w:w="90" w:type="dxa"/>
+              <w:right w:w="90" w:type="dxa"/>
+            </w:tcMar>
+          </w:tcPr>
+          <w:p>
+            <w:pPr>
+              <w:spacing w:after="40" w:line="252" w:lineRule="auto"/>
+              <w:jc w:val="center"/>
+            </w:pPr>
+            <w:r>
+              <w:rPr>
+                <w:sz w:val="22"/>
+              </w:rPr>
+              <w:t>0</w:t>
+            </w:r>
+          </w:p>
+        </w:tc>
+        <w:tc>
+          <w:tcPr>
+            <w:tcW w:type="dxa" w:w="1440"/>
+            <w:vAlign w:val="center"/>
+            <w:shd w:fill="EDF5F7"/>
+            <w:tcBorders>
+              <w:top w:val="single" w:sz="4" w:color="D9D9D9"/>
+              <w:left w:val="single" w:sz="4" w:color="D9D9D9"/>
+              <w:bottom w:val="single" w:sz="4" w:color="D9D9D9"/>
+              <w:right w:val="single" w:sz="4" w:color="D9D9D9"/>
+            </w:tcBorders>
+            <w:tcMar>
+              <w:top w:w="90" w:type="dxa"/>
+              <w:left w:w="90" w:type="dxa"/>
+              <w:bottom w:w="90" w:type="dxa"/>
+              <w:right w:w="90" w:type="dxa"/>
+            </w:tcMar>
+          </w:tcPr>
+          <w:p>
+            <w:pPr>
+              <w:spacing w:after="40" w:line="252" w:lineRule="auto"/>
+            </w:pPr>
+            <w:r>
+              <w:rPr>
+                <w:sz w:val="22"/>
+              </w:rPr>
+              <w:t>1</w:t>
+            </w:r>
+          </w:p>
+        </w:tc>
+        <w:tc>
+          <w:tcPr>
+            <w:tcW w:type="dxa" w:w="7200"/>
+            <w:vAlign w:val="center"/>
+            <w:shd w:fill="EDF5F7"/>
+            <w:tcBorders>
+              <w:top w:val="single" w:sz="4" w:color="D9D9D9"/>
+              <w:left w:val="single" w:sz="4" w:color="D9D9D9"/>
+              <w:bottom w:val="single" w:sz="4" w:color="D9D9D9"/>
+              <w:right w:val="single" w:sz="4" w:color="D9D9D9"/>
+            </w:tcBorders>
+            <w:tcMar>
+              <w:top w:w="90" w:type="dxa"/>
+              <w:left w:w="90" w:type="dxa"/>
+              <w:bottom w:w="90" w:type="dxa"/>
+              <w:right w:w="90" w:type="dxa"/>
+            </w:tcMar>
+          </w:tcPr>
+          <w:p>
+            <w:pPr>
+              <w:spacing w:after="40" w:line="252" w:lineRule="auto"/>
+            </w:pPr>
+            <w:r>
+              <w:rPr>
+                <w:sz w:val="22"/>
+              </w:rPr>
+              <w:t>No transfer: nothing offered</w:t>
+            </w:r>
+          </w:p>
+        </w:tc>
+      </w:tr>
+      <w:tr>
+        <w:trPr>
+          <w:cantSplit/>
+        </w:trPr>
+        <w:tc>
+          <w:tcPr>
+            <w:tcW w:type="dxa" w:w="1440"/>
+            <w:vAlign w:val="center"/>
+            <w:shd w:fill="FFFFFF"/>
+            <w:tcBorders>
+              <w:top w:val="single" w:sz="4" w:color="D9D9D9"/>
+              <w:left w:val="single" w:sz="4" w:color="D9D9D9"/>
+              <w:bottom w:val="single" w:sz="4" w:color="D9D9D9"/>
+              <w:right w:val="single" w:sz="4" w:color="D9D9D9"/>
+            </w:tcBorders>
+            <w:tcMar>
+              <w:top w:w="90" w:type="dxa"/>
+              <w:left w:w="90" w:type="dxa"/>
+              <w:bottom w:w="90" w:type="dxa"/>
+              <w:right w:w="90" w:type="dxa"/>
+            </w:tcMar>
+          </w:tcPr>
+          <w:p>
+            <w:pPr>
+              <w:spacing w:after="40" w:line="252" w:lineRule="auto"/>
+              <w:jc w:val="center"/>
+            </w:pPr>
+            <w:r>
+              <w:rPr>
+                <w:sz w:val="22"/>
+              </w:rPr>
+              <w:t>1</w:t>
+            </w:r>
+          </w:p>
+        </w:tc>
+        <w:tc>
+          <w:tcPr>
+            <w:tcW w:type="dxa" w:w="1440"/>
+            <w:vAlign w:val="center"/>
+            <w:shd w:fill="FFFFFF"/>
+            <w:tcBorders>
+              <w:top w:val="single" w:sz="4" w:color="D9D9D9"/>
+              <w:left w:val="single" w:sz="4" w:color="D9D9D9"/>
+              <w:bottom w:val="single" w:sz="4" w:color="D9D9D9"/>
+              <w:right w:val="single" w:sz="4" w:color="D9D9D9"/>
+            </w:tcBorders>
+            <w:tcMar>
+              <w:top w:w="90" w:type="dxa"/>
+              <w:left w:w="90" w:type="dxa"/>
+              <w:bottom w:w="90" w:type="dxa"/>
+              <w:right w:w="90" w:type="dxa"/>
+            </w:tcMar>
+          </w:tcPr>
+          <w:p>
+            <w:pPr>
+              <w:spacing w:after="40" w:line="252" w:lineRule="auto"/>
+            </w:pPr>
+            <w:r>
+              <w:rPr>
+                <w:sz w:val="22"/>
+              </w:rPr>
+              <w:t>0</w:t>
+            </w:r>
+          </w:p>
+        </w:tc>
+        <w:tc>
+          <w:tcPr>
+            <w:tcW w:type="dxa" w:w="7200"/>
+            <w:vAlign w:val="center"/>
+            <w:shd w:fill="FFFFFF"/>
+            <w:tcBorders>
+              <w:top w:val="single" w:sz="4" w:color="D9D9D9"/>
+              <w:left w:val="single" w:sz="4" w:color="D9D9D9"/>
+              <w:bottom w:val="single" w:sz="4" w:color="D9D9D9"/>
+              <w:right w:val="single" w:sz="4" w:color="D9D9D9"/>
+            </w:tcBorders>
+            <w:tcMar>
+              <w:top w:w="90" w:type="dxa"/>
+              <w:left w:w="90" w:type="dxa"/>
+              <w:bottom w:w="90" w:type="dxa"/>
+              <w:right w:w="90" w:type="dxa"/>
+            </w:tcMar>
+          </w:tcPr>
+          <w:p>
+            <w:pPr>
+              <w:spacing w:after="40" w:line="252" w:lineRule="auto"/>
+            </w:pPr>
+            <w:r>
+              <w:rPr>
+                <w:sz w:val="22"/>
+              </w:rPr>
+              <w:t>No transfer: keep card and labels still</w:t>
+            </w:r>
+          </w:p>
+        </w:tc>
+      </w:tr>
+      <w:tr>
+        <w:trPr>
+          <w:cantSplit/>
+        </w:trPr>
+        <w:tc>
+          <w:tcPr>
+            <w:tcW w:type="dxa" w:w="1440"/>
+            <w:vAlign w:val="center"/>
+            <w:shd w:fill="EDF5F7"/>
+            <w:tcBorders>
+              <w:top w:val="single" w:sz="4" w:color="D9D9D9"/>
+              <w:left w:val="single" w:sz="4" w:color="D9D9D9"/>
+              <w:bottom w:val="single" w:sz="4" w:color="D9D9D9"/>
+              <w:right w:val="single" w:sz="4" w:color="D9D9D9"/>
+            </w:tcBorders>
+            <w:tcMar>
+              <w:top w:w="90" w:type="dxa"/>
+              <w:left w:w="90" w:type="dxa"/>
+              <w:bottom w:w="90" w:type="dxa"/>
+              <w:right w:w="90" w:type="dxa"/>
+            </w:tcMar>
+          </w:tcPr>
+          <w:p>
+            <w:pPr>
+              <w:spacing w:after="40" w:line="252" w:lineRule="auto"/>
+              <w:jc w:val="center"/>
+            </w:pPr>
+            <w:r>
+              <w:rPr>
+                <w:sz w:val="22"/>
+              </w:rPr>
+              <w:t>1</w:t>
+            </w:r>
+          </w:p>
+        </w:tc>
+        <w:tc>
+          <w:tcPr>
+            <w:tcW w:type="dxa" w:w="1440"/>
+            <w:vAlign w:val="center"/>
+            <w:shd w:fill="EDF5F7"/>
+            <w:tcBorders>
+              <w:top w:val="single" w:sz="4" w:color="D9D9D9"/>
+              <w:left w:val="single" w:sz="4" w:color="D9D9D9"/>
+              <w:bottom w:val="single" w:sz="4" w:color="D9D9D9"/>
+              <w:right w:val="single" w:sz="4" w:color="D9D9D9"/>
+            </w:tcBorders>
+            <w:tcMar>
+              <w:top w:w="90" w:type="dxa"/>
+              <w:left w:w="90" w:type="dxa"/>
+              <w:bottom w:w="90" w:type="dxa"/>
+              <w:right w:w="90" w:type="dxa"/>
+            </w:tcMar>
+          </w:tcPr>
+          <w:p>
+            <w:pPr>
+              <w:spacing w:after="40" w:line="252" w:lineRule="auto"/>
+            </w:pPr>
+            <w:r>
+              <w:rPr>
+                <w:sz w:val="22"/>
+              </w:rPr>
+              <w:t>1</w:t>
+            </w:r>
+          </w:p>
+        </w:tc>
+        <w:tc>
+          <w:tcPr>
+            <w:tcW w:type="dxa" w:w="7200"/>
+            <w:vAlign w:val="center"/>
+            <w:shd w:fill="EDF5F7"/>
+            <w:tcBorders>
+              <w:top w:val="single" w:sz="4" w:color="D9D9D9"/>
+              <w:left w:val="single" w:sz="4" w:color="D9D9D9"/>
+              <w:bottom w:val="single" w:sz="4" w:color="D9D9D9"/>
+              <w:right w:val="single" w:sz="4" w:color="D9D9D9"/>
+            </w:tcBorders>
+            <w:tcMar>
+              <w:top w:w="90" w:type="dxa"/>
+              <w:left w:w="90" w:type="dxa"/>
+              <w:bottom w:w="90" w:type="dxa"/>
+              <w:right w:w="90" w:type="dxa"/>
+            </w:tcMar>
+          </w:tcPr>
+          <w:p>
+            <w:pPr>
+              <w:spacing w:after="40" w:line="252" w:lineRule="auto"/>
+            </w:pPr>
+            <w:r>
+              <w:rPr>
+                <w:sz w:val="22"/>
+              </w:rPr>
+              <w:t>One transfer</w:t>
+            </w:r>
+          </w:p>
+        </w:tc>
+      </w:tr>
+    </w:tbl>
+    <w:p>
+      <w:pPr>
+        <w:spacing w:after="80" w:line="20" w:lineRule="exact"/>
+      </w:pPr>
+    </w:p>
+    <w:p>
+      <w:pPr>
+        <w:pStyle w:val="Heading2"/>
+      </w:pPr>
+      <w:r>
+        <w:t>Now try a different pause</w:t>
+      </w:r>
+    </w:p>
+    <w:p>
+      <w:r>
+        <w:t>Start with both skid slots empty. Offer cards 10, 11 and 12. The receiver waits for FOUR edges, then stays ready. Do not reset between these seven numbered edges. Use the earlier worked example to fill the blanks before opening a trace.</w:t>
+      </w:r>
+    </w:p>
+    <w:tbl>
+      <w:tblPr>
+        <w:tblW w:type="auto" w:w="0"/>
+        <w:tblLayout w:type="fixed"/>
+        <w:tblLook w:firstColumn="1" w:firstRow="1" w:lastColumn="0" w:lastRow="0" w:noHBand="0" w:noVBand="1" w:val="04A0"/>
+      </w:tblPr>
+      <w:tblGrid>
+        <w:gridCol w:w="2160"/>
+        <w:gridCol w:w="3960"/>
+        <w:gridCol w:w="3960"/>
+      </w:tblGrid>
+      <w:tr>
+        <w:trPr>
+          <w:cantSplit/>
+          <w:tblHeader/>
+        </w:trPr>
+        <w:tc>
+          <w:tcPr>
+            <w:tcW w:type="dxa" w:w="2160"/>
+            <w:vAlign w:val="center"/>
+            <w:shd w:fill="17365D"/>
+            <w:tcBorders>
+              <w:top w:val="single" w:sz="4" w:color="D9D9D9"/>
+              <w:left w:val="single" w:sz="4" w:color="D9D9D9"/>
+              <w:bottom w:val="single" w:sz="4" w:color="D9D9D9"/>
+              <w:right w:val="single" w:sz="4" w:color="D9D9D9"/>
+            </w:tcBorders>
+            <w:tcMar>
+              <w:top w:w="90" w:type="dxa"/>
+              <w:left w:w="90" w:type="dxa"/>
+              <w:bottom w:w="90" w:type="dxa"/>
+              <w:right w:w="90" w:type="dxa"/>
+            </w:tcMar>
+          </w:tcPr>
+          <w:p>
+            <w:pPr>
+              <w:spacing w:after="40" w:line="252" w:lineRule="auto"/>
+              <w:jc w:val="center"/>
+            </w:pPr>
+            <w:r>
+              <w:rPr>
+                <w:b/>
+                <w:color w:val="FFFFFF"/>
+                <w:sz w:val="20"/>
+              </w:rPr>
+              <w:t>After edge</w:t>
+            </w:r>
+          </w:p>
+        </w:tc>
+        <w:tc>
+          <w:tcPr>
+            <w:tcW w:type="dxa" w:w="3960"/>
+            <w:vAlign w:val="center"/>
+            <w:shd w:fill="17365D"/>
+            <w:tcBorders>
+              <w:top w:val="single" w:sz="4" w:color="D9D9D9"/>
+              <w:left w:val="single" w:sz="4" w:color="D9D9D9"/>
+              <w:bottom w:val="single" w:sz="4" w:color="D9D9D9"/>
+              <w:right w:val="single" w:sz="4" w:color="D9D9D9"/>
+            </w:tcBorders>
+            <w:tcMar>
+              <w:top w:w="90" w:type="dxa"/>
+              <w:left w:w="90" w:type="dxa"/>
+              <w:bottom w:w="90" w:type="dxa"/>
+              <w:right w:w="90" w:type="dxa"/>
+            </w:tcMar>
+          </w:tcPr>
+          <w:p>
+            <w:pPr>
+              <w:spacing w:after="40" w:line="252" w:lineRule="auto"/>
+            </w:pPr>
+            <w:r>
+              <w:rPr>
+                <w:b/>
+                <w:color w:val="FFFFFF"/>
+                <w:sz w:val="20"/>
+              </w:rPr>
+              <w:t>Total skid accepted</w:t>
+            </w:r>
+          </w:p>
+        </w:tc>
+        <w:tc>
+          <w:tcPr>
+            <w:tcW w:type="dxa" w:w="3960"/>
+            <w:vAlign w:val="center"/>
+            <w:shd w:fill="17365D"/>
+            <w:tcBorders>
+              <w:top w:val="single" w:sz="4" w:color="D9D9D9"/>
+              <w:left w:val="single" w:sz="4" w:color="D9D9D9"/>
+              <w:bottom w:val="single" w:sz="4" w:color="D9D9D9"/>
+              <w:right w:val="single" w:sz="4" w:color="D9D9D9"/>
+            </w:tcBorders>
+            <w:tcMar>
+              <w:top w:w="90" w:type="dxa"/>
+              <w:left w:w="90" w:type="dxa"/>
+              <w:bottom w:w="90" w:type="dxa"/>
+              <w:right w:w="90" w:type="dxa"/>
+            </w:tcMar>
+          </w:tcPr>
+          <w:p>
+            <w:pPr>
+              <w:spacing w:after="40" w:line="252" w:lineRule="auto"/>
+            </w:pPr>
+            <w:r>
+              <w:rPr>
+                <w:b/>
+                <w:color w:val="FFFFFF"/>
+                <w:sz w:val="20"/>
+              </w:rPr>
+              <w:t>Total delivered</w:t>
+            </w:r>
+          </w:p>
+        </w:tc>
+      </w:tr>
+      <w:tr>
+        <w:trPr>
+          <w:cantSplit/>
+        </w:trPr>
+        <w:tc>
+          <w:tcPr>
+            <w:tcW w:type="dxa" w:w="2160"/>
+            <w:vAlign w:val="center"/>
+            <w:shd w:fill="FFFFFF"/>
+            <w:tcBorders>
+              <w:top w:val="single" w:sz="4" w:color="D9D9D9"/>
+              <w:left w:val="single" w:sz="4" w:color="D9D9D9"/>
+              <w:bottom w:val="single" w:sz="4" w:color="D9D9D9"/>
+              <w:right w:val="single" w:sz="4" w:color="D9D9D9"/>
+            </w:tcBorders>
+            <w:tcMar>
+              <w:top w:w="90" w:type="dxa"/>
+              <w:left w:w="90" w:type="dxa"/>
+              <w:bottom w:w="90" w:type="dxa"/>
+              <w:right w:w="90" w:type="dxa"/>
+            </w:tcMar>
+          </w:tcPr>
+          <w:p>
+            <w:pPr>
+              <w:spacing w:after="40" w:line="252" w:lineRule="auto"/>
+              <w:jc w:val="center"/>
+            </w:pPr>
+            <w:r>
+              <w:rPr>
+                <w:sz w:val="20"/>
+              </w:rPr>
+              <w:t>1</w:t>
+            </w:r>
+          </w:p>
+        </w:tc>
+        <w:tc>
+          <w:tcPr>
+            <w:tcW w:type="dxa" w:w="3960"/>
+            <w:vAlign w:val="center"/>
+            <w:shd w:fill="FFFFFF"/>
+            <w:tcBorders>
+              <w:top w:val="single" w:sz="4" w:color="D9D9D9"/>
+              <w:left w:val="single" w:sz="4" w:color="D9D9D9"/>
+              <w:bottom w:val="single" w:sz="4" w:color="D9D9D9"/>
+              <w:right w:val="single" w:sz="4" w:color="D9D9D9"/>
+            </w:tcBorders>
+            <w:tcMar>
+              <w:top w:w="90" w:type="dxa"/>
+              <w:left w:w="90" w:type="dxa"/>
+              <w:bottom w:w="90" w:type="dxa"/>
+              <w:right w:w="90" w:type="dxa"/>
+            </w:tcMar>
+          </w:tcPr>
+          <w:p>
+            <w:pPr>
+              <w:spacing w:after="40" w:line="252" w:lineRule="auto"/>
+            </w:pPr>
+            <w:r>
+              <w:rPr>
+                <w:sz w:val="20"/>
+              </w:rPr>
+              <w:t>1</w:t>
+            </w:r>
+          </w:p>
+        </w:tc>
+        <w:tc>
+          <w:tcPr>
+            <w:tcW w:type="dxa" w:w="3960"/>
+            <w:vAlign w:val="center"/>
+            <w:shd w:fill="FFFFFF"/>
+            <w:tcBorders>
+              <w:top w:val="single" w:sz="4" w:color="D9D9D9"/>
+              <w:left w:val="single" w:sz="4" w:color="D9D9D9"/>
+              <w:bottom w:val="single" w:sz="4" w:color="D9D9D9"/>
+              <w:right w:val="single" w:sz="4" w:color="D9D9D9"/>
+            </w:tcBorders>
+            <w:tcMar>
+              <w:top w:w="90" w:type="dxa"/>
+              <w:left w:w="90" w:type="dxa"/>
+              <w:bottom w:w="90" w:type="dxa"/>
+              <w:right w:w="90" w:type="dxa"/>
+            </w:tcMar>
+          </w:tcPr>
+          <w:p>
+            <w:pPr>
+              <w:spacing w:after="40" w:line="252" w:lineRule="auto"/>
+            </w:pPr>
+            <w:r>
+              <w:rPr>
+                <w:sz w:val="20"/>
+              </w:rPr>
+              <w:t>0</w:t>
+            </w:r>
+          </w:p>
+        </w:tc>
+      </w:tr>
+      <w:tr>
+        <w:trPr>
+          <w:cantSplit/>
+        </w:trPr>
+        <w:tc>
+          <w:tcPr>
+            <w:tcW w:type="dxa" w:w="2160"/>
+            <w:vAlign w:val="center"/>
+            <w:shd w:fill="EDF5F7"/>
+            <w:tcBorders>
+              <w:top w:val="single" w:sz="4" w:color="D9D9D9"/>
+              <w:left w:val="single" w:sz="4" w:color="D9D9D9"/>
+              <w:bottom w:val="single" w:sz="4" w:color="D9D9D9"/>
+              <w:right w:val="single" w:sz="4" w:color="D9D9D9"/>
+            </w:tcBorders>
+            <w:tcMar>
+              <w:top w:w="90" w:type="dxa"/>
+              <w:left w:w="90" w:type="dxa"/>
+              <w:bottom w:w="90" w:type="dxa"/>
+              <w:right w:w="90" w:type="dxa"/>
+            </w:tcMar>
+          </w:tcPr>
+          <w:p>
+            <w:pPr>
+              <w:spacing w:after="40" w:line="252" w:lineRule="auto"/>
+              <w:jc w:val="center"/>
+            </w:pPr>
+            <w:r>
+              <w:rPr>
+                <w:sz w:val="20"/>
+              </w:rPr>
+              <w:t>2</w:t>
+            </w:r>
+          </w:p>
+        </w:tc>
+        <w:tc>
+          <w:tcPr>
+            <w:tcW w:type="dxa" w:w="3960"/>
+            <w:vAlign w:val="center"/>
+            <w:shd w:fill="EDF5F7"/>
+            <w:tcBorders>
+              <w:top w:val="single" w:sz="4" w:color="D9D9D9"/>
+              <w:left w:val="single" w:sz="4" w:color="D9D9D9"/>
+              <w:bottom w:val="single" w:sz="4" w:color="D9D9D9"/>
+              <w:right w:val="single" w:sz="4" w:color="D9D9D9"/>
+            </w:tcBorders>
+            <w:tcMar>
+              <w:top w:w="90" w:type="dxa"/>
+              <w:left w:w="90" w:type="dxa"/>
+              <w:bottom w:w="90" w:type="dxa"/>
+              <w:right w:w="90" w:type="dxa"/>
+            </w:tcMar>
+          </w:tcPr>
+          <w:p>
+            <w:pPr>
+              <w:spacing w:after="40" w:line="252" w:lineRule="auto"/>
+            </w:pPr>
+            <w:r>
+              <w:rPr>
+                <w:sz w:val="20"/>
+              </w:rPr>
+              <w:t>____</w:t>
+            </w:r>
+          </w:p>
+        </w:tc>
+        <w:tc>
+          <w:tcPr>
+            <w:tcW w:type="dxa" w:w="3960"/>
+            <w:vAlign w:val="center"/>
+            <w:shd w:fill="EDF5F7"/>
+            <w:tcBorders>
+              <w:top w:val="single" w:sz="4" w:color="D9D9D9"/>
+              <w:left w:val="single" w:sz="4" w:color="D9D9D9"/>
+              <w:bottom w:val="single" w:sz="4" w:color="D9D9D9"/>
+              <w:right w:val="single" w:sz="4" w:color="D9D9D9"/>
+            </w:tcBorders>
+            <w:tcMar>
+              <w:top w:w="90" w:type="dxa"/>
+              <w:left w:w="90" w:type="dxa"/>
+              <w:bottom w:w="90" w:type="dxa"/>
+              <w:right w:w="90" w:type="dxa"/>
+            </w:tcMar>
+          </w:tcPr>
+          <w:p>
+            <w:pPr>
+              <w:spacing w:after="40" w:line="252" w:lineRule="auto"/>
+            </w:pPr>
+            <w:r>
+              <w:rPr>
+                <w:sz w:val="20"/>
+              </w:rPr>
+              <w:t>____</w:t>
+            </w:r>
+          </w:p>
+        </w:tc>
+      </w:tr>
+      <w:tr>
+        <w:trPr>
+          <w:cantSplit/>
+        </w:trPr>
+        <w:tc>
+          <w:tcPr>
+            <w:tcW w:type="dxa" w:w="2160"/>
+            <w:vAlign w:val="center"/>
+            <w:shd w:fill="FFFFFF"/>
+            <w:tcBorders>
+              <w:top w:val="single" w:sz="4" w:color="D9D9D9"/>
+              <w:left w:val="single" w:sz="4" w:color="D9D9D9"/>
+              <w:bottom w:val="single" w:sz="4" w:color="D9D9D9"/>
+              <w:right w:val="single" w:sz="4" w:color="D9D9D9"/>
+            </w:tcBorders>
+            <w:tcMar>
+              <w:top w:w="90" w:type="dxa"/>
+              <w:left w:w="90" w:type="dxa"/>
+              <w:bottom w:w="90" w:type="dxa"/>
+              <w:right w:w="90" w:type="dxa"/>
+            </w:tcMar>
+          </w:tcPr>
+          <w:p>
+            <w:pPr>
+              <w:spacing w:after="40" w:line="252" w:lineRule="auto"/>
+              <w:jc w:val="center"/>
+            </w:pPr>
+            <w:r>
+              <w:rPr>
+                <w:sz w:val="20"/>
+              </w:rPr>
+              <w:t>3</w:t>
+            </w:r>
+          </w:p>
+        </w:tc>
+        <w:tc>
+          <w:tcPr>
+            <w:tcW w:type="dxa" w:w="3960"/>
+            <w:vAlign w:val="center"/>
+            <w:shd w:fill="FFFFFF"/>
+            <w:tcBorders>
+              <w:top w:val="single" w:sz="4" w:color="D9D9D9"/>
+              <w:left w:val="single" w:sz="4" w:color="D9D9D9"/>
+              <w:bottom w:val="single" w:sz="4" w:color="D9D9D9"/>
+              <w:right w:val="single" w:sz="4" w:color="D9D9D9"/>
+            </w:tcBorders>
+            <w:tcMar>
+              <w:top w:w="90" w:type="dxa"/>
+              <w:left w:w="90" w:type="dxa"/>
+              <w:bottom w:w="90" w:type="dxa"/>
+              <w:right w:w="90" w:type="dxa"/>
+            </w:tcMar>
+          </w:tcPr>
+          <w:p>
+            <w:pPr>
+              <w:spacing w:after="40" w:line="252" w:lineRule="auto"/>
+            </w:pPr>
+            <w:r>
+              <w:rPr>
+                <w:sz w:val="20"/>
+              </w:rPr>
+              <w:t>____</w:t>
+            </w:r>
+          </w:p>
+        </w:tc>
+        <w:tc>
+          <w:tcPr>
+            <w:tcW w:type="dxa" w:w="3960"/>
+            <w:vAlign w:val="center"/>
+            <w:shd w:fill="FFFFFF"/>
+            <w:tcBorders>
+              <w:top w:val="single" w:sz="4" w:color="D9D9D9"/>
+              <w:left w:val="single" w:sz="4" w:color="D9D9D9"/>
+              <w:bottom w:val="single" w:sz="4" w:color="D9D9D9"/>
+              <w:right w:val="single" w:sz="4" w:color="D9D9D9"/>
+            </w:tcBorders>
+            <w:tcMar>
+              <w:top w:w="90" w:type="dxa"/>
+              <w:left w:w="90" w:type="dxa"/>
+              <w:bottom w:w="90" w:type="dxa"/>
+              <w:right w:w="90" w:type="dxa"/>
+            </w:tcMar>
+          </w:tcPr>
+          <w:p>
+            <w:pPr>
+              <w:spacing w:after="40" w:line="252" w:lineRule="auto"/>
+            </w:pPr>
+            <w:r>
+              <w:rPr>
+                <w:sz w:val="20"/>
+              </w:rPr>
+              <w:t>____</w:t>
+            </w:r>
+          </w:p>
+        </w:tc>
+      </w:tr>
+      <w:tr>
+        <w:trPr>
+          <w:cantSplit/>
+        </w:trPr>
+        <w:tc>
+          <w:tcPr>
+            <w:tcW w:type="dxa" w:w="2160"/>
+            <w:vAlign w:val="center"/>
+            <w:shd w:fill="EDF5F7"/>
+            <w:tcBorders>
+              <w:top w:val="single" w:sz="4" w:color="D9D9D9"/>
+              <w:left w:val="single" w:sz="4" w:color="D9D9D9"/>
+              <w:bottom w:val="single" w:sz="4" w:color="D9D9D9"/>
+              <w:right w:val="single" w:sz="4" w:color="D9D9D9"/>
+            </w:tcBorders>
+            <w:tcMar>
+              <w:top w:w="90" w:type="dxa"/>
+              <w:left w:w="90" w:type="dxa"/>
+              <w:bottom w:w="90" w:type="dxa"/>
+              <w:right w:w="90" w:type="dxa"/>
+            </w:tcMar>
+          </w:tcPr>
+          <w:p>
+            <w:pPr>
+              <w:spacing w:after="40" w:line="252" w:lineRule="auto"/>
+              <w:jc w:val="center"/>
+            </w:pPr>
+            <w:r>
+              <w:rPr>
+                <w:sz w:val="20"/>
+              </w:rPr>
+              <w:t>4</w:t>
+            </w:r>
+          </w:p>
+        </w:tc>
+        <w:tc>
+          <w:tcPr>
+            <w:tcW w:type="dxa" w:w="3960"/>
+            <w:vAlign w:val="center"/>
+            <w:shd w:fill="EDF5F7"/>
+            <w:tcBorders>
+              <w:top w:val="single" w:sz="4" w:color="D9D9D9"/>
+              <w:left w:val="single" w:sz="4" w:color="D9D9D9"/>
+              <w:bottom w:val="single" w:sz="4" w:color="D9D9D9"/>
+              <w:right w:val="single" w:sz="4" w:color="D9D9D9"/>
+            </w:tcBorders>
+            <w:tcMar>
+              <w:top w:w="90" w:type="dxa"/>
+              <w:left w:w="90" w:type="dxa"/>
+              <w:bottom w:w="90" w:type="dxa"/>
+              <w:right w:w="90" w:type="dxa"/>
+            </w:tcMar>
+          </w:tcPr>
+          <w:p>
+            <w:pPr>
+              <w:spacing w:after="40" w:line="252" w:lineRule="auto"/>
+            </w:pPr>
+            <w:r>
+              <w:rPr>
+                <w:sz w:val="20"/>
+              </w:rPr>
+              <w:t>____</w:t>
+            </w:r>
+          </w:p>
+        </w:tc>
+        <w:tc>
+          <w:tcPr>
+            <w:tcW w:type="dxa" w:w="3960"/>
+            <w:vAlign w:val="center"/>
+            <w:shd w:fill="EDF5F7"/>
+            <w:tcBorders>
+              <w:top w:val="single" w:sz="4" w:color="D9D9D9"/>
+              <w:left w:val="single" w:sz="4" w:color="D9D9D9"/>
+              <w:bottom w:val="single" w:sz="4" w:color="D9D9D9"/>
+              <w:right w:val="single" w:sz="4" w:color="D9D9D9"/>
+            </w:tcBorders>
+            <w:tcMar>
+              <w:top w:w="90" w:type="dxa"/>
+              <w:left w:w="90" w:type="dxa"/>
+              <w:bottom w:w="90" w:type="dxa"/>
+              <w:right w:w="90" w:type="dxa"/>
+            </w:tcMar>
+          </w:tcPr>
+          <w:p>
+            <w:pPr>
+              <w:spacing w:after="40" w:line="252" w:lineRule="auto"/>
+            </w:pPr>
+            <w:r>
+              <w:rPr>
+                <w:sz w:val="20"/>
+              </w:rPr>
+              <w:t>____</w:t>
+            </w:r>
+          </w:p>
+        </w:tc>
+      </w:tr>
+      <w:tr>
+        <w:trPr>
+          <w:cantSplit/>
+        </w:trPr>
+        <w:tc>
+          <w:tcPr>
+            <w:tcW w:type="dxa" w:w="2160"/>
+            <w:vAlign w:val="center"/>
+            <w:shd w:fill="FFFFFF"/>
+            <w:tcBorders>
+              <w:top w:val="single" w:sz="4" w:color="D9D9D9"/>
+              <w:left w:val="single" w:sz="4" w:color="D9D9D9"/>
+              <w:bottom w:val="single" w:sz="4" w:color="D9D9D9"/>
+              <w:right w:val="single" w:sz="4" w:color="D9D9D9"/>
+            </w:tcBorders>
+            <w:tcMar>
+              <w:top w:w="90" w:type="dxa"/>
+              <w:left w:w="90" w:type="dxa"/>
+              <w:bottom w:w="90" w:type="dxa"/>
+              <w:right w:w="90" w:type="dxa"/>
+            </w:tcMar>
+          </w:tcPr>
+          <w:p>
+            <w:pPr>
+              <w:spacing w:after="40" w:line="252" w:lineRule="auto"/>
+              <w:jc w:val="center"/>
+            </w:pPr>
+            <w:r>
+              <w:rPr>
+                <w:sz w:val="20"/>
+              </w:rPr>
+              <w:t>5</w:t>
+            </w:r>
+          </w:p>
+        </w:tc>
+        <w:tc>
+          <w:tcPr>
+            <w:tcW w:type="dxa" w:w="3960"/>
+            <w:vAlign w:val="center"/>
+            <w:shd w:fill="FFFFFF"/>
+            <w:tcBorders>
+              <w:top w:val="single" w:sz="4" w:color="D9D9D9"/>
+              <w:left w:val="single" w:sz="4" w:color="D9D9D9"/>
+              <w:bottom w:val="single" w:sz="4" w:color="D9D9D9"/>
+              <w:right w:val="single" w:sz="4" w:color="D9D9D9"/>
+            </w:tcBorders>
+            <w:tcMar>
+              <w:top w:w="90" w:type="dxa"/>
+              <w:left w:w="90" w:type="dxa"/>
+              <w:bottom w:w="90" w:type="dxa"/>
+              <w:right w:w="90" w:type="dxa"/>
+            </w:tcMar>
+          </w:tcPr>
+          <w:p>
+            <w:pPr>
+              <w:spacing w:after="40" w:line="252" w:lineRule="auto"/>
+            </w:pPr>
+            <w:r>
+              <w:rPr>
+                <w:sz w:val="20"/>
+              </w:rPr>
+              <w:t>____</w:t>
+            </w:r>
+          </w:p>
+        </w:tc>
+        <w:tc>
+          <w:tcPr>
+            <w:tcW w:type="dxa" w:w="3960"/>
+            <w:vAlign w:val="center"/>
+            <w:shd w:fill="FFFFFF"/>
+            <w:tcBorders>
+              <w:top w:val="single" w:sz="4" w:color="D9D9D9"/>
+              <w:left w:val="single" w:sz="4" w:color="D9D9D9"/>
+              <w:bottom w:val="single" w:sz="4" w:color="D9D9D9"/>
+              <w:right w:val="single" w:sz="4" w:color="D9D9D9"/>
+            </w:tcBorders>
+            <w:tcMar>
+              <w:top w:w="90" w:type="dxa"/>
+              <w:left w:w="90" w:type="dxa"/>
+              <w:bottom w:w="90" w:type="dxa"/>
+              <w:right w:w="90" w:type="dxa"/>
+            </w:tcMar>
+          </w:tcPr>
+          <w:p>
+            <w:pPr>
+              <w:spacing w:after="40" w:line="252" w:lineRule="auto"/>
+            </w:pPr>
+            <w:r>
+              <w:rPr>
+                <w:sz w:val="20"/>
+              </w:rPr>
+              <w:t>____</w:t>
+            </w:r>
+          </w:p>
+        </w:tc>
+      </w:tr>
+      <w:tr>
+        <w:trPr>
+          <w:cantSplit/>
+        </w:trPr>
+        <w:tc>
+          <w:tcPr>
+            <w:tcW w:type="dxa" w:w="2160"/>
+            <w:vAlign w:val="center"/>
+            <w:shd w:fill="EDF5F7"/>
+            <w:tcBorders>
+              <w:top w:val="single" w:sz="4" w:color="D9D9D9"/>
+              <w:left w:val="single" w:sz="4" w:color="D9D9D9"/>
+              <w:bottom w:val="single" w:sz="4" w:color="D9D9D9"/>
+              <w:right w:val="single" w:sz="4" w:color="D9D9D9"/>
+            </w:tcBorders>
+            <w:tcMar>
+              <w:top w:w="90" w:type="dxa"/>
+              <w:left w:w="90" w:type="dxa"/>
+              <w:bottom w:w="90" w:type="dxa"/>
+              <w:right w:w="90" w:type="dxa"/>
+            </w:tcMar>
+          </w:tcPr>
+          <w:p>
+            <w:pPr>
+              <w:spacing w:after="40" w:line="252" w:lineRule="auto"/>
+              <w:jc w:val="center"/>
+            </w:pPr>
+            <w:r>
+              <w:rPr>
+                <w:sz w:val="20"/>
+              </w:rPr>
+              <w:t>6</w:t>
+            </w:r>
+          </w:p>
+        </w:tc>
+        <w:tc>
+          <w:tcPr>
+            <w:tcW w:type="dxa" w:w="3960"/>
+            <w:vAlign w:val="center"/>
+            <w:shd w:fill="EDF5F7"/>
+            <w:tcBorders>
+              <w:top w:val="single" w:sz="4" w:color="D9D9D9"/>
+              <w:left w:val="single" w:sz="4" w:color="D9D9D9"/>
+              <w:bottom w:val="single" w:sz="4" w:color="D9D9D9"/>
+              <w:right w:val="single" w:sz="4" w:color="D9D9D9"/>
+            </w:tcBorders>
+            <w:tcMar>
+              <w:top w:w="90" w:type="dxa"/>
+              <w:left w:w="90" w:type="dxa"/>
+              <w:bottom w:w="90" w:type="dxa"/>
+              <w:right w:w="90" w:type="dxa"/>
+            </w:tcMar>
+          </w:tcPr>
+          <w:p>
+            <w:pPr>
+              <w:spacing w:after="40" w:line="252" w:lineRule="auto"/>
+            </w:pPr>
+            <w:r>
+              <w:rPr>
+                <w:sz w:val="20"/>
+              </w:rPr>
+              <w:t>____</w:t>
+            </w:r>
+          </w:p>
+        </w:tc>
+        <w:tc>
+          <w:tcPr>
+            <w:tcW w:type="dxa" w:w="3960"/>
+            <w:vAlign w:val="center"/>
+            <w:shd w:fill="EDF5F7"/>
+            <w:tcBorders>
+              <w:top w:val="single" w:sz="4" w:color="D9D9D9"/>
+              <w:left w:val="single" w:sz="4" w:color="D9D9D9"/>
+              <w:bottom w:val="single" w:sz="4" w:color="D9D9D9"/>
+              <w:right w:val="single" w:sz="4" w:color="D9D9D9"/>
+            </w:tcBorders>
+            <w:tcMar>
+              <w:top w:w="90" w:type="dxa"/>
+              <w:left w:w="90" w:type="dxa"/>
+              <w:bottom w:w="90" w:type="dxa"/>
+              <w:right w:w="90" w:type="dxa"/>
+            </w:tcMar>
+          </w:tcPr>
+          <w:p>
+            <w:pPr>
+              <w:spacing w:after="40" w:line="252" w:lineRule="auto"/>
+            </w:pPr>
+            <w:r>
+              <w:rPr>
+                <w:sz w:val="20"/>
+              </w:rPr>
+              <w:t>____</w:t>
+            </w:r>
+          </w:p>
+        </w:tc>
+      </w:tr>
+      <w:tr>
+        <w:trPr>
+          <w:cantSplit/>
+        </w:trPr>
+        <w:tc>
+          <w:tcPr>
+            <w:tcW w:type="dxa" w:w="2160"/>
+            <w:vAlign w:val="center"/>
+            <w:shd w:fill="FFFFFF"/>
+            <w:tcBorders>
+              <w:top w:val="single" w:sz="4" w:color="D9D9D9"/>
+              <w:left w:val="single" w:sz="4" w:color="D9D9D9"/>
+              <w:bottom w:val="single" w:sz="4" w:color="D9D9D9"/>
+              <w:right w:val="single" w:sz="4" w:color="D9D9D9"/>
+            </w:tcBorders>
+            <w:tcMar>
+              <w:top w:w="90" w:type="dxa"/>
+              <w:left w:w="90" w:type="dxa"/>
+              <w:bottom w:w="90" w:type="dxa"/>
+              <w:right w:w="90" w:type="dxa"/>
+            </w:tcMar>
+          </w:tcPr>
+          <w:p>
+            <w:pPr>
+              <w:spacing w:after="40" w:line="252" w:lineRule="auto"/>
+              <w:jc w:val="center"/>
+            </w:pPr>
+            <w:r>
+              <w:rPr>
+                <w:sz w:val="20"/>
+              </w:rPr>
+              <w:t>7</w:t>
+            </w:r>
+          </w:p>
+        </w:tc>
+        <w:tc>
+          <w:tcPr>
+            <w:tcW w:type="dxa" w:w="3960"/>
+            <w:vAlign w:val="center"/>
+            <w:shd w:fill="FFFFFF"/>
+            <w:tcBorders>
+              <w:top w:val="single" w:sz="4" w:color="D9D9D9"/>
+              <w:left w:val="single" w:sz="4" w:color="D9D9D9"/>
+              <w:bottom w:val="single" w:sz="4" w:color="D9D9D9"/>
+              <w:right w:val="single" w:sz="4" w:color="D9D9D9"/>
+            </w:tcBorders>
+            <w:tcMar>
+              <w:top w:w="90" w:type="dxa"/>
+              <w:left w:w="90" w:type="dxa"/>
+              <w:bottom w:w="90" w:type="dxa"/>
+              <w:right w:w="90" w:type="dxa"/>
+            </w:tcMar>
+          </w:tcPr>
+          <w:p>
+            <w:pPr>
+              <w:spacing w:after="40" w:line="252" w:lineRule="auto"/>
+            </w:pPr>
+            <w:r>
+              <w:rPr>
+                <w:sz w:val="20"/>
+              </w:rPr>
+              <w:t>____</w:t>
+            </w:r>
+          </w:p>
+        </w:tc>
+        <w:tc>
+          <w:tcPr>
+            <w:tcW w:type="dxa" w:w="3960"/>
+            <w:vAlign w:val="center"/>
+            <w:shd w:fill="FFFFFF"/>
+            <w:tcBorders>
+              <w:top w:val="single" w:sz="4" w:color="D9D9D9"/>
+              <w:left w:val="single" w:sz="4" w:color="D9D9D9"/>
+              <w:bottom w:val="single" w:sz="4" w:color="D9D9D9"/>
+              <w:right w:val="single" w:sz="4" w:color="D9D9D9"/>
+            </w:tcBorders>
+            <w:tcMar>
+              <w:top w:w="90" w:type="dxa"/>
+              <w:left w:w="90" w:type="dxa"/>
+              <w:bottom w:w="90" w:type="dxa"/>
+              <w:right w:w="90" w:type="dxa"/>
+            </w:tcMar>
+          </w:tcPr>
+          <w:p>
+            <w:pPr>
+              <w:spacing w:after="40" w:line="252" w:lineRule="auto"/>
+            </w:pPr>
+            <w:r>
+              <w:rPr>
+                <w:sz w:val="20"/>
+              </w:rPr>
+              <w:t>____</w:t>
+            </w:r>
+          </w:p>
+        </w:tc>
+      </w:tr>
+    </w:tbl>
+    <w:p>
+      <w:pPr>
+        <w:spacing w:after="80" w:line="20" w:lineRule="exact"/>
+      </w:pPr>
+    </w:p>
+    <w:p>
+      <w:r>
+        <w:t>The bundled browser bench uses a three-edge pause. This four-edge variation is a card exercise; a guide can change the bench to simulate it. Say which values must stay still during each wait.</w:t>
+      </w:r>
+    </w:p>
+    <w:p>
+      <w:r>
+        <w:rPr>
+          <w:b/>
+          <w:sz w:val="20"/>
+        </w:rPr>
+        <w:t xml:space="preserve">Guide note </w:t>
+      </w:r>
+      <w:r>
+        <w:rPr>
+          <w:sz w:val="20"/>
+        </w:rPr>
+        <w:t>Answers for edges 2 through 7: accepted 2, 2, 2, 2, 3, 3; delivered 0, 0, 0, 1, 2, 3. For independent practice, cover this note. Data is meaningful only while Valid is on. Ready may be on while Valid is off.</w:t>
+      </w:r>
+    </w:p>
+    <w:p>
+      <w:pPr>
+        <w:pStyle w:val="Heading1"/>
+        <w:pageBreakBefore/>
+      </w:pPr>
+      <w:r>
+        <w:t>Guided capstone  Count one shot per press</w:t>
+      </w:r>
+    </w:p>
+    <w:p>
+      <w:r>
+        <w:t>Begin with the working examples/LearningLab/ShotCounter.cs template. Its simulated button input has already been cleaned up by the teacher. Holding the button counts once. Clear wins when Clear and a new press arrive together.</w:t>
+      </w:r>
+    </w:p>
+    <w:p>
+      <w:pPr>
+        <w:spacing w:after="200"/>
+      </w:pPr>
+      <w:r>
+        <w:rPr>
+          <w:rFonts w:ascii="DejaVu Sans Mono" w:hAnsi="DejaVu Sans Mono"/>
+          <w:sz w:val="20"/>
+        </w:rPr>
+        <w:t>var previous = m.Register("previous_shot", 1, 0);</w:t>
+        <w:br/>
+        <w:t>m.Next(previous, shot);</w:t>
+        <w:br/>
+        <w:t>var newPress = shot &amp; ~previous;</w:t>
+        <w:br/>
+        <w:t>var count = m.Register("count", 4, 0);</w:t>
+      </w:r>
+    </w:p>
+    <w:p>
+      <w:r>
+        <w:t>previous remembers whether the button was down at the last edge. newPress is 1 only when the button is down now and was up before. The complete file includes the next-count selection, clear and output wiring.</w:t>
+      </w:r>
+    </w:p>
+    <w:p>
+      <w:pPr>
+        <w:pStyle w:val="Heading2"/>
+      </w:pPr>
+      <w:r>
+        <w:t>One guided change</w:t>
+      </w:r>
+    </w:p>
+    <w:p>
+      <w:r>
+        <w:t>First predict the score for pointsPerShot = 1. Then read the second configuration, pointsPerShot = 2. Change the argument in your own copy of the Build call from 1 to 2, and predict before running. Both configurations are included in the teacher tests.</w:t>
+      </w:r>
+    </w:p>
+    <w:tbl>
+      <w:tblPr>
+        <w:tblW w:type="auto" w:w="0"/>
+        <w:tblLayout w:type="fixed"/>
+        <w:tblLook w:firstColumn="1" w:firstRow="1" w:lastColumn="0" w:lastRow="0" w:noHBand="0" w:noVBand="1" w:val="04A0"/>
+      </w:tblPr>
+      <w:tblGrid>
+        <w:gridCol w:w="4320"/>
+        <w:gridCol w:w="2880"/>
+        <w:gridCol w:w="2880"/>
+      </w:tblGrid>
+      <w:tr>
+        <w:trPr>
+          <w:cantSplit/>
+          <w:tblHeader/>
+        </w:trPr>
+        <w:tc>
+          <w:tcPr>
+            <w:tcW w:type="dxa" w:w="4320"/>
+            <w:vAlign w:val="center"/>
+            <w:shd w:fill="17365D"/>
+            <w:tcBorders>
+              <w:top w:val="single" w:sz="4" w:color="D9D9D9"/>
+              <w:left w:val="single" w:sz="4" w:color="D9D9D9"/>
+              <w:bottom w:val="single" w:sz="4" w:color="D9D9D9"/>
+              <w:right w:val="single" w:sz="4" w:color="D9D9D9"/>
+            </w:tcBorders>
+            <w:tcMar>
+              <w:top w:w="90" w:type="dxa"/>
+              <w:left w:w="90" w:type="dxa"/>
+              <w:bottom w:w="90" w:type="dxa"/>
+              <w:right w:w="90" w:type="dxa"/>
+            </w:tcMar>
+          </w:tcPr>
+          <w:p>
+            <w:pPr>
+              <w:spacing w:after="40" w:line="252" w:lineRule="auto"/>
+            </w:pPr>
+            <w:r>
+              <w:rPr>
+                <w:b/>
+                <w:color w:val="FFFFFF"/>
+                <w:sz w:val="21"/>
+              </w:rPr>
+              <w:t>Action at an edge</w:t>
+            </w:r>
+          </w:p>
+        </w:tc>
+        <w:tc>
+          <w:tcPr>
+            <w:tcW w:type="dxa" w:w="2880"/>
+            <w:vAlign w:val="center"/>
+            <w:shd w:fill="17365D"/>
+            <w:tcBorders>
+              <w:top w:val="single" w:sz="4" w:color="D9D9D9"/>
+              <w:left w:val="single" w:sz="4" w:color="D9D9D9"/>
+              <w:bottom w:val="single" w:sz="4" w:color="D9D9D9"/>
+              <w:right w:val="single" w:sz="4" w:color="D9D9D9"/>
+            </w:tcBorders>
+            <w:tcMar>
+              <w:top w:w="90" w:type="dxa"/>
+              <w:left w:w="90" w:type="dxa"/>
+              <w:bottom w:w="90" w:type="dxa"/>
+              <w:right w:w="90" w:type="dxa"/>
+            </w:tcMar>
+          </w:tcPr>
+          <w:p>
+            <w:pPr>
+              <w:spacing w:after="40" w:line="252" w:lineRule="auto"/>
+            </w:pPr>
+            <w:r>
+              <w:rPr>
+                <w:b/>
+                <w:color w:val="FFFFFF"/>
+                <w:sz w:val="21"/>
+              </w:rPr>
+              <w:t>One point per press</w:t>
+            </w:r>
+          </w:p>
+        </w:tc>
+        <w:tc>
+          <w:tcPr>
+            <w:tcW w:type="dxa" w:w="2880"/>
+            <w:vAlign w:val="center"/>
+            <w:shd w:fill="17365D"/>
+            <w:tcBorders>
+              <w:top w:val="single" w:sz="4" w:color="D9D9D9"/>
+              <w:left w:val="single" w:sz="4" w:color="D9D9D9"/>
+              <w:bottom w:val="single" w:sz="4" w:color="D9D9D9"/>
+              <w:right w:val="single" w:sz="4" w:color="D9D9D9"/>
+            </w:tcBorders>
+            <w:tcMar>
+              <w:top w:w="90" w:type="dxa"/>
+              <w:left w:w="90" w:type="dxa"/>
+              <w:bottom w:w="90" w:type="dxa"/>
+              <w:right w:w="90" w:type="dxa"/>
+            </w:tcMar>
+          </w:tcPr>
+          <w:p>
+            <w:pPr>
+              <w:spacing w:after="40" w:line="252" w:lineRule="auto"/>
+            </w:pPr>
+            <w:r>
+              <w:rPr>
+                <w:b/>
+                <w:color w:val="FFFFFF"/>
+                <w:sz w:val="21"/>
+              </w:rPr>
+              <w:t>Two points per press</w:t>
+            </w:r>
+          </w:p>
+        </w:tc>
+      </w:tr>
+      <w:tr>
+        <w:trPr>
+          <w:cantSplit/>
+        </w:trPr>
+        <w:tc>
+          <w:tcPr>
+            <w:tcW w:type="dxa" w:w="4320"/>
+            <w:vAlign w:val="center"/>
+            <w:shd w:fill="FFFFFF"/>
+            <w:tcBorders>
+              <w:top w:val="single" w:sz="4" w:color="D9D9D9"/>
+              <w:left w:val="single" w:sz="4" w:color="D9D9D9"/>
+              <w:bottom w:val="single" w:sz="4" w:color="D9D9D9"/>
+              <w:right w:val="single" w:sz="4" w:color="D9D9D9"/>
+            </w:tcBorders>
+            <w:tcMar>
+              <w:top w:w="90" w:type="dxa"/>
+              <w:left w:w="90" w:type="dxa"/>
+              <w:bottom w:w="90" w:type="dxa"/>
+              <w:right w:w="90" w:type="dxa"/>
+            </w:tcMar>
+          </w:tcPr>
+          <w:p>
+            <w:pPr>
+              <w:spacing w:after="40" w:line="252" w:lineRule="auto"/>
+              <w:jc w:val="center"/>
+            </w:pPr>
+            <w:r>
+              <w:rPr>
+                <w:sz w:val="21"/>
+              </w:rPr>
+              <w:t>Reset</w:t>
+            </w:r>
+          </w:p>
+        </w:tc>
+        <w:tc>
+          <w:tcPr>
+            <w:tcW w:type="dxa" w:w="2880"/>
+            <w:vAlign w:val="center"/>
+            <w:shd w:fill="FFFFFF"/>
+            <w:tcBorders>
+              <w:top w:val="single" w:sz="4" w:color="D9D9D9"/>
+              <w:left w:val="single" w:sz="4" w:color="D9D9D9"/>
+              <w:bottom w:val="single" w:sz="4" w:color="D9D9D9"/>
+              <w:right w:val="single" w:sz="4" w:color="D9D9D9"/>
+            </w:tcBorders>
+            <w:tcMar>
+              <w:top w:w="90" w:type="dxa"/>
+              <w:left w:w="90" w:type="dxa"/>
+              <w:bottom w:w="90" w:type="dxa"/>
+              <w:right w:w="90" w:type="dxa"/>
+            </w:tcMar>
+          </w:tcPr>
+          <w:p>
+            <w:pPr>
+              <w:spacing w:after="40" w:line="252" w:lineRule="auto"/>
+            </w:pPr>
+            <w:r>
+              <w:rPr>
+                <w:sz w:val="21"/>
+              </w:rPr>
+              <w:t>0</w:t>
+            </w:r>
+          </w:p>
+        </w:tc>
+        <w:tc>
+          <w:tcPr>
+            <w:tcW w:type="dxa" w:w="2880"/>
+            <w:vAlign w:val="center"/>
+            <w:shd w:fill="FFFFFF"/>
+            <w:tcBorders>
+              <w:top w:val="single" w:sz="4" w:color="D9D9D9"/>
+              <w:left w:val="single" w:sz="4" w:color="D9D9D9"/>
+              <w:bottom w:val="single" w:sz="4" w:color="D9D9D9"/>
+              <w:right w:val="single" w:sz="4" w:color="D9D9D9"/>
+            </w:tcBorders>
+            <w:tcMar>
+              <w:top w:w="90" w:type="dxa"/>
+              <w:left w:w="90" w:type="dxa"/>
+              <w:bottom w:w="90" w:type="dxa"/>
+              <w:right w:w="90" w:type="dxa"/>
+            </w:tcMar>
+          </w:tcPr>
+          <w:p>
+            <w:pPr>
+              <w:spacing w:after="40" w:line="252" w:lineRule="auto"/>
+            </w:pPr>
+            <w:r>
+              <w:rPr>
+                <w:sz w:val="21"/>
+              </w:rPr>
+              <w:t>0</w:t>
+            </w:r>
+          </w:p>
+        </w:tc>
+      </w:tr>
+      <w:tr>
+        <w:trPr>
+          <w:cantSplit/>
+        </w:trPr>
+        <w:tc>
+          <w:tcPr>
+            <w:tcW w:type="dxa" w:w="4320"/>
+            <w:vAlign w:val="center"/>
+            <w:shd w:fill="EDF5F7"/>
+            <w:tcBorders>
+              <w:top w:val="single" w:sz="4" w:color="D9D9D9"/>
+              <w:left w:val="single" w:sz="4" w:color="D9D9D9"/>
+              <w:bottom w:val="single" w:sz="4" w:color="D9D9D9"/>
+              <w:right w:val="single" w:sz="4" w:color="D9D9D9"/>
+            </w:tcBorders>
+            <w:tcMar>
+              <w:top w:w="90" w:type="dxa"/>
+              <w:left w:w="90" w:type="dxa"/>
+              <w:bottom w:w="90" w:type="dxa"/>
+              <w:right w:w="90" w:type="dxa"/>
+            </w:tcMar>
+          </w:tcPr>
+          <w:p>
+            <w:pPr>
+              <w:spacing w:after="40" w:line="252" w:lineRule="auto"/>
+              <w:jc w:val="center"/>
+            </w:pPr>
+            <w:r>
+              <w:rPr>
+                <w:sz w:val="21"/>
+              </w:rPr>
+              <w:t>New press</w:t>
+            </w:r>
+          </w:p>
+        </w:tc>
+        <w:tc>
+          <w:tcPr>
+            <w:tcW w:type="dxa" w:w="2880"/>
+            <w:vAlign w:val="center"/>
+            <w:shd w:fill="EDF5F7"/>
+            <w:tcBorders>
+              <w:top w:val="single" w:sz="4" w:color="D9D9D9"/>
+              <w:left w:val="single" w:sz="4" w:color="D9D9D9"/>
+              <w:bottom w:val="single" w:sz="4" w:color="D9D9D9"/>
+              <w:right w:val="single" w:sz="4" w:color="D9D9D9"/>
+            </w:tcBorders>
+            <w:tcMar>
+              <w:top w:w="90" w:type="dxa"/>
+              <w:left w:w="90" w:type="dxa"/>
+              <w:bottom w:w="90" w:type="dxa"/>
+              <w:right w:w="90" w:type="dxa"/>
+            </w:tcMar>
+          </w:tcPr>
+          <w:p>
+            <w:pPr>
+              <w:spacing w:after="40" w:line="252" w:lineRule="auto"/>
+            </w:pPr>
+            <w:r>
+              <w:rPr>
+                <w:sz w:val="21"/>
+              </w:rPr>
+              <w:t>1</w:t>
+            </w:r>
+          </w:p>
+        </w:tc>
+        <w:tc>
+          <w:tcPr>
+            <w:tcW w:type="dxa" w:w="2880"/>
+            <w:vAlign w:val="center"/>
+            <w:shd w:fill="EDF5F7"/>
+            <w:tcBorders>
+              <w:top w:val="single" w:sz="4" w:color="D9D9D9"/>
+              <w:left w:val="single" w:sz="4" w:color="D9D9D9"/>
+              <w:bottom w:val="single" w:sz="4" w:color="D9D9D9"/>
+              <w:right w:val="single" w:sz="4" w:color="D9D9D9"/>
+            </w:tcBorders>
+            <w:tcMar>
+              <w:top w:w="90" w:type="dxa"/>
+              <w:left w:w="90" w:type="dxa"/>
+              <w:bottom w:w="90" w:type="dxa"/>
+              <w:right w:w="90" w:type="dxa"/>
+            </w:tcMar>
+          </w:tcPr>
+          <w:p>
+            <w:pPr>
+              <w:spacing w:after="40" w:line="252" w:lineRule="auto"/>
+            </w:pPr>
+            <w:r>
+              <w:rPr>
+                <w:sz w:val="21"/>
+              </w:rPr>
+              <w:t>____</w:t>
+            </w:r>
+          </w:p>
+        </w:tc>
+      </w:tr>
+      <w:tr>
+        <w:trPr>
+          <w:cantSplit/>
+        </w:trPr>
+        <w:tc>
+          <w:tcPr>
+            <w:tcW w:type="dxa" w:w="4320"/>
+            <w:vAlign w:val="center"/>
+            <w:shd w:fill="FFFFFF"/>
+            <w:tcBorders>
+              <w:top w:val="single" w:sz="4" w:color="D9D9D9"/>
+              <w:left w:val="single" w:sz="4" w:color="D9D9D9"/>
+              <w:bottom w:val="single" w:sz="4" w:color="D9D9D9"/>
+              <w:right w:val="single" w:sz="4" w:color="D9D9D9"/>
+            </w:tcBorders>
+            <w:tcMar>
+              <w:top w:w="90" w:type="dxa"/>
+              <w:left w:w="90" w:type="dxa"/>
+              <w:bottom w:w="90" w:type="dxa"/>
+              <w:right w:w="90" w:type="dxa"/>
+            </w:tcMar>
+          </w:tcPr>
+          <w:p>
+            <w:pPr>
+              <w:spacing w:after="40" w:line="252" w:lineRule="auto"/>
+              <w:jc w:val="center"/>
+            </w:pPr>
+            <w:r>
+              <w:rPr>
+                <w:sz w:val="21"/>
+              </w:rPr>
+              <w:t>Keep holding</w:t>
+            </w:r>
+          </w:p>
+        </w:tc>
+        <w:tc>
+          <w:tcPr>
+            <w:tcW w:type="dxa" w:w="2880"/>
+            <w:vAlign w:val="center"/>
+            <w:shd w:fill="FFFFFF"/>
+            <w:tcBorders>
+              <w:top w:val="single" w:sz="4" w:color="D9D9D9"/>
+              <w:left w:val="single" w:sz="4" w:color="D9D9D9"/>
+              <w:bottom w:val="single" w:sz="4" w:color="D9D9D9"/>
+              <w:right w:val="single" w:sz="4" w:color="D9D9D9"/>
+            </w:tcBorders>
+            <w:tcMar>
+              <w:top w:w="90" w:type="dxa"/>
+              <w:left w:w="90" w:type="dxa"/>
+              <w:bottom w:w="90" w:type="dxa"/>
+              <w:right w:w="90" w:type="dxa"/>
+            </w:tcMar>
+          </w:tcPr>
+          <w:p>
+            <w:pPr>
+              <w:spacing w:after="40" w:line="252" w:lineRule="auto"/>
+            </w:pPr>
+            <w:r>
+              <w:rPr>
+                <w:sz w:val="21"/>
+              </w:rPr>
+              <w:t>1</w:t>
+            </w:r>
+          </w:p>
+        </w:tc>
+        <w:tc>
+          <w:tcPr>
+            <w:tcW w:type="dxa" w:w="2880"/>
+            <w:vAlign w:val="center"/>
+            <w:shd w:fill="FFFFFF"/>
+            <w:tcBorders>
+              <w:top w:val="single" w:sz="4" w:color="D9D9D9"/>
+              <w:left w:val="single" w:sz="4" w:color="D9D9D9"/>
+              <w:bottom w:val="single" w:sz="4" w:color="D9D9D9"/>
+              <w:right w:val="single" w:sz="4" w:color="D9D9D9"/>
+            </w:tcBorders>
+            <w:tcMar>
+              <w:top w:w="90" w:type="dxa"/>
+              <w:left w:w="90" w:type="dxa"/>
+              <w:bottom w:w="90" w:type="dxa"/>
+              <w:right w:w="90" w:type="dxa"/>
+            </w:tcMar>
+          </w:tcPr>
+          <w:p>
+            <w:pPr>
+              <w:spacing w:after="40" w:line="252" w:lineRule="auto"/>
+            </w:pPr>
+            <w:r>
+              <w:rPr>
+                <w:sz w:val="21"/>
+              </w:rPr>
+              <w:t>____</w:t>
+            </w:r>
+          </w:p>
+        </w:tc>
+      </w:tr>
+      <w:tr>
+        <w:trPr>
+          <w:cantSplit/>
+        </w:trPr>
+        <w:tc>
+          <w:tcPr>
+            <w:tcW w:type="dxa" w:w="4320"/>
+            <w:vAlign w:val="center"/>
+            <w:shd w:fill="EDF5F7"/>
+            <w:tcBorders>
+              <w:top w:val="single" w:sz="4" w:color="D9D9D9"/>
+              <w:left w:val="single" w:sz="4" w:color="D9D9D9"/>
+              <w:bottom w:val="single" w:sz="4" w:color="D9D9D9"/>
+              <w:right w:val="single" w:sz="4" w:color="D9D9D9"/>
+            </w:tcBorders>
+            <w:tcMar>
+              <w:top w:w="90" w:type="dxa"/>
+              <w:left w:w="90" w:type="dxa"/>
+              <w:bottom w:w="90" w:type="dxa"/>
+              <w:right w:w="90" w:type="dxa"/>
+            </w:tcMar>
+          </w:tcPr>
+          <w:p>
+            <w:pPr>
+              <w:spacing w:after="40" w:line="252" w:lineRule="auto"/>
+              <w:jc w:val="center"/>
+            </w:pPr>
+            <w:r>
+              <w:rPr>
+                <w:sz w:val="21"/>
+              </w:rPr>
+              <w:t>Release</w:t>
+            </w:r>
+          </w:p>
+        </w:tc>
+        <w:tc>
+          <w:tcPr>
+            <w:tcW w:type="dxa" w:w="2880"/>
+            <w:vAlign w:val="center"/>
+            <w:shd w:fill="EDF5F7"/>
+            <w:tcBorders>
+              <w:top w:val="single" w:sz="4" w:color="D9D9D9"/>
+              <w:left w:val="single" w:sz="4" w:color="D9D9D9"/>
+              <w:bottom w:val="single" w:sz="4" w:color="D9D9D9"/>
+              <w:right w:val="single" w:sz="4" w:color="D9D9D9"/>
+            </w:tcBorders>
+            <w:tcMar>
+              <w:top w:w="90" w:type="dxa"/>
+              <w:left w:w="90" w:type="dxa"/>
+              <w:bottom w:w="90" w:type="dxa"/>
+              <w:right w:w="90" w:type="dxa"/>
+            </w:tcMar>
+          </w:tcPr>
+          <w:p>
+            <w:pPr>
+              <w:spacing w:after="40" w:line="252" w:lineRule="auto"/>
+            </w:pPr>
+            <w:r>
+              <w:rPr>
+                <w:sz w:val="21"/>
+              </w:rPr>
+              <w:t>1</w:t>
+            </w:r>
+          </w:p>
+        </w:tc>
+        <w:tc>
+          <w:tcPr>
+            <w:tcW w:type="dxa" w:w="2880"/>
+            <w:vAlign w:val="center"/>
+            <w:shd w:fill="EDF5F7"/>
+            <w:tcBorders>
+              <w:top w:val="single" w:sz="4" w:color="D9D9D9"/>
+              <w:left w:val="single" w:sz="4" w:color="D9D9D9"/>
+              <w:bottom w:val="single" w:sz="4" w:color="D9D9D9"/>
+              <w:right w:val="single" w:sz="4" w:color="D9D9D9"/>
+            </w:tcBorders>
+            <w:tcMar>
+              <w:top w:w="90" w:type="dxa"/>
+              <w:left w:w="90" w:type="dxa"/>
+              <w:bottom w:w="90" w:type="dxa"/>
+              <w:right w:w="90" w:type="dxa"/>
+            </w:tcMar>
+          </w:tcPr>
+          <w:p>
+            <w:pPr>
+              <w:spacing w:after="40" w:line="252" w:lineRule="auto"/>
+            </w:pPr>
+            <w:r>
+              <w:rPr>
+                <w:sz w:val="21"/>
+              </w:rPr>
+              <w:t>____</w:t>
+            </w:r>
+          </w:p>
+        </w:tc>
+      </w:tr>
+      <w:tr>
+        <w:trPr>
+          <w:cantSplit/>
+        </w:trPr>
+        <w:tc>
+          <w:tcPr>
+            <w:tcW w:type="dxa" w:w="4320"/>
+            <w:vAlign w:val="center"/>
+            <w:shd w:fill="FFFFFF"/>
+            <w:tcBorders>
+              <w:top w:val="single" w:sz="4" w:color="D9D9D9"/>
+              <w:left w:val="single" w:sz="4" w:color="D9D9D9"/>
+              <w:bottom w:val="single" w:sz="4" w:color="D9D9D9"/>
+              <w:right w:val="single" w:sz="4" w:color="D9D9D9"/>
+            </w:tcBorders>
+            <w:tcMar>
+              <w:top w:w="90" w:type="dxa"/>
+              <w:left w:w="90" w:type="dxa"/>
+              <w:bottom w:w="90" w:type="dxa"/>
+              <w:right w:w="90" w:type="dxa"/>
+            </w:tcMar>
+          </w:tcPr>
+          <w:p>
+            <w:pPr>
+              <w:spacing w:after="40" w:line="252" w:lineRule="auto"/>
+              <w:jc w:val="center"/>
+            </w:pPr>
+            <w:r>
+              <w:rPr>
+                <w:sz w:val="21"/>
+              </w:rPr>
+              <w:t>New press</w:t>
+            </w:r>
+          </w:p>
+        </w:tc>
+        <w:tc>
+          <w:tcPr>
+            <w:tcW w:type="dxa" w:w="2880"/>
+            <w:vAlign w:val="center"/>
+            <w:shd w:fill="FFFFFF"/>
+            <w:tcBorders>
+              <w:top w:val="single" w:sz="4" w:color="D9D9D9"/>
+              <w:left w:val="single" w:sz="4" w:color="D9D9D9"/>
+              <w:bottom w:val="single" w:sz="4" w:color="D9D9D9"/>
+              <w:right w:val="single" w:sz="4" w:color="D9D9D9"/>
+            </w:tcBorders>
+            <w:tcMar>
+              <w:top w:w="90" w:type="dxa"/>
+              <w:left w:w="90" w:type="dxa"/>
+              <w:bottom w:w="90" w:type="dxa"/>
+              <w:right w:w="90" w:type="dxa"/>
+            </w:tcMar>
+          </w:tcPr>
+          <w:p>
+            <w:pPr>
+              <w:spacing w:after="40" w:line="252" w:lineRule="auto"/>
+            </w:pPr>
+            <w:r>
+              <w:rPr>
+                <w:sz w:val="21"/>
+              </w:rPr>
+              <w:t>2</w:t>
+            </w:r>
+          </w:p>
+        </w:tc>
+        <w:tc>
+          <w:tcPr>
+            <w:tcW w:type="dxa" w:w="2880"/>
+            <w:vAlign w:val="center"/>
+            <w:shd w:fill="FFFFFF"/>
+            <w:tcBorders>
+              <w:top w:val="single" w:sz="4" w:color="D9D9D9"/>
+              <w:left w:val="single" w:sz="4" w:color="D9D9D9"/>
+              <w:bottom w:val="single" w:sz="4" w:color="D9D9D9"/>
+              <w:right w:val="single" w:sz="4" w:color="D9D9D9"/>
+            </w:tcBorders>
+            <w:tcMar>
+              <w:top w:w="90" w:type="dxa"/>
+              <w:left w:w="90" w:type="dxa"/>
+              <w:bottom w:w="90" w:type="dxa"/>
+              <w:right w:w="90" w:type="dxa"/>
+            </w:tcMar>
+          </w:tcPr>
+          <w:p>
+            <w:pPr>
+              <w:spacing w:after="40" w:line="252" w:lineRule="auto"/>
+            </w:pPr>
+            <w:r>
+              <w:rPr>
+                <w:sz w:val="21"/>
+              </w:rPr>
+              <w:t>____</w:t>
+            </w:r>
+          </w:p>
+        </w:tc>
+      </w:tr>
+      <w:tr>
+        <w:trPr>
+          <w:cantSplit/>
+        </w:trPr>
+        <w:tc>
+          <w:tcPr>
+            <w:tcW w:type="dxa" w:w="4320"/>
+            <w:vAlign w:val="center"/>
+            <w:shd w:fill="EDF5F7"/>
+            <w:tcBorders>
+              <w:top w:val="single" w:sz="4" w:color="D9D9D9"/>
+              <w:left w:val="single" w:sz="4" w:color="D9D9D9"/>
+              <w:bottom w:val="single" w:sz="4" w:color="D9D9D9"/>
+              <w:right w:val="single" w:sz="4" w:color="D9D9D9"/>
+            </w:tcBorders>
+            <w:tcMar>
+              <w:top w:w="90" w:type="dxa"/>
+              <w:left w:w="90" w:type="dxa"/>
+              <w:bottom w:w="90" w:type="dxa"/>
+              <w:right w:w="90" w:type="dxa"/>
+            </w:tcMar>
+          </w:tcPr>
+          <w:p>
+            <w:pPr>
+              <w:spacing w:after="40" w:line="252" w:lineRule="auto"/>
+              <w:jc w:val="center"/>
+            </w:pPr>
+            <w:r>
+              <w:rPr>
+                <w:sz w:val="21"/>
+              </w:rPr>
+              <w:t>Release</w:t>
+            </w:r>
+          </w:p>
+        </w:tc>
+        <w:tc>
+          <w:tcPr>
+            <w:tcW w:type="dxa" w:w="2880"/>
+            <w:vAlign w:val="center"/>
+            <w:shd w:fill="EDF5F7"/>
+            <w:tcBorders>
+              <w:top w:val="single" w:sz="4" w:color="D9D9D9"/>
+              <w:left w:val="single" w:sz="4" w:color="D9D9D9"/>
+              <w:bottom w:val="single" w:sz="4" w:color="D9D9D9"/>
+              <w:right w:val="single" w:sz="4" w:color="D9D9D9"/>
+            </w:tcBorders>
+            <w:tcMar>
+              <w:top w:w="90" w:type="dxa"/>
+              <w:left w:w="90" w:type="dxa"/>
+              <w:bottom w:w="90" w:type="dxa"/>
+              <w:right w:w="90" w:type="dxa"/>
+            </w:tcMar>
+          </w:tcPr>
+          <w:p>
+            <w:pPr>
+              <w:spacing w:after="40" w:line="252" w:lineRule="auto"/>
+            </w:pPr>
+            <w:r>
+              <w:rPr>
+                <w:sz w:val="21"/>
+              </w:rPr>
+              <w:t>2</w:t>
+            </w:r>
+          </w:p>
+        </w:tc>
+        <w:tc>
+          <w:tcPr>
+            <w:tcW w:type="dxa" w:w="2880"/>
+            <w:vAlign w:val="center"/>
+            <w:shd w:fill="EDF5F7"/>
+            <w:tcBorders>
+              <w:top w:val="single" w:sz="4" w:color="D9D9D9"/>
+              <w:left w:val="single" w:sz="4" w:color="D9D9D9"/>
+              <w:bottom w:val="single" w:sz="4" w:color="D9D9D9"/>
+              <w:right w:val="single" w:sz="4" w:color="D9D9D9"/>
+            </w:tcBorders>
+            <w:tcMar>
+              <w:top w:w="90" w:type="dxa"/>
+              <w:left w:w="90" w:type="dxa"/>
+              <w:bottom w:w="90" w:type="dxa"/>
+              <w:right w:w="90" w:type="dxa"/>
+            </w:tcMar>
+          </w:tcPr>
+          <w:p>
+            <w:pPr>
+              <w:spacing w:after="40" w:line="252" w:lineRule="auto"/>
+            </w:pPr>
+            <w:r>
+              <w:rPr>
+                <w:sz w:val="21"/>
+              </w:rPr>
+              <w:t>____</w:t>
+            </w:r>
+          </w:p>
+        </w:tc>
+      </w:tr>
+      <w:tr>
+        <w:trPr>
+          <w:cantSplit/>
+        </w:trPr>
+        <w:tc>
+          <w:tcPr>
+            <w:tcW w:type="dxa" w:w="4320"/>
+            <w:vAlign w:val="center"/>
+            <w:shd w:fill="FFFFFF"/>
+            <w:tcBorders>
+              <w:top w:val="single" w:sz="4" w:color="D9D9D9"/>
+              <w:left w:val="single" w:sz="4" w:color="D9D9D9"/>
+              <w:bottom w:val="single" w:sz="4" w:color="D9D9D9"/>
+              <w:right w:val="single" w:sz="4" w:color="D9D9D9"/>
+            </w:tcBorders>
+            <w:tcMar>
+              <w:top w:w="90" w:type="dxa"/>
+              <w:left w:w="90" w:type="dxa"/>
+              <w:bottom w:w="90" w:type="dxa"/>
+              <w:right w:w="90" w:type="dxa"/>
+            </w:tcMar>
+          </w:tcPr>
+          <w:p>
+            <w:pPr>
+              <w:spacing w:after="40" w:line="252" w:lineRule="auto"/>
+            </w:pPr>
+            <w:r>
+              <w:rPr>
+                <w:sz w:val="21"/>
+              </w:rPr>
+              <w:t>Clear and new press</w:t>
+            </w:r>
+          </w:p>
+        </w:tc>
+        <w:tc>
+          <w:tcPr>
+            <w:tcW w:type="dxa" w:w="2880"/>
+            <w:vAlign w:val="center"/>
+            <w:shd w:fill="FFFFFF"/>
+            <w:tcBorders>
+              <w:top w:val="single" w:sz="4" w:color="D9D9D9"/>
+              <w:left w:val="single" w:sz="4" w:color="D9D9D9"/>
+              <w:bottom w:val="single" w:sz="4" w:color="D9D9D9"/>
+              <w:right w:val="single" w:sz="4" w:color="D9D9D9"/>
+            </w:tcBorders>
+            <w:tcMar>
+              <w:top w:w="90" w:type="dxa"/>
+              <w:left w:w="90" w:type="dxa"/>
+              <w:bottom w:w="90" w:type="dxa"/>
+              <w:right w:w="90" w:type="dxa"/>
+            </w:tcMar>
+          </w:tcPr>
+          <w:p>
+            <w:pPr>
+              <w:spacing w:after="40" w:line="252" w:lineRule="auto"/>
+            </w:pPr>
+            <w:r>
+              <w:rPr>
+                <w:sz w:val="21"/>
+              </w:rPr>
+              <w:t>0</w:t>
+            </w:r>
+          </w:p>
+        </w:tc>
+        <w:tc>
+          <w:tcPr>
+            <w:tcW w:type="dxa" w:w="2880"/>
+            <w:vAlign w:val="center"/>
+            <w:shd w:fill="FFFFFF"/>
+            <w:tcBorders>
+              <w:top w:val="single" w:sz="4" w:color="D9D9D9"/>
+              <w:left w:val="single" w:sz="4" w:color="D9D9D9"/>
+              <w:bottom w:val="single" w:sz="4" w:color="D9D9D9"/>
+              <w:right w:val="single" w:sz="4" w:color="D9D9D9"/>
+            </w:tcBorders>
+            <w:tcMar>
+              <w:top w:w="90" w:type="dxa"/>
+              <w:left w:w="90" w:type="dxa"/>
+              <w:bottom w:w="90" w:type="dxa"/>
+              <w:right w:w="90" w:type="dxa"/>
+            </w:tcMar>
+          </w:tcPr>
+          <w:p>
+            <w:pPr>
+              <w:spacing w:after="40" w:line="252" w:lineRule="auto"/>
+            </w:pPr>
+            <w:r>
+              <w:rPr>
+                <w:sz w:val="21"/>
+              </w:rPr>
+              <w:t>____</w:t>
+            </w:r>
+          </w:p>
+        </w:tc>
+      </w:tr>
+    </w:tbl>
+    <w:p>
+      <w:pPr>
+        <w:spacing w:after="80" w:line="20" w:lineRule="exact"/>
+      </w:pPr>
+    </w:p>
+    <w:p>
+      <w:pPr>
+        <w:pStyle w:val="Heading2"/>
+      </w:pPr>
+      <w:r>
+        <w:t>Teacher run and checks</w:t>
+      </w:r>
+    </w:p>
+    <w:p>
+      <w:pPr>
+        <w:spacing w:after="200"/>
+      </w:pPr>
+      <w:r>
+        <w:rPr>
+          <w:rFonts w:ascii="DejaVu Sans Mono" w:hAnsi="DejaVu Sans Mono"/>
+          <w:sz w:val="20"/>
+        </w:rPr>
+        <w:t>bash tests/run-learning.sh</w:t>
+      </w:r>
+    </w:p>
+    <w:p>
+      <w:r>
+        <w:t>Use the documented .NET or Mono setup plus Python 3, Node.js and Icarus. The command emits both ShotCounter variants and runs their native Verilog benches. The expected sequences check hold, release, clear priority, four-bit wrap and reset. The WASM lab remains a separate set of prepared examples.</w:t>
+      </w:r>
+    </w:p>
+    <w:p>
+      <w:r>
+        <w:t>For the learner, begin with just shot, clear and score. Identify what is stored, complete the prediction table, and explain why a held button does not create more shots. Patterns and decimal scoreboards are later extensions.</w:t>
+      </w:r>
+    </w:p>
+    <w:p>
+      <w:r>
+        <w:rPr>
+          <w:b/>
+          <w:sz w:val="20"/>
+        </w:rPr>
+        <w:t xml:space="preserve">Guide note </w:t>
+      </w:r>
+      <w:r>
+        <w:rPr>
+          <w:sz w:val="20"/>
+        </w:rPr>
+        <w:t>Answers in the two-point column: 2, 2, 2, 4, 4, 0. Four bits wrap modulo 16; eight two-point presses reach 0. This template is not wired to the Go Board image. Physical switches need synchronization and debouncing, and a teacher must connect the module to the board shell before hardware use. Further steps: examples/LearningLab/SHOT_COUNTER.md.</w:t>
       </w:r>
     </w:p>
     <w:sectPr>

</xml_diff>

<commit_message>
Refine learner course through five review rounds and eight short chapters
</commit_message>
<xml_diff>
--- a/docs/SharpHDL_Classroom_Proposal.docx
+++ b/docs/SharpHDL_Classroom_Proposal.docx
@@ -15,7 +15,7 @@
         <w:pStyle w:val="Subtitle"/>
       </w:pPr>
       <w:r>
-        <w:t>An illustrated workbook for curious builders around age ten</w:t>
+        <w:t>An illustrated workbook for curious builders around ages nine and ten</w:t>
       </w:r>
     </w:p>
     <w:p>
@@ -87,7 +87,7 @@
     </w:p>
     <w:p>
       <w:r>
-        <w:t>Work with a partner and a grown-up guide. Predict the answer before you press a button or change the code. Test your idea, then explain what you saw. Swap the builder and predictor jobs halfway through.</w:t>
+        <w:t>Begin with one short chapter and one question. Work with a partner and a grown-up guide. You may predict, or say that you do not know yet and try. Explain by talking, drawing, pointing or moving cards. Both partners get a turn at the controls.</w:t>
       </w:r>
     </w:p>
     <w:tbl>
@@ -135,7 +135,7 @@
                 <w:color w:val="FFFFFF"/>
                 <w:sz w:val="22"/>
               </w:rPr>
-              <w:t>First explore</w:t>
+              <w:t>Choose today</w:t>
             </w:r>
           </w:p>
         </w:tc>
@@ -167,7 +167,7 @@
                 <w:color w:val="FFFFFF"/>
                 <w:sz w:val="22"/>
               </w:rPr>
-              <w:t>Then build</w:t>
+              <w:t>Try a question</w:t>
             </w:r>
           </w:p>
         </w:tc>
@@ -199,7 +199,7 @@
                 <w:color w:val="FFFFFF"/>
                 <w:sz w:val="22"/>
               </w:rPr>
-              <w:t>Finally explain</w:t>
+              <w:t>Show a discovery</w:t>
             </w:r>
           </w:p>
         </w:tc>
@@ -229,13 +229,12 @@
           <w:p>
             <w:pPr>
               <w:spacing w:after="40" w:line="252" w:lineRule="auto"/>
-              <w:jc w:val="center"/>
             </w:pPr>
             <w:r>
               <w:rPr>
                 <w:sz w:val="22"/>
               </w:rPr>
-              <w:t>Bits and lights</w:t>
+              <w:t>Change a number or pause a drill</w:t>
             </w:r>
           </w:p>
         </w:tc>
@@ -265,7 +264,7 @@
               <w:rPr>
                 <w:sz w:val="22"/>
               </w:rPr>
-              <w:t>Adders and memory</w:t>
+              <w:t>What changes and what stays still</w:t>
             </w:r>
           </w:p>
         </w:tc>
@@ -295,7 +294,7 @@
               <w:rPr>
                 <w:sz w:val="22"/>
               </w:rPr>
-              <w:t>Counters and an assembly line</w:t>
+              <w:t>Point, talk, draw or use cards</w:t>
             </w:r>
           </w:p>
         </w:tc>
@@ -330,7 +329,7 @@
               <w:rPr>
                 <w:sz w:val="22"/>
               </w:rPr>
-              <w:t>Number cards and gate puzzles</w:t>
+              <w:t>Pass a parcel with a partner</w:t>
             </w:r>
           </w:p>
         </w:tc>
@@ -360,7 +359,7 @@
               <w:rPr>
                 <w:sz w:val="22"/>
               </w:rPr>
-              <w:t>A small edit to real C# code</w:t>
+              <w:t>When may the parcel move</w:t>
             </w:r>
           </w:p>
         </w:tc>
@@ -390,7 +389,7 @@
               <w:rPr>
                 <w:sz w:val="22"/>
               </w:rPr>
-              <w:t>Your own useful circuit</w:t>
+              <w:t>Both partners take a turn</w:t>
             </w:r>
           </w:p>
         </w:tc>
@@ -414,17 +413,4069 @@
     </w:p>
     <w:p>
       <w:r>
-        <w:t>Eight one-hour lessons, plus printable number cards, a display key, a teacher guide, and answers. The first six lessons can be a complete shorter course. Language comparison is optional enrichment.</w:t>
-      </w:r>
-    </w:p>
-    <w:p>
-      <w:r>
-        <w:br w:type="page"/>
+        <w:t>Start with a 25–30 minute visit using the short chapters that follow. Binary and waveforms are optional later choices. The longer illustrated lessons, printable cards, guide and reference pages remain available when you want to explore further.</w:t>
       </w:r>
     </w:p>
     <w:p>
       <w:pPr>
         <w:pStyle w:val="Heading1"/>
+        <w:pageBreakBefore/>
+      </w:pPr>
+      <w:r>
+        <w:t>Choose your hardware adventure</w:t>
+      </w:r>
+    </w:p>
+    <w:p>
+      <w:r>
+        <w:t>A short route through the SharpHDL workbook for learners around nine. Choose one ready-to-try chapter for today with your guide. You do not need to finish the whole book or learn binary before trying a circuit. A grown-up prepares the experiment. You choose a question and get a turn at the controls.</w:t>
+      </w:r>
+    </w:p>
+    <w:p>
+      <w:r>
+        <w:t>Start with Chapter 1, 2, 4 or 7. Chapter 3 follows 2; Chapter 5 follows 4; Chapter 6 follows 5; Chapter 8 follows 2. Pick by what you can already show, not by speed.</w:t>
+      </w:r>
+    </w:p>
+    <w:p>
+      <w:r>
+        <w:t>You can say “I do not know yet.” Try, notice, and change your prediction. You may explain by talking, drawing, pointing or moving cards. You may ask to repeat, slow down or stop.</w:t>
+      </w:r>
+    </w:p>
+    <w:p>
+      <w:pPr>
+        <w:pStyle w:val="Heading2"/>
+      </w:pPr>
+      <w:r>
+        <w:t>Choose a chapter together</w:t>
+      </w:r>
+    </w:p>
+    <w:tbl>
+      <w:tblPr>
+        <w:tblW w:type="auto" w:w="0"/>
+        <w:tblLayout w:type="fixed"/>
+        <w:tblLook w:firstColumn="1" w:firstRow="1" w:lastColumn="0" w:lastRow="0" w:noHBand="0" w:noVBand="1" w:val="04A0"/>
+      </w:tblPr>
+      <w:tblGrid>
+        <w:gridCol w:w="1224"/>
+        <w:gridCol w:w="8856"/>
+      </w:tblGrid>
+      <w:tr>
+        <w:trPr>
+          <w:cantSplit/>
+          <w:tblHeader/>
+        </w:trPr>
+        <w:tc>
+          <w:tcPr>
+            <w:tcW w:type="dxa" w:w="1224"/>
+            <w:vAlign w:val="center"/>
+            <w:shd w:fill="17365D"/>
+            <w:tcBorders>
+              <w:top w:val="single" w:sz="4" w:color="D9D9D9"/>
+              <w:left w:val="single" w:sz="4" w:color="D9D9D9"/>
+              <w:bottom w:val="single" w:sz="4" w:color="D9D9D9"/>
+              <w:right w:val="single" w:sz="4" w:color="D9D9D9"/>
+            </w:tcBorders>
+            <w:tcMar>
+              <w:top w:w="90" w:type="dxa"/>
+              <w:left w:w="90" w:type="dxa"/>
+              <w:bottom w:w="90" w:type="dxa"/>
+              <w:right w:w="90" w:type="dxa"/>
+            </w:tcMar>
+          </w:tcPr>
+          <w:p>
+            <w:pPr>
+              <w:spacing w:after="40" w:line="252" w:lineRule="auto"/>
+              <w:jc w:val="center"/>
+            </w:pPr>
+            <w:r>
+              <w:rPr>
+                <w:b/>
+                <w:color w:val="FFFFFF"/>
+                <w:sz w:val="22"/>
+              </w:rPr>
+              <w:t>Chapter</w:t>
+            </w:r>
+          </w:p>
+        </w:tc>
+        <w:tc>
+          <w:tcPr>
+            <w:tcW w:type="dxa" w:w="8856"/>
+            <w:vAlign w:val="center"/>
+            <w:shd w:fill="17365D"/>
+            <w:tcBorders>
+              <w:top w:val="single" w:sz="4" w:color="D9D9D9"/>
+              <w:left w:val="single" w:sz="4" w:color="D9D9D9"/>
+              <w:bottom w:val="single" w:sz="4" w:color="D9D9D9"/>
+              <w:right w:val="single" w:sz="4" w:color="D9D9D9"/>
+            </w:tcBorders>
+            <w:tcMar>
+              <w:top w:w="90" w:type="dxa"/>
+              <w:left w:w="90" w:type="dxa"/>
+              <w:bottom w:w="90" w:type="dxa"/>
+              <w:right w:w="90" w:type="dxa"/>
+            </w:tcMar>
+          </w:tcPr>
+          <w:p>
+            <w:pPr>
+              <w:spacing w:after="40" w:line="252" w:lineRule="auto"/>
+            </w:pPr>
+            <w:r>
+              <w:rPr>
+                <w:b/>
+                <w:color w:val="FFFFFF"/>
+                <w:sz w:val="22"/>
+              </w:rPr>
+              <w:t>Try this</w:t>
+            </w:r>
+          </w:p>
+        </w:tc>
+      </w:tr>
+      <w:tr>
+        <w:trPr>
+          <w:cantSplit/>
+        </w:trPr>
+        <w:tc>
+          <w:tcPr>
+            <w:tcW w:type="dxa" w:w="1224"/>
+            <w:vAlign w:val="center"/>
+            <w:shd w:fill="FFFFFF"/>
+            <w:tcBorders>
+              <w:top w:val="single" w:sz="4" w:color="D9D9D9"/>
+              <w:left w:val="single" w:sz="4" w:color="D9D9D9"/>
+              <w:bottom w:val="single" w:sz="4" w:color="D9D9D9"/>
+              <w:right w:val="single" w:sz="4" w:color="D9D9D9"/>
+            </w:tcBorders>
+            <w:tcMar>
+              <w:top w:w="90" w:type="dxa"/>
+              <w:left w:w="90" w:type="dxa"/>
+              <w:bottom w:w="90" w:type="dxa"/>
+              <w:right w:w="90" w:type="dxa"/>
+            </w:tcMar>
+          </w:tcPr>
+          <w:p>
+            <w:pPr>
+              <w:spacing w:after="40" w:line="252" w:lineRule="auto"/>
+              <w:jc w:val="center"/>
+            </w:pPr>
+            <w:r>
+              <w:rPr>
+                <w:sz w:val="22"/>
+              </w:rPr>
+              <w:t>1</w:t>
+            </w:r>
+          </w:p>
+        </w:tc>
+        <w:tc>
+          <w:tcPr>
+            <w:tcW w:type="dxa" w:w="8856"/>
+            <w:vAlign w:val="center"/>
+            <w:shd w:fill="FFFFFF"/>
+            <w:tcBorders>
+              <w:top w:val="single" w:sz="4" w:color="D9D9D9"/>
+              <w:left w:val="single" w:sz="4" w:color="D9D9D9"/>
+              <w:bottom w:val="single" w:sz="4" w:color="D9D9D9"/>
+              <w:right w:val="single" w:sz="4" w:color="D9D9D9"/>
+            </w:tcBorders>
+            <w:tcMar>
+              <w:top w:w="90" w:type="dxa"/>
+              <w:left w:w="90" w:type="dxa"/>
+              <w:bottom w:w="90" w:type="dxa"/>
+              <w:right w:w="90" w:type="dxa"/>
+            </w:tcMar>
+          </w:tcPr>
+          <w:p>
+            <w:pPr>
+              <w:spacing w:after="40" w:line="252" w:lineRule="auto"/>
+            </w:pPr>
+            <w:r>
+              <w:rPr>
+                <w:sz w:val="22"/>
+              </w:rPr>
+              <w:t>Make a change</w:t>
+            </w:r>
+          </w:p>
+        </w:tc>
+      </w:tr>
+      <w:tr>
+        <w:trPr>
+          <w:cantSplit/>
+        </w:trPr>
+        <w:tc>
+          <w:tcPr>
+            <w:tcW w:type="dxa" w:w="1224"/>
+            <w:vAlign w:val="center"/>
+            <w:shd w:fill="EDF5F7"/>
+            <w:tcBorders>
+              <w:top w:val="single" w:sz="4" w:color="D9D9D9"/>
+              <w:left w:val="single" w:sz="4" w:color="D9D9D9"/>
+              <w:bottom w:val="single" w:sz="4" w:color="D9D9D9"/>
+              <w:right w:val="single" w:sz="4" w:color="D9D9D9"/>
+            </w:tcBorders>
+            <w:tcMar>
+              <w:top w:w="90" w:type="dxa"/>
+              <w:left w:w="90" w:type="dxa"/>
+              <w:bottom w:w="90" w:type="dxa"/>
+              <w:right w:w="90" w:type="dxa"/>
+            </w:tcMar>
+          </w:tcPr>
+          <w:p>
+            <w:pPr>
+              <w:spacing w:after="40" w:line="252" w:lineRule="auto"/>
+              <w:jc w:val="center"/>
+            </w:pPr>
+            <w:r>
+              <w:rPr>
+                <w:sz w:val="22"/>
+              </w:rPr>
+              <w:t>2</w:t>
+            </w:r>
+          </w:p>
+        </w:tc>
+        <w:tc>
+          <w:tcPr>
+            <w:tcW w:type="dxa" w:w="8856"/>
+            <w:vAlign w:val="center"/>
+            <w:shd w:fill="EDF5F7"/>
+            <w:tcBorders>
+              <w:top w:val="single" w:sz="4" w:color="D9D9D9"/>
+              <w:left w:val="single" w:sz="4" w:color="D9D9D9"/>
+              <w:bottom w:val="single" w:sz="4" w:color="D9D9D9"/>
+              <w:right w:val="single" w:sz="4" w:color="D9D9D9"/>
+            </w:tcBorders>
+            <w:tcMar>
+              <w:top w:w="90" w:type="dxa"/>
+              <w:left w:w="90" w:type="dxa"/>
+              <w:bottom w:w="90" w:type="dxa"/>
+              <w:right w:w="90" w:type="dxa"/>
+            </w:tcMar>
+          </w:tcPr>
+          <w:p>
+            <w:pPr>
+              <w:spacing w:after="40" w:line="252" w:lineRule="auto"/>
+            </w:pPr>
+            <w:r>
+              <w:rPr>
+                <w:sz w:val="22"/>
+              </w:rPr>
+              <w:t>Wait for the clock</w:t>
+            </w:r>
+          </w:p>
+        </w:tc>
+      </w:tr>
+      <w:tr>
+        <w:trPr>
+          <w:cantSplit/>
+        </w:trPr>
+        <w:tc>
+          <w:tcPr>
+            <w:tcW w:type="dxa" w:w="1224"/>
+            <w:vAlign w:val="center"/>
+            <w:shd w:fill="FFFFFF"/>
+            <w:tcBorders>
+              <w:top w:val="single" w:sz="4" w:color="D9D9D9"/>
+              <w:left w:val="single" w:sz="4" w:color="D9D9D9"/>
+              <w:bottom w:val="single" w:sz="4" w:color="D9D9D9"/>
+              <w:right w:val="single" w:sz="4" w:color="D9D9D9"/>
+            </w:tcBorders>
+            <w:tcMar>
+              <w:top w:w="90" w:type="dxa"/>
+              <w:left w:w="90" w:type="dxa"/>
+              <w:bottom w:w="90" w:type="dxa"/>
+              <w:right w:w="90" w:type="dxa"/>
+            </w:tcMar>
+          </w:tcPr>
+          <w:p>
+            <w:pPr>
+              <w:spacing w:after="40" w:line="252" w:lineRule="auto"/>
+              <w:jc w:val="center"/>
+            </w:pPr>
+            <w:r>
+              <w:rPr>
+                <w:sz w:val="22"/>
+              </w:rPr>
+              <w:t>3</w:t>
+            </w:r>
+          </w:p>
+        </w:tc>
+        <w:tc>
+          <w:tcPr>
+            <w:tcW w:type="dxa" w:w="8856"/>
+            <w:vAlign w:val="center"/>
+            <w:shd w:fill="FFFFFF"/>
+            <w:tcBorders>
+              <w:top w:val="single" w:sz="4" w:color="D9D9D9"/>
+              <w:left w:val="single" w:sz="4" w:color="D9D9D9"/>
+              <w:bottom w:val="single" w:sz="4" w:color="D9D9D9"/>
+              <w:right w:val="single" w:sz="4" w:color="D9D9D9"/>
+            </w:tcBorders>
+            <w:tcMar>
+              <w:top w:w="90" w:type="dxa"/>
+              <w:left w:w="90" w:type="dxa"/>
+              <w:bottom w:w="90" w:type="dxa"/>
+              <w:right w:w="90" w:type="dxa"/>
+            </w:tcMar>
+          </w:tcPr>
+          <w:p>
+            <w:pPr>
+              <w:spacing w:after="40" w:line="252" w:lineRule="auto"/>
+            </w:pPr>
+            <w:r>
+              <w:rPr>
+                <w:sz w:val="22"/>
+              </w:rPr>
+              <w:t>Finish your drill</w:t>
+            </w:r>
+          </w:p>
+        </w:tc>
+      </w:tr>
+      <w:tr>
+        <w:trPr>
+          <w:cantSplit/>
+        </w:trPr>
+        <w:tc>
+          <w:tcPr>
+            <w:tcW w:type="dxa" w:w="1224"/>
+            <w:vAlign w:val="center"/>
+            <w:shd w:fill="EDF5F7"/>
+            <w:tcBorders>
+              <w:top w:val="single" w:sz="4" w:color="D9D9D9"/>
+              <w:left w:val="single" w:sz="4" w:color="D9D9D9"/>
+              <w:bottom w:val="single" w:sz="4" w:color="D9D9D9"/>
+              <w:right w:val="single" w:sz="4" w:color="D9D9D9"/>
+            </w:tcBorders>
+            <w:tcMar>
+              <w:top w:w="90" w:type="dxa"/>
+              <w:left w:w="90" w:type="dxa"/>
+              <w:bottom w:w="90" w:type="dxa"/>
+              <w:right w:w="90" w:type="dxa"/>
+            </w:tcMar>
+          </w:tcPr>
+          <w:p>
+            <w:pPr>
+              <w:spacing w:after="40" w:line="252" w:lineRule="auto"/>
+              <w:jc w:val="center"/>
+            </w:pPr>
+            <w:r>
+              <w:rPr>
+                <w:sz w:val="22"/>
+              </w:rPr>
+              <w:t>4</w:t>
+            </w:r>
+          </w:p>
+        </w:tc>
+        <w:tc>
+          <w:tcPr>
+            <w:tcW w:type="dxa" w:w="8856"/>
+            <w:vAlign w:val="center"/>
+            <w:shd w:fill="EDF5F7"/>
+            <w:tcBorders>
+              <w:top w:val="single" w:sz="4" w:color="D9D9D9"/>
+              <w:left w:val="single" w:sz="4" w:color="D9D9D9"/>
+              <w:bottom w:val="single" w:sz="4" w:color="D9D9D9"/>
+              <w:right w:val="single" w:sz="4" w:color="D9D9D9"/>
+            </w:tcBorders>
+            <w:tcMar>
+              <w:top w:w="90" w:type="dxa"/>
+              <w:left w:w="90" w:type="dxa"/>
+              <w:bottom w:w="90" w:type="dxa"/>
+              <w:right w:w="90" w:type="dxa"/>
+            </w:tcMar>
+          </w:tcPr>
+          <w:p>
+            <w:pPr>
+              <w:spacing w:after="40" w:line="252" w:lineRule="auto"/>
+            </w:pPr>
+            <w:r>
+              <w:rPr>
+                <w:sz w:val="22"/>
+              </w:rPr>
+              <w:t>Pass a parcel</w:t>
+            </w:r>
+          </w:p>
+        </w:tc>
+      </w:tr>
+      <w:tr>
+        <w:trPr>
+          <w:cantSplit/>
+        </w:trPr>
+        <w:tc>
+          <w:tcPr>
+            <w:tcW w:type="dxa" w:w="1224"/>
+            <w:vAlign w:val="center"/>
+            <w:shd w:fill="FFFFFF"/>
+            <w:tcBorders>
+              <w:top w:val="single" w:sz="4" w:color="D9D9D9"/>
+              <w:left w:val="single" w:sz="4" w:color="D9D9D9"/>
+              <w:bottom w:val="single" w:sz="4" w:color="D9D9D9"/>
+              <w:right w:val="single" w:sz="4" w:color="D9D9D9"/>
+            </w:tcBorders>
+            <w:tcMar>
+              <w:top w:w="90" w:type="dxa"/>
+              <w:left w:w="90" w:type="dxa"/>
+              <w:bottom w:w="90" w:type="dxa"/>
+              <w:right w:w="90" w:type="dxa"/>
+            </w:tcMar>
+          </w:tcPr>
+          <w:p>
+            <w:pPr>
+              <w:spacing w:after="40" w:line="252" w:lineRule="auto"/>
+              <w:jc w:val="center"/>
+            </w:pPr>
+            <w:r>
+              <w:rPr>
+                <w:sz w:val="22"/>
+              </w:rPr>
+              <w:t>5</w:t>
+            </w:r>
+          </w:p>
+        </w:tc>
+        <w:tc>
+          <w:tcPr>
+            <w:tcW w:type="dxa" w:w="8856"/>
+            <w:vAlign w:val="center"/>
+            <w:shd w:fill="FFFFFF"/>
+            <w:tcBorders>
+              <w:top w:val="single" w:sz="4" w:color="D9D9D9"/>
+              <w:left w:val="single" w:sz="4" w:color="D9D9D9"/>
+              <w:bottom w:val="single" w:sz="4" w:color="D9D9D9"/>
+              <w:right w:val="single" w:sz="4" w:color="D9D9D9"/>
+            </w:tcBorders>
+            <w:tcMar>
+              <w:top w:w="90" w:type="dxa"/>
+              <w:left w:w="90" w:type="dxa"/>
+              <w:bottom w:w="90" w:type="dxa"/>
+              <w:right w:w="90" w:type="dxa"/>
+            </w:tcMar>
+          </w:tcPr>
+          <w:p>
+            <w:pPr>
+              <w:spacing w:after="40" w:line="252" w:lineRule="auto"/>
+            </w:pPr>
+            <w:r>
+              <w:rPr>
+                <w:sz w:val="22"/>
+              </w:rPr>
+              <w:t>Add two waiting places</w:t>
+            </w:r>
+          </w:p>
+        </w:tc>
+      </w:tr>
+      <w:tr>
+        <w:trPr>
+          <w:cantSplit/>
+        </w:trPr>
+        <w:tc>
+          <w:tcPr>
+            <w:tcW w:type="dxa" w:w="1224"/>
+            <w:vAlign w:val="center"/>
+            <w:shd w:fill="EDF5F7"/>
+            <w:tcBorders>
+              <w:top w:val="single" w:sz="4" w:color="D9D9D9"/>
+              <w:left w:val="single" w:sz="4" w:color="D9D9D9"/>
+              <w:bottom w:val="single" w:sz="4" w:color="D9D9D9"/>
+              <w:right w:val="single" w:sz="4" w:color="D9D9D9"/>
+            </w:tcBorders>
+            <w:tcMar>
+              <w:top w:w="90" w:type="dxa"/>
+              <w:left w:w="90" w:type="dxa"/>
+              <w:bottom w:w="90" w:type="dxa"/>
+              <w:right w:w="90" w:type="dxa"/>
+            </w:tcMar>
+          </w:tcPr>
+          <w:p>
+            <w:pPr>
+              <w:spacing w:after="40" w:line="252" w:lineRule="auto"/>
+              <w:jc w:val="center"/>
+            </w:pPr>
+            <w:r>
+              <w:rPr>
+                <w:sz w:val="22"/>
+              </w:rPr>
+              <w:t>6</w:t>
+            </w:r>
+          </w:p>
+        </w:tc>
+        <w:tc>
+          <w:tcPr>
+            <w:tcW w:type="dxa" w:w="8856"/>
+            <w:vAlign w:val="center"/>
+            <w:shd w:fill="EDF5F7"/>
+            <w:tcBorders>
+              <w:top w:val="single" w:sz="4" w:color="D9D9D9"/>
+              <w:left w:val="single" w:sz="4" w:color="D9D9D9"/>
+              <w:bottom w:val="single" w:sz="4" w:color="D9D9D9"/>
+              <w:right w:val="single" w:sz="4" w:color="D9D9D9"/>
+            </w:tcBorders>
+            <w:tcMar>
+              <w:top w:w="90" w:type="dxa"/>
+              <w:left w:w="90" w:type="dxa"/>
+              <w:bottom w:w="90" w:type="dxa"/>
+              <w:right w:w="90" w:type="dxa"/>
+            </w:tcMar>
+          </w:tcPr>
+          <w:p>
+            <w:pPr>
+              <w:spacing w:after="40" w:line="252" w:lineRule="auto"/>
+            </w:pPr>
+            <w:r>
+              <w:rPr>
+                <w:sz w:val="22"/>
+              </w:rPr>
+              <w:t>Be the parcel detective</w:t>
+            </w:r>
+          </w:p>
+        </w:tc>
+      </w:tr>
+      <w:tr>
+        <w:trPr>
+          <w:cantSplit/>
+        </w:trPr>
+        <w:tc>
+          <w:tcPr>
+            <w:tcW w:type="dxa" w:w="1224"/>
+            <w:vAlign w:val="center"/>
+            <w:shd w:fill="FFFFFF"/>
+            <w:tcBorders>
+              <w:top w:val="single" w:sz="4" w:color="D9D9D9"/>
+              <w:left w:val="single" w:sz="4" w:color="D9D9D9"/>
+              <w:bottom w:val="single" w:sz="4" w:color="D9D9D9"/>
+              <w:right w:val="single" w:sz="4" w:color="D9D9D9"/>
+            </w:tcBorders>
+            <w:tcMar>
+              <w:top w:w="90" w:type="dxa"/>
+              <w:left w:w="90" w:type="dxa"/>
+              <w:bottom w:w="90" w:type="dxa"/>
+              <w:right w:w="90" w:type="dxa"/>
+            </w:tcMar>
+          </w:tcPr>
+          <w:p>
+            <w:pPr>
+              <w:spacing w:after="40" w:line="252" w:lineRule="auto"/>
+              <w:jc w:val="center"/>
+            </w:pPr>
+            <w:r>
+              <w:rPr>
+                <w:sz w:val="22"/>
+              </w:rPr>
+              <w:t>7</w:t>
+            </w:r>
+          </w:p>
+        </w:tc>
+        <w:tc>
+          <w:tcPr>
+            <w:tcW w:type="dxa" w:w="8856"/>
+            <w:vAlign w:val="center"/>
+            <w:shd w:fill="FFFFFF"/>
+            <w:tcBorders>
+              <w:top w:val="single" w:sz="4" w:color="D9D9D9"/>
+              <w:left w:val="single" w:sz="4" w:color="D9D9D9"/>
+              <w:bottom w:val="single" w:sz="4" w:color="D9D9D9"/>
+              <w:right w:val="single" w:sz="4" w:color="D9D9D9"/>
+            </w:tcBorders>
+            <w:tcMar>
+              <w:top w:w="90" w:type="dxa"/>
+              <w:left w:w="90" w:type="dxa"/>
+              <w:bottom w:w="90" w:type="dxa"/>
+              <w:right w:w="90" w:type="dxa"/>
+            </w:tcMar>
+          </w:tcPr>
+          <w:p>
+            <w:pPr>
+              <w:spacing w:after="40" w:line="252" w:lineRule="auto"/>
+            </w:pPr>
+            <w:r>
+              <w:rPr>
+                <w:sz w:val="22"/>
+              </w:rPr>
+              <w:t>Numbers made of lights</w:t>
+            </w:r>
+          </w:p>
+        </w:tc>
+      </w:tr>
+      <w:tr>
+        <w:trPr>
+          <w:cantSplit/>
+        </w:trPr>
+        <w:tc>
+          <w:tcPr>
+            <w:tcW w:type="dxa" w:w="1224"/>
+            <w:vAlign w:val="center"/>
+            <w:shd w:fill="EDF5F7"/>
+            <w:tcBorders>
+              <w:top w:val="single" w:sz="4" w:color="D9D9D9"/>
+              <w:left w:val="single" w:sz="4" w:color="D9D9D9"/>
+              <w:bottom w:val="single" w:sz="4" w:color="D9D9D9"/>
+              <w:right w:val="single" w:sz="4" w:color="D9D9D9"/>
+            </w:tcBorders>
+            <w:tcMar>
+              <w:top w:w="90" w:type="dxa"/>
+              <w:left w:w="90" w:type="dxa"/>
+              <w:bottom w:w="90" w:type="dxa"/>
+              <w:right w:w="90" w:type="dxa"/>
+            </w:tcMar>
+          </w:tcPr>
+          <w:p>
+            <w:pPr>
+              <w:spacing w:after="40" w:line="252" w:lineRule="auto"/>
+              <w:jc w:val="center"/>
+            </w:pPr>
+            <w:r>
+              <w:rPr>
+                <w:sz w:val="22"/>
+              </w:rPr>
+              <w:t>8</w:t>
+            </w:r>
+          </w:p>
+        </w:tc>
+        <w:tc>
+          <w:tcPr>
+            <w:tcW w:type="dxa" w:w="8856"/>
+            <w:vAlign w:val="center"/>
+            <w:shd w:fill="EDF5F7"/>
+            <w:tcBorders>
+              <w:top w:val="single" w:sz="4" w:color="D9D9D9"/>
+              <w:left w:val="single" w:sz="4" w:color="D9D9D9"/>
+              <w:bottom w:val="single" w:sz="4" w:color="D9D9D9"/>
+              <w:right w:val="single" w:sz="4" w:color="D9D9D9"/>
+            </w:tcBorders>
+            <w:tcMar>
+              <w:top w:w="90" w:type="dxa"/>
+              <w:left w:w="90" w:type="dxa"/>
+              <w:bottom w:w="90" w:type="dxa"/>
+              <w:right w:w="90" w:type="dxa"/>
+            </w:tcMar>
+          </w:tcPr>
+          <w:p>
+            <w:pPr>
+              <w:spacing w:after="40" w:line="252" w:lineRule="auto"/>
+            </w:pPr>
+            <w:r>
+              <w:rPr>
+                <w:sz w:val="22"/>
+              </w:rPr>
+              <w:t>Read a circuit recording</w:t>
+            </w:r>
+          </w:p>
+        </w:tc>
+      </w:tr>
+    </w:tbl>
+    <w:p>
+      <w:pPr>
+        <w:spacing w:after="80" w:line="20" w:lineRule="exact"/>
+      </w:pPr>
+    </w:p>
+    <w:p>
+      <w:r>
+        <w:t>Choose one mission for this visit. The later illustrated lessons explain the ideas in more detail. Your guide can use docs/LEARNER_LED_PILOT.md to prepare and record what you discover.</w:t>
+      </w:r>
+    </w:p>
+    <w:p>
+      <w:pPr>
+        <w:pStyle w:val="Heading1"/>
+        <w:pageBreakBefore/>
+      </w:pPr>
+      <w:r>
+        <w:t>Chapter 1 Make a change</w:t>
+      </w:r>
+    </w:p>
+    <w:p>
+      <w:r/>
+      <w:r>
+        <w:rPr>
+          <w:b/>
+        </w:rPr>
+        <w:t>Your mission:</w:t>
+      </w:r>
+      <w:r>
+        <w:t xml:space="preserve"> find which number controls the answer while B stays zero.</w:t>
+      </w:r>
+    </w:p>
+    <w:p>
+      <w:r/>
+      <w:r>
+        <w:rPr>
+          <w:b/>
+        </w:rPr>
+        <w:t>You need:</w:t>
+      </w:r>
+      <w:r>
+        <w:t xml:space="preserve"> the Clock Lab, opened by your guide on “Where did the loop go?” Choose “for · 12 additions.” Your guide starts A at 2 and B at 0. This screen also shows code about repeating additions. Today, leave that explanation to your guide and look just at A, B and Output.</w:t>
+      </w:r>
+    </w:p>
+    <w:p>
+      <w:pPr>
+        <w:ind w:left="216" w:hanging="216"/>
+      </w:pPr>
+      <w:r>
+        <w:t>1. Notice the answer, 2.</w:t>
+      </w:r>
+    </w:p>
+    <w:p>
+      <w:pPr>
+        <w:ind w:left="216" w:hanging="216"/>
+      </w:pPr>
+      <w:r>
+        <w:t>2. Choose a new whole number for A between 0 and 9. Keep B at 0. Predict or say what you notice.</w:t>
+      </w:r>
+    </w:p>
+    <w:p>
+      <w:pPr>
+        <w:ind w:left="216" w:hanging="216"/>
+      </w:pPr>
+      <w:r>
+        <w:t>3. Change A. Does the answer change without a Clock press?</w:t>
+      </w:r>
+    </w:p>
+    <w:p>
+      <w:pPr>
+        <w:ind w:left="216" w:hanging="216"/>
+      </w:pPr>
+      <w:r>
+        <w:t>4. Swap roles. Your partner chooses another A.</w:t>
+      </w:r>
+    </w:p>
+    <w:p>
+      <w:r/>
+      <w:r>
+        <w:rPr>
+          <w:b/>
+        </w:rPr>
+        <w:t>Show me:</w:t>
+      </w:r>
+      <w:r>
+        <w:t xml:space="preserve"> point to the input you changed and the answer it affected.</w:t>
+      </w:r>
+    </w:p>
+    <w:p>
+      <w:r/>
+      <w:r>
+        <w:rPr>
+          <w:b/>
+        </w:rPr>
+        <w:t>Your next question:</w:t>
+      </w:r>
+      <w:r>
+        <w:t xml:space="preserve"> What if A is zero? What if we return to the first number? Choose one or invent another test within 0 to 9.</w:t>
+      </w:r>
+    </w:p>
+    <w:p>
+      <w:r/>
+      <w:r>
+        <w:rPr>
+          <w:b/>
+        </w:rPr>
+        <w:t>Keep this discovery:</w:t>
+      </w:r>
+      <w:r>
+        <w:t xml:space="preserve"> this circuit responds to its inputs without waiting for a clock. The guide will explain loops in a later lesson.</w:t>
+      </w:r>
+    </w:p>
+    <w:p>
+      <w:pPr>
+        <w:pStyle w:val="Heading1"/>
+        <w:pageBreakBefore/>
+      </w:pPr>
+      <w:r>
+        <w:t>Chapter 2 Wait for the clock</w:t>
+      </w:r>
+    </w:p>
+    <w:p>
+      <w:r/>
+      <w:r>
+        <w:rPr>
+          <w:b/>
+        </w:rPr>
+        <w:t>Your mission:</w:t>
+      </w:r>
+      <w:r>
+        <w:t xml:space="preserve"> discover a circuit that waits before changing its stored state.</w:t>
+      </w:r>
+    </w:p>
+    <w:p>
+      <w:r/>
+      <w:r>
+        <w:rPr>
+          <w:b/>
+        </w:rPr>
+        <w:t>You need:</w:t>
+      </w:r>
+      <w:r>
+        <w:t xml:space="preserve"> the Clock Lab, “Hockey drill controller.” You may call it a robot drill instead. Your guide prepares Running with zero completed ticks. Use only “Practice enabled” and “Clock +1” today.</w:t>
+      </w:r>
+    </w:p>
+    <w:p>
+      <w:pPr>
+        <w:ind w:left="216" w:hanging="216"/>
+      </w:pPr>
+      <w:r>
+        <w:t>1. Turn Practice enabled on. Do not press Clock yet. Notice the count.</w:t>
+      </w:r>
+    </w:p>
+    <w:p>
+      <w:pPr>
+        <w:ind w:left="216" w:hanging="216"/>
+      </w:pPr>
+      <w:r>
+        <w:t>2. Predict what one Clock press will do, then press Clock +1.</w:t>
+      </w:r>
+    </w:p>
+    <w:p>
+      <w:pPr>
+        <w:ind w:left="216" w:hanging="216"/>
+      </w:pPr>
+      <w:r>
+        <w:t>3. Turn Practice enabled off. Press Clock +1 twice. Does the count change?</w:t>
+      </w:r>
+    </w:p>
+    <w:p>
+      <w:pPr>
+        <w:ind w:left="216" w:hanging="216"/>
+      </w:pPr>
+      <w:r>
+        <w:t>4. Turn it on again. Press Clock +1 once.</w:t>
+      </w:r>
+    </w:p>
+    <w:p>
+      <w:r/>
+      <w:r>
+        <w:rPr>
+          <w:b/>
+        </w:rPr>
+        <w:t>Show me:</w:t>
+      </w:r>
+      <w:r>
+        <w:t xml:space="preserve"> make one clock edge that changes the count and one that keeps it still. Ask your guide to restart before your partner takes a turn.</w:t>
+      </w:r>
+    </w:p>
+    <w:p>
+      <w:r/>
+      <w:r>
+        <w:rPr>
+          <w:b/>
+        </w:rPr>
+        <w:t>Your next question:</w:t>
+      </w:r>
+      <w:r>
+        <w:t xml:space="preserve"> choose one, two or three disabled clocks. Will waiting longer change the count?</w:t>
+      </w:r>
+    </w:p>
+    <w:p>
+      <w:r/>
+      <w:r>
+        <w:rPr>
+          <w:b/>
+        </w:rPr>
+        <w:t>Keep this discovery:</w:t>
+      </w:r>
+      <w:r>
+        <w:t xml:space="preserve"> while this drill is Running, an enabled clock edge adds one. A disabled clock edge keeps the count still.</w:t>
+      </w:r>
+    </w:p>
+    <w:p>
+      <w:pPr>
+        <w:pStyle w:val="Heading1"/>
+        <w:pageBreakBefore/>
+      </w:pPr>
+      <w:r>
+        <w:t>Chapter 3 Finish your drill</w:t>
+      </w:r>
+    </w:p>
+    <w:p>
+      <w:r/>
+      <w:r>
+        <w:rPr>
+          <w:b/>
+        </w:rPr>
+        <w:t>Your mission:</w:t>
+      </w:r>
+      <w:r>
+        <w:t xml:space="preserve"> reach Done and find out what the next clock does.</w:t>
+      </w:r>
+    </w:p>
+    <w:p>
+      <w:r/>
+      <w:r>
+        <w:rPr>
+          <w:b/>
+        </w:rPr>
+        <w:t>You need:</w:t>
+      </w:r>
+      <w:r>
+        <w:t xml:space="preserve"> the controller and your guide's fresh Running at zero setup. Keep Start off and Stop off. Use manual Clock presses.</w:t>
+      </w:r>
+    </w:p>
+    <w:p>
+      <w:pPr>
+        <w:ind w:left="216" w:hanging="216"/>
+      </w:pPr>
+      <w:r>
+        <w:t>1. Turn Practice enabled on. Press Clock +1 once. Read the count and state.</w:t>
+      </w:r>
+    </w:p>
+    <w:p>
+      <w:pPr>
+        <w:ind w:left="216" w:hanging="216"/>
+      </w:pPr>
+      <w:r>
+        <w:t>2. Continue one edge at a time. Stop pressing when the state becomes Done.</w:t>
+      </w:r>
+    </w:p>
+    <w:p>
+      <w:pPr>
+        <w:ind w:left="216" w:hanging="216"/>
+      </w:pPr>
+      <w:r>
+        <w:t>3. Draw or point to the count at Done.</w:t>
+      </w:r>
+    </w:p>
+    <w:p>
+      <w:pPr>
+        <w:ind w:left="216" w:hanging="216"/>
+      </w:pPr>
+      <w:r>
+        <w:t>4. Predict the next two states, then press Clock +1 twice, looking after each edge.</w:t>
+      </w:r>
+    </w:p>
+    <w:tbl>
+      <w:tblPr>
+        <w:tblW w:type="auto" w:w="0"/>
+        <w:tblLayout w:type="fixed"/>
+        <w:tblLook w:firstColumn="1" w:firstRow="1" w:lastColumn="0" w:lastRow="0" w:noHBand="0" w:noVBand="1" w:val="04A0"/>
+      </w:tblPr>
+      <w:tblGrid>
+        <w:gridCol w:w="3024"/>
+        <w:gridCol w:w="3312"/>
+        <w:gridCol w:w="3744"/>
+      </w:tblGrid>
+      <w:tr>
+        <w:trPr>
+          <w:cantSplit/>
+          <w:tblHeader/>
+        </w:trPr>
+        <w:tc>
+          <w:tcPr>
+            <w:tcW w:type="dxa" w:w="3024"/>
+            <w:vAlign w:val="center"/>
+            <w:shd w:fill="17365D"/>
+            <w:tcBorders>
+              <w:top w:val="single" w:sz="4" w:color="D9D9D9"/>
+              <w:left w:val="single" w:sz="4" w:color="D9D9D9"/>
+              <w:bottom w:val="single" w:sz="4" w:color="D9D9D9"/>
+              <w:right w:val="single" w:sz="4" w:color="D9D9D9"/>
+            </w:tcBorders>
+            <w:tcMar>
+              <w:top w:w="90" w:type="dxa"/>
+              <w:left w:w="90" w:type="dxa"/>
+              <w:bottom w:w="90" w:type="dxa"/>
+              <w:right w:w="90" w:type="dxa"/>
+            </w:tcMar>
+          </w:tcPr>
+          <w:p>
+            <w:pPr>
+              <w:spacing w:after="40" w:line="252" w:lineRule="auto"/>
+              <w:jc w:val="center"/>
+            </w:pPr>
+            <w:r>
+              <w:rPr>
+                <w:b/>
+                <w:color w:val="FFFFFF"/>
+                <w:sz w:val="22"/>
+              </w:rPr>
+              <w:t>Moment</w:t>
+            </w:r>
+          </w:p>
+        </w:tc>
+        <w:tc>
+          <w:tcPr>
+            <w:tcW w:type="dxa" w:w="3312"/>
+            <w:vAlign w:val="center"/>
+            <w:shd w:fill="17365D"/>
+            <w:tcBorders>
+              <w:top w:val="single" w:sz="4" w:color="D9D9D9"/>
+              <w:left w:val="single" w:sz="4" w:color="D9D9D9"/>
+              <w:bottom w:val="single" w:sz="4" w:color="D9D9D9"/>
+              <w:right w:val="single" w:sz="4" w:color="D9D9D9"/>
+            </w:tcBorders>
+            <w:tcMar>
+              <w:top w:w="90" w:type="dxa"/>
+              <w:left w:w="90" w:type="dxa"/>
+              <w:bottom w:w="90" w:type="dxa"/>
+              <w:right w:w="90" w:type="dxa"/>
+            </w:tcMar>
+          </w:tcPr>
+          <w:p>
+            <w:pPr>
+              <w:spacing w:after="40" w:line="252" w:lineRule="auto"/>
+            </w:pPr>
+            <w:r>
+              <w:rPr>
+                <w:b/>
+                <w:color w:val="FFFFFF"/>
+                <w:sz w:val="22"/>
+              </w:rPr>
+              <w:t>State I saw</w:t>
+            </w:r>
+          </w:p>
+        </w:tc>
+        <w:tc>
+          <w:tcPr>
+            <w:tcW w:type="dxa" w:w="3744"/>
+            <w:vAlign w:val="center"/>
+            <w:shd w:fill="17365D"/>
+            <w:tcBorders>
+              <w:top w:val="single" w:sz="4" w:color="D9D9D9"/>
+              <w:left w:val="single" w:sz="4" w:color="D9D9D9"/>
+              <w:bottom w:val="single" w:sz="4" w:color="D9D9D9"/>
+              <w:right w:val="single" w:sz="4" w:color="D9D9D9"/>
+            </w:tcBorders>
+            <w:tcMar>
+              <w:top w:w="90" w:type="dxa"/>
+              <w:left w:w="90" w:type="dxa"/>
+              <w:bottom w:w="90" w:type="dxa"/>
+              <w:right w:w="90" w:type="dxa"/>
+            </w:tcMar>
+          </w:tcPr>
+          <w:p>
+            <w:pPr>
+              <w:spacing w:after="40" w:line="252" w:lineRule="auto"/>
+            </w:pPr>
+            <w:r>
+              <w:rPr>
+                <w:b/>
+                <w:color w:val="FFFFFF"/>
+                <w:sz w:val="22"/>
+              </w:rPr>
+              <w:t>Count I saw</w:t>
+            </w:r>
+          </w:p>
+        </w:tc>
+      </w:tr>
+      <w:tr>
+        <w:trPr>
+          <w:cantSplit/>
+        </w:trPr>
+        <w:tc>
+          <w:tcPr>
+            <w:tcW w:type="dxa" w:w="3024"/>
+            <w:vAlign w:val="center"/>
+            <w:shd w:fill="FFFFFF"/>
+            <w:tcBorders>
+              <w:top w:val="single" w:sz="4" w:color="D9D9D9"/>
+              <w:left w:val="single" w:sz="4" w:color="D9D9D9"/>
+              <w:bottom w:val="single" w:sz="4" w:color="D9D9D9"/>
+              <w:right w:val="single" w:sz="4" w:color="D9D9D9"/>
+            </w:tcBorders>
+            <w:tcMar>
+              <w:top w:w="90" w:type="dxa"/>
+              <w:left w:w="90" w:type="dxa"/>
+              <w:bottom w:w="90" w:type="dxa"/>
+              <w:right w:w="90" w:type="dxa"/>
+            </w:tcMar>
+          </w:tcPr>
+          <w:p>
+            <w:pPr>
+              <w:spacing w:after="40" w:line="252" w:lineRule="auto"/>
+              <w:jc w:val="center"/>
+            </w:pPr>
+            <w:r>
+              <w:rPr>
+                <w:sz w:val="22"/>
+              </w:rPr>
+              <w:t>Finished</w:t>
+            </w:r>
+          </w:p>
+        </w:tc>
+        <w:tc>
+          <w:tcPr>
+            <w:tcW w:type="dxa" w:w="3312"/>
+            <w:vAlign w:val="center"/>
+            <w:shd w:fill="FFFFFF"/>
+            <w:tcBorders>
+              <w:top w:val="single" w:sz="4" w:color="D9D9D9"/>
+              <w:left w:val="single" w:sz="4" w:color="D9D9D9"/>
+              <w:bottom w:val="single" w:sz="4" w:color="D9D9D9"/>
+              <w:right w:val="single" w:sz="4" w:color="D9D9D9"/>
+            </w:tcBorders>
+            <w:tcMar>
+              <w:top w:w="90" w:type="dxa"/>
+              <w:left w:w="90" w:type="dxa"/>
+              <w:bottom w:w="90" w:type="dxa"/>
+              <w:right w:w="90" w:type="dxa"/>
+            </w:tcMar>
+          </w:tcPr>
+          <w:p>
+            <w:pPr>
+              <w:spacing w:after="40" w:line="252" w:lineRule="auto"/>
+            </w:pPr>
+            <w:r>
+              <w:rPr>
+                <w:sz w:val="22"/>
+              </w:rPr>
+            </w:r>
+          </w:p>
+        </w:tc>
+        <w:tc>
+          <w:tcPr>
+            <w:tcW w:type="dxa" w:w="3744"/>
+            <w:vAlign w:val="center"/>
+            <w:shd w:fill="FFFFFF"/>
+            <w:tcBorders>
+              <w:top w:val="single" w:sz="4" w:color="D9D9D9"/>
+              <w:left w:val="single" w:sz="4" w:color="D9D9D9"/>
+              <w:bottom w:val="single" w:sz="4" w:color="D9D9D9"/>
+              <w:right w:val="single" w:sz="4" w:color="D9D9D9"/>
+            </w:tcBorders>
+            <w:tcMar>
+              <w:top w:w="90" w:type="dxa"/>
+              <w:left w:w="90" w:type="dxa"/>
+              <w:bottom w:w="90" w:type="dxa"/>
+              <w:right w:w="90" w:type="dxa"/>
+            </w:tcMar>
+          </w:tcPr>
+          <w:p>
+            <w:pPr>
+              <w:spacing w:after="40" w:line="252" w:lineRule="auto"/>
+            </w:pPr>
+            <w:r>
+              <w:rPr>
+                <w:sz w:val="22"/>
+              </w:rPr>
+            </w:r>
+          </w:p>
+        </w:tc>
+      </w:tr>
+      <w:tr>
+        <w:trPr>
+          <w:cantSplit/>
+        </w:trPr>
+        <w:tc>
+          <w:tcPr>
+            <w:tcW w:type="dxa" w:w="3024"/>
+            <w:vAlign w:val="center"/>
+            <w:shd w:fill="EDF5F7"/>
+            <w:tcBorders>
+              <w:top w:val="single" w:sz="4" w:color="D9D9D9"/>
+              <w:left w:val="single" w:sz="4" w:color="D9D9D9"/>
+              <w:bottom w:val="single" w:sz="4" w:color="D9D9D9"/>
+              <w:right w:val="single" w:sz="4" w:color="D9D9D9"/>
+            </w:tcBorders>
+            <w:tcMar>
+              <w:top w:w="90" w:type="dxa"/>
+              <w:left w:w="90" w:type="dxa"/>
+              <w:bottom w:w="90" w:type="dxa"/>
+              <w:right w:w="90" w:type="dxa"/>
+            </w:tcMar>
+          </w:tcPr>
+          <w:p>
+            <w:pPr>
+              <w:spacing w:after="40" w:line="252" w:lineRule="auto"/>
+              <w:jc w:val="center"/>
+            </w:pPr>
+            <w:r>
+              <w:rPr>
+                <w:sz w:val="22"/>
+              </w:rPr>
+              <w:t>One more edge</w:t>
+            </w:r>
+          </w:p>
+        </w:tc>
+        <w:tc>
+          <w:tcPr>
+            <w:tcW w:type="dxa" w:w="3312"/>
+            <w:vAlign w:val="center"/>
+            <w:shd w:fill="EDF5F7"/>
+            <w:tcBorders>
+              <w:top w:val="single" w:sz="4" w:color="D9D9D9"/>
+              <w:left w:val="single" w:sz="4" w:color="D9D9D9"/>
+              <w:bottom w:val="single" w:sz="4" w:color="D9D9D9"/>
+              <w:right w:val="single" w:sz="4" w:color="D9D9D9"/>
+            </w:tcBorders>
+            <w:tcMar>
+              <w:top w:w="90" w:type="dxa"/>
+              <w:left w:w="90" w:type="dxa"/>
+              <w:bottom w:w="90" w:type="dxa"/>
+              <w:right w:w="90" w:type="dxa"/>
+            </w:tcMar>
+          </w:tcPr>
+          <w:p>
+            <w:pPr>
+              <w:spacing w:after="40" w:line="252" w:lineRule="auto"/>
+            </w:pPr>
+            <w:r>
+              <w:rPr>
+                <w:sz w:val="22"/>
+              </w:rPr>
+            </w:r>
+          </w:p>
+        </w:tc>
+        <w:tc>
+          <w:tcPr>
+            <w:tcW w:type="dxa" w:w="3744"/>
+            <w:vAlign w:val="center"/>
+            <w:shd w:fill="EDF5F7"/>
+            <w:tcBorders>
+              <w:top w:val="single" w:sz="4" w:color="D9D9D9"/>
+              <w:left w:val="single" w:sz="4" w:color="D9D9D9"/>
+              <w:bottom w:val="single" w:sz="4" w:color="D9D9D9"/>
+              <w:right w:val="single" w:sz="4" w:color="D9D9D9"/>
+            </w:tcBorders>
+            <w:tcMar>
+              <w:top w:w="90" w:type="dxa"/>
+              <w:left w:w="90" w:type="dxa"/>
+              <w:bottom w:w="90" w:type="dxa"/>
+              <w:right w:w="90" w:type="dxa"/>
+            </w:tcMar>
+          </w:tcPr>
+          <w:p>
+            <w:pPr>
+              <w:spacing w:after="40" w:line="252" w:lineRule="auto"/>
+            </w:pPr>
+            <w:r>
+              <w:rPr>
+                <w:sz w:val="22"/>
+              </w:rPr>
+            </w:r>
+          </w:p>
+        </w:tc>
+      </w:tr>
+      <w:tr>
+        <w:trPr>
+          <w:cantSplit/>
+        </w:trPr>
+        <w:tc>
+          <w:tcPr>
+            <w:tcW w:type="dxa" w:w="3024"/>
+            <w:vAlign w:val="center"/>
+            <w:shd w:fill="FFFFFF"/>
+            <w:tcBorders>
+              <w:top w:val="single" w:sz="4" w:color="D9D9D9"/>
+              <w:left w:val="single" w:sz="4" w:color="D9D9D9"/>
+              <w:bottom w:val="single" w:sz="4" w:color="D9D9D9"/>
+              <w:right w:val="single" w:sz="4" w:color="D9D9D9"/>
+            </w:tcBorders>
+            <w:tcMar>
+              <w:top w:w="90" w:type="dxa"/>
+              <w:left w:w="90" w:type="dxa"/>
+              <w:bottom w:w="90" w:type="dxa"/>
+              <w:right w:w="90" w:type="dxa"/>
+            </w:tcMar>
+          </w:tcPr>
+          <w:p>
+            <w:pPr>
+              <w:spacing w:after="40" w:line="252" w:lineRule="auto"/>
+              <w:jc w:val="center"/>
+            </w:pPr>
+            <w:r>
+              <w:rPr>
+                <w:sz w:val="22"/>
+              </w:rPr>
+              <w:t>Another edge</w:t>
+            </w:r>
+          </w:p>
+        </w:tc>
+        <w:tc>
+          <w:tcPr>
+            <w:tcW w:type="dxa" w:w="3312"/>
+            <w:vAlign w:val="center"/>
+            <w:shd w:fill="FFFFFF"/>
+            <w:tcBorders>
+              <w:top w:val="single" w:sz="4" w:color="D9D9D9"/>
+              <w:left w:val="single" w:sz="4" w:color="D9D9D9"/>
+              <w:bottom w:val="single" w:sz="4" w:color="D9D9D9"/>
+              <w:right w:val="single" w:sz="4" w:color="D9D9D9"/>
+            </w:tcBorders>
+            <w:tcMar>
+              <w:top w:w="90" w:type="dxa"/>
+              <w:left w:w="90" w:type="dxa"/>
+              <w:bottom w:w="90" w:type="dxa"/>
+              <w:right w:w="90" w:type="dxa"/>
+            </w:tcMar>
+          </w:tcPr>
+          <w:p>
+            <w:pPr>
+              <w:spacing w:after="40" w:line="252" w:lineRule="auto"/>
+            </w:pPr>
+            <w:r>
+              <w:rPr>
+                <w:sz w:val="22"/>
+              </w:rPr>
+            </w:r>
+          </w:p>
+        </w:tc>
+        <w:tc>
+          <w:tcPr>
+            <w:tcW w:type="dxa" w:w="3744"/>
+            <w:vAlign w:val="center"/>
+            <w:shd w:fill="FFFFFF"/>
+            <w:tcBorders>
+              <w:top w:val="single" w:sz="4" w:color="D9D9D9"/>
+              <w:left w:val="single" w:sz="4" w:color="D9D9D9"/>
+              <w:bottom w:val="single" w:sz="4" w:color="D9D9D9"/>
+              <w:right w:val="single" w:sz="4" w:color="D9D9D9"/>
+            </w:tcBorders>
+            <w:tcMar>
+              <w:top w:w="90" w:type="dxa"/>
+              <w:left w:w="90" w:type="dxa"/>
+              <w:bottom w:w="90" w:type="dxa"/>
+              <w:right w:w="90" w:type="dxa"/>
+            </w:tcMar>
+          </w:tcPr>
+          <w:p>
+            <w:pPr>
+              <w:spacing w:after="40" w:line="252" w:lineRule="auto"/>
+            </w:pPr>
+            <w:r>
+              <w:rPr>
+                <w:sz w:val="22"/>
+              </w:rPr>
+            </w:r>
+          </w:p>
+        </w:tc>
+      </w:tr>
+    </w:tbl>
+    <w:p>
+      <w:pPr>
+        <w:spacing w:after="80" w:line="20" w:lineRule="exact"/>
+      </w:pPr>
+    </w:p>
+    <w:p>
+      <w:r/>
+      <w:r>
+        <w:rPr>
+          <w:b/>
+        </w:rPr>
+        <w:t>Show me:</w:t>
+      </w:r>
+      <w:r>
+        <w:t xml:space="preserve"> find Done again after your guide restarts. It takes four enabled edges after entering Running.</w:t>
+      </w:r>
+    </w:p>
+    <w:p>
+      <w:r/>
+      <w:r>
+        <w:rPr>
+          <w:b/>
+        </w:rPr>
+        <w:t>Your next question:</w:t>
+      </w:r>
+      <w:r>
+        <w:t xml:space="preserve"> on another run, choose one pause before finishing. Does the pause add a practice tick?</w:t>
+      </w:r>
+    </w:p>
+    <w:p>
+      <w:pPr>
+        <w:pStyle w:val="Heading1"/>
+        <w:pageBreakBefore/>
+      </w:pPr>
+      <w:r>
+        <w:t>Chapter 4 Pass a parcel</w:t>
+      </w:r>
+    </w:p>
+    <w:p>
+      <w:r/>
+      <w:r>
+        <w:rPr>
+          <w:b/>
+        </w:rPr>
+        <w:t>Your mission:</w:t>
+      </w:r>
+      <w:r>
+        <w:t xml:space="preserve"> deliver cards in order without losing or copying one.</w:t>
+      </w:r>
+    </w:p>
+    <w:p>
+      <w:r/>
+      <w:r>
+        <w:rPr>
+          <w:b/>
+        </w:rPr>
+        <w:t>You need:</w:t>
+      </w:r>
+      <w:r>
+        <w:t xml:space="preserve"> cards 10, 11, 12; an Offer card (Valid); a Can take card (Ready); a clock caller. Sit at a table if you prefer. The caller may turn a printed upward-arrow card instead of clapping. The arrow marks one clock edge.</w:t>
+      </w:r>
+    </w:p>
+    <w:p>
+      <w:pPr>
+        <w:ind w:left="216" w:hanging="216"/>
+      </w:pPr>
+      <w:r>
+        <w:t>1. The sender offers 10 and shows Valid. The receiver chooses Wait for one or two edges, so Ready is off.</w:t>
+      </w:r>
+    </w:p>
+    <w:p>
+      <w:pPr>
+        <w:ind w:left="216" w:hanging="216"/>
+      </w:pPr>
+      <w:r>
+        <w:t>2. At each edge, transfer only if Valid and Ready are both on. Otherwise keep an offered card still.</w:t>
+      </w:r>
+    </w:p>
+    <w:p>
+      <w:pPr>
+        <w:ind w:left="216" w:hanging="216"/>
+      </w:pPr>
+      <w:r>
+        <w:t>3. The receiver turns Ready on. At the next edge take 10. The sender offers 11 for a later edge, then 12.</w:t>
+      </w:r>
+    </w:p>
+    <w:p>
+      <w:pPr>
+        <w:ind w:left="216" w:hanging="216"/>
+      </w:pPr>
+      <w:r>
+        <w:t>4. After the receiver takes card 12, turn Valid off. Keep Ready on for one extra edge: nothing should arrive. Swap sender and receiver, choose a new wait, and repeat.</w:t>
+      </w:r>
+    </w:p>
+    <w:tbl>
+      <w:tblPr>
+        <w:tblW w:type="auto" w:w="0"/>
+        <w:tblLayout w:type="fixed"/>
+        <w:tblLook w:firstColumn="1" w:firstRow="1" w:lastColumn="0" w:lastRow="0" w:noHBand="0" w:noVBand="1" w:val="04A0"/>
+      </w:tblPr>
+      <w:tblGrid>
+        <w:gridCol w:w="3024"/>
+        <w:gridCol w:w="3312"/>
+        <w:gridCol w:w="3744"/>
+      </w:tblGrid>
+      <w:tr>
+        <w:trPr>
+          <w:cantSplit/>
+          <w:tblHeader/>
+        </w:trPr>
+        <w:tc>
+          <w:tcPr>
+            <w:tcW w:type="dxa" w:w="3024"/>
+            <w:vAlign w:val="center"/>
+            <w:shd w:fill="17365D"/>
+            <w:tcBorders>
+              <w:top w:val="single" w:sz="4" w:color="D9D9D9"/>
+              <w:left w:val="single" w:sz="4" w:color="D9D9D9"/>
+              <w:bottom w:val="single" w:sz="4" w:color="D9D9D9"/>
+              <w:right w:val="single" w:sz="4" w:color="D9D9D9"/>
+            </w:tcBorders>
+            <w:tcMar>
+              <w:top w:w="90" w:type="dxa"/>
+              <w:left w:w="90" w:type="dxa"/>
+              <w:bottom w:w="90" w:type="dxa"/>
+              <w:right w:w="90" w:type="dxa"/>
+            </w:tcMar>
+          </w:tcPr>
+          <w:p>
+            <w:pPr>
+              <w:spacing w:after="40" w:line="252" w:lineRule="auto"/>
+              <w:jc w:val="center"/>
+            </w:pPr>
+            <w:r>
+              <w:rPr>
+                <w:b/>
+                <w:color w:val="FFFFFF"/>
+                <w:sz w:val="22"/>
+              </w:rPr>
+              <w:t>Offered now</w:t>
+            </w:r>
+          </w:p>
+        </w:tc>
+        <w:tc>
+          <w:tcPr>
+            <w:tcW w:type="dxa" w:w="3312"/>
+            <w:vAlign w:val="center"/>
+            <w:shd w:fill="17365D"/>
+            <w:tcBorders>
+              <w:top w:val="single" w:sz="4" w:color="D9D9D9"/>
+              <w:left w:val="single" w:sz="4" w:color="D9D9D9"/>
+              <w:bottom w:val="single" w:sz="4" w:color="D9D9D9"/>
+              <w:right w:val="single" w:sz="4" w:color="D9D9D9"/>
+            </w:tcBorders>
+            <w:tcMar>
+              <w:top w:w="90" w:type="dxa"/>
+              <w:left w:w="90" w:type="dxa"/>
+              <w:bottom w:w="90" w:type="dxa"/>
+              <w:right w:w="90" w:type="dxa"/>
+            </w:tcMar>
+          </w:tcPr>
+          <w:p>
+            <w:pPr>
+              <w:spacing w:after="40" w:line="252" w:lineRule="auto"/>
+            </w:pPr>
+            <w:r>
+              <w:rPr>
+                <w:b/>
+                <w:color w:val="FFFFFF"/>
+                <w:sz w:val="22"/>
+              </w:rPr>
+              <w:t>Can take now</w:t>
+            </w:r>
+          </w:p>
+        </w:tc>
+        <w:tc>
+          <w:tcPr>
+            <w:tcW w:type="dxa" w:w="3744"/>
+            <w:vAlign w:val="center"/>
+            <w:shd w:fill="17365D"/>
+            <w:tcBorders>
+              <w:top w:val="single" w:sz="4" w:color="D9D9D9"/>
+              <w:left w:val="single" w:sz="4" w:color="D9D9D9"/>
+              <w:bottom w:val="single" w:sz="4" w:color="D9D9D9"/>
+              <w:right w:val="single" w:sz="4" w:color="D9D9D9"/>
+            </w:tcBorders>
+            <w:tcMar>
+              <w:top w:w="90" w:type="dxa"/>
+              <w:left w:w="90" w:type="dxa"/>
+              <w:bottom w:w="90" w:type="dxa"/>
+              <w:right w:w="90" w:type="dxa"/>
+            </w:tcMar>
+          </w:tcPr>
+          <w:p>
+            <w:pPr>
+              <w:spacing w:after="40" w:line="252" w:lineRule="auto"/>
+            </w:pPr>
+            <w:r>
+              <w:rPr>
+                <w:b/>
+                <w:color w:val="FFFFFF"/>
+                <w:sz w:val="22"/>
+              </w:rPr>
+              <w:t>At the edge</w:t>
+            </w:r>
+          </w:p>
+        </w:tc>
+      </w:tr>
+      <w:tr>
+        <w:trPr>
+          <w:cantSplit/>
+        </w:trPr>
+        <w:tc>
+          <w:tcPr>
+            <w:tcW w:type="dxa" w:w="3024"/>
+            <w:vAlign w:val="center"/>
+            <w:shd w:fill="FFFFFF"/>
+            <w:tcBorders>
+              <w:top w:val="single" w:sz="4" w:color="D9D9D9"/>
+              <w:left w:val="single" w:sz="4" w:color="D9D9D9"/>
+              <w:bottom w:val="single" w:sz="4" w:color="D9D9D9"/>
+              <w:right w:val="single" w:sz="4" w:color="D9D9D9"/>
+            </w:tcBorders>
+            <w:tcMar>
+              <w:top w:w="90" w:type="dxa"/>
+              <w:left w:w="90" w:type="dxa"/>
+              <w:bottom w:w="90" w:type="dxa"/>
+              <w:right w:w="90" w:type="dxa"/>
+            </w:tcMar>
+          </w:tcPr>
+          <w:p>
+            <w:pPr>
+              <w:spacing w:after="40" w:line="252" w:lineRule="auto"/>
+              <w:jc w:val="center"/>
+            </w:pPr>
+            <w:r>
+              <w:rPr>
+                <w:sz w:val="22"/>
+              </w:rPr>
+              <w:t>No</w:t>
+            </w:r>
+          </w:p>
+        </w:tc>
+        <w:tc>
+          <w:tcPr>
+            <w:tcW w:type="dxa" w:w="3312"/>
+            <w:vAlign w:val="center"/>
+            <w:shd w:fill="FFFFFF"/>
+            <w:tcBorders>
+              <w:top w:val="single" w:sz="4" w:color="D9D9D9"/>
+              <w:left w:val="single" w:sz="4" w:color="D9D9D9"/>
+              <w:bottom w:val="single" w:sz="4" w:color="D9D9D9"/>
+              <w:right w:val="single" w:sz="4" w:color="D9D9D9"/>
+            </w:tcBorders>
+            <w:tcMar>
+              <w:top w:w="90" w:type="dxa"/>
+              <w:left w:w="90" w:type="dxa"/>
+              <w:bottom w:w="90" w:type="dxa"/>
+              <w:right w:w="90" w:type="dxa"/>
+            </w:tcMar>
+          </w:tcPr>
+          <w:p>
+            <w:pPr>
+              <w:spacing w:after="40" w:line="252" w:lineRule="auto"/>
+            </w:pPr>
+            <w:r>
+              <w:rPr>
+                <w:sz w:val="22"/>
+              </w:rPr>
+              <w:t>No or yes</w:t>
+            </w:r>
+          </w:p>
+        </w:tc>
+        <w:tc>
+          <w:tcPr>
+            <w:tcW w:type="dxa" w:w="3744"/>
+            <w:vAlign w:val="center"/>
+            <w:shd w:fill="FFFFFF"/>
+            <w:tcBorders>
+              <w:top w:val="single" w:sz="4" w:color="D9D9D9"/>
+              <w:left w:val="single" w:sz="4" w:color="D9D9D9"/>
+              <w:bottom w:val="single" w:sz="4" w:color="D9D9D9"/>
+              <w:right w:val="single" w:sz="4" w:color="D9D9D9"/>
+            </w:tcBorders>
+            <w:tcMar>
+              <w:top w:w="90" w:type="dxa"/>
+              <w:left w:w="90" w:type="dxa"/>
+              <w:bottom w:w="90" w:type="dxa"/>
+              <w:right w:w="90" w:type="dxa"/>
+            </w:tcMar>
+          </w:tcPr>
+          <w:p>
+            <w:pPr>
+              <w:spacing w:after="40" w:line="252" w:lineRule="auto"/>
+            </w:pPr>
+            <w:r>
+              <w:rPr>
+                <w:sz w:val="22"/>
+              </w:rPr>
+              <w:t>No parcel moves</w:t>
+            </w:r>
+          </w:p>
+        </w:tc>
+      </w:tr>
+      <w:tr>
+        <w:trPr>
+          <w:cantSplit/>
+        </w:trPr>
+        <w:tc>
+          <w:tcPr>
+            <w:tcW w:type="dxa" w:w="3024"/>
+            <w:vAlign w:val="center"/>
+            <w:shd w:fill="EDF5F7"/>
+            <w:tcBorders>
+              <w:top w:val="single" w:sz="4" w:color="D9D9D9"/>
+              <w:left w:val="single" w:sz="4" w:color="D9D9D9"/>
+              <w:bottom w:val="single" w:sz="4" w:color="D9D9D9"/>
+              <w:right w:val="single" w:sz="4" w:color="D9D9D9"/>
+            </w:tcBorders>
+            <w:tcMar>
+              <w:top w:w="90" w:type="dxa"/>
+              <w:left w:w="90" w:type="dxa"/>
+              <w:bottom w:w="90" w:type="dxa"/>
+              <w:right w:w="90" w:type="dxa"/>
+            </w:tcMar>
+          </w:tcPr>
+          <w:p>
+            <w:pPr>
+              <w:spacing w:after="40" w:line="252" w:lineRule="auto"/>
+              <w:jc w:val="center"/>
+            </w:pPr>
+            <w:r>
+              <w:rPr>
+                <w:sz w:val="22"/>
+              </w:rPr>
+              <w:t>Yes</w:t>
+            </w:r>
+          </w:p>
+        </w:tc>
+        <w:tc>
+          <w:tcPr>
+            <w:tcW w:type="dxa" w:w="3312"/>
+            <w:vAlign w:val="center"/>
+            <w:shd w:fill="EDF5F7"/>
+            <w:tcBorders>
+              <w:top w:val="single" w:sz="4" w:color="D9D9D9"/>
+              <w:left w:val="single" w:sz="4" w:color="D9D9D9"/>
+              <w:bottom w:val="single" w:sz="4" w:color="D9D9D9"/>
+              <w:right w:val="single" w:sz="4" w:color="D9D9D9"/>
+            </w:tcBorders>
+            <w:tcMar>
+              <w:top w:w="90" w:type="dxa"/>
+              <w:left w:w="90" w:type="dxa"/>
+              <w:bottom w:w="90" w:type="dxa"/>
+              <w:right w:w="90" w:type="dxa"/>
+            </w:tcMar>
+          </w:tcPr>
+          <w:p>
+            <w:pPr>
+              <w:spacing w:after="40" w:line="252" w:lineRule="auto"/>
+            </w:pPr>
+            <w:r>
+              <w:rPr>
+                <w:sz w:val="22"/>
+              </w:rPr>
+              <w:t>No</w:t>
+            </w:r>
+          </w:p>
+        </w:tc>
+        <w:tc>
+          <w:tcPr>
+            <w:tcW w:type="dxa" w:w="3744"/>
+            <w:vAlign w:val="center"/>
+            <w:shd w:fill="EDF5F7"/>
+            <w:tcBorders>
+              <w:top w:val="single" w:sz="4" w:color="D9D9D9"/>
+              <w:left w:val="single" w:sz="4" w:color="D9D9D9"/>
+              <w:bottom w:val="single" w:sz="4" w:color="D9D9D9"/>
+              <w:right w:val="single" w:sz="4" w:color="D9D9D9"/>
+            </w:tcBorders>
+            <w:tcMar>
+              <w:top w:w="90" w:type="dxa"/>
+              <w:left w:w="90" w:type="dxa"/>
+              <w:bottom w:w="90" w:type="dxa"/>
+              <w:right w:w="90" w:type="dxa"/>
+            </w:tcMar>
+          </w:tcPr>
+          <w:p>
+            <w:pPr>
+              <w:spacing w:after="40" w:line="252" w:lineRule="auto"/>
+            </w:pPr>
+            <w:r>
+              <w:rPr>
+                <w:sz w:val="22"/>
+              </w:rPr>
+              <w:t>Hold the same parcel</w:t>
+            </w:r>
+          </w:p>
+        </w:tc>
+      </w:tr>
+      <w:tr>
+        <w:trPr>
+          <w:cantSplit/>
+        </w:trPr>
+        <w:tc>
+          <w:tcPr>
+            <w:tcW w:type="dxa" w:w="3024"/>
+            <w:vAlign w:val="center"/>
+            <w:shd w:fill="FFFFFF"/>
+            <w:tcBorders>
+              <w:top w:val="single" w:sz="4" w:color="D9D9D9"/>
+              <w:left w:val="single" w:sz="4" w:color="D9D9D9"/>
+              <w:bottom w:val="single" w:sz="4" w:color="D9D9D9"/>
+              <w:right w:val="single" w:sz="4" w:color="D9D9D9"/>
+            </w:tcBorders>
+            <w:tcMar>
+              <w:top w:w="90" w:type="dxa"/>
+              <w:left w:w="90" w:type="dxa"/>
+              <w:bottom w:w="90" w:type="dxa"/>
+              <w:right w:w="90" w:type="dxa"/>
+            </w:tcMar>
+          </w:tcPr>
+          <w:p>
+            <w:pPr>
+              <w:spacing w:after="40" w:line="252" w:lineRule="auto"/>
+              <w:jc w:val="center"/>
+            </w:pPr>
+            <w:r>
+              <w:rPr>
+                <w:sz w:val="22"/>
+              </w:rPr>
+              <w:t>Yes</w:t>
+            </w:r>
+          </w:p>
+        </w:tc>
+        <w:tc>
+          <w:tcPr>
+            <w:tcW w:type="dxa" w:w="3312"/>
+            <w:vAlign w:val="center"/>
+            <w:shd w:fill="FFFFFF"/>
+            <w:tcBorders>
+              <w:top w:val="single" w:sz="4" w:color="D9D9D9"/>
+              <w:left w:val="single" w:sz="4" w:color="D9D9D9"/>
+              <w:bottom w:val="single" w:sz="4" w:color="D9D9D9"/>
+              <w:right w:val="single" w:sz="4" w:color="D9D9D9"/>
+            </w:tcBorders>
+            <w:tcMar>
+              <w:top w:w="90" w:type="dxa"/>
+              <w:left w:w="90" w:type="dxa"/>
+              <w:bottom w:w="90" w:type="dxa"/>
+              <w:right w:w="90" w:type="dxa"/>
+            </w:tcMar>
+          </w:tcPr>
+          <w:p>
+            <w:pPr>
+              <w:spacing w:after="40" w:line="252" w:lineRule="auto"/>
+            </w:pPr>
+            <w:r>
+              <w:rPr>
+                <w:sz w:val="22"/>
+              </w:rPr>
+              <w:t>Yes</w:t>
+            </w:r>
+          </w:p>
+        </w:tc>
+        <w:tc>
+          <w:tcPr>
+            <w:tcW w:type="dxa" w:w="3744"/>
+            <w:vAlign w:val="center"/>
+            <w:shd w:fill="FFFFFF"/>
+            <w:tcBorders>
+              <w:top w:val="single" w:sz="4" w:color="D9D9D9"/>
+              <w:left w:val="single" w:sz="4" w:color="D9D9D9"/>
+              <w:bottom w:val="single" w:sz="4" w:color="D9D9D9"/>
+              <w:right w:val="single" w:sz="4" w:color="D9D9D9"/>
+            </w:tcBorders>
+            <w:tcMar>
+              <w:top w:w="90" w:type="dxa"/>
+              <w:left w:w="90" w:type="dxa"/>
+              <w:bottom w:w="90" w:type="dxa"/>
+              <w:right w:w="90" w:type="dxa"/>
+            </w:tcMar>
+          </w:tcPr>
+          <w:p>
+            <w:pPr>
+              <w:spacing w:after="40" w:line="252" w:lineRule="auto"/>
+            </w:pPr>
+            <w:r>
+              <w:rPr>
+                <w:sz w:val="22"/>
+              </w:rPr>
+              <w:t>Transfer one parcel</w:t>
+            </w:r>
+          </w:p>
+        </w:tc>
+      </w:tr>
+    </w:tbl>
+    <w:p>
+      <w:pPr>
+        <w:spacing w:after="80" w:line="20" w:lineRule="exact"/>
+      </w:pPr>
+    </w:p>
+    <w:p>
+      <w:r/>
+      <w:r>
+        <w:rPr>
+          <w:b/>
+        </w:rPr>
+        <w:t>Show me:</w:t>
+      </w:r>
+      <w:r>
+        <w:t xml:space="preserve"> one transfer and one wait. Can take without an offer must not invent a parcel.</w:t>
+      </w:r>
+    </w:p>
+    <w:p>
+      <w:r/>
+      <w:r>
+        <w:rPr>
+          <w:b/>
+        </w:rPr>
+        <w:t>Your next question:</w:t>
+      </w:r>
+      <w:r>
+        <w:t xml:space="preserve"> does a longer wait change the parcel's number? Try it.</w:t>
+      </w:r>
+    </w:p>
+    <w:p>
+      <w:pPr>
+        <w:pStyle w:val="Heading1"/>
+        <w:pageBreakBefore/>
+      </w:pPr>
+      <w:r>
+        <w:t>Chapter 5 Add two waiting places</w:t>
+      </w:r>
+    </w:p>
+    <w:p>
+      <w:r/>
+      <w:r>
+        <w:rPr>
+          <w:b/>
+        </w:rPr>
+        <w:t>Your mission:</w:t>
+      </w:r>
+      <w:r>
+        <w:t xml:space="preserve"> find out how two storage places help a sender during a short wait.</w:t>
+      </w:r>
+    </w:p>
+    <w:p>
+      <w:r/>
+      <w:r>
+        <w:rPr>
+          <w:b/>
+        </w:rPr>
+        <w:t>You need:</w:t>
+      </w:r>
+      <w:r>
+        <w:t xml:space="preserve"> the same cards; two places labeled Head (next to leave) and Spill (extra place). Your guide manages these places at first. Begin empty; offer 10; receiver Ready off.</w:t>
+      </w:r>
+    </w:p>
+    <w:p>
+      <w:pPr>
+        <w:ind w:left="216" w:hanging="216"/>
+      </w:pPr>
+      <w:r>
+        <w:t>1. Choose three or four waiting edges, then leave the receiver Ready on.</w:t>
+      </w:r>
+    </w:p>
+    <w:p>
+      <w:pPr>
+        <w:ind w:left="216" w:hanging="216"/>
+      </w:pPr>
+      <w:r>
+        <w:t>2. Before each edge, your guide marks which cards may enter and leave. At the edge, make both agreed moves together.</w:t>
+      </w:r>
+    </w:p>
+    <w:p>
+      <w:pPr>
+        <w:ind w:left="216" w:hanging="216"/>
+      </w:pPr>
+      <w:r>
+        <w:t xml:space="preserve">3. Stop after the second waiting edge. </w:t>
+      </w:r>
+      <w:r>
+        <w:rPr>
+          <w:b/>
+        </w:rPr>
+        <w:t>Show me:</w:t>
+      </w:r>
+      <w:r>
+        <w:t xml:space="preserve"> point to the next card to leave and the card still waiting with the sender.</w:t>
+      </w:r>
+    </w:p>
+    <w:p>
+      <w:pPr>
+        <w:ind w:left="216" w:hanging="216"/>
+      </w:pPr>
+      <w:r>
+        <w:t>4. Turn sender Valid off as soon as 12 enters the buffer. Continue until all three arrive; keep receiver Ready on for an extra empty edge. Then swap roles and repeat. A full buffer refuses another card until its stored state shows room.</w:t>
+      </w:r>
+    </w:p>
+    <w:p>
+      <w:r/>
+      <w:r>
+        <w:rPr>
+          <w:b/>
+        </w:rPr>
+        <w:t>Your next question:</w:t>
+      </w:r>
+      <w:r>
+        <w:t xml:space="preserve"> try the same wait without the two places. Which sender can hand over more cards before the receiver starts?</w:t>
+      </w:r>
+    </w:p>
+    <w:p>
+      <w:r/>
+      <w:r>
+        <w:rPr>
+          <w:b/>
+        </w:rPr>
+        <w:t>For your guide:</w:t>
+      </w:r>
+      <w:r>
+        <w:t xml:space="preserve"> the exact move rules and a worked table are in docs/LEARNER_LED_PILOT.md, under “Later chapters with a buffer.”</w:t>
+      </w:r>
+    </w:p>
+    <w:p>
+      <w:r/>
+      <w:r>
+        <w:rPr>
+          <w:b/>
+        </w:rPr>
+        <w:t>Keep this discovery:</w:t>
+      </w:r>
+      <w:r>
+        <w:t xml:space="preserve"> storage can absorb a short wait. It cannot make the receiver work faster. A newly accepted card cannot also leave an empty registered buffer at that same edge.</w:t>
+      </w:r>
+    </w:p>
+    <w:p>
+      <w:pPr>
+        <w:pStyle w:val="Heading1"/>
+        <w:pageBreakBefore/>
+      </w:pPr>
+      <w:r>
+        <w:t>Chapter 6 Be the parcel detective</w:t>
+      </w:r>
+    </w:p>
+    <w:p>
+      <w:r/>
+      <w:r>
+        <w:rPr>
+          <w:b/>
+        </w:rPr>
+        <w:t>Your mission:</w:t>
+      </w:r>
+      <w:r>
+        <w:t xml:space="preserve"> prove that every accepted parcel is accounted for.</w:t>
+      </w:r>
+    </w:p>
+    <w:p>
+      <w:r/>
+      <w:r>
+        <w:rPr>
+          <w:b/>
+        </w:rPr>
+        <w:t>You need:</w:t>
+      </w:r>
+      <w:r>
+        <w:t xml:space="preserve"> the buffered card activity, starting empty with counters at zero. Do not reset during this experiment. Let your guide manage the buffer while you keep the ledger. You may point or say the numbers and ask your guide to write them, or use counters to show each row.</w:t>
+      </w:r>
+    </w:p>
+    <w:p>
+      <w:pPr>
+        <w:ind w:left="216" w:hanging="216"/>
+      </w:pPr>
+      <w:r>
+        <w:t>1. Count a parcel as accepted when it enters the buffer.</w:t>
+      </w:r>
+    </w:p>
+    <w:p>
+      <w:pPr>
+        <w:ind w:left="216" w:hanging="216"/>
+      </w:pPr>
+      <w:r>
+        <w:t>2. Count a parcel as delivered when it leaves the buffer.</w:t>
+      </w:r>
+    </w:p>
+    <w:p>
+      <w:pPr>
+        <w:ind w:left="216" w:hanging="216"/>
+      </w:pPr>
+      <w:r>
+        <w:t>3. After every edge, count the cards still stored. Write down each delivered number in order.</w:t>
+      </w:r>
+    </w:p>
+    <w:p>
+      <w:pPr>
+        <w:ind w:left="216" w:hanging="216"/>
+      </w:pPr>
+      <w:r>
+        <w:t>4. Check: accepted = delivered + stored. Stored must be 0, 1 or 2.</w:t>
+      </w:r>
+    </w:p>
+    <w:tbl>
+      <w:tblPr>
+        <w:tblW w:type="auto" w:w="0"/>
+        <w:tblLayout w:type="fixed"/>
+        <w:tblLook w:firstColumn="1" w:firstRow="1" w:lastColumn="0" w:lastRow="0" w:noHBand="0" w:noVBand="1" w:val="04A0"/>
+      </w:tblPr>
+      <w:tblGrid>
+        <w:gridCol w:w="1008"/>
+        <w:gridCol w:w="1800"/>
+        <w:gridCol w:w="1800"/>
+        <w:gridCol w:w="1584"/>
+        <w:gridCol w:w="3888"/>
+      </w:tblGrid>
+      <w:tr>
+        <w:trPr>
+          <w:cantSplit/>
+          <w:tblHeader/>
+        </w:trPr>
+        <w:tc>
+          <w:tcPr>
+            <w:tcW w:type="dxa" w:w="1008"/>
+            <w:vAlign w:val="center"/>
+            <w:shd w:fill="17365D"/>
+            <w:tcBorders>
+              <w:top w:val="single" w:sz="4" w:color="D9D9D9"/>
+              <w:left w:val="single" w:sz="4" w:color="D9D9D9"/>
+              <w:bottom w:val="single" w:sz="4" w:color="D9D9D9"/>
+              <w:right w:val="single" w:sz="4" w:color="D9D9D9"/>
+            </w:tcBorders>
+            <w:tcMar>
+              <w:top w:w="90" w:type="dxa"/>
+              <w:left w:w="90" w:type="dxa"/>
+              <w:bottom w:w="90" w:type="dxa"/>
+              <w:right w:w="90" w:type="dxa"/>
+            </w:tcMar>
+          </w:tcPr>
+          <w:p>
+            <w:pPr>
+              <w:spacing w:after="40" w:line="252" w:lineRule="auto"/>
+              <w:jc w:val="center"/>
+            </w:pPr>
+            <w:r>
+              <w:rPr>
+                <w:b/>
+                <w:color w:val="FFFFFF"/>
+                <w:sz w:val="22"/>
+              </w:rPr>
+              <w:t>After edge</w:t>
+            </w:r>
+          </w:p>
+        </w:tc>
+        <w:tc>
+          <w:tcPr>
+            <w:tcW w:type="dxa" w:w="1800"/>
+            <w:vAlign w:val="center"/>
+            <w:shd w:fill="17365D"/>
+            <w:tcBorders>
+              <w:top w:val="single" w:sz="4" w:color="D9D9D9"/>
+              <w:left w:val="single" w:sz="4" w:color="D9D9D9"/>
+              <w:bottom w:val="single" w:sz="4" w:color="D9D9D9"/>
+              <w:right w:val="single" w:sz="4" w:color="D9D9D9"/>
+            </w:tcBorders>
+            <w:tcMar>
+              <w:top w:w="90" w:type="dxa"/>
+              <w:left w:w="90" w:type="dxa"/>
+              <w:bottom w:w="90" w:type="dxa"/>
+              <w:right w:w="90" w:type="dxa"/>
+            </w:tcMar>
+          </w:tcPr>
+          <w:p>
+            <w:pPr>
+              <w:spacing w:after="40" w:line="252" w:lineRule="auto"/>
+            </w:pPr>
+            <w:r>
+              <w:rPr>
+                <w:b/>
+                <w:color w:val="FFFFFF"/>
+                <w:sz w:val="22"/>
+              </w:rPr>
+              <w:t>Accepted total</w:t>
+            </w:r>
+          </w:p>
+        </w:tc>
+        <w:tc>
+          <w:tcPr>
+            <w:tcW w:type="dxa" w:w="1800"/>
+            <w:vAlign w:val="center"/>
+            <w:shd w:fill="17365D"/>
+            <w:tcBorders>
+              <w:top w:val="single" w:sz="4" w:color="D9D9D9"/>
+              <w:left w:val="single" w:sz="4" w:color="D9D9D9"/>
+              <w:bottom w:val="single" w:sz="4" w:color="D9D9D9"/>
+              <w:right w:val="single" w:sz="4" w:color="D9D9D9"/>
+            </w:tcBorders>
+            <w:tcMar>
+              <w:top w:w="90" w:type="dxa"/>
+              <w:left w:w="90" w:type="dxa"/>
+              <w:bottom w:w="90" w:type="dxa"/>
+              <w:right w:w="90" w:type="dxa"/>
+            </w:tcMar>
+          </w:tcPr>
+          <w:p>
+            <w:pPr>
+              <w:spacing w:after="40" w:line="252" w:lineRule="auto"/>
+            </w:pPr>
+            <w:r>
+              <w:rPr>
+                <w:b/>
+                <w:color w:val="FFFFFF"/>
+                <w:sz w:val="22"/>
+              </w:rPr>
+              <w:t>Delivered total</w:t>
+            </w:r>
+          </w:p>
+        </w:tc>
+        <w:tc>
+          <w:tcPr>
+            <w:tcW w:type="dxa" w:w="1584"/>
+            <w:vAlign w:val="center"/>
+            <w:shd w:fill="17365D"/>
+            <w:tcBorders>
+              <w:top w:val="single" w:sz="4" w:color="D9D9D9"/>
+              <w:left w:val="single" w:sz="4" w:color="D9D9D9"/>
+              <w:bottom w:val="single" w:sz="4" w:color="D9D9D9"/>
+              <w:right w:val="single" w:sz="4" w:color="D9D9D9"/>
+            </w:tcBorders>
+            <w:tcMar>
+              <w:top w:w="90" w:type="dxa"/>
+              <w:left w:w="90" w:type="dxa"/>
+              <w:bottom w:w="90" w:type="dxa"/>
+              <w:right w:w="90" w:type="dxa"/>
+            </w:tcMar>
+          </w:tcPr>
+          <w:p>
+            <w:pPr>
+              <w:spacing w:after="40" w:line="252" w:lineRule="auto"/>
+            </w:pPr>
+            <w:r>
+              <w:rPr>
+                <w:b/>
+                <w:color w:val="FFFFFF"/>
+                <w:sz w:val="22"/>
+              </w:rPr>
+              <w:t>Still stored</w:t>
+            </w:r>
+          </w:p>
+        </w:tc>
+        <w:tc>
+          <w:tcPr>
+            <w:tcW w:type="dxa" w:w="3888"/>
+            <w:vAlign w:val="center"/>
+            <w:shd w:fill="17365D"/>
+            <w:tcBorders>
+              <w:top w:val="single" w:sz="4" w:color="D9D9D9"/>
+              <w:left w:val="single" w:sz="4" w:color="D9D9D9"/>
+              <w:bottom w:val="single" w:sz="4" w:color="D9D9D9"/>
+              <w:right w:val="single" w:sz="4" w:color="D9D9D9"/>
+            </w:tcBorders>
+            <w:tcMar>
+              <w:top w:w="90" w:type="dxa"/>
+              <w:left w:w="90" w:type="dxa"/>
+              <w:bottom w:w="90" w:type="dxa"/>
+              <w:right w:w="90" w:type="dxa"/>
+            </w:tcMar>
+          </w:tcPr>
+          <w:p>
+            <w:pPr>
+              <w:spacing w:after="40" w:line="252" w:lineRule="auto"/>
+            </w:pPr>
+            <w:r>
+              <w:rPr>
+                <w:b/>
+                <w:color w:val="FFFFFF"/>
+                <w:sz w:val="22"/>
+              </w:rPr>
+              <w:t>Delivered number this edge</w:t>
+            </w:r>
+          </w:p>
+        </w:tc>
+      </w:tr>
+      <w:tr>
+        <w:trPr>
+          <w:cantSplit/>
+        </w:trPr>
+        <w:tc>
+          <w:tcPr>
+            <w:tcW w:type="dxa" w:w="1008"/>
+            <w:vAlign w:val="center"/>
+            <w:shd w:fill="FFFFFF"/>
+            <w:tcBorders>
+              <w:top w:val="single" w:sz="4" w:color="D9D9D9"/>
+              <w:left w:val="single" w:sz="4" w:color="D9D9D9"/>
+              <w:bottom w:val="single" w:sz="4" w:color="D9D9D9"/>
+              <w:right w:val="single" w:sz="4" w:color="D9D9D9"/>
+            </w:tcBorders>
+            <w:tcMar>
+              <w:top w:w="90" w:type="dxa"/>
+              <w:left w:w="90" w:type="dxa"/>
+              <w:bottom w:w="90" w:type="dxa"/>
+              <w:right w:w="90" w:type="dxa"/>
+            </w:tcMar>
+          </w:tcPr>
+          <w:p>
+            <w:pPr>
+              <w:spacing w:after="40" w:line="252" w:lineRule="auto"/>
+              <w:jc w:val="center"/>
+            </w:pPr>
+            <w:r>
+              <w:rPr>
+                <w:sz w:val="22"/>
+              </w:rPr>
+              <w:t>1</w:t>
+            </w:r>
+          </w:p>
+        </w:tc>
+        <w:tc>
+          <w:tcPr>
+            <w:tcW w:type="dxa" w:w="1800"/>
+            <w:vAlign w:val="center"/>
+            <w:shd w:fill="FFFFFF"/>
+            <w:tcBorders>
+              <w:top w:val="single" w:sz="4" w:color="D9D9D9"/>
+              <w:left w:val="single" w:sz="4" w:color="D9D9D9"/>
+              <w:bottom w:val="single" w:sz="4" w:color="D9D9D9"/>
+              <w:right w:val="single" w:sz="4" w:color="D9D9D9"/>
+            </w:tcBorders>
+            <w:tcMar>
+              <w:top w:w="90" w:type="dxa"/>
+              <w:left w:w="90" w:type="dxa"/>
+              <w:bottom w:w="90" w:type="dxa"/>
+              <w:right w:w="90" w:type="dxa"/>
+            </w:tcMar>
+          </w:tcPr>
+          <w:p>
+            <w:pPr>
+              <w:spacing w:after="40" w:line="252" w:lineRule="auto"/>
+            </w:pPr>
+            <w:r>
+              <w:rPr>
+                <w:sz w:val="22"/>
+              </w:rPr>
+            </w:r>
+          </w:p>
+        </w:tc>
+        <w:tc>
+          <w:tcPr>
+            <w:tcW w:type="dxa" w:w="1800"/>
+            <w:vAlign w:val="center"/>
+            <w:shd w:fill="FFFFFF"/>
+            <w:tcBorders>
+              <w:top w:val="single" w:sz="4" w:color="D9D9D9"/>
+              <w:left w:val="single" w:sz="4" w:color="D9D9D9"/>
+              <w:bottom w:val="single" w:sz="4" w:color="D9D9D9"/>
+              <w:right w:val="single" w:sz="4" w:color="D9D9D9"/>
+            </w:tcBorders>
+            <w:tcMar>
+              <w:top w:w="90" w:type="dxa"/>
+              <w:left w:w="90" w:type="dxa"/>
+              <w:bottom w:w="90" w:type="dxa"/>
+              <w:right w:w="90" w:type="dxa"/>
+            </w:tcMar>
+          </w:tcPr>
+          <w:p>
+            <w:pPr>
+              <w:spacing w:after="40" w:line="252" w:lineRule="auto"/>
+            </w:pPr>
+            <w:r>
+              <w:rPr>
+                <w:sz w:val="22"/>
+              </w:rPr>
+            </w:r>
+          </w:p>
+        </w:tc>
+        <w:tc>
+          <w:tcPr>
+            <w:tcW w:type="dxa" w:w="1584"/>
+            <w:vAlign w:val="center"/>
+            <w:shd w:fill="FFFFFF"/>
+            <w:tcBorders>
+              <w:top w:val="single" w:sz="4" w:color="D9D9D9"/>
+              <w:left w:val="single" w:sz="4" w:color="D9D9D9"/>
+              <w:bottom w:val="single" w:sz="4" w:color="D9D9D9"/>
+              <w:right w:val="single" w:sz="4" w:color="D9D9D9"/>
+            </w:tcBorders>
+            <w:tcMar>
+              <w:top w:w="90" w:type="dxa"/>
+              <w:left w:w="90" w:type="dxa"/>
+              <w:bottom w:w="90" w:type="dxa"/>
+              <w:right w:w="90" w:type="dxa"/>
+            </w:tcMar>
+          </w:tcPr>
+          <w:p>
+            <w:pPr>
+              <w:spacing w:after="40" w:line="252" w:lineRule="auto"/>
+            </w:pPr>
+            <w:r>
+              <w:rPr>
+                <w:sz w:val="22"/>
+              </w:rPr>
+            </w:r>
+          </w:p>
+        </w:tc>
+        <w:tc>
+          <w:tcPr>
+            <w:tcW w:type="dxa" w:w="3888"/>
+            <w:vAlign w:val="center"/>
+            <w:shd w:fill="FFFFFF"/>
+            <w:tcBorders>
+              <w:top w:val="single" w:sz="4" w:color="D9D9D9"/>
+              <w:left w:val="single" w:sz="4" w:color="D9D9D9"/>
+              <w:bottom w:val="single" w:sz="4" w:color="D9D9D9"/>
+              <w:right w:val="single" w:sz="4" w:color="D9D9D9"/>
+            </w:tcBorders>
+            <w:tcMar>
+              <w:top w:w="90" w:type="dxa"/>
+              <w:left w:w="90" w:type="dxa"/>
+              <w:bottom w:w="90" w:type="dxa"/>
+              <w:right w:w="90" w:type="dxa"/>
+            </w:tcMar>
+          </w:tcPr>
+          <w:p>
+            <w:pPr>
+              <w:spacing w:after="40" w:line="252" w:lineRule="auto"/>
+            </w:pPr>
+            <w:r>
+              <w:rPr>
+                <w:sz w:val="22"/>
+              </w:rPr>
+            </w:r>
+          </w:p>
+        </w:tc>
+      </w:tr>
+      <w:tr>
+        <w:trPr>
+          <w:cantSplit/>
+        </w:trPr>
+        <w:tc>
+          <w:tcPr>
+            <w:tcW w:type="dxa" w:w="1008"/>
+            <w:vAlign w:val="center"/>
+            <w:shd w:fill="EDF5F7"/>
+            <w:tcBorders>
+              <w:top w:val="single" w:sz="4" w:color="D9D9D9"/>
+              <w:left w:val="single" w:sz="4" w:color="D9D9D9"/>
+              <w:bottom w:val="single" w:sz="4" w:color="D9D9D9"/>
+              <w:right w:val="single" w:sz="4" w:color="D9D9D9"/>
+            </w:tcBorders>
+            <w:tcMar>
+              <w:top w:w="90" w:type="dxa"/>
+              <w:left w:w="90" w:type="dxa"/>
+              <w:bottom w:w="90" w:type="dxa"/>
+              <w:right w:w="90" w:type="dxa"/>
+            </w:tcMar>
+          </w:tcPr>
+          <w:p>
+            <w:pPr>
+              <w:spacing w:after="40" w:line="252" w:lineRule="auto"/>
+              <w:jc w:val="center"/>
+            </w:pPr>
+            <w:r>
+              <w:rPr>
+                <w:sz w:val="22"/>
+              </w:rPr>
+              <w:t>2</w:t>
+            </w:r>
+          </w:p>
+        </w:tc>
+        <w:tc>
+          <w:tcPr>
+            <w:tcW w:type="dxa" w:w="1800"/>
+            <w:vAlign w:val="center"/>
+            <w:shd w:fill="EDF5F7"/>
+            <w:tcBorders>
+              <w:top w:val="single" w:sz="4" w:color="D9D9D9"/>
+              <w:left w:val="single" w:sz="4" w:color="D9D9D9"/>
+              <w:bottom w:val="single" w:sz="4" w:color="D9D9D9"/>
+              <w:right w:val="single" w:sz="4" w:color="D9D9D9"/>
+            </w:tcBorders>
+            <w:tcMar>
+              <w:top w:w="90" w:type="dxa"/>
+              <w:left w:w="90" w:type="dxa"/>
+              <w:bottom w:w="90" w:type="dxa"/>
+              <w:right w:w="90" w:type="dxa"/>
+            </w:tcMar>
+          </w:tcPr>
+          <w:p>
+            <w:pPr>
+              <w:spacing w:after="40" w:line="252" w:lineRule="auto"/>
+            </w:pPr>
+            <w:r>
+              <w:rPr>
+                <w:sz w:val="22"/>
+              </w:rPr>
+            </w:r>
+          </w:p>
+        </w:tc>
+        <w:tc>
+          <w:tcPr>
+            <w:tcW w:type="dxa" w:w="1800"/>
+            <w:vAlign w:val="center"/>
+            <w:shd w:fill="EDF5F7"/>
+            <w:tcBorders>
+              <w:top w:val="single" w:sz="4" w:color="D9D9D9"/>
+              <w:left w:val="single" w:sz="4" w:color="D9D9D9"/>
+              <w:bottom w:val="single" w:sz="4" w:color="D9D9D9"/>
+              <w:right w:val="single" w:sz="4" w:color="D9D9D9"/>
+            </w:tcBorders>
+            <w:tcMar>
+              <w:top w:w="90" w:type="dxa"/>
+              <w:left w:w="90" w:type="dxa"/>
+              <w:bottom w:w="90" w:type="dxa"/>
+              <w:right w:w="90" w:type="dxa"/>
+            </w:tcMar>
+          </w:tcPr>
+          <w:p>
+            <w:pPr>
+              <w:spacing w:after="40" w:line="252" w:lineRule="auto"/>
+            </w:pPr>
+            <w:r>
+              <w:rPr>
+                <w:sz w:val="22"/>
+              </w:rPr>
+            </w:r>
+          </w:p>
+        </w:tc>
+        <w:tc>
+          <w:tcPr>
+            <w:tcW w:type="dxa" w:w="1584"/>
+            <w:vAlign w:val="center"/>
+            <w:shd w:fill="EDF5F7"/>
+            <w:tcBorders>
+              <w:top w:val="single" w:sz="4" w:color="D9D9D9"/>
+              <w:left w:val="single" w:sz="4" w:color="D9D9D9"/>
+              <w:bottom w:val="single" w:sz="4" w:color="D9D9D9"/>
+              <w:right w:val="single" w:sz="4" w:color="D9D9D9"/>
+            </w:tcBorders>
+            <w:tcMar>
+              <w:top w:w="90" w:type="dxa"/>
+              <w:left w:w="90" w:type="dxa"/>
+              <w:bottom w:w="90" w:type="dxa"/>
+              <w:right w:w="90" w:type="dxa"/>
+            </w:tcMar>
+          </w:tcPr>
+          <w:p>
+            <w:pPr>
+              <w:spacing w:after="40" w:line="252" w:lineRule="auto"/>
+            </w:pPr>
+            <w:r>
+              <w:rPr>
+                <w:sz w:val="22"/>
+              </w:rPr>
+            </w:r>
+          </w:p>
+        </w:tc>
+        <w:tc>
+          <w:tcPr>
+            <w:tcW w:type="dxa" w:w="3888"/>
+            <w:vAlign w:val="center"/>
+            <w:shd w:fill="EDF5F7"/>
+            <w:tcBorders>
+              <w:top w:val="single" w:sz="4" w:color="D9D9D9"/>
+              <w:left w:val="single" w:sz="4" w:color="D9D9D9"/>
+              <w:bottom w:val="single" w:sz="4" w:color="D9D9D9"/>
+              <w:right w:val="single" w:sz="4" w:color="D9D9D9"/>
+            </w:tcBorders>
+            <w:tcMar>
+              <w:top w:w="90" w:type="dxa"/>
+              <w:left w:w="90" w:type="dxa"/>
+              <w:bottom w:w="90" w:type="dxa"/>
+              <w:right w:w="90" w:type="dxa"/>
+            </w:tcMar>
+          </w:tcPr>
+          <w:p>
+            <w:pPr>
+              <w:spacing w:after="40" w:line="252" w:lineRule="auto"/>
+            </w:pPr>
+            <w:r>
+              <w:rPr>
+                <w:sz w:val="22"/>
+              </w:rPr>
+            </w:r>
+          </w:p>
+        </w:tc>
+      </w:tr>
+      <w:tr>
+        <w:trPr>
+          <w:cantSplit/>
+        </w:trPr>
+        <w:tc>
+          <w:tcPr>
+            <w:tcW w:type="dxa" w:w="1008"/>
+            <w:vAlign w:val="center"/>
+            <w:shd w:fill="FFFFFF"/>
+            <w:tcBorders>
+              <w:top w:val="single" w:sz="4" w:color="D9D9D9"/>
+              <w:left w:val="single" w:sz="4" w:color="D9D9D9"/>
+              <w:bottom w:val="single" w:sz="4" w:color="D9D9D9"/>
+              <w:right w:val="single" w:sz="4" w:color="D9D9D9"/>
+            </w:tcBorders>
+            <w:tcMar>
+              <w:top w:w="90" w:type="dxa"/>
+              <w:left w:w="90" w:type="dxa"/>
+              <w:bottom w:w="90" w:type="dxa"/>
+              <w:right w:w="90" w:type="dxa"/>
+            </w:tcMar>
+          </w:tcPr>
+          <w:p>
+            <w:pPr>
+              <w:spacing w:after="40" w:line="252" w:lineRule="auto"/>
+              <w:jc w:val="center"/>
+            </w:pPr>
+            <w:r>
+              <w:rPr>
+                <w:sz w:val="22"/>
+              </w:rPr>
+              <w:t>3</w:t>
+            </w:r>
+          </w:p>
+        </w:tc>
+        <w:tc>
+          <w:tcPr>
+            <w:tcW w:type="dxa" w:w="1800"/>
+            <w:vAlign w:val="center"/>
+            <w:shd w:fill="FFFFFF"/>
+            <w:tcBorders>
+              <w:top w:val="single" w:sz="4" w:color="D9D9D9"/>
+              <w:left w:val="single" w:sz="4" w:color="D9D9D9"/>
+              <w:bottom w:val="single" w:sz="4" w:color="D9D9D9"/>
+              <w:right w:val="single" w:sz="4" w:color="D9D9D9"/>
+            </w:tcBorders>
+            <w:tcMar>
+              <w:top w:w="90" w:type="dxa"/>
+              <w:left w:w="90" w:type="dxa"/>
+              <w:bottom w:w="90" w:type="dxa"/>
+              <w:right w:w="90" w:type="dxa"/>
+            </w:tcMar>
+          </w:tcPr>
+          <w:p>
+            <w:pPr>
+              <w:spacing w:after="40" w:line="252" w:lineRule="auto"/>
+            </w:pPr>
+            <w:r>
+              <w:rPr>
+                <w:sz w:val="22"/>
+              </w:rPr>
+            </w:r>
+          </w:p>
+        </w:tc>
+        <w:tc>
+          <w:tcPr>
+            <w:tcW w:type="dxa" w:w="1800"/>
+            <w:vAlign w:val="center"/>
+            <w:shd w:fill="FFFFFF"/>
+            <w:tcBorders>
+              <w:top w:val="single" w:sz="4" w:color="D9D9D9"/>
+              <w:left w:val="single" w:sz="4" w:color="D9D9D9"/>
+              <w:bottom w:val="single" w:sz="4" w:color="D9D9D9"/>
+              <w:right w:val="single" w:sz="4" w:color="D9D9D9"/>
+            </w:tcBorders>
+            <w:tcMar>
+              <w:top w:w="90" w:type="dxa"/>
+              <w:left w:w="90" w:type="dxa"/>
+              <w:bottom w:w="90" w:type="dxa"/>
+              <w:right w:w="90" w:type="dxa"/>
+            </w:tcMar>
+          </w:tcPr>
+          <w:p>
+            <w:pPr>
+              <w:spacing w:after="40" w:line="252" w:lineRule="auto"/>
+            </w:pPr>
+            <w:r>
+              <w:rPr>
+                <w:sz w:val="22"/>
+              </w:rPr>
+            </w:r>
+          </w:p>
+        </w:tc>
+        <w:tc>
+          <w:tcPr>
+            <w:tcW w:type="dxa" w:w="1584"/>
+            <w:vAlign w:val="center"/>
+            <w:shd w:fill="FFFFFF"/>
+            <w:tcBorders>
+              <w:top w:val="single" w:sz="4" w:color="D9D9D9"/>
+              <w:left w:val="single" w:sz="4" w:color="D9D9D9"/>
+              <w:bottom w:val="single" w:sz="4" w:color="D9D9D9"/>
+              <w:right w:val="single" w:sz="4" w:color="D9D9D9"/>
+            </w:tcBorders>
+            <w:tcMar>
+              <w:top w:w="90" w:type="dxa"/>
+              <w:left w:w="90" w:type="dxa"/>
+              <w:bottom w:w="90" w:type="dxa"/>
+              <w:right w:w="90" w:type="dxa"/>
+            </w:tcMar>
+          </w:tcPr>
+          <w:p>
+            <w:pPr>
+              <w:spacing w:after="40" w:line="252" w:lineRule="auto"/>
+            </w:pPr>
+            <w:r>
+              <w:rPr>
+                <w:sz w:val="22"/>
+              </w:rPr>
+            </w:r>
+          </w:p>
+        </w:tc>
+        <w:tc>
+          <w:tcPr>
+            <w:tcW w:type="dxa" w:w="3888"/>
+            <w:vAlign w:val="center"/>
+            <w:shd w:fill="FFFFFF"/>
+            <w:tcBorders>
+              <w:top w:val="single" w:sz="4" w:color="D9D9D9"/>
+              <w:left w:val="single" w:sz="4" w:color="D9D9D9"/>
+              <w:bottom w:val="single" w:sz="4" w:color="D9D9D9"/>
+              <w:right w:val="single" w:sz="4" w:color="D9D9D9"/>
+            </w:tcBorders>
+            <w:tcMar>
+              <w:top w:w="90" w:type="dxa"/>
+              <w:left w:w="90" w:type="dxa"/>
+              <w:bottom w:w="90" w:type="dxa"/>
+              <w:right w:w="90" w:type="dxa"/>
+            </w:tcMar>
+          </w:tcPr>
+          <w:p>
+            <w:pPr>
+              <w:spacing w:after="40" w:line="252" w:lineRule="auto"/>
+            </w:pPr>
+            <w:r>
+              <w:rPr>
+                <w:sz w:val="22"/>
+              </w:rPr>
+            </w:r>
+          </w:p>
+        </w:tc>
+      </w:tr>
+      <w:tr>
+        <w:trPr>
+          <w:cantSplit/>
+        </w:trPr>
+        <w:tc>
+          <w:tcPr>
+            <w:tcW w:type="dxa" w:w="1008"/>
+            <w:vAlign w:val="center"/>
+            <w:shd w:fill="EDF5F7"/>
+            <w:tcBorders>
+              <w:top w:val="single" w:sz="4" w:color="D9D9D9"/>
+              <w:left w:val="single" w:sz="4" w:color="D9D9D9"/>
+              <w:bottom w:val="single" w:sz="4" w:color="D9D9D9"/>
+              <w:right w:val="single" w:sz="4" w:color="D9D9D9"/>
+            </w:tcBorders>
+            <w:tcMar>
+              <w:top w:w="90" w:type="dxa"/>
+              <w:left w:w="90" w:type="dxa"/>
+              <w:bottom w:w="90" w:type="dxa"/>
+              <w:right w:w="90" w:type="dxa"/>
+            </w:tcMar>
+          </w:tcPr>
+          <w:p>
+            <w:pPr>
+              <w:spacing w:after="40" w:line="252" w:lineRule="auto"/>
+              <w:jc w:val="center"/>
+            </w:pPr>
+            <w:r>
+              <w:rPr>
+                <w:sz w:val="22"/>
+              </w:rPr>
+              <w:t>4</w:t>
+            </w:r>
+          </w:p>
+        </w:tc>
+        <w:tc>
+          <w:tcPr>
+            <w:tcW w:type="dxa" w:w="1800"/>
+            <w:vAlign w:val="center"/>
+            <w:shd w:fill="EDF5F7"/>
+            <w:tcBorders>
+              <w:top w:val="single" w:sz="4" w:color="D9D9D9"/>
+              <w:left w:val="single" w:sz="4" w:color="D9D9D9"/>
+              <w:bottom w:val="single" w:sz="4" w:color="D9D9D9"/>
+              <w:right w:val="single" w:sz="4" w:color="D9D9D9"/>
+            </w:tcBorders>
+            <w:tcMar>
+              <w:top w:w="90" w:type="dxa"/>
+              <w:left w:w="90" w:type="dxa"/>
+              <w:bottom w:w="90" w:type="dxa"/>
+              <w:right w:w="90" w:type="dxa"/>
+            </w:tcMar>
+          </w:tcPr>
+          <w:p>
+            <w:pPr>
+              <w:spacing w:after="40" w:line="252" w:lineRule="auto"/>
+            </w:pPr>
+            <w:r>
+              <w:rPr>
+                <w:sz w:val="22"/>
+              </w:rPr>
+            </w:r>
+          </w:p>
+        </w:tc>
+        <w:tc>
+          <w:tcPr>
+            <w:tcW w:type="dxa" w:w="1800"/>
+            <w:vAlign w:val="center"/>
+            <w:shd w:fill="EDF5F7"/>
+            <w:tcBorders>
+              <w:top w:val="single" w:sz="4" w:color="D9D9D9"/>
+              <w:left w:val="single" w:sz="4" w:color="D9D9D9"/>
+              <w:bottom w:val="single" w:sz="4" w:color="D9D9D9"/>
+              <w:right w:val="single" w:sz="4" w:color="D9D9D9"/>
+            </w:tcBorders>
+            <w:tcMar>
+              <w:top w:w="90" w:type="dxa"/>
+              <w:left w:w="90" w:type="dxa"/>
+              <w:bottom w:w="90" w:type="dxa"/>
+              <w:right w:w="90" w:type="dxa"/>
+            </w:tcMar>
+          </w:tcPr>
+          <w:p>
+            <w:pPr>
+              <w:spacing w:after="40" w:line="252" w:lineRule="auto"/>
+            </w:pPr>
+            <w:r>
+              <w:rPr>
+                <w:sz w:val="22"/>
+              </w:rPr>
+            </w:r>
+          </w:p>
+        </w:tc>
+        <w:tc>
+          <w:tcPr>
+            <w:tcW w:type="dxa" w:w="1584"/>
+            <w:vAlign w:val="center"/>
+            <w:shd w:fill="EDF5F7"/>
+            <w:tcBorders>
+              <w:top w:val="single" w:sz="4" w:color="D9D9D9"/>
+              <w:left w:val="single" w:sz="4" w:color="D9D9D9"/>
+              <w:bottom w:val="single" w:sz="4" w:color="D9D9D9"/>
+              <w:right w:val="single" w:sz="4" w:color="D9D9D9"/>
+            </w:tcBorders>
+            <w:tcMar>
+              <w:top w:w="90" w:type="dxa"/>
+              <w:left w:w="90" w:type="dxa"/>
+              <w:bottom w:w="90" w:type="dxa"/>
+              <w:right w:w="90" w:type="dxa"/>
+            </w:tcMar>
+          </w:tcPr>
+          <w:p>
+            <w:pPr>
+              <w:spacing w:after="40" w:line="252" w:lineRule="auto"/>
+            </w:pPr>
+            <w:r>
+              <w:rPr>
+                <w:sz w:val="22"/>
+              </w:rPr>
+            </w:r>
+          </w:p>
+        </w:tc>
+        <w:tc>
+          <w:tcPr>
+            <w:tcW w:type="dxa" w:w="3888"/>
+            <w:vAlign w:val="center"/>
+            <w:shd w:fill="EDF5F7"/>
+            <w:tcBorders>
+              <w:top w:val="single" w:sz="4" w:color="D9D9D9"/>
+              <w:left w:val="single" w:sz="4" w:color="D9D9D9"/>
+              <w:bottom w:val="single" w:sz="4" w:color="D9D9D9"/>
+              <w:right w:val="single" w:sz="4" w:color="D9D9D9"/>
+            </w:tcBorders>
+            <w:tcMar>
+              <w:top w:w="90" w:type="dxa"/>
+              <w:left w:w="90" w:type="dxa"/>
+              <w:bottom w:w="90" w:type="dxa"/>
+              <w:right w:w="90" w:type="dxa"/>
+            </w:tcMar>
+          </w:tcPr>
+          <w:p>
+            <w:pPr>
+              <w:spacing w:after="40" w:line="252" w:lineRule="auto"/>
+            </w:pPr>
+            <w:r>
+              <w:rPr>
+                <w:sz w:val="22"/>
+              </w:rPr>
+            </w:r>
+          </w:p>
+        </w:tc>
+      </w:tr>
+      <w:tr>
+        <w:trPr>
+          <w:cantSplit/>
+        </w:trPr>
+        <w:tc>
+          <w:tcPr>
+            <w:tcW w:type="dxa" w:w="1008"/>
+            <w:vAlign w:val="center"/>
+            <w:shd w:fill="FFFFFF"/>
+            <w:tcBorders>
+              <w:top w:val="single" w:sz="4" w:color="D9D9D9"/>
+              <w:left w:val="single" w:sz="4" w:color="D9D9D9"/>
+              <w:bottom w:val="single" w:sz="4" w:color="D9D9D9"/>
+              <w:right w:val="single" w:sz="4" w:color="D9D9D9"/>
+            </w:tcBorders>
+            <w:tcMar>
+              <w:top w:w="90" w:type="dxa"/>
+              <w:left w:w="90" w:type="dxa"/>
+              <w:bottom w:w="90" w:type="dxa"/>
+              <w:right w:w="90" w:type="dxa"/>
+            </w:tcMar>
+          </w:tcPr>
+          <w:p>
+            <w:pPr>
+              <w:spacing w:after="40" w:line="252" w:lineRule="auto"/>
+              <w:jc w:val="center"/>
+            </w:pPr>
+            <w:r>
+              <w:rPr>
+                <w:sz w:val="22"/>
+              </w:rPr>
+              <w:t>5</w:t>
+            </w:r>
+          </w:p>
+        </w:tc>
+        <w:tc>
+          <w:tcPr>
+            <w:tcW w:type="dxa" w:w="1800"/>
+            <w:vAlign w:val="center"/>
+            <w:shd w:fill="FFFFFF"/>
+            <w:tcBorders>
+              <w:top w:val="single" w:sz="4" w:color="D9D9D9"/>
+              <w:left w:val="single" w:sz="4" w:color="D9D9D9"/>
+              <w:bottom w:val="single" w:sz="4" w:color="D9D9D9"/>
+              <w:right w:val="single" w:sz="4" w:color="D9D9D9"/>
+            </w:tcBorders>
+            <w:tcMar>
+              <w:top w:w="90" w:type="dxa"/>
+              <w:left w:w="90" w:type="dxa"/>
+              <w:bottom w:w="90" w:type="dxa"/>
+              <w:right w:w="90" w:type="dxa"/>
+            </w:tcMar>
+          </w:tcPr>
+          <w:p>
+            <w:pPr>
+              <w:spacing w:after="40" w:line="252" w:lineRule="auto"/>
+            </w:pPr>
+            <w:r>
+              <w:rPr>
+                <w:sz w:val="22"/>
+              </w:rPr>
+            </w:r>
+          </w:p>
+        </w:tc>
+        <w:tc>
+          <w:tcPr>
+            <w:tcW w:type="dxa" w:w="1800"/>
+            <w:vAlign w:val="center"/>
+            <w:shd w:fill="FFFFFF"/>
+            <w:tcBorders>
+              <w:top w:val="single" w:sz="4" w:color="D9D9D9"/>
+              <w:left w:val="single" w:sz="4" w:color="D9D9D9"/>
+              <w:bottom w:val="single" w:sz="4" w:color="D9D9D9"/>
+              <w:right w:val="single" w:sz="4" w:color="D9D9D9"/>
+            </w:tcBorders>
+            <w:tcMar>
+              <w:top w:w="90" w:type="dxa"/>
+              <w:left w:w="90" w:type="dxa"/>
+              <w:bottom w:w="90" w:type="dxa"/>
+              <w:right w:w="90" w:type="dxa"/>
+            </w:tcMar>
+          </w:tcPr>
+          <w:p>
+            <w:pPr>
+              <w:spacing w:after="40" w:line="252" w:lineRule="auto"/>
+            </w:pPr>
+            <w:r>
+              <w:rPr>
+                <w:sz w:val="22"/>
+              </w:rPr>
+            </w:r>
+          </w:p>
+        </w:tc>
+        <w:tc>
+          <w:tcPr>
+            <w:tcW w:type="dxa" w:w="1584"/>
+            <w:vAlign w:val="center"/>
+            <w:shd w:fill="FFFFFF"/>
+            <w:tcBorders>
+              <w:top w:val="single" w:sz="4" w:color="D9D9D9"/>
+              <w:left w:val="single" w:sz="4" w:color="D9D9D9"/>
+              <w:bottom w:val="single" w:sz="4" w:color="D9D9D9"/>
+              <w:right w:val="single" w:sz="4" w:color="D9D9D9"/>
+            </w:tcBorders>
+            <w:tcMar>
+              <w:top w:w="90" w:type="dxa"/>
+              <w:left w:w="90" w:type="dxa"/>
+              <w:bottom w:w="90" w:type="dxa"/>
+              <w:right w:w="90" w:type="dxa"/>
+            </w:tcMar>
+          </w:tcPr>
+          <w:p>
+            <w:pPr>
+              <w:spacing w:after="40" w:line="252" w:lineRule="auto"/>
+            </w:pPr>
+            <w:r>
+              <w:rPr>
+                <w:sz w:val="22"/>
+              </w:rPr>
+            </w:r>
+          </w:p>
+        </w:tc>
+        <w:tc>
+          <w:tcPr>
+            <w:tcW w:type="dxa" w:w="3888"/>
+            <w:vAlign w:val="center"/>
+            <w:shd w:fill="FFFFFF"/>
+            <w:tcBorders>
+              <w:top w:val="single" w:sz="4" w:color="D9D9D9"/>
+              <w:left w:val="single" w:sz="4" w:color="D9D9D9"/>
+              <w:bottom w:val="single" w:sz="4" w:color="D9D9D9"/>
+              <w:right w:val="single" w:sz="4" w:color="D9D9D9"/>
+            </w:tcBorders>
+            <w:tcMar>
+              <w:top w:w="90" w:type="dxa"/>
+              <w:left w:w="90" w:type="dxa"/>
+              <w:bottom w:w="90" w:type="dxa"/>
+              <w:right w:w="90" w:type="dxa"/>
+            </w:tcMar>
+          </w:tcPr>
+          <w:p>
+            <w:pPr>
+              <w:spacing w:after="40" w:line="252" w:lineRule="auto"/>
+            </w:pPr>
+            <w:r>
+              <w:rPr>
+                <w:sz w:val="22"/>
+              </w:rPr>
+            </w:r>
+          </w:p>
+        </w:tc>
+      </w:tr>
+      <w:tr>
+        <w:trPr>
+          <w:cantSplit/>
+        </w:trPr>
+        <w:tc>
+          <w:tcPr>
+            <w:tcW w:type="dxa" w:w="1008"/>
+            <w:vAlign w:val="center"/>
+            <w:shd w:fill="EDF5F7"/>
+            <w:tcBorders>
+              <w:top w:val="single" w:sz="4" w:color="D9D9D9"/>
+              <w:left w:val="single" w:sz="4" w:color="D9D9D9"/>
+              <w:bottom w:val="single" w:sz="4" w:color="D9D9D9"/>
+              <w:right w:val="single" w:sz="4" w:color="D9D9D9"/>
+            </w:tcBorders>
+            <w:tcMar>
+              <w:top w:w="90" w:type="dxa"/>
+              <w:left w:w="90" w:type="dxa"/>
+              <w:bottom w:w="90" w:type="dxa"/>
+              <w:right w:w="90" w:type="dxa"/>
+            </w:tcMar>
+          </w:tcPr>
+          <w:p>
+            <w:pPr>
+              <w:spacing w:after="40" w:line="252" w:lineRule="auto"/>
+              <w:jc w:val="center"/>
+            </w:pPr>
+            <w:r>
+              <w:rPr>
+                <w:sz w:val="22"/>
+              </w:rPr>
+              <w:t>6</w:t>
+            </w:r>
+          </w:p>
+        </w:tc>
+        <w:tc>
+          <w:tcPr>
+            <w:tcW w:type="dxa" w:w="1800"/>
+            <w:vAlign w:val="center"/>
+            <w:shd w:fill="EDF5F7"/>
+            <w:tcBorders>
+              <w:top w:val="single" w:sz="4" w:color="D9D9D9"/>
+              <w:left w:val="single" w:sz="4" w:color="D9D9D9"/>
+              <w:bottom w:val="single" w:sz="4" w:color="D9D9D9"/>
+              <w:right w:val="single" w:sz="4" w:color="D9D9D9"/>
+            </w:tcBorders>
+            <w:tcMar>
+              <w:top w:w="90" w:type="dxa"/>
+              <w:left w:w="90" w:type="dxa"/>
+              <w:bottom w:w="90" w:type="dxa"/>
+              <w:right w:w="90" w:type="dxa"/>
+            </w:tcMar>
+          </w:tcPr>
+          <w:p>
+            <w:pPr>
+              <w:spacing w:after="40" w:line="252" w:lineRule="auto"/>
+            </w:pPr>
+            <w:r>
+              <w:rPr>
+                <w:sz w:val="22"/>
+              </w:rPr>
+            </w:r>
+          </w:p>
+        </w:tc>
+        <w:tc>
+          <w:tcPr>
+            <w:tcW w:type="dxa" w:w="1800"/>
+            <w:vAlign w:val="center"/>
+            <w:shd w:fill="EDF5F7"/>
+            <w:tcBorders>
+              <w:top w:val="single" w:sz="4" w:color="D9D9D9"/>
+              <w:left w:val="single" w:sz="4" w:color="D9D9D9"/>
+              <w:bottom w:val="single" w:sz="4" w:color="D9D9D9"/>
+              <w:right w:val="single" w:sz="4" w:color="D9D9D9"/>
+            </w:tcBorders>
+            <w:tcMar>
+              <w:top w:w="90" w:type="dxa"/>
+              <w:left w:w="90" w:type="dxa"/>
+              <w:bottom w:w="90" w:type="dxa"/>
+              <w:right w:w="90" w:type="dxa"/>
+            </w:tcMar>
+          </w:tcPr>
+          <w:p>
+            <w:pPr>
+              <w:spacing w:after="40" w:line="252" w:lineRule="auto"/>
+            </w:pPr>
+            <w:r>
+              <w:rPr>
+                <w:sz w:val="22"/>
+              </w:rPr>
+            </w:r>
+          </w:p>
+        </w:tc>
+        <w:tc>
+          <w:tcPr>
+            <w:tcW w:type="dxa" w:w="1584"/>
+            <w:vAlign w:val="center"/>
+            <w:shd w:fill="EDF5F7"/>
+            <w:tcBorders>
+              <w:top w:val="single" w:sz="4" w:color="D9D9D9"/>
+              <w:left w:val="single" w:sz="4" w:color="D9D9D9"/>
+              <w:bottom w:val="single" w:sz="4" w:color="D9D9D9"/>
+              <w:right w:val="single" w:sz="4" w:color="D9D9D9"/>
+            </w:tcBorders>
+            <w:tcMar>
+              <w:top w:w="90" w:type="dxa"/>
+              <w:left w:w="90" w:type="dxa"/>
+              <w:bottom w:w="90" w:type="dxa"/>
+              <w:right w:w="90" w:type="dxa"/>
+            </w:tcMar>
+          </w:tcPr>
+          <w:p>
+            <w:pPr>
+              <w:spacing w:after="40" w:line="252" w:lineRule="auto"/>
+            </w:pPr>
+            <w:r>
+              <w:rPr>
+                <w:sz w:val="22"/>
+              </w:rPr>
+            </w:r>
+          </w:p>
+        </w:tc>
+        <w:tc>
+          <w:tcPr>
+            <w:tcW w:type="dxa" w:w="3888"/>
+            <w:vAlign w:val="center"/>
+            <w:shd w:fill="EDF5F7"/>
+            <w:tcBorders>
+              <w:top w:val="single" w:sz="4" w:color="D9D9D9"/>
+              <w:left w:val="single" w:sz="4" w:color="D9D9D9"/>
+              <w:bottom w:val="single" w:sz="4" w:color="D9D9D9"/>
+              <w:right w:val="single" w:sz="4" w:color="D9D9D9"/>
+            </w:tcBorders>
+            <w:tcMar>
+              <w:top w:w="90" w:type="dxa"/>
+              <w:left w:w="90" w:type="dxa"/>
+              <w:bottom w:w="90" w:type="dxa"/>
+              <w:right w:w="90" w:type="dxa"/>
+            </w:tcMar>
+          </w:tcPr>
+          <w:p>
+            <w:pPr>
+              <w:spacing w:after="40" w:line="252" w:lineRule="auto"/>
+            </w:pPr>
+            <w:r>
+              <w:rPr>
+                <w:sz w:val="22"/>
+              </w:rPr>
+            </w:r>
+          </w:p>
+        </w:tc>
+      </w:tr>
+      <w:tr>
+        <w:trPr>
+          <w:cantSplit/>
+        </w:trPr>
+        <w:tc>
+          <w:tcPr>
+            <w:tcW w:type="dxa" w:w="1008"/>
+            <w:vAlign w:val="center"/>
+            <w:shd w:fill="FFFFFF"/>
+            <w:tcBorders>
+              <w:top w:val="single" w:sz="4" w:color="D9D9D9"/>
+              <w:left w:val="single" w:sz="4" w:color="D9D9D9"/>
+              <w:bottom w:val="single" w:sz="4" w:color="D9D9D9"/>
+              <w:right w:val="single" w:sz="4" w:color="D9D9D9"/>
+            </w:tcBorders>
+            <w:tcMar>
+              <w:top w:w="90" w:type="dxa"/>
+              <w:left w:w="90" w:type="dxa"/>
+              <w:bottom w:w="90" w:type="dxa"/>
+              <w:right w:w="90" w:type="dxa"/>
+            </w:tcMar>
+          </w:tcPr>
+          <w:p>
+            <w:pPr>
+              <w:spacing w:after="40" w:line="252" w:lineRule="auto"/>
+              <w:jc w:val="center"/>
+            </w:pPr>
+            <w:r>
+              <w:rPr>
+                <w:sz w:val="22"/>
+              </w:rPr>
+              <w:t>7</w:t>
+            </w:r>
+          </w:p>
+        </w:tc>
+        <w:tc>
+          <w:tcPr>
+            <w:tcW w:type="dxa" w:w="1800"/>
+            <w:vAlign w:val="center"/>
+            <w:shd w:fill="FFFFFF"/>
+            <w:tcBorders>
+              <w:top w:val="single" w:sz="4" w:color="D9D9D9"/>
+              <w:left w:val="single" w:sz="4" w:color="D9D9D9"/>
+              <w:bottom w:val="single" w:sz="4" w:color="D9D9D9"/>
+              <w:right w:val="single" w:sz="4" w:color="D9D9D9"/>
+            </w:tcBorders>
+            <w:tcMar>
+              <w:top w:w="90" w:type="dxa"/>
+              <w:left w:w="90" w:type="dxa"/>
+              <w:bottom w:w="90" w:type="dxa"/>
+              <w:right w:w="90" w:type="dxa"/>
+            </w:tcMar>
+          </w:tcPr>
+          <w:p>
+            <w:pPr>
+              <w:spacing w:after="40" w:line="252" w:lineRule="auto"/>
+            </w:pPr>
+            <w:r>
+              <w:rPr>
+                <w:sz w:val="22"/>
+              </w:rPr>
+            </w:r>
+          </w:p>
+        </w:tc>
+        <w:tc>
+          <w:tcPr>
+            <w:tcW w:type="dxa" w:w="1800"/>
+            <w:vAlign w:val="center"/>
+            <w:shd w:fill="FFFFFF"/>
+            <w:tcBorders>
+              <w:top w:val="single" w:sz="4" w:color="D9D9D9"/>
+              <w:left w:val="single" w:sz="4" w:color="D9D9D9"/>
+              <w:bottom w:val="single" w:sz="4" w:color="D9D9D9"/>
+              <w:right w:val="single" w:sz="4" w:color="D9D9D9"/>
+            </w:tcBorders>
+            <w:tcMar>
+              <w:top w:w="90" w:type="dxa"/>
+              <w:left w:w="90" w:type="dxa"/>
+              <w:bottom w:w="90" w:type="dxa"/>
+              <w:right w:w="90" w:type="dxa"/>
+            </w:tcMar>
+          </w:tcPr>
+          <w:p>
+            <w:pPr>
+              <w:spacing w:after="40" w:line="252" w:lineRule="auto"/>
+            </w:pPr>
+            <w:r>
+              <w:rPr>
+                <w:sz w:val="22"/>
+              </w:rPr>
+            </w:r>
+          </w:p>
+        </w:tc>
+        <w:tc>
+          <w:tcPr>
+            <w:tcW w:type="dxa" w:w="1584"/>
+            <w:vAlign w:val="center"/>
+            <w:shd w:fill="FFFFFF"/>
+            <w:tcBorders>
+              <w:top w:val="single" w:sz="4" w:color="D9D9D9"/>
+              <w:left w:val="single" w:sz="4" w:color="D9D9D9"/>
+              <w:bottom w:val="single" w:sz="4" w:color="D9D9D9"/>
+              <w:right w:val="single" w:sz="4" w:color="D9D9D9"/>
+            </w:tcBorders>
+            <w:tcMar>
+              <w:top w:w="90" w:type="dxa"/>
+              <w:left w:w="90" w:type="dxa"/>
+              <w:bottom w:w="90" w:type="dxa"/>
+              <w:right w:w="90" w:type="dxa"/>
+            </w:tcMar>
+          </w:tcPr>
+          <w:p>
+            <w:pPr>
+              <w:spacing w:after="40" w:line="252" w:lineRule="auto"/>
+            </w:pPr>
+            <w:r>
+              <w:rPr>
+                <w:sz w:val="22"/>
+              </w:rPr>
+            </w:r>
+          </w:p>
+        </w:tc>
+        <w:tc>
+          <w:tcPr>
+            <w:tcW w:type="dxa" w:w="3888"/>
+            <w:vAlign w:val="center"/>
+            <w:shd w:fill="FFFFFF"/>
+            <w:tcBorders>
+              <w:top w:val="single" w:sz="4" w:color="D9D9D9"/>
+              <w:left w:val="single" w:sz="4" w:color="D9D9D9"/>
+              <w:bottom w:val="single" w:sz="4" w:color="D9D9D9"/>
+              <w:right w:val="single" w:sz="4" w:color="D9D9D9"/>
+            </w:tcBorders>
+            <w:tcMar>
+              <w:top w:w="90" w:type="dxa"/>
+              <w:left w:w="90" w:type="dxa"/>
+              <w:bottom w:w="90" w:type="dxa"/>
+              <w:right w:w="90" w:type="dxa"/>
+            </w:tcMar>
+          </w:tcPr>
+          <w:p>
+            <w:pPr>
+              <w:spacing w:after="40" w:line="252" w:lineRule="auto"/>
+            </w:pPr>
+            <w:r>
+              <w:rPr>
+                <w:sz w:val="22"/>
+              </w:rPr>
+            </w:r>
+          </w:p>
+        </w:tc>
+      </w:tr>
+      <w:tr>
+        <w:trPr>
+          <w:cantSplit/>
+        </w:trPr>
+        <w:tc>
+          <w:tcPr>
+            <w:tcW w:type="dxa" w:w="1008"/>
+            <w:vAlign w:val="center"/>
+            <w:shd w:fill="EDF5F7"/>
+            <w:tcBorders>
+              <w:top w:val="single" w:sz="4" w:color="D9D9D9"/>
+              <w:left w:val="single" w:sz="4" w:color="D9D9D9"/>
+              <w:bottom w:val="single" w:sz="4" w:color="D9D9D9"/>
+              <w:right w:val="single" w:sz="4" w:color="D9D9D9"/>
+            </w:tcBorders>
+            <w:tcMar>
+              <w:top w:w="90" w:type="dxa"/>
+              <w:left w:w="90" w:type="dxa"/>
+              <w:bottom w:w="90" w:type="dxa"/>
+              <w:right w:w="90" w:type="dxa"/>
+            </w:tcMar>
+          </w:tcPr>
+          <w:p>
+            <w:pPr>
+              <w:spacing w:after="40" w:line="252" w:lineRule="auto"/>
+              <w:jc w:val="center"/>
+            </w:pPr>
+            <w:r>
+              <w:rPr>
+                <w:sz w:val="22"/>
+              </w:rPr>
+              <w:t>8</w:t>
+            </w:r>
+          </w:p>
+        </w:tc>
+        <w:tc>
+          <w:tcPr>
+            <w:tcW w:type="dxa" w:w="1800"/>
+            <w:vAlign w:val="center"/>
+            <w:shd w:fill="EDF5F7"/>
+            <w:tcBorders>
+              <w:top w:val="single" w:sz="4" w:color="D9D9D9"/>
+              <w:left w:val="single" w:sz="4" w:color="D9D9D9"/>
+              <w:bottom w:val="single" w:sz="4" w:color="D9D9D9"/>
+              <w:right w:val="single" w:sz="4" w:color="D9D9D9"/>
+            </w:tcBorders>
+            <w:tcMar>
+              <w:top w:w="90" w:type="dxa"/>
+              <w:left w:w="90" w:type="dxa"/>
+              <w:bottom w:w="90" w:type="dxa"/>
+              <w:right w:w="90" w:type="dxa"/>
+            </w:tcMar>
+          </w:tcPr>
+          <w:p>
+            <w:pPr>
+              <w:spacing w:after="40" w:line="252" w:lineRule="auto"/>
+            </w:pPr>
+            <w:r>
+              <w:rPr>
+                <w:sz w:val="22"/>
+              </w:rPr>
+            </w:r>
+          </w:p>
+        </w:tc>
+        <w:tc>
+          <w:tcPr>
+            <w:tcW w:type="dxa" w:w="1800"/>
+            <w:vAlign w:val="center"/>
+            <w:shd w:fill="EDF5F7"/>
+            <w:tcBorders>
+              <w:top w:val="single" w:sz="4" w:color="D9D9D9"/>
+              <w:left w:val="single" w:sz="4" w:color="D9D9D9"/>
+              <w:bottom w:val="single" w:sz="4" w:color="D9D9D9"/>
+              <w:right w:val="single" w:sz="4" w:color="D9D9D9"/>
+            </w:tcBorders>
+            <w:tcMar>
+              <w:top w:w="90" w:type="dxa"/>
+              <w:left w:w="90" w:type="dxa"/>
+              <w:bottom w:w="90" w:type="dxa"/>
+              <w:right w:w="90" w:type="dxa"/>
+            </w:tcMar>
+          </w:tcPr>
+          <w:p>
+            <w:pPr>
+              <w:spacing w:after="40" w:line="252" w:lineRule="auto"/>
+            </w:pPr>
+            <w:r>
+              <w:rPr>
+                <w:sz w:val="22"/>
+              </w:rPr>
+            </w:r>
+          </w:p>
+        </w:tc>
+        <w:tc>
+          <w:tcPr>
+            <w:tcW w:type="dxa" w:w="1584"/>
+            <w:vAlign w:val="center"/>
+            <w:shd w:fill="EDF5F7"/>
+            <w:tcBorders>
+              <w:top w:val="single" w:sz="4" w:color="D9D9D9"/>
+              <w:left w:val="single" w:sz="4" w:color="D9D9D9"/>
+              <w:bottom w:val="single" w:sz="4" w:color="D9D9D9"/>
+              <w:right w:val="single" w:sz="4" w:color="D9D9D9"/>
+            </w:tcBorders>
+            <w:tcMar>
+              <w:top w:w="90" w:type="dxa"/>
+              <w:left w:w="90" w:type="dxa"/>
+              <w:bottom w:w="90" w:type="dxa"/>
+              <w:right w:w="90" w:type="dxa"/>
+            </w:tcMar>
+          </w:tcPr>
+          <w:p>
+            <w:pPr>
+              <w:spacing w:after="40" w:line="252" w:lineRule="auto"/>
+            </w:pPr>
+            <w:r>
+              <w:rPr>
+                <w:sz w:val="22"/>
+              </w:rPr>
+            </w:r>
+          </w:p>
+        </w:tc>
+        <w:tc>
+          <w:tcPr>
+            <w:tcW w:type="dxa" w:w="3888"/>
+            <w:vAlign w:val="center"/>
+            <w:shd w:fill="EDF5F7"/>
+            <w:tcBorders>
+              <w:top w:val="single" w:sz="4" w:color="D9D9D9"/>
+              <w:left w:val="single" w:sz="4" w:color="D9D9D9"/>
+              <w:bottom w:val="single" w:sz="4" w:color="D9D9D9"/>
+              <w:right w:val="single" w:sz="4" w:color="D9D9D9"/>
+            </w:tcBorders>
+            <w:tcMar>
+              <w:top w:w="90" w:type="dxa"/>
+              <w:left w:w="90" w:type="dxa"/>
+              <w:bottom w:w="90" w:type="dxa"/>
+              <w:right w:w="90" w:type="dxa"/>
+            </w:tcMar>
+          </w:tcPr>
+          <w:p>
+            <w:pPr>
+              <w:spacing w:after="40" w:line="252" w:lineRule="auto"/>
+            </w:pPr>
+            <w:r>
+              <w:rPr>
+                <w:sz w:val="22"/>
+              </w:rPr>
+            </w:r>
+          </w:p>
+        </w:tc>
+      </w:tr>
+    </w:tbl>
+    <w:p>
+      <w:pPr>
+        <w:spacing w:after="80" w:line="20" w:lineRule="exact"/>
+      </w:pPr>
+    </w:p>
+    <w:p>
+      <w:r>
+        <w:t>These eight rows cover either pause choice and an extra empty check. A card still with the sender has not been accepted.</w:t>
+      </w:r>
+    </w:p>
+    <w:p>
+      <w:r/>
+      <w:r>
+        <w:rPr>
+          <w:b/>
+        </w:rPr>
+        <w:t>Show me:</w:t>
+      </w:r>
+      <w:r>
+        <w:t xml:space="preserve"> explain one row using actual cards. Check the delivery list is 10, 11, 12 as well as checking the totals.</w:t>
+      </w:r>
+    </w:p>
+    <w:p>
+      <w:r/>
+      <w:r>
+        <w:rPr>
+          <w:b/>
+        </w:rPr>
+        <w:t>Your next question:</w:t>
+      </w:r>
+      <w:r>
+        <w:t xml:space="preserve"> have your guide make a pretend ledger mistake. Can your cards reveal it?</w:t>
+      </w:r>
+    </w:p>
+    <w:p>
+      <w:pPr>
+        <w:pStyle w:val="Heading1"/>
+        <w:pageBreakBefore/>
+      </w:pPr>
+      <w:r>
+        <w:t>Chapter 7 Numbers made of lights</w:t>
+      </w:r>
+    </w:p>
+    <w:p>
+      <w:r/>
+      <w:r>
+        <w:rPr>
+          <w:b/>
+        </w:rPr>
+        <w:t>Your mission:</w:t>
+      </w:r>
+      <w:r>
+        <w:t xml:space="preserve"> show a number with four on-or-off cards.</w:t>
+      </w:r>
+    </w:p>
+    <w:p>
+      <w:r/>
+      <w:r>
+        <w:rPr>
+          <w:b/>
+        </w:rPr>
+        <w:t>You need:</w:t>
+      </w:r>
+      <w:r>
+        <w:t xml:space="preserve"> cards labeled 8, 4, 2, 1. Keep the labels visible. Mark each ON or OFF using words, not color alone.</w:t>
+      </w:r>
+    </w:p>
+    <w:p>
+      <w:pPr>
+        <w:ind w:left="216" w:hanging="216"/>
+      </w:pPr>
+      <w:r>
+        <w:t>1. Choose a number from 0 to 15. Turn ON the cards whose values add to your number.</w:t>
+      </w:r>
+    </w:p>
+    <w:p>
+      <w:pPr>
+        <w:ind w:left="216" w:hanging="216"/>
+      </w:pPr>
+      <w:r>
+        <w:t>2. Your partner adds the ON values. Do you agree?</w:t>
+      </w:r>
+    </w:p>
+    <w:p>
+      <w:pPr>
+        <w:ind w:left="216" w:hanging="216"/>
+      </w:pPr>
+      <w:r>
+        <w:t>3. Record ON as 1 and OFF as 0, in the order 8, 4, 2, 1.</w:t>
+      </w:r>
+    </w:p>
+    <w:p>
+      <w:pPr>
+        <w:ind w:left="216" w:hanging="216"/>
+      </w:pPr>
+      <w:r>
+        <w:t>4. Swap roles with a different number.</w:t>
+      </w:r>
+    </w:p>
+    <w:tbl>
+      <w:tblPr>
+        <w:tblW w:type="auto" w:w="0"/>
+        <w:tblLayout w:type="fixed"/>
+        <w:tblLook w:firstColumn="1" w:firstRow="1" w:lastColumn="0" w:lastRow="0" w:noHBand="0" w:noVBand="1" w:val="04A0"/>
+      </w:tblPr>
+      <w:tblGrid>
+        <w:gridCol w:w="3024"/>
+        <w:gridCol w:w="3312"/>
+        <w:gridCol w:w="3744"/>
+      </w:tblGrid>
+      <w:tr>
+        <w:trPr>
+          <w:cantSplit/>
+          <w:tblHeader/>
+        </w:trPr>
+        <w:tc>
+          <w:tcPr>
+            <w:tcW w:type="dxa" w:w="3024"/>
+            <w:vAlign w:val="center"/>
+            <w:shd w:fill="17365D"/>
+            <w:tcBorders>
+              <w:top w:val="single" w:sz="4" w:color="D9D9D9"/>
+              <w:left w:val="single" w:sz="4" w:color="D9D9D9"/>
+              <w:bottom w:val="single" w:sz="4" w:color="D9D9D9"/>
+              <w:right w:val="single" w:sz="4" w:color="D9D9D9"/>
+            </w:tcBorders>
+            <w:tcMar>
+              <w:top w:w="90" w:type="dxa"/>
+              <w:left w:w="90" w:type="dxa"/>
+              <w:bottom w:w="90" w:type="dxa"/>
+              <w:right w:w="90" w:type="dxa"/>
+            </w:tcMar>
+          </w:tcPr>
+          <w:p>
+            <w:pPr>
+              <w:spacing w:after="40" w:line="252" w:lineRule="auto"/>
+              <w:jc w:val="center"/>
+            </w:pPr>
+            <w:r>
+              <w:rPr>
+                <w:b/>
+                <w:color w:val="FFFFFF"/>
+                <w:sz w:val="22"/>
+              </w:rPr>
+              <w:t>Number</w:t>
+            </w:r>
+          </w:p>
+        </w:tc>
+        <w:tc>
+          <w:tcPr>
+            <w:tcW w:type="dxa" w:w="3312"/>
+            <w:vAlign w:val="center"/>
+            <w:shd w:fill="17365D"/>
+            <w:tcBorders>
+              <w:top w:val="single" w:sz="4" w:color="D9D9D9"/>
+              <w:left w:val="single" w:sz="4" w:color="D9D9D9"/>
+              <w:bottom w:val="single" w:sz="4" w:color="D9D9D9"/>
+              <w:right w:val="single" w:sz="4" w:color="D9D9D9"/>
+            </w:tcBorders>
+            <w:tcMar>
+              <w:top w:w="90" w:type="dxa"/>
+              <w:left w:w="90" w:type="dxa"/>
+              <w:bottom w:w="90" w:type="dxa"/>
+              <w:right w:w="90" w:type="dxa"/>
+            </w:tcMar>
+          </w:tcPr>
+          <w:p>
+            <w:pPr>
+              <w:spacing w:after="40" w:line="252" w:lineRule="auto"/>
+            </w:pPr>
+            <w:r>
+              <w:rPr>
+                <w:b/>
+                <w:color w:val="FFFFFF"/>
+                <w:sz w:val="22"/>
+              </w:rPr>
+              <w:t>ON cards</w:t>
+            </w:r>
+          </w:p>
+        </w:tc>
+        <w:tc>
+          <w:tcPr>
+            <w:tcW w:type="dxa" w:w="3744"/>
+            <w:vAlign w:val="center"/>
+            <w:shd w:fill="17365D"/>
+            <w:tcBorders>
+              <w:top w:val="single" w:sz="4" w:color="D9D9D9"/>
+              <w:left w:val="single" w:sz="4" w:color="D9D9D9"/>
+              <w:bottom w:val="single" w:sz="4" w:color="D9D9D9"/>
+              <w:right w:val="single" w:sz="4" w:color="D9D9D9"/>
+            </w:tcBorders>
+            <w:tcMar>
+              <w:top w:w="90" w:type="dxa"/>
+              <w:left w:w="90" w:type="dxa"/>
+              <w:bottom w:w="90" w:type="dxa"/>
+              <w:right w:w="90" w:type="dxa"/>
+            </w:tcMar>
+          </w:tcPr>
+          <w:p>
+            <w:pPr>
+              <w:spacing w:after="40" w:line="252" w:lineRule="auto"/>
+            </w:pPr>
+            <w:r>
+              <w:rPr>
+                <w:b/>
+                <w:color w:val="FFFFFF"/>
+                <w:sz w:val="22"/>
+              </w:rPr>
+              <w:t>Pattern</w:t>
+            </w:r>
+          </w:p>
+        </w:tc>
+      </w:tr>
+      <w:tr>
+        <w:trPr>
+          <w:cantSplit/>
+        </w:trPr>
+        <w:tc>
+          <w:tcPr>
+            <w:tcW w:type="dxa" w:w="3024"/>
+            <w:vAlign w:val="center"/>
+            <w:shd w:fill="FFFFFF"/>
+            <w:tcBorders>
+              <w:top w:val="single" w:sz="4" w:color="D9D9D9"/>
+              <w:left w:val="single" w:sz="4" w:color="D9D9D9"/>
+              <w:bottom w:val="single" w:sz="4" w:color="D9D9D9"/>
+              <w:right w:val="single" w:sz="4" w:color="D9D9D9"/>
+            </w:tcBorders>
+            <w:tcMar>
+              <w:top w:w="90" w:type="dxa"/>
+              <w:left w:w="90" w:type="dxa"/>
+              <w:bottom w:w="90" w:type="dxa"/>
+              <w:right w:w="90" w:type="dxa"/>
+            </w:tcMar>
+          </w:tcPr>
+          <w:p>
+            <w:pPr>
+              <w:spacing w:after="40" w:line="252" w:lineRule="auto"/>
+              <w:jc w:val="center"/>
+            </w:pPr>
+            <w:r>
+              <w:rPr>
+                <w:sz w:val="22"/>
+              </w:rPr>
+              <w:t>5</w:t>
+            </w:r>
+          </w:p>
+        </w:tc>
+        <w:tc>
+          <w:tcPr>
+            <w:tcW w:type="dxa" w:w="3312"/>
+            <w:vAlign w:val="center"/>
+            <w:shd w:fill="FFFFFF"/>
+            <w:tcBorders>
+              <w:top w:val="single" w:sz="4" w:color="D9D9D9"/>
+              <w:left w:val="single" w:sz="4" w:color="D9D9D9"/>
+              <w:bottom w:val="single" w:sz="4" w:color="D9D9D9"/>
+              <w:right w:val="single" w:sz="4" w:color="D9D9D9"/>
+            </w:tcBorders>
+            <w:tcMar>
+              <w:top w:w="90" w:type="dxa"/>
+              <w:left w:w="90" w:type="dxa"/>
+              <w:bottom w:w="90" w:type="dxa"/>
+              <w:right w:w="90" w:type="dxa"/>
+            </w:tcMar>
+          </w:tcPr>
+          <w:p>
+            <w:pPr>
+              <w:spacing w:after="40" w:line="252" w:lineRule="auto"/>
+            </w:pPr>
+            <w:r>
+              <w:rPr>
+                <w:sz w:val="22"/>
+              </w:rPr>
+              <w:t>4 and 1</w:t>
+            </w:r>
+          </w:p>
+        </w:tc>
+        <w:tc>
+          <w:tcPr>
+            <w:tcW w:type="dxa" w:w="3744"/>
+            <w:vAlign w:val="center"/>
+            <w:shd w:fill="FFFFFF"/>
+            <w:tcBorders>
+              <w:top w:val="single" w:sz="4" w:color="D9D9D9"/>
+              <w:left w:val="single" w:sz="4" w:color="D9D9D9"/>
+              <w:bottom w:val="single" w:sz="4" w:color="D9D9D9"/>
+              <w:right w:val="single" w:sz="4" w:color="D9D9D9"/>
+            </w:tcBorders>
+            <w:tcMar>
+              <w:top w:w="90" w:type="dxa"/>
+              <w:left w:w="90" w:type="dxa"/>
+              <w:bottom w:w="90" w:type="dxa"/>
+              <w:right w:w="90" w:type="dxa"/>
+            </w:tcMar>
+          </w:tcPr>
+          <w:p>
+            <w:pPr>
+              <w:spacing w:after="40" w:line="252" w:lineRule="auto"/>
+            </w:pPr>
+            <w:r>
+              <w:rPr>
+                <w:sz w:val="22"/>
+              </w:rPr>
+              <w:t>0101</w:t>
+            </w:r>
+          </w:p>
+        </w:tc>
+      </w:tr>
+      <w:tr>
+        <w:trPr>
+          <w:cantSplit/>
+        </w:trPr>
+        <w:tc>
+          <w:tcPr>
+            <w:tcW w:type="dxa" w:w="3024"/>
+            <w:vAlign w:val="center"/>
+            <w:shd w:fill="EDF5F7"/>
+            <w:tcBorders>
+              <w:top w:val="single" w:sz="4" w:color="D9D9D9"/>
+              <w:left w:val="single" w:sz="4" w:color="D9D9D9"/>
+              <w:bottom w:val="single" w:sz="4" w:color="D9D9D9"/>
+              <w:right w:val="single" w:sz="4" w:color="D9D9D9"/>
+            </w:tcBorders>
+            <w:tcMar>
+              <w:top w:w="90" w:type="dxa"/>
+              <w:left w:w="90" w:type="dxa"/>
+              <w:bottom w:w="90" w:type="dxa"/>
+              <w:right w:w="90" w:type="dxa"/>
+            </w:tcMar>
+          </w:tcPr>
+          <w:p>
+            <w:pPr>
+              <w:spacing w:after="40" w:line="252" w:lineRule="auto"/>
+              <w:jc w:val="center"/>
+            </w:pPr>
+            <w:r>
+              <w:rPr>
+                <w:sz w:val="22"/>
+              </w:rPr>
+              <w:t>9</w:t>
+            </w:r>
+          </w:p>
+        </w:tc>
+        <w:tc>
+          <w:tcPr>
+            <w:tcW w:type="dxa" w:w="3312"/>
+            <w:vAlign w:val="center"/>
+            <w:shd w:fill="EDF5F7"/>
+            <w:tcBorders>
+              <w:top w:val="single" w:sz="4" w:color="D9D9D9"/>
+              <w:left w:val="single" w:sz="4" w:color="D9D9D9"/>
+              <w:bottom w:val="single" w:sz="4" w:color="D9D9D9"/>
+              <w:right w:val="single" w:sz="4" w:color="D9D9D9"/>
+            </w:tcBorders>
+            <w:tcMar>
+              <w:top w:w="90" w:type="dxa"/>
+              <w:left w:w="90" w:type="dxa"/>
+              <w:bottom w:w="90" w:type="dxa"/>
+              <w:right w:w="90" w:type="dxa"/>
+            </w:tcMar>
+          </w:tcPr>
+          <w:p>
+            <w:pPr>
+              <w:spacing w:after="40" w:line="252" w:lineRule="auto"/>
+            </w:pPr>
+            <w:r>
+              <w:rPr>
+                <w:sz w:val="22"/>
+              </w:rPr>
+              <w:t>8 and 1</w:t>
+            </w:r>
+          </w:p>
+        </w:tc>
+        <w:tc>
+          <w:tcPr>
+            <w:tcW w:type="dxa" w:w="3744"/>
+            <w:vAlign w:val="center"/>
+            <w:shd w:fill="EDF5F7"/>
+            <w:tcBorders>
+              <w:top w:val="single" w:sz="4" w:color="D9D9D9"/>
+              <w:left w:val="single" w:sz="4" w:color="D9D9D9"/>
+              <w:bottom w:val="single" w:sz="4" w:color="D9D9D9"/>
+              <w:right w:val="single" w:sz="4" w:color="D9D9D9"/>
+            </w:tcBorders>
+            <w:tcMar>
+              <w:top w:w="90" w:type="dxa"/>
+              <w:left w:w="90" w:type="dxa"/>
+              <w:bottom w:w="90" w:type="dxa"/>
+              <w:right w:w="90" w:type="dxa"/>
+            </w:tcMar>
+          </w:tcPr>
+          <w:p>
+            <w:pPr>
+              <w:spacing w:after="40" w:line="252" w:lineRule="auto"/>
+            </w:pPr>
+            <w:r>
+              <w:rPr>
+                <w:sz w:val="22"/>
+              </w:rPr>
+              <w:t>1001</w:t>
+            </w:r>
+          </w:p>
+        </w:tc>
+      </w:tr>
+      <w:tr>
+        <w:trPr>
+          <w:cantSplit/>
+        </w:trPr>
+        <w:tc>
+          <w:tcPr>
+            <w:tcW w:type="dxa" w:w="3024"/>
+            <w:vAlign w:val="center"/>
+            <w:shd w:fill="FFFFFF"/>
+            <w:tcBorders>
+              <w:top w:val="single" w:sz="4" w:color="D9D9D9"/>
+              <w:left w:val="single" w:sz="4" w:color="D9D9D9"/>
+              <w:bottom w:val="single" w:sz="4" w:color="D9D9D9"/>
+              <w:right w:val="single" w:sz="4" w:color="D9D9D9"/>
+            </w:tcBorders>
+            <w:tcMar>
+              <w:top w:w="90" w:type="dxa"/>
+              <w:left w:w="90" w:type="dxa"/>
+              <w:bottom w:w="90" w:type="dxa"/>
+              <w:right w:w="90" w:type="dxa"/>
+            </w:tcMar>
+          </w:tcPr>
+          <w:p>
+            <w:pPr>
+              <w:spacing w:after="40" w:line="252" w:lineRule="auto"/>
+              <w:jc w:val="center"/>
+            </w:pPr>
+            <w:r>
+              <w:rPr>
+                <w:sz w:val="22"/>
+              </w:rPr>
+              <w:t>Your choice</w:t>
+            </w:r>
+          </w:p>
+        </w:tc>
+        <w:tc>
+          <w:tcPr>
+            <w:tcW w:type="dxa" w:w="3312"/>
+            <w:vAlign w:val="center"/>
+            <w:shd w:fill="FFFFFF"/>
+            <w:tcBorders>
+              <w:top w:val="single" w:sz="4" w:color="D9D9D9"/>
+              <w:left w:val="single" w:sz="4" w:color="D9D9D9"/>
+              <w:bottom w:val="single" w:sz="4" w:color="D9D9D9"/>
+              <w:right w:val="single" w:sz="4" w:color="D9D9D9"/>
+            </w:tcBorders>
+            <w:tcMar>
+              <w:top w:w="90" w:type="dxa"/>
+              <w:left w:w="90" w:type="dxa"/>
+              <w:bottom w:w="90" w:type="dxa"/>
+              <w:right w:w="90" w:type="dxa"/>
+            </w:tcMar>
+          </w:tcPr>
+          <w:p>
+            <w:pPr>
+              <w:spacing w:after="40" w:line="252" w:lineRule="auto"/>
+            </w:pPr>
+            <w:r>
+              <w:rPr>
+                <w:sz w:val="22"/>
+              </w:rPr>
+            </w:r>
+          </w:p>
+        </w:tc>
+        <w:tc>
+          <w:tcPr>
+            <w:tcW w:type="dxa" w:w="3744"/>
+            <w:vAlign w:val="center"/>
+            <w:shd w:fill="FFFFFF"/>
+            <w:tcBorders>
+              <w:top w:val="single" w:sz="4" w:color="D9D9D9"/>
+              <w:left w:val="single" w:sz="4" w:color="D9D9D9"/>
+              <w:bottom w:val="single" w:sz="4" w:color="D9D9D9"/>
+              <w:right w:val="single" w:sz="4" w:color="D9D9D9"/>
+            </w:tcBorders>
+            <w:tcMar>
+              <w:top w:w="90" w:type="dxa"/>
+              <w:left w:w="90" w:type="dxa"/>
+              <w:bottom w:w="90" w:type="dxa"/>
+              <w:right w:w="90" w:type="dxa"/>
+            </w:tcMar>
+          </w:tcPr>
+          <w:p>
+            <w:pPr>
+              <w:spacing w:after="40" w:line="252" w:lineRule="auto"/>
+            </w:pPr>
+            <w:r>
+              <w:rPr>
+                <w:sz w:val="22"/>
+              </w:rPr>
+            </w:r>
+          </w:p>
+        </w:tc>
+      </w:tr>
+    </w:tbl>
+    <w:p>
+      <w:pPr>
+        <w:spacing w:after="80" w:line="20" w:lineRule="exact"/>
+      </w:pPr>
+    </w:p>
+    <w:p>
+      <w:r/>
+      <w:r>
+        <w:rPr>
+          <w:b/>
+        </w:rPr>
+        <w:t>Show me:</w:t>
+      </w:r>
+      <w:r>
+        <w:t xml:space="preserve"> make a number and explain why its cards add up correctly.</w:t>
+      </w:r>
+    </w:p>
+    <w:p>
+      <w:r/>
+      <w:r>
+        <w:rPr>
+          <w:b/>
+        </w:rPr>
+        <w:t>Your next question:</w:t>
+      </w:r>
+      <w:r>
+        <w:t xml:space="preserve"> what is the biggest number these four cards can make? What new card would we need for 16?</w:t>
+      </w:r>
+    </w:p>
+    <w:p>
+      <w:r/>
+      <w:r>
+        <w:rPr>
+          <w:b/>
+        </w:rPr>
+        <w:t>Keep this discovery:</w:t>
+      </w:r>
+      <w:r>
+        <w:t xml:space="preserve"> binary uses the same numbers, written with place values that double. A display may use A for ten through F for fifteen; ask for the display key if you use the board.</w:t>
+      </w:r>
+    </w:p>
+    <w:p>
+      <w:pPr>
+        <w:pStyle w:val="Heading1"/>
+        <w:pageBreakBefore/>
+      </w:pPr>
+      <w:r>
+        <w:t>Chapter 8 Read a circuit recording</w:t>
+      </w:r>
+    </w:p>
+    <w:p>
+      <w:r/>
+      <w:r>
+        <w:rPr>
+          <w:b/>
+        </w:rPr>
+        <w:t>Your mission:</w:t>
+      </w:r>
+      <w:r>
+        <w:t xml:space="preserve"> find one count and one pause in a finished waveform recording.</w:t>
+      </w:r>
+    </w:p>
+    <w:p>
+      <w:r/>
+      <w:r>
+        <w:rPr>
+          <w:b/>
+        </w:rPr>
+        <w:t>You need:</w:t>
+      </w:r>
+      <w:r>
+        <w:t xml:space="preserve"> the WASM workbook lab, “Count, pause, resume,” opened by your guide. Begin with its recorded trace. Your guide can run the prepared RTL test to produce a fresh trace.</w:t>
+      </w:r>
+    </w:p>
+    <w:p>
+      <w:pPr>
+        <w:ind w:left="216" w:hanging="216"/>
+      </w:pPr>
+      <w:r>
+        <w:t>1. Press First event, then Next rising edge. This first edge at 2 ns resets the count to zero. Your guide points out reset. After that, watch clk, s_enable and s_value.</w:t>
+      </w:r>
+    </w:p>
+    <w:p>
+      <w:pPr>
+        <w:ind w:left="216" w:hanging="216"/>
+      </w:pPr>
+      <w:r>
+        <w:t>2. Use Next rising edge to visit enabled edges at 6, 10 and 14 ns. Watch the count reach 1, 2 and 3.</w:t>
+      </w:r>
+    </w:p>
+    <w:p>
+      <w:pPr>
+        <w:ind w:left="216" w:hanging="216"/>
+      </w:pPr>
+      <w:r>
+        <w:t>3. Visit 18 and 22 ns. Enable is off. What stays the same?</w:t>
+      </w:r>
+    </w:p>
+    <w:p>
+      <w:pPr>
+        <w:ind w:left="216" w:hanging="216"/>
+      </w:pPr>
+      <w:r>
+        <w:t>4. Visit 26 ns. Enable is on again. What happens?</w:t>
+      </w:r>
+    </w:p>
+    <w:p>
+      <w:r/>
+      <w:r>
+        <w:rPr>
+          <w:b/>
+        </w:rPr>
+        <w:t>Show me:</w:t>
+      </w:r>
+      <w:r>
+        <w:t xml:space="preserve"> choose an edge and point to evidence that it counted or held.</w:t>
+      </w:r>
+    </w:p>
+    <w:p>
+      <w:r/>
+      <w:r>
+        <w:rPr>
+          <w:b/>
+        </w:rPr>
+        <w:t>Your next question:</w:t>
+      </w:r>
+      <w:r>
+        <w:t xml:space="preserve"> choose a different edge for your partner to explain. If you prefer a new input experiment, return to Chapter 2.</w:t>
+      </w:r>
+    </w:p>
+    <w:p>
+      <w:r/>
+      <w:r>
+        <w:rPr>
+          <w:b/>
+        </w:rPr>
+        <w:t>Keep this discovery:</w:t>
+      </w:r>
+      <w:r>
+        <w:t xml:space="preserve"> moving the cursor explores a finished recording. It does not clock a live circuit or change the prepared inputs. The time labels arrange this test; they do not measure an FPGA's speed.</w:t>
+      </w:r>
+    </w:p>
+    <w:p>
+      <w:pPr>
+        <w:pStyle w:val="Heading1"/>
+        <w:pageBreakBefore/>
       </w:pPr>
       <w:r>
         <w:t>Meet your little hardware workshop</w:t>
@@ -1033,13 +5084,9 @@
       </w:r>
     </w:p>
     <w:p>
-      <w:r>
-        <w:br w:type="page"/>
-      </w:r>
-    </w:p>
-    <w:p>
       <w:pPr>
         <w:pStyle w:val="Heading1"/>
+        <w:pageBreakBefore/>
       </w:pPr>
       <w:r>
         <w:t>Lesson one  Numbers made of lights</w:t>
@@ -2129,13 +6176,9 @@
       </w:r>
     </w:p>
     <w:p>
-      <w:r>
-        <w:br w:type="page"/>
-      </w:r>
-    </w:p>
-    <w:p>
       <w:pPr>
         <w:pStyle w:val="Heading1"/>
+        <w:pageBreakBefore/>
       </w:pPr>
       <w:r>
         <w:t>Lesson two  Gates make decisions</w:t>
@@ -2919,13 +6962,9 @@
       </w:r>
     </w:p>
     <w:p>
-      <w:r>
-        <w:br w:type="page"/>
-      </w:r>
-    </w:p>
-    <w:p>
       <w:pPr>
         <w:pStyle w:val="Heading1"/>
+        <w:pageBreakBefore/>
       </w:pPr>
       <w:r>
         <w:t>Lesson three  Make an adder</w:t>
@@ -3728,13 +7767,9 @@
       </w:hyperlink>
     </w:p>
     <w:p>
-      <w:r>
-        <w:br w:type="page"/>
-      </w:r>
-    </w:p>
-    <w:p>
       <w:pPr>
         <w:pStyle w:val="Heading1"/>
+        <w:pageBreakBefore/>
       </w:pPr>
       <w:r>
         <w:t>Lesson four  What happens when bits run out</w:t>
@@ -4365,13 +8400,9 @@
       </w:r>
     </w:p>
     <w:p>
-      <w:r>
-        <w:br w:type="page"/>
-      </w:r>
-    </w:p>
-    <w:p>
       <w:pPr>
         <w:pStyle w:val="Heading1"/>
+        <w:pageBreakBefore/>
       </w:pPr>
       <w:r>
         <w:t>Lesson five  A circuit that remembers</w:t>
@@ -5144,13 +9175,9 @@
       </w:r>
     </w:p>
     <w:p>
-      <w:r>
-        <w:br w:type="page"/>
-      </w:r>
-    </w:p>
-    <w:p>
       <w:pPr>
         <w:pStyle w:val="Heading1"/>
+        <w:pageBreakBefore/>
       </w:pPr>
       <w:r>
         <w:t>Lesson six  A blinking counter</w:t>
@@ -5882,13 +9909,9 @@
       </w:hyperlink>
     </w:p>
     <w:p>
-      <w:r>
-        <w:br w:type="page"/>
-      </w:r>
-    </w:p>
-    <w:p>
       <w:pPr>
         <w:pStyle w:val="Heading1"/>
+        <w:pageBreakBefore/>
       </w:pPr>
       <w:r>
         <w:t>Lesson seven  A hardware assembly line</w:t>
@@ -6514,13 +10537,9 @@
       </w:r>
     </w:p>
     <w:p>
-      <w:r>
-        <w:br w:type="page"/>
-      </w:r>
-    </w:p>
-    <w:p>
       <w:pPr>
         <w:pStyle w:val="Heading1"/>
+        <w:pageBreakBefore/>
       </w:pPr>
       <w:r>
         <w:t>Lesson eight  Invent a useful circuit</w:t>
@@ -7153,13 +11172,9 @@
       </w:r>
     </w:p>
     <w:p>
-      <w:r>
-        <w:br w:type="page"/>
-      </w:r>
-    </w:p>
-    <w:p>
       <w:pPr>
         <w:pStyle w:val="Heading1"/>
+        <w:pageBreakBefore/>
       </w:pPr>
       <w:r>
         <w:t>Bonus  When the receiver needs a rest</w:t>
@@ -7713,13 +11728,9 @@
       </w:r>
     </w:p>
     <w:p>
-      <w:r>
-        <w:br w:type="page"/>
-      </w:r>
-    </w:p>
-    <w:p>
       <w:pPr>
         <w:pStyle w:val="Heading1"/>
+        <w:pageBreakBefore/>
       </w:pPr>
       <w:r>
         <w:t>Printable number cards</w:t>
@@ -8300,13 +12311,9 @@
       </w:r>
     </w:p>
     <w:p>
-      <w:r>
-        <w:br w:type="page"/>
-      </w:r>
-    </w:p>
-    <w:p>
       <w:pPr>
         <w:pStyle w:val="Heading1"/>
+        <w:pageBreakBefore/>
       </w:pPr>
       <w:r>
         <w:t>The number display detective key</w:t>
@@ -10092,13 +14099,9 @@
       </w:r>
     </w:p>
     <w:p>
-      <w:r>
-        <w:br w:type="page"/>
-      </w:r>
-    </w:p>
-    <w:p>
       <w:pPr>
         <w:pStyle w:val="Heading1"/>
+        <w:pageBreakBefore/>
       </w:pPr>
       <w:r>
         <w:t>Guide for the grown up builder</w:t>
@@ -10106,7 +14109,7 @@
     </w:p>
     <w:p>
       <w:r>
-        <w:t>Start with one board per pair and one source language. Prepare the shell, editor and USB programming before class. Keep the first edit to a constant in StudentLogic.cs.</w:t>
+        <w:t>For a first session, use one short learner chapter for 25–30 minutes. Let the pair choose a mission and test. Binary, code and waveforms can wait. Use docs/LEARNER_LED_PILOT.md for the exact buffer transition table, startup steps, mission-specific observations and a printable observation sheet. For later board work, prepare the shell, editor and USB programming before class.</w:t>
       </w:r>
     </w:p>
     <w:tbl>
@@ -10254,7 +14257,7 @@
               <w:rPr>
                 <w:sz w:val="21"/>
               </w:rPr>
-              <w:t>10</w:t>
+              <w:t>3</w:t>
             </w:r>
           </w:p>
         </w:tc>
@@ -10284,7 +14287,7 @@
               <w:rPr>
                 <w:sz w:val="21"/>
               </w:rPr>
-              <w:t>Predict the result</w:t>
+              <w:t>Choose one mission</w:t>
             </w:r>
           </w:p>
         </w:tc>
@@ -10314,7 +14317,7 @@
               <w:rPr>
                 <w:sz w:val="21"/>
               </w:rPr>
-              <w:t>Ask for a reason before the answer</w:t>
+              <w:t>Offer two manageable choices</w:t>
             </w:r>
           </w:p>
         </w:tc>
@@ -10350,7 +14353,7 @@
               <w:rPr>
                 <w:sz w:val="21"/>
               </w:rPr>
-              <w:t>10</w:t>
+              <w:t>5</w:t>
             </w:r>
           </w:p>
         </w:tc>
@@ -10380,7 +14383,7 @@
               <w:rPr>
                 <w:sz w:val="21"/>
               </w:rPr>
-              <w:t>Cards or a physical model</w:t>
+              <w:t>First learner tries</w:t>
             </w:r>
           </w:p>
         </w:tc>
@@ -10410,7 +14413,7 @@
               <w:rPr>
                 <w:sz w:val="21"/>
               </w:rPr>
-              <w:t>Make bits and registers tangible</w:t>
+              <w:t>Allow a prediction or an open question</w:t>
             </w:r>
           </w:p>
         </w:tc>
@@ -10446,7 +14449,7 @@
               <w:rPr>
                 <w:sz w:val="21"/>
               </w:rPr>
-              <w:t>25</w:t>
+              <w:t>5</w:t>
             </w:r>
           </w:p>
         </w:tc>
@@ -10476,7 +14479,7 @@
               <w:rPr>
                 <w:sz w:val="21"/>
               </w:rPr>
-              <w:t>Build and try</w:t>
+              <w:t>Swap the controls</w:t>
             </w:r>
           </w:p>
         </w:tc>
@@ -10506,7 +14509,7 @@
               <w:rPr>
                 <w:sz w:val="21"/>
               </w:rPr>
-              <w:t>Handle tool setup and programming</w:t>
+              <w:t>Give the second learner a fresh start</w:t>
             </w:r>
           </w:p>
         </w:tc>
@@ -10542,7 +14545,7 @@
               <w:rPr>
                 <w:sz w:val="21"/>
               </w:rPr>
-              <w:t>10</w:t>
+              <w:t>7</w:t>
             </w:r>
           </w:p>
         </w:tc>
@@ -10572,7 +14575,7 @@
               <w:rPr>
                 <w:sz w:val="21"/>
               </w:rPr>
-              <w:t>Test predictions</w:t>
+              <w:t>Choose another test</w:t>
             </w:r>
           </w:p>
         </w:tc>
@@ -10602,7 +14605,7 @@
               <w:rPr>
                 <w:sz w:val="21"/>
               </w:rPr>
-              <w:t>Keep automatic checks in the build</w:t>
+              <w:t>Help both children notice cause and effect</w:t>
             </w:r>
           </w:p>
         </w:tc>
@@ -10668,7 +14671,7 @@
               <w:rPr>
                 <w:sz w:val="21"/>
               </w:rPr>
-              <w:t>Explain and reflect</w:t>
+              <w:t>Show a discovery</w:t>
             </w:r>
           </w:p>
         </w:tc>
@@ -10698,7 +14701,103 @@
               <w:rPr>
                 <w:sz w:val="21"/>
               </w:rPr>
-              <w:t>Have partners swap explanations</w:t>
+              <w:t>Ask each learner to demonstrate or point</w:t>
+            </w:r>
+          </w:p>
+        </w:tc>
+      </w:tr>
+      <w:tr>
+        <w:trPr>
+          <w:cantSplit/>
+        </w:trPr>
+        <w:tc>
+          <w:tcPr>
+            <w:tcW w:type="dxa" w:w="1152"/>
+            <w:vAlign w:val="center"/>
+            <w:shd w:fill="EDF5F7"/>
+            <w:tcBorders>
+              <w:top w:val="single" w:sz="4" w:color="D9D9D9"/>
+              <w:left w:val="single" w:sz="4" w:color="D9D9D9"/>
+              <w:bottom w:val="single" w:sz="4" w:color="D9D9D9"/>
+              <w:right w:val="single" w:sz="4" w:color="D9D9D9"/>
+            </w:tcBorders>
+            <w:tcMar>
+              <w:top w:w="90" w:type="dxa"/>
+              <w:left w:w="90" w:type="dxa"/>
+              <w:bottom w:w="90" w:type="dxa"/>
+              <w:right w:w="90" w:type="dxa"/>
+            </w:tcMar>
+          </w:tcPr>
+          <w:p>
+            <w:pPr>
+              <w:spacing w:after="40" w:line="252" w:lineRule="auto"/>
+              <w:jc w:val="center"/>
+            </w:pPr>
+            <w:r>
+              <w:rPr>
+                <w:sz w:val="21"/>
+              </w:rPr>
+              <w:t>3</w:t>
+            </w:r>
+          </w:p>
+        </w:tc>
+        <w:tc>
+          <w:tcPr>
+            <w:tcW w:type="dxa" w:w="3888"/>
+            <w:vAlign w:val="center"/>
+            <w:shd w:fill="EDF5F7"/>
+            <w:tcBorders>
+              <w:top w:val="single" w:sz="4" w:color="D9D9D9"/>
+              <w:left w:val="single" w:sz="4" w:color="D9D9D9"/>
+              <w:bottom w:val="single" w:sz="4" w:color="D9D9D9"/>
+              <w:right w:val="single" w:sz="4" w:color="D9D9D9"/>
+            </w:tcBorders>
+            <w:tcMar>
+              <w:top w:w="90" w:type="dxa"/>
+              <w:left w:w="90" w:type="dxa"/>
+              <w:bottom w:w="90" w:type="dxa"/>
+              <w:right w:w="90" w:type="dxa"/>
+            </w:tcMar>
+          </w:tcPr>
+          <w:p>
+            <w:pPr>
+              <w:spacing w:after="40" w:line="252" w:lineRule="auto"/>
+            </w:pPr>
+            <w:r>
+              <w:rPr>
+                <w:sz w:val="21"/>
+              </w:rPr>
+              <w:t>Private feedback and next choice</w:t>
+            </w:r>
+          </w:p>
+        </w:tc>
+        <w:tc>
+          <w:tcPr>
+            <w:tcW w:type="dxa" w:w="5040"/>
+            <w:vAlign w:val="center"/>
+            <w:shd w:fill="EDF5F7"/>
+            <w:tcBorders>
+              <w:top w:val="single" w:sz="4" w:color="D9D9D9"/>
+              <w:left w:val="single" w:sz="4" w:color="D9D9D9"/>
+              <w:bottom w:val="single" w:sz="4" w:color="D9D9D9"/>
+              <w:right w:val="single" w:sz="4" w:color="D9D9D9"/>
+            </w:tcBorders>
+            <w:tcMar>
+              <w:top w:w="90" w:type="dxa"/>
+              <w:left w:w="90" w:type="dxa"/>
+              <w:bottom w:w="90" w:type="dxa"/>
+              <w:right w:w="90" w:type="dxa"/>
+            </w:tcMar>
+          </w:tcPr>
+          <w:p>
+            <w:pPr>
+              <w:spacing w:after="40" w:line="252" w:lineRule="auto"/>
+            </w:pPr>
+            <w:r>
+              <w:rPr>
+                <w:sz w:val="21"/>
+              </w:rPr>
+              <w:t>Ask each learner what to repeat or change</w:t>
             </w:r>
           </w:p>
         </w:tc>
@@ -10710,11 +14809,35 @@
       </w:pPr>
     </w:p>
     <w:p>
+      <w:r>
+        <w:t>This plan totals 28 minutes. Repeats and extra missions belong in another visit or outside this budget. Stop earlier for a break when needed.</w:t>
+      </w:r>
+    </w:p>
+    <w:p>
       <w:pPr>
         <w:pStyle w:val="Heading2"/>
       </w:pPr>
       <w:r>
-        <w:t>The supported classroom target</w:t>
+        <w:t>Record what each learner actually does</w:t>
+      </w:r>
+    </w:p>
+    <w:p>
+      <w:r>
+        <w:t>Use the mission-specific prompts and observation sheet in docs/LEARNER_LED_PILOT.md. Keep enjoyment and demonstrated understanding separate. Record the learner’s own question, their turn at the controls, and whether they showed the idea independently or with help. Do not turn this into a score or a race.</w:t>
+      </w:r>
+    </w:p>
+    <w:p>
+      <w:r>
+        <w:t>For parcel chapters, the guide uses that file’s exact buffer transition table. Decide all transfers from the cards and signals visible before the edge, then move the agreed cards together. Check accepted = delivered + stored, and check the delivered order too.</w:t>
+      </w:r>
+    </w:p>
+    <w:p>
+      <w:pPr>
+        <w:pStyle w:val="Heading1"/>
+        <w:pageBreakBefore/>
+      </w:pPr>
+      <w:r>
+        <w:t>Teacher preparation and classroom target</w:t>
       </w:r>
     </w:p>
     <w:p>
@@ -10794,13 +14917,9 @@
       </w:r>
     </w:p>
     <w:p>
-      <w:r>
-        <w:br w:type="page"/>
-      </w:r>
-    </w:p>
-    <w:p>
       <w:pPr>
         <w:pStyle w:val="Heading1"/>
+        <w:pageBreakBefore/>
       </w:pPr>
       <w:r>
         <w:t>Answer key and progress passport</w:t>
@@ -10808,7 +14927,7 @@
     </w:p>
     <w:p>
       <w:r>
-        <w:t>Use the answers after children have made predictions. Praise a clear explanation and a test that catches a mistake, rather than the number of lines typed.</w:t>
+        <w:t>Use the answers after children have had a chance to explore or predict. Praise a clear explanation and a test that catches a mistake, rather than the number of lines typed.</w:t>
       </w:r>
     </w:p>
     <w:tbl>
@@ -12420,13 +16539,9 @@
       </w:r>
     </w:p>
     <w:p>
-      <w:r>
-        <w:br w:type="page"/>
-      </w:r>
-    </w:p>
-    <w:p>
       <w:pPr>
         <w:pStyle w:val="Heading1"/>
+        <w:pageBreakBefore/>
       </w:pPr>
       <w:r>
         <w:t>Teacher reference  Supported operators</w:t>
@@ -13283,13 +17398,9 @@
       </w:r>
     </w:p>
     <w:p>
-      <w:r>
-        <w:br w:type="page"/>
-      </w:r>
-    </w:p>
-    <w:p>
       <w:pPr>
         <w:pStyle w:val="Heading1"/>
+        <w:pageBreakBefore/>
       </w:pPr>
       <w:r>
         <w:t>Teacher extension  Two ways to multiply</w:t>
@@ -14715,13 +18826,9 @@
       </w:r>
     </w:p>
     <w:p>
-      <w:r>
-        <w:br w:type="page"/>
-      </w:r>
-    </w:p>
-    <w:p>
       <w:pPr>
         <w:pStyle w:val="Heading1"/>
+        <w:pageBreakBefore/>
       </w:pPr>
       <w:r>
         <w:t>Teacher extension  Divide and round</w:t>
@@ -15738,13 +19845,9 @@
       </w:r>
     </w:p>
     <w:p>
-      <w:r>
-        <w:br w:type="page"/>
-      </w:r>
-    </w:p>
-    <w:p>
       <w:pPr>
         <w:pStyle w:val="Heading1"/>
+        <w:pageBreakBefore/>
       </w:pPr>
       <w:r>
         <w:t>Why SharpHDL</w:t>
@@ -16344,13 +20447,9 @@
       </w:r>
     </w:p>
     <w:p>
-      <w:r>
-        <w:br w:type="page"/>
-      </w:r>
-    </w:p>
-    <w:p>
       <w:pPr>
         <w:pStyle w:val="Heading1"/>
+        <w:pageBreakBefore/>
       </w:pPr>
       <w:r>
         <w:t>Teacher extension  Ordinary code becomes gates</w:t>
@@ -17053,13 +21152,9 @@
       </w:r>
     </w:p>
     <w:p>
-      <w:r>
-        <w:br w:type="page"/>
-      </w:r>
-    </w:p>
-    <w:p>
       <w:pPr>
         <w:pStyle w:val="Heading1"/>
+        <w:pageBreakBefore/>
       </w:pPr>
       <w:r>
         <w:t>Teacher extension  Loops shifts and memory</w:t>
@@ -18205,13 +22300,9 @@
       </w:r>
     </w:p>
     <w:p>
-      <w:r>
-        <w:br w:type="page"/>
-      </w:r>
-    </w:p>
-    <w:p>
       <w:pPr>
         <w:pStyle w:val="Heading1"/>
+        <w:pageBreakBefore/>
       </w:pPr>
       <w:r>
         <w:t>Clock lab  Coach the circuit</w:t>
@@ -18219,7 +22310,7 @@
     </w:p>
     <w:p>
       <w:r>
-        <w:t>Open SharpHDL_Learning_Lab.html in a modern browser. It works offline. This companion is most useful after Lesson 5, when children know that a register changes on a clock edge. Start with the hockey drill; the number shifts and loops are optional extensions.</w:t>
+        <w:t>Open SharpHDL_Learning_Lab.html in a modern browser. It works offline. This companion is most useful after Lesson 5, when children know that a register changes on a clock edge. The short learner chapters also offer an earlier guided route. Hide the code and focus on one control at a time.</w:t>
       </w:r>
     </w:p>
     <w:p>
@@ -18231,8 +22322,8 @@
       <w:r>
         <w:drawing>
           <wp:inline xmlns:a="http://schemas.openxmlformats.org/drawingml/2006/main" xmlns:pic="http://schemas.openxmlformats.org/drawingml/2006/picture">
-            <wp:extent cx="5669280" cy="1211946"/>
-            <wp:docPr id="16" name="Picture 16" descr="The controller remembers one state. Start enters Running; four enabled practice ticks reach Done. Stop cancels a running drill. Reset returns to Ready." title="fsm lab"/>
+            <wp:extent cx="4937760" cy="1055566"/>
+            <wp:docPr id="16" name="Picture 16" descr="Start enters Running; four enabled ticks reach Done. Stop cancels a drill. Reset returns to Ready." title="fsm lab"/>
             <wp:cNvGraphicFramePr>
               <a:graphicFrameLocks noChangeAspect="1"/>
             </wp:cNvGraphicFramePr>
@@ -18252,7 +22343,7 @@
                   <pic:spPr>
                     <a:xfrm>
                       <a:off x="0" y="0"/>
-                      <a:ext cx="5669280" cy="1211946"/>
+                      <a:ext cx="4937760" cy="1055566"/>
                     </a:xfrm>
                     <a:prstGeom prst="rect"/>
                   </pic:spPr>
@@ -18273,7 +22364,7 @@
           <w:i/>
           <w:sz w:val="20"/>
         </w:rPr>
-        <w:t>The controller remembers one state. Start enters Running; four enabled practice ticks reach Done. Stop cancels a running drill. Reset returns to Ready.</w:t>
+        <w:t>Start enters Running; four enabled ticks reach Done. Stop cancels a drill. Reset returns to Ready.</w:t>
       </w:r>
     </w:p>
     <w:p>
@@ -18281,7 +22372,12 @@
         <w:pStyle w:val="Heading2"/>
       </w:pPr>
       <w:r>
-        <w:t>Predict before you press the clock</w:t>
+        <w:t>Try one edge at a time</w:t>
+      </w:r>
+    </w:p>
+    <w:p>
+      <w:r>
+        <w:t>For a fresh drill, stop Auto if running. Turn Start and Stop off, turn Practice enabled on, and press Reset. Reset clears registers but leaves input checkboxes unchanged. Turn Start on, press Clock +1 once, then turn Start off. You are now Running at count zero.</w:t>
       </w:r>
     </w:p>
     <w:tbl>
@@ -18395,7 +22491,7 @@
               <w:rPr>
                 <w:sz w:val="21"/>
               </w:rPr>
-              <w:t>Turn Start on and press Clock once</w:t>
+              <w:t>From Ready/0, turn Start on and press Clock once</w:t>
             </w:r>
           </w:p>
         </w:tc>
@@ -18425,7 +22521,7 @@
               <w:rPr>
                 <w:sz w:val="21"/>
               </w:rPr>
-              <w:t>Running begins, but count is still zero. The first practice tick is the next edge.</w:t>
+              <w:t>Running begins at zero. Turn Start off; the first practice tick is the next edge.</w:t>
             </w:r>
           </w:p>
         </w:tc>
@@ -18460,7 +22556,7 @@
               <w:rPr>
                 <w:sz w:val="21"/>
               </w:rPr>
-              <w:t>Turn Start off and clock four times</w:t>
+              <w:t>From Running/0 with Start off, clock four times</w:t>
             </w:r>
           </w:p>
         </w:tc>
@@ -18490,7 +22586,7 @@
               <w:rPr>
                 <w:sz w:val="21"/>
               </w:rPr>
-              <w:t>Count reaches four and state becomes Done. One more edge returns to Ready.</w:t>
+              <w:t>Done/4 is temporary. The next two edges show Ready/4, then Ready/0.</w:t>
             </w:r>
           </w:p>
         </w:tc>
@@ -18666,7 +22762,7 @@
     </w:p>
     <w:p>
       <w:r>
-        <w:t>This short extract shows the idea; the HTML includes the full C# with Stop and Done transitions. A missing transition holds the state. When two transitions match, the first listed wins. The helper creates real hardware; it does not automatically schedule an arbitrary while loop.</w:t>
+        <w:t>The HTML contains the full C# including Stop and Done transitions. A missing transition holds state; the first matching transition wins. This helper builds hardware, not an automatically clocked while loop.</w:t>
       </w:r>
     </w:p>
     <w:p>
@@ -18695,13 +22791,9 @@
       </w:hyperlink>
     </w:p>
     <w:p>
-      <w:r>
-        <w:br w:type="page"/>
-      </w:r>
-    </w:p>
-    <w:p>
       <w:pPr>
         <w:pStyle w:val="Heading1"/>
+        <w:pageBreakBefore/>
       </w:pPr>
       <w:r>
         <w:t>Teacher extension  A loop with a clock</w:t>
@@ -19403,13 +23495,9 @@
       </w:hyperlink>
     </w:p>
     <w:p>
-      <w:r>
-        <w:br w:type="page"/>
-      </w:r>
-    </w:p>
-    <w:p>
       <w:pPr>
         <w:pStyle w:val="Heading1"/>
+        <w:pageBreakBefore/>
       </w:pPr>
       <w:r>
         <w:t>Teacher extension  Number boxes and drawers</w:t>
@@ -19832,13 +23920,9 @@
       </w:r>
     </w:p>
     <w:p>
-      <w:r>
-        <w:br w:type="page"/>
-      </w:r>
-    </w:p>
-    <w:p>
       <w:pPr>
         <w:pStyle w:val="Heading1"/>
+        <w:pageBreakBefore/>
       </w:pPr>
       <w:r>
         <w:t>Teacher extension  Names on the wires</w:t>
@@ -20271,13 +24355,9 @@
       </w:r>
     </w:p>
     <w:p>
-      <w:r>
-        <w:br w:type="page"/>
-      </w:r>
-    </w:p>
-    <w:p>
       <w:pPr>
         <w:pStyle w:val="Heading1"/>
+        <w:pageBreakBefore/>
       </w:pPr>
       <w:r>
         <w:t>Browser lab  Follow the clock</w:t>
@@ -20918,13 +24998,9 @@
       </w:r>
     </w:p>
     <w:p>
-      <w:r>
-        <w:br w:type="page"/>
-      </w:r>
-    </w:p>
-    <w:p>
       <w:pPr>
         <w:pStyle w:val="Heading1"/>
+        <w:pageBreakBefore/>
       </w:pPr>
       <w:r>
         <w:t>Browser lab  Guide and extension cards</w:t>
@@ -21444,13 +25520,9 @@
       </w:r>
     </w:p>
     <w:p>
-      <w:r>
-        <w:br w:type="page"/>
-      </w:r>
-    </w:p>
-    <w:p>
       <w:pPr>
         <w:pStyle w:val="Heading1"/>
+        <w:pageBreakBefore/>
       </w:pPr>
       <w:r>
         <w:t>Browser lab  Passing cards without losing one</w:t>
@@ -22858,13 +26930,9 @@
       </w:r>
     </w:p>
     <w:p>
-      <w:r>
-        <w:br w:type="page"/>
-      </w:r>
-    </w:p>
-    <w:p>
       <w:pPr>
         <w:pStyle w:val="Heading1"/>
+        <w:pageBreakBefore/>
       </w:pPr>
       <w:r>
         <w:t>Practice  Offer a card and give permission</w:t>

</xml_diff>